<commit_message>
entrega: memoria con el capítulo 6 reescrito y la discusión del 5 actualizada
</commit_message>
<xml_diff>
--- a/memoria/memoria.docx
+++ b/memoria/memoria.docx
@@ -1948,7 +1948,7 @@
         <w:rPr>
           <w:sz w:val="18"/>
         </w:rPr>
-        <w:t>Generado desde el commit 725bf48 del repositorio del trabajo.</w:t>
+        <w:t>Generado desde el commit 38a0fd3 con cambios sin confirmar del repositorio del trabajo.</w:t>
       </w:r>
     </w:p>
     <w:p>
@@ -1989,7 +1989,7 @@
         <w:tab/>
       </w:r>
       <w:r>
-        <w:t>12</w:t>
+        <w:t>13</w:t>
       </w:r>
     </w:p>
     <w:p>
@@ -2006,7 +2006,7 @@
         <w:tab/>
       </w:r>
       <w:r>
-        <w:t>13</w:t>
+        <w:t>14</w:t>
       </w:r>
     </w:p>
     <w:p>
@@ -2023,7 +2023,7 @@
         <w:tab/>
       </w:r>
       <w:r>
-        <w:t>14</w:t>
+        <w:t>15</w:t>
       </w:r>
     </w:p>
     <w:p>
@@ -2040,7 +2040,7 @@
         <w:tab/>
       </w:r>
       <w:r>
-        <w:t>14</w:t>
+        <w:t>15</w:t>
       </w:r>
     </w:p>
     <w:p>
@@ -2057,7 +2057,7 @@
         <w:tab/>
       </w:r>
       <w:r>
-        <w:t>18</w:t>
+        <w:t>19</w:t>
       </w:r>
     </w:p>
     <w:p>
@@ -2074,7 +2074,7 @@
         <w:tab/>
       </w:r>
       <w:r>
-        <w:t>20</w:t>
+        <w:t>21</w:t>
       </w:r>
     </w:p>
     <w:p>
@@ -2091,7 +2091,7 @@
         <w:tab/>
       </w:r>
       <w:r>
-        <w:t>20</w:t>
+        <w:t>21</w:t>
       </w:r>
     </w:p>
     <w:p>
@@ -2108,7 +2108,7 @@
         <w:tab/>
       </w:r>
       <w:r>
-        <w:t>21</w:t>
+        <w:t>22</w:t>
       </w:r>
     </w:p>
     <w:p>
@@ -2125,7 +2125,7 @@
         <w:tab/>
       </w:r>
       <w:r>
-        <w:t>22</w:t>
+        <w:t>23</w:t>
       </w:r>
     </w:p>
     <w:p>
@@ -2142,7 +2142,7 @@
         <w:tab/>
       </w:r>
       <w:r>
-        <w:t>22</w:t>
+        <w:t>23</w:t>
       </w:r>
     </w:p>
     <w:p>
@@ -2159,7 +2159,7 @@
         <w:tab/>
       </w:r>
       <w:r>
-        <w:t>23</w:t>
+        <w:t>24</w:t>
       </w:r>
     </w:p>
     <w:p>
@@ -2176,7 +2176,7 @@
         <w:tab/>
       </w:r>
       <w:r>
-        <w:t>24</w:t>
+        <w:t>25</w:t>
       </w:r>
     </w:p>
     <w:p>
@@ -2193,7 +2193,7 @@
         <w:tab/>
       </w:r>
       <w:r>
-        <w:t>24</w:t>
+        <w:t>25</w:t>
       </w:r>
     </w:p>
     <w:p>
@@ -2210,7 +2210,7 @@
         <w:tab/>
       </w:r>
       <w:r>
-        <w:t>25</w:t>
+        <w:t>26</w:t>
       </w:r>
     </w:p>
     <w:p>
@@ -2227,7 +2227,7 @@
         <w:tab/>
       </w:r>
       <w:r>
-        <w:t>26</w:t>
+        <w:t>27</w:t>
       </w:r>
     </w:p>
     <w:p>
@@ -2244,7 +2244,7 @@
         <w:tab/>
       </w:r>
       <w:r>
-        <w:t>26</w:t>
+        <w:t>27</w:t>
       </w:r>
     </w:p>
     <w:p>
@@ -2261,7 +2261,7 @@
         <w:tab/>
       </w:r>
       <w:r>
-        <w:t>27</w:t>
+        <w:t>28</w:t>
       </w:r>
     </w:p>
     <w:p>
@@ -2278,7 +2278,7 @@
         <w:tab/>
       </w:r>
       <w:r>
-        <w:t>27</w:t>
+        <w:t>28</w:t>
       </w:r>
     </w:p>
     <w:p>
@@ -2295,7 +2295,7 @@
         <w:tab/>
       </w:r>
       <w:r>
-        <w:t>28</w:t>
+        <w:t>29</w:t>
       </w:r>
     </w:p>
     <w:p>
@@ -2312,7 +2312,7 @@
         <w:tab/>
       </w:r>
       <w:r>
-        <w:t>29</w:t>
+        <w:t>30</w:t>
       </w:r>
     </w:p>
     <w:p>
@@ -2329,7 +2329,7 @@
         <w:tab/>
       </w:r>
       <w:r>
-        <w:t>30</w:t>
+        <w:t>31</w:t>
       </w:r>
     </w:p>
     <w:p>
@@ -2346,7 +2346,7 @@
         <w:tab/>
       </w:r>
       <w:r>
-        <w:t>30</w:t>
+        <w:t>31</w:t>
       </w:r>
     </w:p>
     <w:p>
@@ -2363,7 +2363,7 @@
         <w:tab/>
       </w:r>
       <w:r>
-        <w:t>31</w:t>
+        <w:t>32</w:t>
       </w:r>
     </w:p>
     <w:p>
@@ -2380,7 +2380,7 @@
         <w:tab/>
       </w:r>
       <w:r>
-        <w:t>33</w:t>
+        <w:t>34</w:t>
       </w:r>
     </w:p>
     <w:p>
@@ -2397,7 +2397,7 @@
         <w:tab/>
       </w:r>
       <w:r>
-        <w:t>33</w:t>
+        <w:t>34</w:t>
       </w:r>
     </w:p>
     <w:p>
@@ -2414,7 +2414,7 @@
         <w:tab/>
       </w:r>
       <w:r>
-        <w:t>35</w:t>
+        <w:t>36</w:t>
       </w:r>
     </w:p>
     <w:p>
@@ -2431,7 +2431,7 @@
         <w:tab/>
       </w:r>
       <w:r>
-        <w:t>35</w:t>
+        <w:t>36</w:t>
       </w:r>
     </w:p>
     <w:p>
@@ -2448,7 +2448,7 @@
         <w:tab/>
       </w:r>
       <w:r>
-        <w:t>37</w:t>
+        <w:t>38</w:t>
       </w:r>
     </w:p>
     <w:p>
@@ -2465,7 +2465,7 @@
         <w:tab/>
       </w:r>
       <w:r>
-        <w:t>39</w:t>
+        <w:t>40</w:t>
       </w:r>
     </w:p>
     <w:p>
@@ -2482,7 +2482,7 @@
         <w:tab/>
       </w:r>
       <w:r>
-        <w:t>40</w:t>
+        <w:t>41</w:t>
       </w:r>
     </w:p>
     <w:p>
@@ -2499,7 +2499,7 @@
         <w:tab/>
       </w:r>
       <w:r>
-        <w:t>41</w:t>
+        <w:t>42</w:t>
       </w:r>
     </w:p>
     <w:p>
@@ -2516,7 +2516,7 @@
         <w:tab/>
       </w:r>
       <w:r>
-        <w:t>43</w:t>
+        <w:t>44</w:t>
       </w:r>
     </w:p>
     <w:p>
@@ -2533,7 +2533,7 @@
         <w:tab/>
       </w:r>
       <w:r>
-        <w:t>43</w:t>
+        <w:t>44</w:t>
       </w:r>
     </w:p>
     <w:p>
@@ -2550,7 +2550,7 @@
         <w:tab/>
       </w:r>
       <w:r>
-        <w:t>44</w:t>
+        <w:t>45</w:t>
       </w:r>
     </w:p>
     <w:p>
@@ -2567,7 +2567,7 @@
         <w:tab/>
       </w:r>
       <w:r>
-        <w:t>44</w:t>
+        <w:t>45</w:t>
       </w:r>
     </w:p>
     <w:p>
@@ -2584,7 +2584,7 @@
         <w:tab/>
       </w:r>
       <w:r>
-        <w:t>46</w:t>
+        <w:t>47</w:t>
       </w:r>
     </w:p>
     <w:p>
@@ -2601,7 +2601,7 @@
         <w:tab/>
       </w:r>
       <w:r>
-        <w:t>47</w:t>
+        <w:t>48</w:t>
       </w:r>
     </w:p>
     <w:p>
@@ -2618,7 +2618,7 @@
         <w:tab/>
       </w:r>
       <w:r>
-        <w:t>48</w:t>
+        <w:t>49</w:t>
       </w:r>
     </w:p>
     <w:p>
@@ -2635,7 +2635,7 @@
         <w:tab/>
       </w:r>
       <w:r>
-        <w:t>49</w:t>
+        <w:t>50</w:t>
       </w:r>
     </w:p>
     <w:p>
@@ -2652,7 +2652,7 @@
         <w:tab/>
       </w:r>
       <w:r>
-        <w:t>49</w:t>
+        <w:t>50</w:t>
       </w:r>
     </w:p>
     <w:p>
@@ -2669,7 +2669,7 @@
         <w:tab/>
       </w:r>
       <w:r>
-        <w:t>49</w:t>
+        <w:t>50</w:t>
       </w:r>
     </w:p>
     <w:p>
@@ -2686,7 +2686,7 @@
         <w:tab/>
       </w:r>
       <w:r>
-        <w:t>50</w:t>
+        <w:t>51</w:t>
       </w:r>
     </w:p>
     <w:p>
@@ -2703,7 +2703,7 @@
         <w:tab/>
       </w:r>
       <w:r>
-        <w:t>51</w:t>
+        <w:t>52</w:t>
       </w:r>
     </w:p>
     <w:p>
@@ -2720,7 +2720,7 @@
         <w:tab/>
       </w:r>
       <w:r>
-        <w:t>52</w:t>
+        <w:t>53</w:t>
       </w:r>
     </w:p>
     <w:p>
@@ -2737,7 +2737,7 @@
         <w:tab/>
       </w:r>
       <w:r>
-        <w:t>53</w:t>
+        <w:t>54</w:t>
       </w:r>
     </w:p>
     <w:p>
@@ -2754,7 +2754,7 @@
         <w:tab/>
       </w:r>
       <w:r>
-        <w:t>53</w:t>
+        <w:t>54</w:t>
       </w:r>
     </w:p>
     <w:p>
@@ -2771,7 +2771,7 @@
         <w:tab/>
       </w:r>
       <w:r>
-        <w:t>54</w:t>
+        <w:t>55</w:t>
       </w:r>
     </w:p>
     <w:p>
@@ -2788,7 +2788,7 @@
         <w:tab/>
       </w:r>
       <w:r>
-        <w:t>55</w:t>
+        <w:t>56</w:t>
       </w:r>
     </w:p>
     <w:p>
@@ -2805,7 +2805,7 @@
         <w:tab/>
       </w:r>
       <w:r>
-        <w:t>56</w:t>
+        <w:t>57</w:t>
       </w:r>
     </w:p>
     <w:p>
@@ -2822,7 +2822,7 @@
         <w:tab/>
       </w:r>
       <w:r>
-        <w:t>56</w:t>
+        <w:t>57</w:t>
       </w:r>
     </w:p>
     <w:p>
@@ -2839,7 +2839,7 @@
         <w:tab/>
       </w:r>
       <w:r>
-        <w:t>56</w:t>
+        <w:t>57</w:t>
       </w:r>
     </w:p>
     <w:p>
@@ -2856,7 +2856,7 @@
         <w:tab/>
       </w:r>
       <w:r>
-        <w:t>58</w:t>
+        <w:t>59</w:t>
       </w:r>
     </w:p>
     <w:p>
@@ -2873,7 +2873,7 @@
         <w:tab/>
       </w:r>
       <w:r>
-        <w:t>59</w:t>
+        <w:t>60</w:t>
       </w:r>
     </w:p>
     <w:p>
@@ -2890,7 +2890,7 @@
         <w:tab/>
       </w:r>
       <w:r>
-        <w:t>69</w:t>
+        <w:t>70</w:t>
       </w:r>
     </w:p>
     <w:p>
@@ -2907,7 +2907,7 @@
         <w:tab/>
       </w:r>
       <w:r>
-        <w:t>69</w:t>
+        <w:t>70</w:t>
       </w:r>
     </w:p>
     <w:p>
@@ -2924,7 +2924,7 @@
         <w:tab/>
       </w:r>
       <w:r>
-        <w:t>82</w:t>
+        <w:t>83</w:t>
       </w:r>
     </w:p>
     <w:p>
@@ -2941,7 +2941,7 @@
         <w:tab/>
       </w:r>
       <w:r>
-        <w:t>85</w:t>
+        <w:t>86</w:t>
       </w:r>
     </w:p>
     <w:p>
@@ -2958,7 +2958,7 @@
         <w:tab/>
       </w:r>
       <w:r>
-        <w:t>92</w:t>
+        <w:t>93</w:t>
       </w:r>
     </w:p>
     <w:p>
@@ -2975,7 +2975,7 @@
         <w:tab/>
       </w:r>
       <w:r>
-        <w:t>94</w:t>
+        <w:t>95</w:t>
       </w:r>
     </w:p>
     <w:p>
@@ -2992,7 +2992,7 @@
         <w:tab/>
       </w:r>
       <w:r>
-        <w:t>98</w:t>
+        <w:t>99</w:t>
       </w:r>
     </w:p>
     <w:p>
@@ -3009,7 +3009,7 @@
         <w:tab/>
       </w:r>
       <w:r>
-        <w:t>99</w:t>
+        <w:t>100</w:t>
       </w:r>
     </w:p>
     <w:p>
@@ -3026,7 +3026,7 @@
         <w:tab/>
       </w:r>
       <w:r>
-        <w:t>105</w:t>
+        <w:t>106</w:t>
       </w:r>
     </w:p>
     <w:p>
@@ -3037,13 +3037,13 @@
         </w:tabs>
       </w:pPr>
       <w:r>
-        <w:t xml:space="preserve">Lo que los resultados sostienen</w:t>
+        <w:t xml:space="preserve">PI.1 · Qué sostiene el diagnóstico, y con qué margen</w:t>
       </w:r>
       <w:r>
         <w:tab/>
       </w:r>
       <w:r>
-        <w:t>106</w:t>
+        <w:t>107</w:t>
       </w:r>
     </w:p>
     <w:p>
@@ -3054,13 +3054,13 @@
         </w:tabs>
       </w:pPr>
       <w:r>
-        <w:t xml:space="preserve">Lo que no sostienen</w:t>
+        <w:t xml:space="preserve">PI.2 · Qué significa que la trazabilidad se cumpla por construcción</w:t>
       </w:r>
       <w:r>
         <w:tab/>
       </w:r>
       <w:r>
-        <w:t>107</w:t>
+        <w:t>108</w:t>
       </w:r>
     </w:p>
     <w:p>
@@ -3071,13 +3071,81 @@
         </w:tabs>
       </w:pPr>
       <w:r>
+        <w:t xml:space="preserve">PI.3 · Qué precio tiene la abstención</w:t>
+      </w:r>
+      <w:r>
+        <w:tab/>
+      </w:r>
+      <w:r>
+        <w:t>108</w:t>
+      </w:r>
+    </w:p>
+    <w:p>
+      <w:pPr>
+        <w:pStyle w:val="TDC3"/>
+        <w:tabs>
+          <w:tab w:val="right" w:leader="dot" w:pos="8505"/>
+        </w:tabs>
+      </w:pPr>
+      <w:r>
+        <w:t xml:space="preserve">PI.4 · Por qué la condición con distractor no medía lo que decía</w:t>
+      </w:r>
+      <w:r>
+        <w:tab/>
+      </w:r>
+      <w:r>
+        <w:t>109</w:t>
+      </w:r>
+    </w:p>
+    <w:p>
+      <w:pPr>
+        <w:pStyle w:val="TDC3"/>
+        <w:tabs>
+          <w:tab w:val="right" w:leader="dot" w:pos="8505"/>
+        </w:tabs>
+      </w:pPr>
+      <w:r>
+        <w:t xml:space="preserve">La respuesta a la pregunta de investigación</w:t>
+      </w:r>
+      <w:r>
+        <w:tab/>
+      </w:r>
+      <w:r>
+        <w:t>110</w:t>
+      </w:r>
+    </w:p>
+    <w:p>
+      <w:pPr>
+        <w:pStyle w:val="TDC3"/>
+        <w:tabs>
+          <w:tab w:val="right" w:leader="dot" w:pos="8505"/>
+        </w:tabs>
+      </w:pPr>
+      <w:r>
+        <w:t xml:space="preserve">Lo que los resultados no sostienen</w:t>
+      </w:r>
+      <w:r>
+        <w:tab/>
+      </w:r>
+      <w:r>
+        <w:t>110</w:t>
+      </w:r>
+    </w:p>
+    <w:p>
+      <w:pPr>
+        <w:pStyle w:val="TDC3"/>
+        <w:tabs>
+          <w:tab w:val="right" w:leader="dot" w:pos="8505"/>
+        </w:tabs>
+      </w:pPr>
+      <w:r>
         <w:t xml:space="preserve">El patrón que atraviesa el trabajo</w:t>
       </w:r>
       <w:r>
         <w:tab/>
       </w:r>
       <w:r>
-        <w:t>108</w:t>
+        <w:t>111</w:t>
       </w:r>
     </w:p>
     <w:p>
@@ -3094,7 +3162,7 @@
         <w:tab/>
       </w:r>
       <w:r>
-        <w:t>108</w:t>
+        <w:t>112</w:t>
       </w:r>
     </w:p>
     <w:p>
@@ -3105,13 +3173,13 @@
         </w:tabs>
       </w:pPr>
       <w:r>
-        <w:t xml:space="preserve">Conclusiones provisionales sobre los objetivos y la pregunta de investigación</w:t>
+        <w:t xml:space="preserve">El recorrido experimental y lo que mide cada etapa</w:t>
       </w:r>
       <w:r>
         <w:tab/>
       </w:r>
       <w:r>
-        <w:t>108</w:t>
+        <w:t>113</w:t>
       </w:r>
     </w:p>
     <w:p>
@@ -3122,13 +3190,13 @@
         </w:tabs>
       </w:pPr>
       <w:r>
-        <w:t xml:space="preserve">Contribuciones del trabajo</w:t>
+        <w:t xml:space="preserve">Cumplimiento de los objetivos específicos</w:t>
       </w:r>
       <w:r>
         <w:tab/>
       </w:r>
       <w:r>
-        <w:t>116</w:t>
+        <w:t>115</w:t>
       </w:r>
     </w:p>
     <w:p>
@@ -3139,13 +3207,13 @@
         </w:tabs>
       </w:pPr>
       <w:r>
-        <w:t xml:space="preserve">Contribuciones técnicas</w:t>
+        <w:t xml:space="preserve">OE1 · Delimitación del vacío en la literatura</w:t>
       </w:r>
       <w:r>
         <w:tab/>
       </w:r>
       <w:r>
-        <w:t>116</w:t>
+        <w:t>115</w:t>
       </w:r>
     </w:p>
     <w:p>
@@ -3156,13 +3224,13 @@
         </w:tabs>
       </w:pPr>
       <w:r>
-        <w:t xml:space="preserve">Contribuciones experimentales</w:t>
+        <w:t xml:space="preserve">OE2 · Un entorno experimental reproducible</w:t>
       </w:r>
       <w:r>
         <w:tab/>
       </w:r>
       <w:r>
-        <w:t>116</w:t>
+        <w:t>115</w:t>
       </w:r>
     </w:p>
     <w:p>
@@ -3173,13 +3241,13 @@
         </w:tabs>
       </w:pPr>
       <w:r>
-        <w:t xml:space="preserve">Contribución metodológica, complementaria y acotada</w:t>
+        <w:t xml:space="preserve">OE3 · Diagnóstico, confianza y señales que lo sostienen</w:t>
       </w:r>
       <w:r>
         <w:tab/>
       </w:r>
       <w:r>
-        <w:t>118</w:t>
+        <w:t>116</w:t>
       </w:r>
     </w:p>
     <w:p>
@@ -3190,13 +3258,47 @@
         </w:tabs>
       </w:pPr>
       <w:r>
-        <w:t xml:space="preserve">Limitaciones de las contribuciones</w:t>
+        <w:t xml:space="preserve">OE4 · Recuperación y verificación de la evidencia</w:t>
       </w:r>
       <w:r>
         <w:tab/>
       </w:r>
       <w:r>
-        <w:t>119</w:t>
+        <w:t>116</w:t>
+      </w:r>
+    </w:p>
+    <w:p>
+      <w:pPr>
+        <w:pStyle w:val="TDC3"/>
+        <w:tabs>
+          <w:tab w:val="right" w:leader="dot" w:pos="8505"/>
+        </w:tabs>
+      </w:pPr>
+      <w:r>
+        <w:t xml:space="preserve">OE5 · Comportamiento integrado bajo cada condición de evidencia</w:t>
+      </w:r>
+      <w:r>
+        <w:tab/>
+      </w:r>
+      <w:r>
+        <w:t>117</w:t>
+      </w:r>
+    </w:p>
+    <w:p>
+      <w:pPr>
+        <w:pStyle w:val="TDC3"/>
+        <w:tabs>
+          <w:tab w:val="right" w:leader="dot" w:pos="8505"/>
+        </w:tabs>
+      </w:pPr>
+      <w:r>
+        <w:t xml:space="preserve">Lo que cada componente aporta</w:t>
+      </w:r>
+      <w:r>
+        <w:tab/>
+      </w:r>
+      <w:r>
+        <w:t>117</w:t>
       </w:r>
     </w:p>
     <w:p>
@@ -3207,13 +3309,13 @@
         </w:tabs>
       </w:pPr>
       <w:r>
-        <w:t xml:space="preserve">Limitaciones</w:t>
+        <w:t xml:space="preserve">Respuesta a la pregunta de investigación</w:t>
       </w:r>
       <w:r>
         <w:tab/>
       </w:r>
       <w:r>
-        <w:t>119</w:t>
+        <w:t>120</w:t>
       </w:r>
     </w:p>
     <w:p>
@@ -3224,13 +3326,81 @@
         </w:tabs>
       </w:pPr>
       <w:r>
-        <w:t xml:space="preserve">Prospectiva</w:t>
+        <w:t xml:space="preserve">Contribuciones del trabajo</w:t>
       </w:r>
       <w:r>
         <w:tab/>
       </w:r>
       <w:r>
+        <w:t>121</w:t>
+      </w:r>
+    </w:p>
+    <w:p>
+      <w:pPr>
+        <w:pStyle w:val="TDC3"/>
+        <w:tabs>
+          <w:tab w:val="right" w:leader="dot" w:pos="8505"/>
+        </w:tabs>
+      </w:pPr>
+      <w:r>
+        <w:t xml:space="preserve">Contribuciones técnicas</w:t>
+      </w:r>
+      <w:r>
+        <w:tab/>
+      </w:r>
+      <w:r>
+        <w:t>121</w:t>
+      </w:r>
+    </w:p>
+    <w:p>
+      <w:pPr>
+        <w:pStyle w:val="TDC3"/>
+        <w:tabs>
+          <w:tab w:val="right" w:leader="dot" w:pos="8505"/>
+        </w:tabs>
+      </w:pPr>
+      <w:r>
+        <w:t xml:space="preserve">Contribuciones experimentales</w:t>
+      </w:r>
+      <w:r>
+        <w:tab/>
+      </w:r>
+      <w:r>
         <w:t>122</w:t>
+      </w:r>
+    </w:p>
+    <w:p>
+      <w:pPr>
+        <w:pStyle w:val="TDC3"/>
+        <w:tabs>
+          <w:tab w:val="right" w:leader="dot" w:pos="8505"/>
+        </w:tabs>
+      </w:pPr>
+      <w:r>
+        <w:t xml:space="preserve">Contribución metodológica, complementaria y acotada</w:t>
+      </w:r>
+      <w:r>
+        <w:tab/>
+      </w:r>
+      <w:r>
+        <w:t>123</w:t>
+      </w:r>
+    </w:p>
+    <w:p>
+      <w:pPr>
+        <w:pStyle w:val="TDC3"/>
+        <w:tabs>
+          <w:tab w:val="right" w:leader="dot" w:pos="8505"/>
+        </w:tabs>
+      </w:pPr>
+      <w:r>
+        <w:t xml:space="preserve">Limitaciones de las contribuciones</w:t>
+      </w:r>
+      <w:r>
+        <w:tab/>
+      </w:r>
+      <w:r>
+        <w:t>124</w:t>
       </w:r>
     </w:p>
     <w:p>
@@ -3241,13 +3411,47 @@
         </w:tabs>
       </w:pPr>
       <w:r>
+        <w:t xml:space="preserve">Limitaciones</w:t>
+      </w:r>
+      <w:r>
+        <w:tab/>
+      </w:r>
+      <w:r>
+        <w:t>124</w:t>
+      </w:r>
+    </w:p>
+    <w:p>
+      <w:pPr>
+        <w:pStyle w:val="TDC2"/>
+        <w:tabs>
+          <w:tab w:val="right" w:leader="dot" w:pos="8505"/>
+        </w:tabs>
+      </w:pPr>
+      <w:r>
+        <w:t xml:space="preserve">Prospectiva</w:t>
+      </w:r>
+      <w:r>
+        <w:tab/>
+      </w:r>
+      <w:r>
+        <w:t>127</w:t>
+      </w:r>
+    </w:p>
+    <w:p>
+      <w:pPr>
+        <w:pStyle w:val="TDC2"/>
+        <w:tabs>
+          <w:tab w:val="right" w:leader="dot" w:pos="8505"/>
+        </w:tabs>
+      </w:pPr>
+      <w:r>
         <w:t xml:space="preserve">Consideraciones finales</w:t>
       </w:r>
       <w:r>
         <w:tab/>
       </w:r>
       <w:r>
-        <w:t>124</w:t>
+        <w:t>129</w:t>
       </w:r>
     </w:p>
     <w:p>
@@ -3264,7 +3468,7 @@
         <w:tab/>
       </w:r>
       <w:r>
-        <w:t>124</w:t>
+        <w:t>129</w:t>
       </w:r>
     </w:p>
     <w:p>
@@ -3281,7 +3485,7 @@
         <w:tab/>
       </w:r>
       <w:r>
-        <w:t>129</w:t>
+        <w:t>134</w:t>
       </w:r>
     </w:p>
     <w:p>
@@ -3298,7 +3502,7 @@
         <w:tab/>
       </w:r>
       <w:r>
-        <w:t>130</w:t>
+        <w:t>135</w:t>
       </w:r>
     </w:p>
     <w:p>
@@ -3315,7 +3519,7 @@
         <w:tab/>
       </w:r>
       <w:r>
-        <w:t>130</w:t>
+        <w:t>135</w:t>
       </w:r>
     </w:p>
     <w:p>
@@ -3332,7 +3536,7 @@
         <w:tab/>
       </w:r>
       <w:r>
-        <w:t>131</w:t>
+        <w:t>136</w:t>
       </w:r>
     </w:p>
     <w:p>
@@ -3349,7 +3553,7 @@
         <w:tab/>
       </w:r>
       <w:r>
-        <w:t>132</w:t>
+        <w:t>137</w:t>
       </w:r>
     </w:p>
     <w:p>
@@ -3366,7 +3570,7 @@
         <w:tab/>
       </w:r>
       <w:r>
-        <w:t>132</w:t>
+        <w:t>137</w:t>
       </w:r>
     </w:p>
     <w:p>
@@ -3383,7 +3587,7 @@
         <w:tab/>
       </w:r>
       <w:r>
-        <w:t>133</w:t>
+        <w:t>138</w:t>
       </w:r>
     </w:p>
     <w:p>
@@ -3400,7 +3604,7 @@
         <w:tab/>
       </w:r>
       <w:r>
-        <w:t>134</w:t>
+        <w:t>139</w:t>
       </w:r>
     </w:p>
     <w:p>
@@ -3417,7 +3621,7 @@
         <w:tab/>
       </w:r>
       <w:r>
-        <w:t>136</w:t>
+        <w:t>141</w:t>
       </w:r>
     </w:p>
     <w:p>
@@ -3434,7 +3638,7 @@
         <w:tab/>
       </w:r>
       <w:r>
-        <w:t>139</w:t>
+        <w:t>144</w:t>
       </w:r>
     </w:p>
     <w:p>
@@ -3451,7 +3655,7 @@
         <w:tab/>
       </w:r>
       <w:r>
-        <w:t>139</w:t>
+        <w:t>144</w:t>
       </w:r>
     </w:p>
     <w:p>
@@ -3468,7 +3672,7 @@
         <w:tab/>
       </w:r>
       <w:r>
-        <w:t>140</w:t>
+        <w:t>145</w:t>
       </w:r>
     </w:p>
     <w:p>
@@ -3485,7 +3689,7 @@
         <w:tab/>
       </w:r>
       <w:r>
-        <w:t>142</w:t>
+        <w:t>147</w:t>
       </w:r>
     </w:p>
     <w:p>
@@ -3502,7 +3706,7 @@
         <w:tab/>
       </w:r>
       <w:r>
-        <w:t>143</w:t>
+        <w:t>148</w:t>
       </w:r>
     </w:p>
     <w:p>
@@ -3519,7 +3723,7 @@
         <w:tab/>
       </w:r>
       <w:r>
-        <w:t>143</w:t>
+        <w:t>148</w:t>
       </w:r>
     </w:p>
     <w:p>
@@ -3536,7 +3740,7 @@
         <w:tab/>
       </w:r>
       <w:r>
-        <w:t>144</w:t>
+        <w:t>149</w:t>
       </w:r>
     </w:p>
     <w:p>
@@ -3553,7 +3757,7 @@
         <w:tab/>
       </w:r>
       <w:r>
-        <w:t>145</w:t>
+        <w:t>150</w:t>
       </w:r>
     </w:p>
     <w:p>
@@ -3570,7 +3774,7 @@
         <w:tab/>
       </w:r>
       <w:r>
-        <w:t>145</w:t>
+        <w:t>150</w:t>
       </w:r>
     </w:p>
     <w:p>
@@ -3587,7 +3791,7 @@
         <w:tab/>
       </w:r>
       <w:r>
-        <w:t>145</w:t>
+        <w:t>150</w:t>
       </w:r>
     </w:p>
     <w:p>
@@ -3604,7 +3808,7 @@
         <w:tab/>
       </w:r>
       <w:r>
-        <w:t>146</w:t>
+        <w:t>151</w:t>
       </w:r>
     </w:p>
     <w:p>
@@ -3621,7 +3825,7 @@
         <w:tab/>
       </w:r>
       <w:r>
-        <w:t>146</w:t>
+        <w:t>151</w:t>
       </w:r>
     </w:p>
     <w:p>
@@ -3638,7 +3842,7 @@
         <w:tab/>
       </w:r>
       <w:r>
-        <w:t>147</w:t>
+        <w:t>152</w:t>
       </w:r>
     </w:p>
     <w:p>
@@ -3655,7 +3859,7 @@
         <w:tab/>
       </w:r>
       <w:r>
-        <w:t>147</w:t>
+        <w:t>152</w:t>
       </w:r>
     </w:p>
     <w:p>
@@ -3701,7 +3905,7 @@
         <w:tab/>
       </w:r>
       <w:r>
-        <w:t>60</w:t>
+        <w:t>61</w:t>
       </w:r>
     </w:p>
     <w:p>
@@ -3718,7 +3922,7 @@
         <w:tab/>
       </w:r>
       <w:r>
-        <w:t>62</w:t>
+        <w:t>63</w:t>
       </w:r>
     </w:p>
     <w:p>
@@ -3735,7 +3939,7 @@
         <w:tab/>
       </w:r>
       <w:r>
-        <w:t>63</w:t>
+        <w:t>64</w:t>
       </w:r>
     </w:p>
     <w:p>
@@ -3752,7 +3956,7 @@
         <w:tab/>
       </w:r>
       <w:r>
-        <w:t>65</w:t>
+        <w:t>66</w:t>
       </w:r>
     </w:p>
     <w:p>
@@ -3769,7 +3973,7 @@
         <w:tab/>
       </w:r>
       <w:r>
-        <w:t>67</w:t>
+        <w:t>68</w:t>
       </w:r>
     </w:p>
     <w:p>
@@ -3786,7 +3990,7 @@
         <w:tab/>
       </w:r>
       <w:r>
-        <w:t>71</w:t>
+        <w:t>72</w:t>
       </w:r>
     </w:p>
     <w:p>
@@ -3803,7 +4007,7 @@
         <w:tab/>
       </w:r>
       <w:r>
-        <w:t>72</w:t>
+        <w:t>73</w:t>
       </w:r>
     </w:p>
     <w:p>
@@ -3820,7 +4024,7 @@
         <w:tab/>
       </w:r>
       <w:r>
-        <w:t>74</w:t>
+        <w:t>75</w:t>
       </w:r>
     </w:p>
     <w:p>
@@ -3837,7 +4041,7 @@
         <w:tab/>
       </w:r>
       <w:r>
-        <w:t>75</w:t>
+        <w:t>76</w:t>
       </w:r>
     </w:p>
     <w:p>
@@ -3854,7 +4058,7 @@
         <w:tab/>
       </w:r>
       <w:r>
-        <w:t>77</w:t>
+        <w:t>78</w:t>
       </w:r>
     </w:p>
     <w:p>
@@ -3871,7 +4075,7 @@
         <w:tab/>
       </w:r>
       <w:r>
-        <w:t>79</w:t>
+        <w:t>80</w:t>
       </w:r>
     </w:p>
     <w:p>
@@ -3888,7 +4092,7 @@
         <w:tab/>
       </w:r>
       <w:r>
-        <w:t>81</w:t>
+        <w:t>82</w:t>
       </w:r>
     </w:p>
     <w:p>
@@ -3905,7 +4109,7 @@
         <w:tab/>
       </w:r>
       <w:r>
-        <w:t>83</w:t>
+        <w:t>84</w:t>
       </w:r>
     </w:p>
     <w:p>
@@ -3922,7 +4126,7 @@
         <w:tab/>
       </w:r>
       <w:r>
-        <w:t>88</w:t>
+        <w:t>89</w:t>
       </w:r>
     </w:p>
     <w:p>
@@ -3939,7 +4143,7 @@
         <w:tab/>
       </w:r>
       <w:r>
-        <w:t>95</w:t>
+        <w:t>96</w:t>
       </w:r>
     </w:p>
     <w:p>
@@ -3956,7 +4160,7 @@
         <w:tab/>
       </w:r>
       <w:r>
-        <w:t>100</w:t>
+        <w:t>101</w:t>
       </w:r>
     </w:p>
     <w:p>
@@ -3973,7 +4177,7 @@
         <w:tab/>
       </w:r>
       <w:r>
-        <w:t>101</w:t>
+        <w:t>102</w:t>
       </w:r>
     </w:p>
     <w:p>
@@ -3990,7 +4194,7 @@
         <w:tab/>
       </w:r>
       <w:r>
-        <w:t>103</w:t>
+        <w:t>104</w:t>
       </w:r>
     </w:p>
     <w:p>
@@ -4007,7 +4211,7 @@
         <w:tab/>
       </w:r>
       <w:r>
-        <w:t>110</w:t>
+        <w:t>114</w:t>
       </w:r>
     </w:p>
     <w:p>
@@ -4024,7 +4228,7 @@
         <w:tab/>
       </w:r>
       <w:r>
-        <w:t>115</w:t>
+        <w:t>119</w:t>
       </w:r>
     </w:p>
     <w:p>
@@ -4041,7 +4245,7 @@
         <w:tab/>
       </w:r>
       <w:r>
-        <w:t>121</w:t>
+        <w:t>126</w:t>
       </w:r>
     </w:p>
     <w:p>
@@ -4058,7 +4262,7 @@
         <w:tab/>
       </w:r>
       <w:r>
-        <w:t>135</w:t>
+        <w:t>140</w:t>
       </w:r>
     </w:p>
     <w:p>
@@ -4075,7 +4279,7 @@
         <w:tab/>
       </w:r>
       <w:r>
-        <w:t>137</w:t>
+        <w:t>142</w:t>
       </w:r>
     </w:p>
     <w:p>
@@ -4092,7 +4296,7 @@
         <w:tab/>
       </w:r>
       <w:r>
-        <w:t>141</w:t>
+        <w:t>146</w:t>
       </w:r>
     </w:p>
     <w:p>
@@ -4138,7 +4342,7 @@
         <w:tab/>
       </w:r>
       <w:r>
-        <w:t>22</w:t>
+        <w:t>23</w:t>
       </w:r>
     </w:p>
     <w:p>
@@ -4155,7 +4359,7 @@
         <w:tab/>
       </w:r>
       <w:r>
-        <w:t>31</w:t>
+        <w:t>32</w:t>
       </w:r>
     </w:p>
     <w:p>
@@ -4172,7 +4376,7 @@
         <w:tab/>
       </w:r>
       <w:r>
-        <w:t>36</w:t>
+        <w:t>37</w:t>
       </w:r>
     </w:p>
     <w:p>
@@ -4189,7 +4393,7 @@
         <w:tab/>
       </w:r>
       <w:r>
-        <w:t>37</w:t>
+        <w:t>38</w:t>
       </w:r>
     </w:p>
     <w:p>
@@ -4206,7 +4410,7 @@
         <w:tab/>
       </w:r>
       <w:r>
-        <w:t>38</w:t>
+        <w:t>39</w:t>
       </w:r>
     </w:p>
     <w:p>
@@ -4223,7 +4427,7 @@
         <w:tab/>
       </w:r>
       <w:r>
-        <w:t>39</w:t>
+        <w:t>40</w:t>
       </w:r>
     </w:p>
     <w:p>
@@ -4240,7 +4444,7 @@
         <w:tab/>
       </w:r>
       <w:r>
-        <w:t>41</w:t>
+        <w:t>42</w:t>
       </w:r>
     </w:p>
     <w:p>
@@ -4257,7 +4461,7 @@
         <w:tab/>
       </w:r>
       <w:r>
-        <w:t>42</w:t>
+        <w:t>43</w:t>
       </w:r>
     </w:p>
     <w:p>
@@ -4274,7 +4478,7 @@
         <w:tab/>
       </w:r>
       <w:r>
-        <w:t>43</w:t>
+        <w:t>44</w:t>
       </w:r>
     </w:p>
     <w:p>
@@ -4291,7 +4495,7 @@
         <w:tab/>
       </w:r>
       <w:r>
-        <w:t>48</w:t>
+        <w:t>49</w:t>
       </w:r>
     </w:p>
     <w:p>
@@ -4308,7 +4512,7 @@
         <w:tab/>
       </w:r>
       <w:r>
-        <w:t>49</w:t>
+        <w:t>50</w:t>
       </w:r>
     </w:p>
     <w:p>
@@ -4325,7 +4529,7 @@
         <w:tab/>
       </w:r>
       <w:r>
-        <w:t>50</w:t>
+        <w:t>51</w:t>
       </w:r>
     </w:p>
     <w:p>
@@ -4342,7 +4546,7 @@
         <w:tab/>
       </w:r>
       <w:r>
-        <w:t>51</w:t>
+        <w:t>52</w:t>
       </w:r>
     </w:p>
     <w:p>
@@ -4359,7 +4563,7 @@
         <w:tab/>
       </w:r>
       <w:r>
-        <w:t>52</w:t>
+        <w:t>53</w:t>
       </w:r>
     </w:p>
     <w:p>
@@ -4376,7 +4580,7 @@
         <w:tab/>
       </w:r>
       <w:r>
-        <w:t>53</w:t>
+        <w:t>54</w:t>
       </w:r>
     </w:p>
     <w:p>
@@ -4393,7 +4597,7 @@
         <w:tab/>
       </w:r>
       <w:r>
-        <w:t>54</w:t>
+        <w:t>55</w:t>
       </w:r>
     </w:p>
     <w:p>
@@ -4410,7 +4614,7 @@
         <w:tab/>
       </w:r>
       <w:r>
-        <w:t>69</w:t>
+        <w:t>70</w:t>
       </w:r>
     </w:p>
     <w:p>
@@ -4427,7 +4631,7 @@
         <w:tab/>
       </w:r>
       <w:r>
-        <w:t>78</w:t>
+        <w:t>79</w:t>
       </w:r>
     </w:p>
     <w:p>
@@ -4444,7 +4648,7 @@
         <w:tab/>
       </w:r>
       <w:r>
-        <w:t>82</w:t>
+        <w:t>83</w:t>
       </w:r>
     </w:p>
     <w:p>
@@ -4461,7 +4665,7 @@
         <w:tab/>
       </w:r>
       <w:r>
-        <w:t>84</w:t>
+        <w:t>85</w:t>
       </w:r>
     </w:p>
     <w:p>
@@ -4478,7 +4682,7 @@
         <w:tab/>
       </w:r>
       <w:r>
-        <w:t>86</w:t>
+        <w:t>87</w:t>
       </w:r>
     </w:p>
     <w:p>
@@ -4495,7 +4699,7 @@
         <w:tab/>
       </w:r>
       <w:r>
-        <w:t>89</w:t>
+        <w:t>90</w:t>
       </w:r>
     </w:p>
     <w:p>
@@ -4512,7 +4716,7 @@
         <w:tab/>
       </w:r>
       <w:r>
-        <w:t>92</w:t>
+        <w:t>93</w:t>
       </w:r>
     </w:p>
     <w:p>
@@ -4529,7 +4733,7 @@
         <w:tab/>
       </w:r>
       <w:r>
-        <w:t>94</w:t>
+        <w:t>95</w:t>
       </w:r>
     </w:p>
     <w:p>
@@ -4546,7 +4750,7 @@
         <w:tab/>
       </w:r>
       <w:r>
-        <w:t>130</w:t>
+        <w:t>135</w:t>
       </w:r>
     </w:p>
     <w:p>
@@ -4563,7 +4767,7 @@
         <w:tab/>
       </w:r>
       <w:r>
-        <w:t>131</w:t>
+        <w:t>136</w:t>
       </w:r>
     </w:p>
     <w:p>
@@ -4580,7 +4784,7 @@
         <w:tab/>
       </w:r>
       <w:r>
-        <w:t>132</w:t>
+        <w:t>137</w:t>
       </w:r>
     </w:p>
     <w:p>
@@ -4597,7 +4801,7 @@
         <w:tab/>
       </w:r>
       <w:r>
-        <w:t>133</w:t>
+        <w:t>138</w:t>
       </w:r>
     </w:p>
     <w:p>
@@ -4614,7 +4818,7 @@
         <w:tab/>
       </w:r>
       <w:r>
-        <w:t>133</w:t>
+        <w:t>138</w:t>
       </w:r>
     </w:p>
     <w:p>
@@ -4631,7 +4835,7 @@
         <w:tab/>
       </w:r>
       <w:r>
-        <w:t>139</w:t>
+        <w:t>144</w:t>
       </w:r>
     </w:p>
     <w:p>
@@ -4648,7 +4852,7 @@
         <w:tab/>
       </w:r>
       <w:r>
-        <w:t>142</w:t>
+        <w:t>147</w:t>
       </w:r>
     </w:p>
     <w:p>
@@ -4665,7 +4869,7 @@
         <w:tab/>
       </w:r>
       <w:r>
-        <w:t>142</w:t>
+        <w:t>147</w:t>
       </w:r>
     </w:p>
     <w:p>
@@ -4682,7 +4886,7 @@
         <w:tab/>
       </w:r>
       <w:r>
-        <w:t>143</w:t>
+        <w:t>148</w:t>
       </w:r>
     </w:p>
     <w:p>
@@ -4699,7 +4903,7 @@
         <w:tab/>
       </w:r>
       <w:r>
-        <w:t>144</w:t>
+        <w:t>149</w:t>
       </w:r>
     </w:p>
     <w:p>
@@ -4716,7 +4920,7 @@
         <w:tab/>
       </w:r>
       <w:r>
-        <w:t>145</w:t>
+        <w:t>150</w:t>
       </w:r>
     </w:p>
     <w:p>
@@ -4733,7 +4937,7 @@
         <w:tab/>
       </w:r>
       <w:r>
-        <w:t>146</w:t>
+        <w:t>151</w:t>
       </w:r>
     </w:p>
     <w:p>
@@ -4750,7 +4954,7 @@
         <w:tab/>
       </w:r>
       <w:r>
-        <w:t>146</w:t>
+        <w:t>151</w:t>
       </w:r>
     </w:p>
     <w:p>
@@ -4767,7 +4971,7 @@
         <w:tab/>
       </w:r>
       <w:r>
-        <w:t>147</w:t>
+        <w:t>152</w:t>
       </w:r>
     </w:p>
     <w:p>
@@ -4784,7 +4988,7 @@
         <w:tab/>
       </w:r>
       <w:r>
-        <w:t>148</w:t>
+        <w:t>153</w:t>
       </w:r>
     </w:p>
     <w:p>
@@ -23136,7 +23340,51 @@
         <w:pStyle w:val="Normal"/>
       </w:pPr>
       <w:r>
-        <w:t xml:space="preserve">La discusión separa lo que los resultados sostienen de lo que no sostienen, y termina con el patrón que atraviesa el trabajo.</w:t>
+        <w:t xml:space="preserve">Los apartados anteriores presentan las mediciones. Este las interpreta: para cada subpregunta,</w:t>
+      </w:r>
+      <w:r>
+        <w:t xml:space="preserve"> </w:t>
+      </w:r>
+      <w:r>
+        <w:t xml:space="preserve">qué se observó, qué permite concluir y hasta dónde llega esa conclusión. El orden es deliberado:</w:t>
+      </w:r>
+      <w:r>
+        <w:t xml:space="preserve"> </w:t>
+      </w:r>
+      <w:r>
+        <w:t xml:space="preserve">primero la evidencia y después su alcance, porque el alcance de una conclusión depende de cómo se</w:t>
+      </w:r>
+      <w:r>
+        <w:t xml:space="preserve"> </w:t>
+      </w:r>
+      <w:r>
+        <w:t xml:space="preserve">obtuvo y no al revés.</w:t>
+      </w:r>
+    </w:p>
+    <w:p>
+      <w:pPr>
+        <w:pStyle w:val="Normal"/>
+      </w:pPr>
+      <w:r>
+        <w:t xml:space="preserve">Una advertencia de lectura vale para todo lo que sigue. Las cifras de desarrollo proceden de la</w:t>
+      </w:r>
+      <w:r>
+        <w:t xml:space="preserve"> </w:t>
+      </w:r>
+      <w:r>
+        <w:t xml:space="preserve">partición de validación y de un criterio que se revisó dos veces sobre los mismos casos; las de la</w:t>
+      </w:r>
+      <w:r>
+        <w:t xml:space="preserve"> </w:t>
+      </w:r>
+      <w:r>
+        <w:t xml:space="preserve">evaluación final proceden de la partición de prueba, con la política congelada antes de abrirla.</w:t>
+      </w:r>
+      <w:r>
+        <w:t xml:space="preserve"> </w:t>
+      </w:r>
+      <w:r>
+        <w:t xml:space="preserve">Las dos se citan, y se dice cuál es cuál.</w:t>
       </w:r>
     </w:p>
     <w:p>
@@ -23147,19 +23395,11 @@
         </w:numPr>
         <w:pStyle w:val="Ttulosubapartado"/>
       </w:pPr>
-      <w:bookmarkStart w:id="148" w:name="_b60f0b453e677567ae9a3529e384ef7e7e9859f"/>
-      <w:r>
-        <w:t xml:space="preserve">Lo que los resultados sostienen</w:t>
+      <w:bookmarkStart w:id="148" w:name="_a6fa91cc9c2e05a367acd48b6f934f6a2751d08"/>
+      <w:r>
+        <w:t xml:space="preserve">PI.1 · Qué sostiene el diagnóstico, y con qué margen</w:t>
       </w:r>
       <w:bookmarkEnd w:id="148"/>
-    </w:p>
-    <w:p>
-      <w:pPr>
-        <w:pStyle w:val="Normal"/>
-      </w:pPr>
-      <w:r>
-        <w:t xml:space="preserve">Sobre datos sintéticos parametrizados con el manual del vehículo y sobre la partición de validación, las cuatro subpreguntas alcanzan estados distintos, y conviene no unificarlos.</w:t>
-      </w:r>
     </w:p>
     <w:p>
       <w:pPr>
@@ -23170,31 +23410,59 @@
           <w:b/>
           <w:bCs/>
         </w:rPr>
-        <w:t xml:space="preserve">PI.1 queda sostenida en su forma actual y no en la original.</w:t>
-      </w:r>
-      <w:r>
-        <w:t xml:space="preserve"> </w:t>
-      </w:r>
-      <w:r>
-        <w:t xml:space="preserve">El bosque aleatorio diagnostica por encima de la referencia mínima, con una exactitud de 0,878 frente a 0,286, y su confianza, infraconfiada en origen, queda calibrada, con un error de calibración que baja de 0,144 a 0,085. La formulación original de esta subpregunta, escrita antes de entrenar, pedía además que un modelo temporal superase a la línea base con un margen no atribuible al azar, y eso no ocurrió. La atribución describe bien tres de los cinco fallos y, en el fallo de encendido, arrastra señales que el mecanismo no justifica.</w:t>
-      </w:r>
-    </w:p>
-    <w:p>
-      <w:pPr>
-        <w:pStyle w:val="Normal"/>
-      </w:pPr>
+        <w:t xml:space="preserve">Lo observado.</w:t>
+      </w:r>
+      <w:r>
+        <w:t xml:space="preserve"> </w:t>
+      </w:r>
+      <w:r>
+        <w:t xml:space="preserve">El bosque aleatorio alcanza una exactitud de 0,878 sobre validación, frente al</w:t>
+      </w:r>
+      <w:r>
+        <w:t xml:space="preserve"> </w:t>
+      </w:r>
+      <w:r>
+        <w:t xml:space="preserve">0,286 de la referencia mínima, y su confianza, infraconfiada en origen, queda centrada tras la</w:t>
+      </w:r>
+      <w:r>
+        <w:t xml:space="preserve"> </w:t>
+      </w:r>
+      <w:r>
+        <w:t xml:space="preserve">calibración: el error de calibración baja de 0,144 a 0,085. El modelo temporal, con 0,827, queda</w:t>
+      </w:r>
+      <w:r>
+        <w:t xml:space="preserve"> </w:t>
+      </w:r>
+      <w:r>
+        <w:t xml:space="preserve">por debajo del bosque. La atribución apunta, en las cinco condiciones, a una señal que la ficha del</w:t>
+      </w:r>
+      <w:r>
+        <w:t xml:space="preserve"> </w:t>
+      </w:r>
+      <w:r>
+        <w:t xml:space="preserve">fallo declara, y en tres de ellas</w:t>
+      </w:r>
+      <w:r>
+        <w:t xml:space="preserve"> </w:t>
+      </w:r>
       <w:r>
         <w:rPr>
           <w:b/>
           <w:bCs/>
         </w:rPr>
-        <w:t xml:space="preserve">PI.2 queda sostenida como trazabilidad, no como soporte medido.</w:t>
-      </w:r>
-      <w:r>
-        <w:t xml:space="preserve"> </w:t>
-      </w:r>
-      <w:r>
-        <w:t xml:space="preserve">Toda afirmación que el verificador admite conserva la observación que la origina y los fragmentos citados, y cada comprobación queda registrada por separado. Que esos fragmentos sostengan lo afirmado lo establecen las comprobaciones deterministas del propio verificador, no una medición independiente: si coinciden con un juicio externo no se ha medido, porque el conjunto anotado no incluye las afirmaciones admisibles. El vacío que motiva el trabajo, medir si cada afirmación se sostiene en su fragmento, queda así abordado por construcción y no por medición. En la explicación que redacta el modelo de lenguaje la correspondencia es más débil: no cita nada que no haya recibido, pero cita fragmentos que el verificador no aceptó.</w:t>
+        <w:t xml:space="preserve">todo</w:t>
+      </w:r>
+      <w:r>
+        <w:t xml:space="preserve"> </w:t>
+      </w:r>
+      <w:r>
+        <w:t xml:space="preserve">el peso atribuido cae dentro de ese conjunto; en la</w:t>
+      </w:r>
+      <w:r>
+        <w:t xml:space="preserve"> </w:t>
+      </w:r>
+      <w:r>
+        <w:t xml:space="preserve">deriva del caudalímetro queda el 86,4 % y en el fallo de encendido, el 87,2 %.</w:t>
       </w:r>
     </w:p>
     <w:p>
@@ -23206,13 +23474,31 @@
           <w:b/>
           <w:bCs/>
         </w:rPr>
-        <w:t xml:space="preserve">PI.3 queda sostenida en la muestra de validación, con dos salvedades.</w:t>
-      </w:r>
-      <w:r>
-        <w:t xml:space="preserve"> </w:t>
-      </w:r>
-      <w:r>
-        <w:t xml:space="preserve">La decisión cambia con la evidencia en la dirección correcta: sin evidencia documental aplicable, o con documentación que no sostiene las afirmaciones, el sistema se abstiene, y no explicó ninguno de los casos que debían terminar en abstención. La primera salvedad es que la condición de evidencia retirada produce la abstención por construcción, y el contraste que pone a prueba el criterio es el de la evidencia parcial. La segunda es que el criterio se revisó dos veces sobre los mismos casos, y su primera versión explicaba la mitad de los que debían abstenerse. El precio está en el otro error, dos abstenciones innecesarias de cinco, una por la confianza del modelo y otra por la confianza y por falta de soporte documental. Todo ello sobre cinco ventanas bien diagnosticadas; la evaluación final dirá si se mantiene.</w:t>
+        <w:t xml:space="preserve">Qué permite concluir.</w:t>
+      </w:r>
+      <w:r>
+        <w:t xml:space="preserve"> </w:t>
+      </w:r>
+      <w:r>
+        <w:t xml:space="preserve">Que las señales OBD-II contienen estructura diagnóstica aprovechable por</w:t>
+      </w:r>
+      <w:r>
+        <w:t xml:space="preserve"> </w:t>
+      </w:r>
+      <w:r>
+        <w:t xml:space="preserve">un modelo convencional, y que la confianza de ese modelo puede hacerse utilizable como puerta de</w:t>
+      </w:r>
+      <w:r>
+        <w:t xml:space="preserve"> </w:t>
+      </w:r>
+      <w:r>
+        <w:t xml:space="preserve">decisión. Es la condición previa de todo lo demás: sin un diagnóstico con confianza interpretable,</w:t>
+      </w:r>
+      <w:r>
+        <w:t xml:space="preserve"> </w:t>
+      </w:r>
+      <w:r>
+        <w:t xml:space="preserve">el criterio de suficiencia no tendría sobre qué operar.</w:t>
       </w:r>
     </w:p>
     <w:p>
@@ -23224,21 +23510,55 @@
           <w:b/>
           <w:bCs/>
         </w:rPr>
-        <w:t xml:space="preserve">PI.4 no queda sostenida con el diseño actual.</w:t>
-      </w:r>
-      <w:r>
-        <w:t xml:space="preserve"> </w:t>
-      </w:r>
-      <w:r>
-        <w:t xml:space="preserve">Ningún fragmento de otro motor sostuvo una afirmación, con o sin filtro de motor. Pero la condición que debía medirlo, con el filtro activo, no añade en ninguno de los tres fallos un distractor que la condición parcial no tuviera, de modo que no manipula la variable que decía manipular. Sin filtro el distractor sí entra, y se rechaza por aplicabilidad en dos fallos y por vocabulario de la señal en el tercero. La novedad que el capítulo 3 atribuía a esta subpregunta es, en consecuencia, más estrecha, y la condición requiere un rediseño antes de sostener sobre ella una inferencia.</w:t>
-      </w:r>
-    </w:p>
-    <w:p>
-      <w:pPr>
-        <w:pStyle w:val="Normal"/>
-      </w:pPr>
-      <w:r>
-        <w:t xml:space="preserve">Aplicada la regla que el capítulo 4 fijó para la respuesta global, con PI.1, PI.2 y PI.3 en su forma actual y PI.4 sin sostener, la respuesta a la pregunta de investigación es</w:t>
+        <w:t xml:space="preserve">Qué no permite concluir.</w:t>
+      </w:r>
+      <w:r>
+        <w:t xml:space="preserve"> </w:t>
+      </w:r>
+      <w:r>
+        <w:t xml:space="preserve">La formulación original de esta subpregunta, escrita antes de</w:t>
+      </w:r>
+      <w:r>
+        <w:t xml:space="preserve"> </w:t>
+      </w:r>
+      <w:r>
+        <w:t xml:space="preserve">entrenar, pedía además que un modelo temporal superase a la línea base con un margen no atribuible</w:t>
+      </w:r>
+      <w:r>
+        <w:t xml:space="preserve"> </w:t>
+      </w:r>
+      <w:r>
+        <w:t xml:space="preserve">al azar. No ocurrió, y la comparación entre los dos conjuntos sintéticos no lo aclara porque cambia</w:t>
+      </w:r>
+      <w:r>
+        <w:t xml:space="preserve"> </w:t>
+      </w:r>
+      <w:r>
+        <w:t xml:space="preserve">a la vez el volumen y el generador. En el fallo de encendido la atribución arrastra señales que el</w:t>
+      </w:r>
+      <w:r>
+        <w:t xml:space="preserve"> </w:t>
+      </w:r>
+      <w:r>
+        <w:t xml:space="preserve">mecanismo no justifica —el 12,8 % de su peso atribuido cae fuera de las señales declaradas, en la</w:t>
+      </w:r>
+      <w:r>
+        <w:t xml:space="preserve"> </w:t>
+      </w:r>
+      <w:r>
+        <w:t xml:space="preserve">temperatura del refrigerante, el avance de encendido o la velocidad—, de modo que la explicación</w:t>
+      </w:r>
+      <w:r>
+        <w:t xml:space="preserve"> </w:t>
+      </w:r>
+      <w:r>
+        <w:t xml:space="preserve">interna no es uniformemente fiable entre condiciones. Y en la deriva del caudalímetro la señal del</w:t>
+      </w:r>
+      <w:r>
+        <w:t xml:space="preserve"> </w:t>
+      </w:r>
+      <w:r>
+        <w:t xml:space="preserve">componente que falla, el caudal de aire,</w:t>
       </w:r>
       <w:r>
         <w:t xml:space="preserve"> </w:t>
@@ -23248,10 +23568,52 @@
           <w:b/>
           <w:bCs/>
         </w:rPr>
-        <w:t xml:space="preserve">parcialmente sostenida</w:t>
-      </w:r>
-      <w:r>
-        <w:t xml:space="preserve">, con carácter provisional y sobre validación. La calificación descansa en criterios reescritos tras los primeros resultados, en una PI.2 que se cumple por construcción y en cifras de desarrollo; la evaluación final puede cambiarla. De los cinco desenlaces que la refutarían, el de la abstención trivial no se produjo: el sistema se abstiene en catorce de diecisiete casos, pero doce debían terminar en abstención y en los cinco con evidencia completa explica tres.</w:t>
+        <w:t xml:space="preserve">no recibe peso alguno</w:t>
+      </w:r>
+      <w:r>
+        <w:t xml:space="preserve">: la atribución se apoya en los</w:t>
+      </w:r>
+      <w:r>
+        <w:t xml:space="preserve"> </w:t>
+      </w:r>
+      <w:r>
+        <w:t xml:space="preserve">ajustes de combustible con que la centralita compensa la deriva, que es mecánicamente correcto y</w:t>
+      </w:r>
+      <w:r>
+        <w:t xml:space="preserve"> </w:t>
+      </w:r>
+      <w:r>
+        <w:t xml:space="preserve">obliga a que el verificador no admita la afirmación «el caudalímetro deriva porque el caudal es</w:t>
+      </w:r>
+      <w:r>
+        <w:t xml:space="preserve"> </w:t>
+      </w:r>
+      <w:r>
+        <w:t xml:space="preserve">bajo».</w:t>
+      </w:r>
+    </w:p>
+    <w:p>
+      <w:pPr>
+        <w:pStyle w:val="Normal"/>
+      </w:pPr>
+      <w:r>
+        <w:rPr>
+          <w:b/>
+          <w:bCs/>
+        </w:rPr>
+        <w:t xml:space="preserve">Alcance.</w:t>
+      </w:r>
+      <w:r>
+        <w:t xml:space="preserve"> </w:t>
+      </w:r>
+      <w:r>
+        <w:t xml:space="preserve">La subpregunta queda sostenida en su forma acotada —diagnóstico y calibración— y no en</w:t>
+      </w:r>
+      <w:r>
+        <w:t xml:space="preserve"> </w:t>
+      </w:r>
+      <w:r>
+        <w:t xml:space="preserve">la original, que incluía la ventaja del modelo temporal.</w:t>
       </w:r>
     </w:p>
     <w:p>
@@ -23262,9 +23624,9 @@
         </w:numPr>
         <w:pStyle w:val="Ttulosubapartado"/>
       </w:pPr>
-      <w:bookmarkStart w:id="149" w:name="_322b35844b6e778ecd9924fd647dc41f8c41394"/>
-      <w:r>
-        <w:t xml:space="preserve">Lo que no sostienen</w:t>
+      <w:bookmarkStart w:id="149" w:name="_4ae75fc2edd1221d2d5cf6c41b2cb0ea6e96fb6"/>
+      <w:r>
+        <w:t xml:space="preserve">PI.2 · Qué significa que la trazabilidad se cumpla por construcción</w:t>
       </w:r>
       <w:bookmarkEnd w:id="149"/>
     </w:p>
@@ -23273,7 +23635,154 @@
         <w:pStyle w:val="Normal"/>
       </w:pPr>
       <w:r>
-        <w:t xml:space="preserve">No sostienen nada sobre el comportamiento en un vehículo real: caracterizan el mecanismo ante los fallos representados en el generador. Es la primera limitación del capítulo 6. No sostienen el comportamiento del agente cuando el diagnóstico de partida es erróneo, salvo en el escenario adverso descrito, anterior a la corrección del índice y construido sobre dos ventanas; con la política v2.2 ese escenario deja de aceptar soporte falso, y sigue siendo de dos ventanas. Tampoco sostienen que la abstención sea barata: dos de cinco casos con evidencia completa terminan en abstención, y esa cobertura, 3 de 5, es el precio de una falsa confianza nula en esta muestra. Un criterio más laxo en la confianza habría explicado cuatro de los cinco casos, entre ellos C01, cuyo diagnóstico el modelo acierta pero con una confianza calibrada de 0,60; la elección del umbral es una elección de política y se declara como tal. Ni sostienen que el adaptador del modelo de lenguaje generalice: se entrenó sobre ejemplos generados con la recuperación anterior a la corrección del índice y con ventanas que incluyen las de tres casos evaluados, dos en entrenamiento y una en validación, y no se ha reentrenado. Tampoco sostienen que el comportamiento observado se deba a separar la decisión de la redacción: sin ablaciones y sin una comparación con una abstención decidida por el propio modelo de lenguaje, lo medido es el comportamiento de un sistema que implementa esa separación.</w:t>
+        <w:rPr>
+          <w:b/>
+          <w:bCs/>
+        </w:rPr>
+        <w:t xml:space="preserve">Lo observado.</w:t>
+      </w:r>
+      <w:r>
+        <w:t xml:space="preserve"> </w:t>
+      </w:r>
+      <w:r>
+        <w:t xml:space="preserve">Toda afirmación que el verificador admite conserva la observación que la origina</w:t>
+      </w:r>
+      <w:r>
+        <w:t xml:space="preserve"> </w:t>
+      </w:r>
+      <w:r>
+        <w:t xml:space="preserve">y los fragmentos citados, y cada comprobación queda registrada por separado. En la explicación que</w:t>
+      </w:r>
+      <w:r>
+        <w:t xml:space="preserve"> </w:t>
+      </w:r>
+      <w:r>
+        <w:t xml:space="preserve">redacta el modelo de lenguaje la correspondencia es más débil: no cita nada que no haya recibido,</w:t>
+      </w:r>
+      <w:r>
+        <w:t xml:space="preserve"> </w:t>
+      </w:r>
+      <w:r>
+        <w:t xml:space="preserve">pero cita fragmentos que el verificador no aceptó.</w:t>
+      </w:r>
+    </w:p>
+    <w:p>
+      <w:pPr>
+        <w:pStyle w:val="Normal"/>
+      </w:pPr>
+      <w:r>
+        <w:rPr>
+          <w:b/>
+          <w:bCs/>
+        </w:rPr>
+        <w:t xml:space="preserve">Qué permite concluir.</w:t>
+      </w:r>
+      <w:r>
+        <w:t xml:space="preserve"> </w:t>
+      </w:r>
+      <w:r>
+        <w:t xml:space="preserve">Que la trazabilidad es una propiedad</w:t>
+      </w:r>
+      <w:r>
+        <w:t xml:space="preserve"> </w:t>
+      </w:r>
+      <w:r>
+        <w:rPr>
+          <w:b/>
+          <w:bCs/>
+        </w:rPr>
+        <w:t xml:space="preserve">verificable</w:t>
+      </w:r>
+      <w:r>
+        <w:t xml:space="preserve"> </w:t>
+      </w:r>
+      <w:r>
+        <w:t xml:space="preserve">del recorrido, no una</w:t>
+      </w:r>
+      <w:r>
+        <w:t xml:space="preserve"> </w:t>
+      </w:r>
+      <w:r>
+        <w:t xml:space="preserve">promesa: cada paso deja registro de qué recibió y qué decidió.</w:t>
+      </w:r>
+    </w:p>
+    <w:p>
+      <w:pPr>
+        <w:pStyle w:val="Normal"/>
+      </w:pPr>
+      <w:r>
+        <w:rPr>
+          <w:b/>
+          <w:bCs/>
+        </w:rPr>
+        <w:t xml:space="preserve">Qué no permite concluir.</w:t>
+      </w:r>
+      <w:r>
+        <w:t xml:space="preserve"> </w:t>
+      </w:r>
+      <w:r>
+        <w:t xml:space="preserve">Que los fragmentos citados sostengan de hecho lo afirmado. Eso lo</w:t>
+      </w:r>
+      <w:r>
+        <w:t xml:space="preserve"> </w:t>
+      </w:r>
+      <w:r>
+        <w:t xml:space="preserve">establecen las comprobaciones deterministas del propio verificador, no una medición independiente:</w:t>
+      </w:r>
+      <w:r>
+        <w:t xml:space="preserve"> </w:t>
+      </w:r>
+      <w:r>
+        <w:t xml:space="preserve">si coinciden con el juicio de un lector experto</w:t>
+      </w:r>
+      <w:r>
+        <w:t xml:space="preserve"> </w:t>
+      </w:r>
+      <w:r>
+        <w:rPr>
+          <w:b/>
+          <w:bCs/>
+        </w:rPr>
+        <w:t xml:space="preserve">no se ha medido</w:t>
+      </w:r>
+      <w:r>
+        <w:t xml:space="preserve">, porque el conjunto anotado no</w:t>
+      </w:r>
+      <w:r>
+        <w:t xml:space="preserve"> </w:t>
+      </w:r>
+      <w:r>
+        <w:t xml:space="preserve">incluye las afirmaciones admisibles de cada caso. El vacío que motiva el trabajo —medir si cada</w:t>
+      </w:r>
+      <w:r>
+        <w:t xml:space="preserve"> </w:t>
+      </w:r>
+      <w:r>
+        <w:t xml:space="preserve">afirmación se sostiene en su fragmento— queda abordado por construcción y no por medición.</w:t>
+      </w:r>
+    </w:p>
+    <w:p>
+      <w:pPr>
+        <w:pStyle w:val="Normal"/>
+      </w:pPr>
+      <w:r>
+        <w:rPr>
+          <w:b/>
+          <w:bCs/>
+        </w:rPr>
+        <w:t xml:space="preserve">Alcance.</w:t>
+      </w:r>
+      <w:r>
+        <w:t xml:space="preserve"> </w:t>
+      </w:r>
+      <w:r>
+        <w:t xml:space="preserve">Trazabilidad demostrada; soporte medido, no. La distinción es la que separa este</w:t>
+      </w:r>
+      <w:r>
+        <w:t xml:space="preserve"> </w:t>
+      </w:r>
+      <w:r>
+        <w:t xml:space="preserve">resultado de la contribución que el capítulo 3 esperaba.</w:t>
       </w:r>
     </w:p>
     <w:p>
@@ -23284,37 +23793,1040 @@
         </w:numPr>
         <w:pStyle w:val="Ttulosubapartado"/>
       </w:pPr>
-      <w:bookmarkStart w:id="150" w:name="_978f06f89d85a2d9ff8a92b4947fdc8b2e8c741"/>
+      <w:bookmarkStart w:id="150" w:name="_23904b260bb38e3a98d237910e0d2090000c9a8"/>
+      <w:r>
+        <w:t xml:space="preserve">PI.3 · Qué precio tiene la abstención</w:t>
+      </w:r>
+      <w:bookmarkEnd w:id="150"/>
+    </w:p>
+    <w:p>
+      <w:pPr>
+        <w:pStyle w:val="Normal"/>
+      </w:pPr>
+      <w:r>
+        <w:rPr>
+          <w:b/>
+          <w:bCs/>
+        </w:rPr>
+        <w:t xml:space="preserve">Lo observado en validación.</w:t>
+      </w:r>
+      <w:r>
+        <w:t xml:space="preserve"> </w:t>
+      </w:r>
+      <w:r>
+        <w:t xml:space="preserve">La decisión cambia con la evidencia en la dirección correcta: sin</w:t>
+      </w:r>
+      <w:r>
+        <w:t xml:space="preserve"> </w:t>
+      </w:r>
+      <w:r>
+        <w:t xml:space="preserve">documentación aplicable, o con documentación que no cubre las afirmaciones, el sistema se abstiene,</w:t>
+      </w:r>
+      <w:r>
+        <w:t xml:space="preserve"> </w:t>
+      </w:r>
+      <w:r>
+        <w:t xml:space="preserve">y no explicó ninguno de los casos que debían terminar en abstención. El precio aparece en el otro</w:t>
+      </w:r>
+      <w:r>
+        <w:t xml:space="preserve"> </w:t>
+      </w:r>
+      <w:r>
+        <w:t xml:space="preserve">error: dos abstenciones innecesarias de cinco.</w:t>
+      </w:r>
+    </w:p>
+    <w:p>
+      <w:pPr>
+        <w:pStyle w:val="Normal"/>
+      </w:pPr>
+      <w:r>
+        <w:rPr>
+          <w:b/>
+          <w:bCs/>
+        </w:rPr>
+        <w:t xml:space="preserve">Lo observado sobre el conjunto de prueba.</w:t>
+      </w:r>
+      <w:r>
+        <w:t xml:space="preserve"> </w:t>
+      </w:r>
+      <w:r>
+        <w:t xml:space="preserve">El estrato operativo de la evaluación final da</w:t>
+      </w:r>
+      <w:r>
+        <w:t xml:space="preserve"> </w:t>
+      </w:r>
+      <w:r>
+        <w:rPr>
+          <w:b/>
+          <w:bCs/>
+        </w:rPr>
+        <w:t xml:space="preserve">0 de</w:t>
+      </w:r>
+      <w:r>
+        <w:rPr>
+          <w:b/>
+          <w:bCs/>
+        </w:rPr>
+        <w:t xml:space="preserve"> </w:t>
+      </w:r>
+      <w:r>
+        <w:rPr>
+          <w:b/>
+          <w:bCs/>
+        </w:rPr>
+        <w:t xml:space="preserve">14</w:t>
+      </w:r>
+      <w:r>
+        <w:t xml:space="preserve"> </w:t>
+      </w:r>
+      <w:r>
+        <w:t xml:space="preserve">de falsa confianza,</w:t>
+      </w:r>
+      <w:r>
+        <w:t xml:space="preserve"> </w:t>
+      </w:r>
+      <w:r>
+        <w:rPr>
+          <w:b/>
+          <w:bCs/>
+        </w:rPr>
+        <w:t xml:space="preserve">2 de 8</w:t>
+      </w:r>
+      <w:r>
+        <w:t xml:space="preserve"> </w:t>
+      </w:r>
+      <w:r>
+        <w:t xml:space="preserve">de abstención innecesaria y una cobertura de</w:t>
+      </w:r>
+      <w:r>
+        <w:t xml:space="preserve"> </w:t>
+      </w:r>
+      <w:r>
+        <w:rPr>
+          <w:b/>
+          <w:bCs/>
+        </w:rPr>
+        <w:t xml:space="preserve">6 de 10</w:t>
+      </w:r>
+      <w:r>
+        <w:t xml:space="preserve"> </w:t>
+      </w:r>
+      <w:r>
+        <w:t xml:space="preserve">con</w:t>
+      </w:r>
+      <w:r>
+        <w:t xml:space="preserve"> </w:t>
+      </w:r>
+      <w:r>
+        <w:t xml:space="preserve">evidencia completa. El patrón de validación se mantiene: el error que el diseño perseguía no se</w:t>
+      </w:r>
+      <w:r>
+        <w:t xml:space="preserve"> </w:t>
+      </w:r>
+      <w:r>
+        <w:t xml:space="preserve">observa, y el que se paga a cambio sigue ahí, en la misma proporción.</w:t>
+      </w:r>
+    </w:p>
+    <w:p>
+      <w:pPr>
+        <w:pStyle w:val="Normal"/>
+      </w:pPr>
+      <w:r>
+        <w:rPr>
+          <w:b/>
+          <w:bCs/>
+        </w:rPr>
+        <w:t xml:space="preserve">Qué permite concluir.</w:t>
+      </w:r>
+      <w:r>
+        <w:t xml:space="preserve"> </w:t>
+      </w:r>
+      <w:r>
+        <w:t xml:space="preserve">Que un criterio de suficiencia determinista, separado del modelo que</w:t>
+      </w:r>
+      <w:r>
+        <w:t xml:space="preserve"> </w:t>
+      </w:r>
+      <w:r>
+        <w:t xml:space="preserve">redacta, evita la falsa confianza en las dos muestras en que se ha medido. Las ablaciones localizan</w:t>
+      </w:r>
+      <w:r>
+        <w:t xml:space="preserve"> </w:t>
+      </w:r>
+      <w:r>
+        <w:t xml:space="preserve">el mecanismo: sustituir el criterio compuesto por una puerta de confianza sola lleva la falsa</w:t>
+      </w:r>
+      <w:r>
+        <w:t xml:space="preserve"> </w:t>
+      </w:r>
+      <w:r>
+        <w:t xml:space="preserve">confianza de 0 de 9 a 9 de 9, mientras retirar la atribución no cambia ninguna de las dos tasas.</w:t>
+      </w:r>
+    </w:p>
+    <w:p>
+      <w:pPr>
+        <w:pStyle w:val="Normal"/>
+      </w:pPr>
+      <w:r>
+        <w:rPr>
+          <w:b/>
+          <w:bCs/>
+        </w:rPr>
+        <w:t xml:space="preserve">Qué no permite concluir.</w:t>
+      </w:r>
+      <w:r>
+        <w:t xml:space="preserve"> </w:t>
+      </w:r>
+      <w:r>
+        <w:t xml:space="preserve">Que la falsa confianza sea imposible. Con numerador cero y denominador</w:t>
+      </w:r>
+      <w:r>
+        <w:t xml:space="preserve"> </w:t>
+      </w:r>
+      <w:r>
+        <w:t xml:space="preserve">catorce, el intervalo de Wilson al 95 % llega hasta 0,215, y las catorce ejecuciones proceden de</w:t>
+      </w:r>
+      <w:r>
+        <w:t xml:space="preserve"> </w:t>
+      </w:r>
+      <w:r>
+        <w:t xml:space="preserve">siete ventanas, de modo que el intervalo real es más ancho. Lo medido es que</w:t>
+      </w:r>
+      <w:r>
+        <w:t xml:space="preserve"> </w:t>
+      </w:r>
+      <w:r>
+        <w:rPr>
+          <w:b/>
+          <w:bCs/>
+        </w:rPr>
+        <w:t xml:space="preserve">en esta muestra no</w:t>
+      </w:r>
+      <w:r>
+        <w:rPr>
+          <w:b/>
+          <w:bCs/>
+        </w:rPr>
+        <w:t xml:space="preserve"> </w:t>
+      </w:r>
+      <w:r>
+        <w:rPr>
+          <w:b/>
+          <w:bCs/>
+        </w:rPr>
+        <w:t xml:space="preserve">ocurrió</w:t>
+      </w:r>
+      <w:r>
+        <w:t xml:space="preserve">, no que no pueda ocurrir. Tampoco permite concluir que el precio sea bajo: dos de cada</w:t>
+      </w:r>
+      <w:r>
+        <w:t xml:space="preserve"> </w:t>
+      </w:r>
+      <w:r>
+        <w:t xml:space="preserve">ocho explicaciones legítimas se perdieron, y un umbral más laxo habría recuperado una de ellas.</w:t>
+      </w:r>
+    </w:p>
+    <w:p>
+      <w:pPr>
+        <w:pStyle w:val="Normal"/>
+      </w:pPr>
+      <w:r>
+        <w:rPr>
+          <w:b/>
+          <w:bCs/>
+        </w:rPr>
+        <w:t xml:space="preserve">Alcance.</w:t>
+      </w:r>
+      <w:r>
+        <w:t xml:space="preserve"> </w:t>
+      </w:r>
+      <w:r>
+        <w:t xml:space="preserve">Sostenida sobre las dos particiones, con el precio declarado y sin extrapolar a tasas</w:t>
+      </w:r>
+      <w:r>
+        <w:t xml:space="preserve"> </w:t>
+      </w:r>
+      <w:r>
+        <w:t xml:space="preserve">poblacionales.</w:t>
+      </w:r>
+    </w:p>
+    <w:p>
+      <w:pPr>
+        <w:numPr>
+          <w:ilvl w:val="1"/>
+          <w:numId w:val="906"/>
+        </w:numPr>
+        <w:pStyle w:val="Ttulosubapartado"/>
+      </w:pPr>
+      <w:bookmarkStart w:id="151" w:name="_7ce5583c7846208abc7c894a48f1463ad41755f"/>
+      <w:r>
+        <w:t xml:space="preserve">PI.4 · Por qué la condición con distractor no medía lo que decía</w:t>
+      </w:r>
+      <w:bookmarkEnd w:id="151"/>
+    </w:p>
+    <w:p>
+      <w:pPr>
+        <w:pStyle w:val="Normal"/>
+      </w:pPr>
+      <w:r>
+        <w:rPr>
+          <w:b/>
+          <w:bCs/>
+        </w:rPr>
+        <w:t xml:space="preserve">Lo observado.</w:t>
+      </w:r>
+      <w:r>
+        <w:t xml:space="preserve"> </w:t>
+      </w:r>
+      <w:r>
+        <w:t xml:space="preserve">Ningún fragmento de otro motor sostuvo una afirmación, con filtro o sin él. Pero</w:t>
+      </w:r>
+      <w:r>
+        <w:t xml:space="preserve"> </w:t>
+      </w:r>
+      <w:r>
+        <w:t xml:space="preserve">la condición que debía medirlo, con el filtro activo, no añadía en ninguno de los tres fallos un</w:t>
+      </w:r>
+      <w:r>
+        <w:t xml:space="preserve"> </w:t>
+      </w:r>
+      <w:r>
+        <w:t xml:space="preserve">distractor que la condición parcial no tuviera: no manipulaba la variable que declaraba manipular.</w:t>
+      </w:r>
+      <w:r>
+        <w:t xml:space="preserve"> </w:t>
+      </w:r>
+      <w:r>
+        <w:t xml:space="preserve">El rediseño sin filtro sí introduce el distractor, y en las seis ejecuciones el sistema se abstuvo</w:t>
+      </w:r>
+      <w:r>
+        <w:t xml:space="preserve"> </w:t>
+      </w:r>
+      <w:r>
+        <w:t xml:space="preserve">y en las seis el motivo registrado fue la insuficiencia de la evidencia, no la baja confianza.</w:t>
+      </w:r>
+    </w:p>
+    <w:p>
+      <w:pPr>
+        <w:pStyle w:val="Normal"/>
+      </w:pPr>
+      <w:r>
+        <w:rPr>
+          <w:b/>
+          <w:bCs/>
+        </w:rPr>
+        <w:t xml:space="preserve">Qué permite concluir.</w:t>
+      </w:r>
+      <w:r>
+        <w:t xml:space="preserve"> </w:t>
+      </w:r>
+      <w:r>
+        <w:t xml:space="preserve">Que el rechazo de evidencia impertinente ocurre por la vía prevista —la</w:t>
+      </w:r>
+      <w:r>
+        <w:t xml:space="preserve"> </w:t>
+      </w:r>
+      <w:r>
+        <w:t xml:space="preserve">comprobación de que el fragmento hable de la señal observada— y no por un efecto colateral de la</w:t>
+      </w:r>
+      <w:r>
+        <w:t xml:space="preserve"> </w:t>
+      </w:r>
+      <w:r>
+        <w:t xml:space="preserve">puerta de confianza.</w:t>
+      </w:r>
+    </w:p>
+    <w:p>
+      <w:pPr>
+        <w:pStyle w:val="Normal"/>
+      </w:pPr>
+      <w:r>
+        <w:rPr>
+          <w:b/>
+          <w:bCs/>
+        </w:rPr>
+        <w:t xml:space="preserve">Qué no permite concluir.</w:t>
+      </w:r>
+      <w:r>
+        <w:t xml:space="preserve"> </w:t>
+      </w:r>
+      <w:r>
+        <w:t xml:space="preserve">Nada sobre su frecuencia. Son</w:t>
+      </w:r>
+      <w:r>
+        <w:t xml:space="preserve"> </w:t>
+      </w:r>
+      <w:r>
+        <w:rPr>
+          <w:b/>
+          <w:bCs/>
+        </w:rPr>
+        <w:t xml:space="preserve">tres casos construidos</w:t>
+      </w:r>
+      <w:r>
+        <w:t xml:space="preserve"> </w:t>
+      </w:r>
+      <w:r>
+        <w:t xml:space="preserve">y seis</w:t>
+      </w:r>
+      <w:r>
+        <w:t xml:space="preserve"> </w:t>
+      </w:r>
+      <w:r>
+        <w:t xml:space="preserve">ejecuciones procedentes de tres ventanas: el recuento se publica como recuento y no como tasa.</w:t>
+      </w:r>
+    </w:p>
+    <w:p>
+      <w:pPr>
+        <w:pStyle w:val="Normal"/>
+      </w:pPr>
+      <w:r>
+        <w:rPr>
+          <w:b/>
+          <w:bCs/>
+        </w:rPr>
+        <w:t xml:space="preserve">Alcance.</w:t>
+      </w:r>
+      <w:r>
+        <w:t xml:space="preserve"> </w:t>
+      </w:r>
+      <w:r>
+        <w:t xml:space="preserve">La novedad que el capítulo 3 atribuía a esta subpregunta es más estrecha de lo</w:t>
+      </w:r>
+      <w:r>
+        <w:t xml:space="preserve"> </w:t>
+      </w:r>
+      <w:r>
+        <w:t xml:space="preserve">enunciado, y el resultado del rediseño la sostiene solo sobre un número de casos que no permite</w:t>
+      </w:r>
+      <w:r>
+        <w:t xml:space="preserve"> </w:t>
+      </w:r>
+      <w:r>
+        <w:t xml:space="preserve">estimar nada.</w:t>
+      </w:r>
+    </w:p>
+    <w:p>
+      <w:pPr>
+        <w:numPr>
+          <w:ilvl w:val="1"/>
+          <w:numId w:val="906"/>
+        </w:numPr>
+        <w:pStyle w:val="Ttulosubapartado"/>
+      </w:pPr>
+      <w:bookmarkStart w:id="152" w:name="_b3ec47366dafe6e7e636c1d6a4af0be71bd241f"/>
+      <w:r>
+        <w:t xml:space="preserve">La respuesta a la pregunta de investigación</w:t>
+      </w:r>
+      <w:bookmarkEnd w:id="152"/>
+    </w:p>
+    <w:p>
+      <w:pPr>
+        <w:pStyle w:val="Normal"/>
+      </w:pPr>
+      <w:r>
+        <w:t xml:space="preserve">Aplicada la regla que el capítulo 4 fijó para la respuesta global, con PI.1 sostenida en su forma</w:t>
+      </w:r>
+      <w:r>
+        <w:t xml:space="preserve"> </w:t>
+      </w:r>
+      <w:r>
+        <w:t xml:space="preserve">acotada, PI.2 como trazabilidad y no como soporte medido, PI.3 sostenida sobre las dos particiones</w:t>
+      </w:r>
+      <w:r>
+        <w:t xml:space="preserve"> </w:t>
+      </w:r>
+      <w:r>
+        <w:t xml:space="preserve">y PI.4 reducida a un rediseño con tres casos, la respuesta es</w:t>
+      </w:r>
+      <w:r>
+        <w:t xml:space="preserve"> </w:t>
+      </w:r>
+      <w:r>
+        <w:rPr>
+          <w:b/>
+          <w:bCs/>
+        </w:rPr>
+        <w:t xml:space="preserve">parcialmente sostenida</w:t>
+      </w:r>
+      <w:r>
+        <w:t xml:space="preserve">.</w:t>
+      </w:r>
+    </w:p>
+    <w:p>
+      <w:pPr>
+        <w:pStyle w:val="Normal"/>
+      </w:pPr>
+      <w:r>
+        <w:t xml:space="preserve">Dos cosas la separan de una respuesta firme. La primera es que la calificación descansa en criterios</w:t>
+      </w:r>
+      <w:r>
+        <w:t xml:space="preserve"> </w:t>
+      </w:r>
+      <w:r>
+        <w:t xml:space="preserve">reescritos tras ver los primeros resultados y en una PI.2 que se cumple por construcción. La</w:t>
+      </w:r>
+      <w:r>
+        <w:t xml:space="preserve"> </w:t>
+      </w:r>
+      <w:r>
+        <w:t xml:space="preserve">segunda es el tamaño de las muestras: ninguna de las cifras finales procede de más de diez</w:t>
+      </w:r>
+      <w:r>
+        <w:t xml:space="preserve"> </w:t>
+      </w:r>
+      <w:r>
+        <w:t xml:space="preserve">ventanas, y la aritmética de un intervalo de confianza sobre ese material deja márgenes anchos.</w:t>
+      </w:r>
+    </w:p>
+    <w:p>
+      <w:pPr>
+        <w:pStyle w:val="Normal"/>
+      </w:pPr>
+      <w:r>
+        <w:t xml:space="preserve">De los cinco desenlaces que el capítulo 4 declaró como refutatorios, ninguno se produjo. El de la</w:t>
+      </w:r>
+      <w:r>
+        <w:t xml:space="preserve"> </w:t>
+      </w:r>
+      <w:r>
+        <w:t xml:space="preserve">abstención trivial merece comprobarse explícitamente, porque es el más fácil de confundir con un</w:t>
+      </w:r>
+      <w:r>
+        <w:t xml:space="preserve"> </w:t>
+      </w:r>
+      <w:r>
+        <w:t xml:space="preserve">buen resultado: el sistema no se abstiene siempre. Sobre el conjunto de prueba explica seis de las</w:t>
+      </w:r>
+      <w:r>
+        <w:t xml:space="preserve"> </w:t>
+      </w:r>
+      <w:r>
+        <w:t xml:space="preserve">diez ejecuciones con evidencia completa y se abstiene en las catorce que debían terminar así.</w:t>
+      </w:r>
+    </w:p>
+    <w:p>
+      <w:pPr>
+        <w:numPr>
+          <w:ilvl w:val="1"/>
+          <w:numId w:val="906"/>
+        </w:numPr>
+        <w:pStyle w:val="Ttulosubapartado"/>
+      </w:pPr>
+      <w:bookmarkStart w:id="153" w:name="_f50225193eb05a466c44b3a7bb3e4ad45aa691b"/>
+      <w:r>
+        <w:t xml:space="preserve">Lo que los resultados no sostienen</w:t>
+      </w:r>
+      <w:bookmarkEnd w:id="153"/>
+    </w:p>
+    <w:p>
+      <w:pPr>
+        <w:pStyle w:val="Normal"/>
+      </w:pPr>
+      <w:r>
+        <w:rPr>
+          <w:b/>
+          <w:bCs/>
+        </w:rPr>
+        <w:t xml:space="preserve">Nada sobre un vehículo real.</w:t>
+      </w:r>
+      <w:r>
+        <w:t xml:space="preserve"> </w:t>
+      </w:r>
+      <w:r>
+        <w:t xml:space="preserve">Caracterizan el comportamiento del sistema ante los fallos que el</w:t>
+      </w:r>
+      <w:r>
+        <w:t xml:space="preserve"> </w:t>
+      </w:r>
+      <w:r>
+        <w:t xml:space="preserve">generador representa, parametrizado con el manual del vehículo de referencia. Es la primera</w:t>
+      </w:r>
+      <w:r>
+        <w:t xml:space="preserve"> </w:t>
+      </w:r>
+      <w:r>
+        <w:t xml:space="preserve">limitación del capítulo 6.</w:t>
+      </w:r>
+    </w:p>
+    <w:p>
+      <w:pPr>
+        <w:pStyle w:val="Normal"/>
+      </w:pPr>
+      <w:r>
+        <w:rPr>
+          <w:b/>
+          <w:bCs/>
+        </w:rPr>
+        <w:t xml:space="preserve">Nada sobre un diagnóstico de partida erróneo</w:t>
+      </w:r>
+      <w:r>
+        <w:t xml:space="preserve">, salvo en el escenario adverso descrito, construido</w:t>
+      </w:r>
+      <w:r>
+        <w:t xml:space="preserve"> </w:t>
+      </w:r>
+      <w:r>
+        <w:t xml:space="preserve">sobre dos ventanas y anterior a la corrección del índice. Con la política vigente ese escenario deja</w:t>
+      </w:r>
+      <w:r>
+        <w:t xml:space="preserve"> </w:t>
+      </w:r>
+      <w:r>
+        <w:t xml:space="preserve">de aceptar soporte falso, y sigue siendo de dos ventanas.</w:t>
+      </w:r>
+    </w:p>
+    <w:p>
+      <w:pPr>
+        <w:pStyle w:val="Normal"/>
+      </w:pPr>
+      <w:r>
+        <w:rPr>
+          <w:b/>
+          <w:bCs/>
+        </w:rPr>
+        <w:t xml:space="preserve">Nada sobre la generalización del adaptador</w:t>
+      </w:r>
+      <w:r>
+        <w:t xml:space="preserve"> </w:t>
+      </w:r>
+      <w:r>
+        <w:t xml:space="preserve">del modelo de lenguaje: se ajustó con ejemplos</w:t>
+      </w:r>
+      <w:r>
+        <w:t xml:space="preserve"> </w:t>
+      </w:r>
+      <w:r>
+        <w:t xml:space="preserve">generados por la recuperación anterior a la corrección del índice y con ventanas que incluyen las de</w:t>
+      </w:r>
+      <w:r>
+        <w:t xml:space="preserve"> </w:t>
+      </w:r>
+      <w:r>
+        <w:t xml:space="preserve">tres casos evaluados. No se ha reentrenado, y esa contaminación está declarada.</w:t>
+      </w:r>
+    </w:p>
+    <w:p>
+      <w:pPr>
+        <w:pStyle w:val="Normal"/>
+      </w:pPr>
+      <w:r>
+        <w:rPr>
+          <w:b/>
+          <w:bCs/>
+        </w:rPr>
+        <w:t xml:space="preserve">Nada sobre el efecto de separar la decisión de la redacción.</w:t>
+      </w:r>
+      <w:r>
+        <w:t xml:space="preserve"> </w:t>
+      </w:r>
+      <w:r>
+        <w:t xml:space="preserve">Lo medido es el comportamiento de un</w:t>
+      </w:r>
+      <w:r>
+        <w:t xml:space="preserve"> </w:t>
+      </w:r>
+      <w:r>
+        <w:t xml:space="preserve">sistema que implementa esa separación, no una comparación con uno que deje la abstención en manos</w:t>
+      </w:r>
+      <w:r>
+        <w:t xml:space="preserve"> </w:t>
+      </w:r>
+      <w:r>
+        <w:t xml:space="preserve">del modelo de lenguaje. Esa comparación exigiría una ablación que no se ejecutó.</w:t>
+      </w:r>
+    </w:p>
+    <w:p>
+      <w:pPr>
+        <w:pStyle w:val="Normal"/>
+      </w:pPr>
+      <w:r>
+        <w:rPr>
+          <w:b/>
+          <w:bCs/>
+        </w:rPr>
+        <w:t xml:space="preserve">Nada sobre la fidelidad numérica del texto entregado.</w:t>
+      </w:r>
+      <w:r>
+        <w:t xml:space="preserve"> </w:t>
+      </w:r>
+      <w:r>
+        <w:t xml:space="preserve">Siete de las treinta y cinco salidas del</w:t>
+      </w:r>
+      <w:r>
+        <w:t xml:space="preserve"> </w:t>
+      </w:r>
+      <w:r>
+        <w:t xml:space="preserve">redactor contienen al menos una cifra que el verificador no produjo. Ninguna de las tasas cambia por</w:t>
+      </w:r>
+      <w:r>
+        <w:t xml:space="preserve"> </w:t>
+      </w:r>
+      <w:r>
+        <w:t xml:space="preserve">ello, porque las produce el verificador determinista; lo que queda sin garantizar es que el texto</w:t>
+      </w:r>
+      <w:r>
+        <w:t xml:space="preserve"> </w:t>
+      </w:r>
+      <w:r>
+        <w:t xml:space="preserve">que el usuario lee diga los números que el sistema calculó.</w:t>
+      </w:r>
+    </w:p>
+    <w:p>
+      <w:pPr>
+        <w:numPr>
+          <w:ilvl w:val="1"/>
+          <w:numId w:val="906"/>
+        </w:numPr>
+        <w:pStyle w:val="Ttulosubapartado"/>
+      </w:pPr>
+      <w:bookmarkStart w:id="154" w:name="_978f06f89d85a2d9ff8a92b4947fdc8b2e8c741"/>
       <w:r>
         <w:t xml:space="preserve">El patrón que atraviesa el trabajo</w:t>
       </w:r>
-      <w:bookmarkEnd w:id="150"/>
-    </w:p>
-    <w:p>
-      <w:pPr>
-        <w:pStyle w:val="Normal"/>
-      </w:pPr>
-      <w:r>
-        <w:t xml:space="preserve">Varios de los errores relevantes del trabajo se detectaron mirando cifras que no cuadraban, no ejecutando pruebas automáticas: una exactitud de cero por un tipo de dato, una puntuación de fusión en otra escala, una condición ABSENT que seguía explicando, un código genérico que hacía parecer que la evidencia no existía, un efecto aparente del idioma que el filtro tapaba, un esquema que rechazaba respuestas correctas, un índice que mezclaba dos espacios vectoriales. Cada uno quedó registrado con su consecuencia si no se hubiera detectado, y varios habrían producido resultados falsos que parecían correctos. Es la misma observación que motiva la pregunta de investigación, aplicada al propio proceso de investigarla: la evidencia aparente no sobrevive siempre al escrutinio, y un sistema, o un investigador, que no distinga entre tener una referencia y tener soporte producirá afirmaciones con referencia y sin soporte.</w:t>
-      </w:r>
-    </w:p>
-    <w:p>
-      <w:pPr>
-        <w:pStyle w:val="Normal"/>
-      </w:pPr>
-      <w:r>
-        <w:t xml:space="preserve">Quedan para la evaluación final dos cosas que este capítulo no puede ofrecer todavía: la medición sobre el conjunto de prueba, que dirá si las cifras de validación se mantienen sobre datos no usados para fijar ningún umbral ni revisar el criterio, y la comparación con los trabajos del capítulo 3, que solo tiene sentido sobre resultados finales. De las ablaciones queda pendiente la variante de la recuperación léxica que la enmienda declara.</w:t>
+      <w:bookmarkEnd w:id="154"/>
+    </w:p>
+    <w:p>
+      <w:pPr>
+        <w:pStyle w:val="Normal"/>
+      </w:pPr>
+      <w:r>
+        <w:t xml:space="preserve">Varios de los errores relevantes se detectaron mirando cifras que no cuadraban, no ejecutando</w:t>
+      </w:r>
+      <w:r>
+        <w:t xml:space="preserve"> </w:t>
+      </w:r>
+      <w:r>
+        <w:t xml:space="preserve">pruebas automáticas: una exactitud de cero por un tipo de dato, una puntuación de fusión en otra</w:t>
+      </w:r>
+      <w:r>
+        <w:t xml:space="preserve"> </w:t>
+      </w:r>
+      <w:r>
+        <w:t xml:space="preserve">escala, una condición sin evidencia que seguía explicando, un código genérico que hacía parecer que</w:t>
+      </w:r>
+      <w:r>
+        <w:t xml:space="preserve"> </w:t>
+      </w:r>
+      <w:r>
+        <w:t xml:space="preserve">la evidencia no existía, un efecto aparente del idioma que el filtro tapaba, un esquema que</w:t>
+      </w:r>
+      <w:r>
+        <w:t xml:space="preserve"> </w:t>
+      </w:r>
+      <w:r>
+        <w:t xml:space="preserve">rechazaba respuestas correctas, un índice que mezclaba dos espacios vectoriales.</w:t>
+      </w:r>
+    </w:p>
+    <w:p>
+      <w:pPr>
+        <w:pStyle w:val="Normal"/>
+      </w:pPr>
+      <w:r>
+        <w:t xml:space="preserve">Cada uno quedó registrado con la consecuencia que habría tenido de no detectarse, y varios habrían</w:t>
+      </w:r>
+      <w:r>
+        <w:t xml:space="preserve"> </w:t>
+      </w:r>
+      <w:r>
+        <w:t xml:space="preserve">producido resultados falsos de apariencia correcta. Es la misma observación que motiva la pregunta</w:t>
+      </w:r>
+      <w:r>
+        <w:t xml:space="preserve"> </w:t>
+      </w:r>
+      <w:r>
+        <w:t xml:space="preserve">de investigación, aplicada al propio proceso de investigarla: la evidencia aparente no sobrevive</w:t>
+      </w:r>
+      <w:r>
+        <w:t xml:space="preserve"> </w:t>
+      </w:r>
+      <w:r>
+        <w:t xml:space="preserve">siempre al escrutinio, y quien no distinga entre</w:t>
+      </w:r>
+      <w:r>
+        <w:t xml:space="preserve"> </w:t>
+      </w:r>
+      <w:r>
+        <w:rPr>
+          <w:b/>
+          <w:bCs/>
+        </w:rPr>
+        <w:t xml:space="preserve">tener una referencia</w:t>
+      </w:r>
+      <w:r>
+        <w:t xml:space="preserve"> </w:t>
+      </w:r>
+      <w:r>
+        <w:t xml:space="preserve">y</w:t>
+      </w:r>
+      <w:r>
+        <w:t xml:space="preserve"> </w:t>
+      </w:r>
+      <w:r>
+        <w:rPr>
+          <w:b/>
+          <w:bCs/>
+        </w:rPr>
+        <w:t xml:space="preserve">tener soporte</w:t>
+      </w:r>
+      <w:r>
+        <w:t xml:space="preserve"> </w:t>
+      </w:r>
+      <w:r>
+        <w:t xml:space="preserve">—un sistema o un investigador— producirá afirmaciones con referencia y sin soporte.</w:t>
+      </w:r>
+    </w:p>
+    <w:p>
+      <w:pPr>
+        <w:pStyle w:val="Normal"/>
+      </w:pPr>
+      <w:r>
+        <w:t xml:space="preserve">Queda pendiente la comparación con los trabajos del capítulo 3, que el capítulo 6 aborda sobre los</w:t>
+      </w:r>
+      <w:r>
+        <w:t xml:space="preserve"> </w:t>
+      </w:r>
+      <w:r>
+        <w:t xml:space="preserve">resultados finales, y la variante de recuperación léxica que la enmienda de las ablaciones declara y</w:t>
+      </w:r>
+      <w:r>
+        <w:t xml:space="preserve"> </w:t>
+      </w:r>
+      <w:r>
+        <w:t xml:space="preserve">que quedó inconclusa.</w:t>
       </w:r>
     </w:p>
     <w:p>
       <w:pPr>
         <w:pStyle w:val="Ttulo1"/>
       </w:pPr>
-      <w:bookmarkStart w:id="151" w:name="_e573ea55e4a7d2294a654dc8a2ed3cc7f288b68"/>
+      <w:bookmarkStart w:id="155" w:name="_e573ea55e4a7d2294a654dc8a2ed3cc7f288b68"/>
       <w:r>
         <w:t xml:space="preserve">Capítulo 6: Conclusiones</w:t>
       </w:r>
-      <w:bookmarkEnd w:id="151"/>
+      <w:bookmarkEnd w:id="155"/>
+    </w:p>
+    <w:p>
+      <w:pPr>
+        <w:pStyle w:val="Normal"/>
+      </w:pPr>
+      <w:r>
+        <w:t xml:space="preserve">Un sistema de diagnóstico que explica una avería puede equivocarse de dos maneras que no cuestan lo</w:t>
+      </w:r>
+      <w:r>
+        <w:t xml:space="preserve"> </w:t>
+      </w:r>
+      <w:r>
+        <w:t xml:space="preserve">mismo. Puede fallar el diagnóstico, y eso se mide con las métricas de siempre. O puede acertar el</w:t>
+      </w:r>
+      <w:r>
+        <w:t xml:space="preserve"> </w:t>
+      </w:r>
+      <w:r>
+        <w:t xml:space="preserve">diagnóstico y sostenerlo con una explicación que suena razonable y que no se apoya en nada: una</w:t>
+      </w:r>
+      <w:r>
+        <w:t xml:space="preserve"> </w:t>
+      </w:r>
+      <w:r>
+        <w:t xml:space="preserve">referencia a un procedimiento del manual que no dice lo que la frase afirma, una observación que la</w:t>
+      </w:r>
+      <w:r>
+        <w:t xml:space="preserve"> </w:t>
+      </w:r>
+      <w:r>
+        <w:t xml:space="preserve">telemetría no contiene. El segundo error es el que motiva este trabajo, porque en un taller orienta</w:t>
+      </w:r>
+      <w:r>
+        <w:t xml:space="preserve"> </w:t>
+      </w:r>
+      <w:r>
+        <w:t xml:space="preserve">una reparación y porque, a diferencia del primero, no deja rastro en ninguna métrica de acierto.</w:t>
+      </w:r>
+    </w:p>
+    <w:p>
+      <w:pPr>
+        <w:pStyle w:val="Normal"/>
+      </w:pPr>
+      <w:r>
+        <w:t xml:space="preserve">El trabajo estudia si un agente con recuperación aumentada puede explicar el diagnóstico de un</w:t>
+      </w:r>
+      <w:r>
+        <w:t xml:space="preserve"> </w:t>
+      </w:r>
+      <w:r>
+        <w:t xml:space="preserve">vehículo a partir de telemetría OBD-II de modo que cada afirmación se pueda seguir hasta la</w:t>
+      </w:r>
+      <w:r>
+        <w:t xml:space="preserve"> </w:t>
+      </w:r>
+      <w:r>
+        <w:t xml:space="preserve">evidencia que la sostiene, y abstenerse cuando esa evidencia no basta. Para examinarlo construye un</w:t>
+      </w:r>
+      <w:r>
+        <w:t xml:space="preserve"> </w:t>
+      </w:r>
+      <w:r>
+        <w:t xml:space="preserve">banco de pruebas en el que la evidencia disponible se manipula a propósito —completa, parcial,</w:t>
+      </w:r>
+      <w:r>
+        <w:t xml:space="preserve"> </w:t>
+      </w:r>
+      <w:r>
+        <w:t xml:space="preserve">retirada, o acompañada de documentación de otro motor— y en el que la decisión de explicar o</w:t>
+      </w:r>
+      <w:r>
+        <w:t xml:space="preserve"> </w:t>
+      </w:r>
+      <w:r>
+        <w:t xml:space="preserve">callarse no la toma el modelo de lenguaje, sino un verificador determinista que examina lo que hay.</w:t>
+      </w:r>
+    </w:p>
+    <w:p>
+      <w:pPr>
+        <w:pStyle w:val="Normal"/>
+      </w:pPr>
+      <w:r>
+        <w:rPr>
+          <w:b/>
+          <w:bCs/>
+        </w:rPr>
+        <w:t xml:space="preserve">Lo que los resultados muestran.</w:t>
+      </w:r>
+      <w:r>
+        <w:t xml:space="preserve"> </w:t>
+      </w:r>
+      <w:r>
+        <w:t xml:space="preserve">El criterio de suficiencia evita la falsa confianza en las dos</w:t>
+      </w:r>
+      <w:r>
+        <w:t xml:space="preserve"> </w:t>
+      </w:r>
+      <w:r>
+        <w:t xml:space="preserve">particiones en que se ha medido: ninguna de las catorce ejecuciones del conjunto de prueba que</w:t>
+      </w:r>
+      <w:r>
+        <w:t xml:space="preserve"> </w:t>
+      </w:r>
+      <w:r>
+        <w:t xml:space="preserve">debían terminar en abstención terminó en explicación. Las ablaciones localizan el mecanismo: con</w:t>
+      </w:r>
+      <w:r>
+        <w:t xml:space="preserve"> </w:t>
+      </w:r>
+      <w:r>
+        <w:t xml:space="preserve">una puerta de confianza sola, ese mismo error aparece en las nueve ejecuciones. Y el precio está</w:t>
+      </w:r>
+      <w:r>
+        <w:t xml:space="preserve"> </w:t>
+      </w:r>
+      <w:r>
+        <w:t xml:space="preserve">medido y es alto: dos de cada ocho explicaciones legítimas se perdieron.</w:t>
+      </w:r>
+    </w:p>
+    <w:p>
+      <w:pPr>
+        <w:pStyle w:val="Normal"/>
+      </w:pPr>
+      <w:r>
+        <w:rPr>
+          <w:b/>
+          <w:bCs/>
+        </w:rPr>
+        <w:t xml:space="preserve">La contribución central</w:t>
+      </w:r>
+      <w:r>
+        <w:t xml:space="preserve"> </w:t>
+      </w:r>
+      <w:r>
+        <w:t xml:space="preserve">no es el sistema, que combina componentes conocidos. Es el banco de</w:t>
+      </w:r>
+      <w:r>
+        <w:t xml:space="preserve"> </w:t>
+      </w:r>
+      <w:r>
+        <w:t xml:space="preserve">pruebas con evidencia manipulada y las mediciones que produce, y en particular la demostración de</w:t>
+      </w:r>
+      <w:r>
+        <w:t xml:space="preserve"> </w:t>
+      </w:r>
+      <w:r>
+        <w:t xml:space="preserve">que una confianza diagnóstica alta no basta: en la ablación que retira el criterio documental, el</w:t>
+      </w:r>
+      <w:r>
+        <w:t xml:space="preserve"> </w:t>
+      </w:r>
+      <w:r>
+        <w:t xml:space="preserve">sistema explica con confianza todas las ejecuciones que debían terminar calladas.</w:t>
+      </w:r>
+    </w:p>
+    <w:p>
+      <w:pPr>
+        <w:pStyle w:val="Normal"/>
+      </w:pPr>
+      <w:r>
+        <w:rPr>
+          <w:b/>
+          <w:bCs/>
+        </w:rPr>
+        <w:t xml:space="preserve">Y lo que ninguna de esas cifras alcanza.</w:t>
+      </w:r>
+      <w:r>
+        <w:t xml:space="preserve"> </w:t>
+      </w:r>
+      <w:r>
+        <w:t xml:space="preserve">La telemetría es sintética y procede de un solo</w:t>
+      </w:r>
+      <w:r>
+        <w:t xml:space="preserve"> </w:t>
+      </w:r>
+      <w:r>
+        <w:t xml:space="preserve">vehículo. Las muestras son pequeñas: ninguna cifra final descansa en más de diez ventanas. La</w:t>
+      </w:r>
+      <w:r>
+        <w:t xml:space="preserve"> </w:t>
+      </w:r>
+      <w:r>
+        <w:t xml:space="preserve">correspondencia entre una afirmación y su evidencia se cumple por construcción del verificador y no</w:t>
+      </w:r>
+      <w:r>
+        <w:t xml:space="preserve"> </w:t>
+      </w:r>
+      <w:r>
+        <w:t xml:space="preserve">se ha contrastado con un juicio independiente. Y el conjunto de prueba no permaneció cerrado: se</w:t>
+      </w:r>
+      <w:r>
+        <w:t xml:space="preserve"> </w:t>
+      </w:r>
+      <w:r>
+        <w:t xml:space="preserve">abrió cinco veces bajo autorización registrada, y el anexo B recoge cada apertura con su nivel de</w:t>
+      </w:r>
+      <w:r>
+        <w:t xml:space="preserve"> </w:t>
+      </w:r>
+      <w:r>
+        <w:t xml:space="preserve">exposición.</w:t>
+      </w:r>
+    </w:p>
+    <w:p>
+      <w:pPr>
+        <w:pStyle w:val="Normal"/>
+      </w:pPr>
+      <w:r>
+        <w:t xml:space="preserve">Lo que sigue recorre los cinco objetivos específicos con la evidencia de cada uno, responde a la</w:t>
+      </w:r>
+      <w:r>
+        <w:t xml:space="preserve"> </w:t>
+      </w:r>
+      <w:r>
+        <w:t xml:space="preserve">pregunta de investigación, delimita las contribuciones y las limitaciones, y termina con lo que</w:t>
+      </w:r>
+      <w:r>
+        <w:t xml:space="preserve"> </w:t>
+      </w:r>
+      <w:r>
+        <w:t xml:space="preserve">quedaría por hacer.</w:t>
+      </w:r>
     </w:p>
     <w:p>
       <w:pPr>
@@ -23324,75 +24836,11 @@
         </w:numPr>
         <w:pStyle w:val="TtuloApartado"/>
       </w:pPr>
-      <w:bookmarkStart w:id="152" w:name="_6e577f61c2a85d1ebfde6ebe10a41b708a49435"/>
-      <w:r>
-        <w:t xml:space="preserve">Conclusiones provisionales sobre los objetivos y la pregunta de investigación</w:t>
-      </w:r>
-      <w:bookmarkEnd w:id="152"/>
-    </w:p>
-    <w:p>
-      <w:pPr>
-        <w:pStyle w:val="Normal"/>
-      </w:pPr>
-      <w:r>
-        <w:t xml:space="preserve">Esta es una entrega intermedia. Las conclusiones recorren los objetivos específicos en su orden y terminan en el general, y en cada uno separan lo que los resultados sobre validación permiten observar de lo que añade la evaluación final sobre el conjunto de prueba,</w:t>
-      </w:r>
-      <w:r>
-        <w:t xml:space="preserve"> </w:t>
-      </w:r>
-      <w:r>
-        <w:rPr>
-          <w:b/>
-          <w:bCs/>
-        </w:rPr>
-        <w:t xml:space="preserve">ejecutada el 12 de octubre de 2026 en el tercero de tres intentos</w:t>
-      </w:r>
-      <w:r>
-        <w:t xml:space="preserve">. El conjunto de prueba</w:t>
-      </w:r>
-      <w:r>
-        <w:t xml:space="preserve"> </w:t>
-      </w:r>
-      <w:r>
-        <w:rPr>
-          <w:b/>
-          <w:bCs/>
-        </w:rPr>
-        <w:t xml:space="preserve">no sigue cerrado</w:t>
-      </w:r>
-      <w:r>
-        <w:t xml:space="preserve">: se abrió cinco veces, y el anexo B recoge esas aperturas con su nivel de exposición. Las cifras de esa evaluación están incorporadas al capítulo 5 y se recogen aquí donde cambian lo que un objetivo puede afirmar.</w:t>
-      </w:r>
-    </w:p>
-    <w:p>
-      <w:pPr>
-        <w:pStyle w:val="CitaLiteralAPA"/>
-      </w:pPr>
-      <w:r>
-        <w:rPr>
-          <w:b/>
-          <w:bCs/>
-        </w:rPr>
-        <w:t xml:space="preserve">Corrección del 13 de octubre de 2026.</w:t>
-      </w:r>
-      <w:r>
-        <w:t xml:space="preserve"> </w:t>
-      </w:r>
-      <w:r>
-        <w:t xml:space="preserve">Este párrafo decía antes: «de lo que requiere la evaluación final sobre el conjunto de prueba, que sigue cerrado». La evaluación final se ejecutó el 12 de octubre de 2026 y el conjunto se había abierto cinco veces. Corrección</w:t>
-      </w:r>
-      <w:r>
-        <w:t xml:space="preserve"> </w:t>
-      </w:r>
-      <w:r>
-        <w:rPr>
-          <w:rStyle w:val="VerbatimChar"/>
-        </w:rPr>
-        <w:t xml:space="preserve">F-2</w:t>
-      </w:r>
-      <w:r>
-        <w:t xml:space="preserve">.</w:t>
-      </w:r>
+      <w:bookmarkStart w:id="156" w:name="_42f1e19b743ed9eadd0780cf65b5e0cac8886fe"/>
+      <w:r>
+        <w:t xml:space="preserve">El recorrido experimental y lo que mide cada etapa</w:t>
+      </w:r>
+      <w:bookmarkEnd w:id="156"/>
     </w:p>
     <w:p>
       <w:pPr>
@@ -23431,18 +24879,18 @@
           <wp:inline>
             <wp:extent cx="4383606" cy="5164751"/>
             <wp:effectExtent b="0" l="0" r="0" t="0"/>
-            <wp:docPr descr="Ocho etapas encadenadas, del dato OBD-II al resultado experimental, con los experimentos que cubren cada una anotados a la derecha." title="" id="154" name="Picture"/>
+            <wp:docPr descr="Ocho etapas encadenadas, del dato OBD-II al resultado experimental, con los experimentos que cubren cada una anotados a la derecha." title="" id="158" name="Picture"/>
             <a:graphic>
               <a:graphicData uri="http://schemas.openxmlformats.org/drawingml/2006/picture">
                 <pic:pic>
                   <pic:nvPicPr>
-                    <pic:cNvPr descr="../../artifacts/figures/memoria/FIG-6-01_recorrido_experimental.png" id="155" name="Picture"/>
+                    <pic:cNvPr descr="../../artifacts/figures/memoria/FIG-6-01_recorrido_experimental.png" id="159" name="Picture"/>
                     <pic:cNvPicPr>
                       <a:picLocks noChangeArrowheads="1" noChangeAspect="1"/>
                     </pic:cNvPicPr>
                   </pic:nvPicPr>
                   <pic:blipFill>
-                    <a:blip r:embed="rId153"/>
+                    <a:blip r:embed="rId157"/>
                     <a:stretch>
                       <a:fillRect/>
                     </a:stretch>
@@ -23543,18 +24991,60 @@
     </w:p>
     <w:p>
       <w:pPr>
-        <w:pStyle w:val="Normal"/>
-      </w:pPr>
-      <w:r>
-        <w:t xml:space="preserve">OE1, la revisión del estado del conocimiento, se cumplió en el alcance declarado. La revisión, inspirada en PRISMA pero sin su flujo formal, sin protocolo registrado y sin cribado por duplicado, delimitó el vacío en cuatro frentes y fundamentó las tres decisiones de diseño del capítulo 1; esos límites están declarados en el capítulo 3.</w:t>
-      </w:r>
-    </w:p>
-    <w:p>
-      <w:pPr>
-        <w:pStyle w:val="Normal"/>
-      </w:pPr>
-      <w:r>
-        <w:t xml:space="preserve">OE2, el entorno experimental reproducible, se cumplió parcialmente sobre telemetría sintética. El generador es determinista, los conjuntos se reparten por sesión,</w:t>
+        <w:numPr>
+          <w:ilvl w:val="0"/>
+          <w:numId w:val="907"/>
+        </w:numPr>
+        <w:pStyle w:val="TtuloApartado"/>
+      </w:pPr>
+      <w:bookmarkStart w:id="160" w:name="_7037725355d06f2fbd13453443a6e839df87984"/>
+      <w:r>
+        <w:t xml:space="preserve">Cumplimiento de los objetivos específicos</w:t>
+      </w:r>
+      <w:bookmarkEnd w:id="160"/>
+    </w:p>
+    <w:p>
+      <w:pPr>
+        <w:numPr>
+          <w:ilvl w:val="1"/>
+          <w:numId w:val="907"/>
+        </w:numPr>
+        <w:pStyle w:val="Ttulosubapartado"/>
+      </w:pPr>
+      <w:bookmarkStart w:id="161" w:name="_c572760902e32d7e74cd4790704555cf1269854"/>
+      <w:r>
+        <w:t xml:space="preserve">OE1 · Delimitación del vacío en la literatura</w:t>
+      </w:r>
+      <w:bookmarkEnd w:id="161"/>
+    </w:p>
+    <w:p>
+      <w:pPr>
+        <w:pStyle w:val="Normal"/>
+      </w:pPr>
+      <w:r>
+        <w:t xml:space="preserve">Se cumplió en el alcance declarado. La revisión, inspirada en PRISMA pero sin su flujo formal, sin protocolo registrado y sin cribado por duplicado, delimitó el vacío en cuatro frentes y fundamentó las tres decisiones de diseño del capítulo 1; esos límites están declarados en el capítulo 3.</w:t>
+      </w:r>
+    </w:p>
+    <w:p>
+      <w:pPr>
+        <w:numPr>
+          <w:ilvl w:val="1"/>
+          <w:numId w:val="907"/>
+        </w:numPr>
+        <w:pStyle w:val="Ttulosubapartado"/>
+      </w:pPr>
+      <w:bookmarkStart w:id="162" w:name="_eb5b4f4146e43a4ce2fbdecb3adac049e5f4d28"/>
+      <w:r>
+        <w:t xml:space="preserve">OE2 · Un entorno experimental reproducible</w:t>
+      </w:r>
+      <w:bookmarkEnd w:id="162"/>
+    </w:p>
+    <w:p>
+      <w:pPr>
+        <w:pStyle w:val="Normal"/>
+      </w:pPr>
+      <w:r>
+        <w:t xml:space="preserve">Se cumplió parcialmente, y solo sobre telemetría sintética. El generador es determinista, los conjuntos se reparten por sesión,</w:t>
       </w:r>
       <w:r>
         <w:t xml:space="preserve"> </w:t>
@@ -23610,7 +25100,7 @@
         <w:t xml:space="preserve"> </w:t>
       </w:r>
       <w:r>
-        <w:t xml:space="preserve">con el generador publicado, porque es anterior a su calibración, y lo que lo hace peligroso es que su ventanado y su reparto sí reproducen, de modo que una reconstrucción ingenua pasaría las pruebas midiendo otras señales; de ese conjunto salen la comparación de volumen que el capítulo 5 discute y el conjunto de evaluación independiente del redactor, todavía sin ejecutar, y no las cifras publicadas. Y cuatro pruebas y seis comprobaciones de tipado dependían de dos paquetes que se importaban sin estar declarados, lo que solo se vio al validar el procedimiento desde un clon limpio.</w:t>
+        <w:t xml:space="preserve">con el generador publicado, porque es anterior a su calibración, y lo que lo hace peligroso es que su ventanado y su reparto sí reproducen, de modo que una reconstrucción ingenua pasaría las pruebas midiendo otras señales; de ese conjunto salen la comparación de volumen que el capítulo 5 discute y el conjunto de evaluación independiente del redactor, que no llegó a ejecutarse, y no las cifras publicadas. Y cuatro pruebas y seis comprobaciones de tipado dependían de dos paquetes que se importaban sin estar declarados, lo que solo se vio al validar el procedimiento desde un clon limpio.</w:t>
       </w:r>
     </w:p>
     <w:p>
@@ -23721,26 +25211,68 @@
     </w:p>
     <w:p>
       <w:pPr>
-        <w:pStyle w:val="Normal"/>
-      </w:pPr>
-      <w:r>
-        <w:t xml:space="preserve">OE3, el diagnóstico a partir de la telemetría con la caracterización de su confianza y de sus señales, se cumplió parcialmente. Sobre validación, el bosque aleatorio alcanza una exactitud de 0,878 frente a 0,286 de la clase mayoritaria, y su confianza, infraconfiada en origen, queda calibrada, con un error de calibración que baja de 0,144 a 0,085. Con este volumen de datos el modelo temporal no aportó ventaja sobre el tabular, y la formulación original de la subpregunta, que la pedía, no se cumplió. La atribución describe con señales coherentes con el mecanismo la fuga de vacío, el termostato y la sonda; en la deriva del caudalímetro señala las correcciones de combustible y no el caudal, y en el fallo de encendido incluye entre sus seis señales principales cuatro que el mecanismo no justifica, aunque con menos peso que las declaradas. Dos de los errores del diagnóstico admiten una lectura más precisa desde la expresión efectiva del fallo: cinco de las catorce ventanas del termostato no contienen ninguna señal observable de él, y ninguna de las del fallo de encendido lo expresa por completo, de modo que parte de lo que el modelo no detecta es evidencia que no está.</w:t>
-      </w:r>
-    </w:p>
-    <w:p>
-      <w:pPr>
-        <w:pStyle w:val="Normal"/>
-      </w:pPr>
-      <w:r>
-        <w:t xml:space="preserve">OE4, la recuperación y la verificación de la evidencia, se cumplió parcialmente sobre los diecisiete casos anotados. Toda afirmación que el verificador admite conserva la observación que la origina y los fragmentos aplicables que superaron sus comprobaciones de soporte; si esas comprobaciones coinciden con un juicio independiente sobre lo que cada fragmento sostiene no se ha medido, porque el conjunto anotado no incluye las afirmaciones admisibles. Sin guía por código de avería, ninguna estrategia de recuperación encuentra el procedimiento relevante en todos los casos puntuados; guiada por el código asociado al diagnóstico, lo encuentra en los cinco, y ese resultado no cambió al corregir el índice documental y reejecutar. El modelo de lenguaje no cita nada que no se le haya entregado, pero cita fragmentos aplicables que el verificador no aceptó, y su adaptador se ajustó con ventanas que incluyen las de tres casos evaluados. Que las comprobaciones del verificador coincidan con lo que un fragmento sostiene de verdad no se ha medido de forma independiente.</w:t>
-      </w:r>
-    </w:p>
-    <w:p>
-      <w:pPr>
-        <w:pStyle w:val="Normal"/>
-      </w:pPr>
-      <w:r>
-        <w:t xml:space="preserve">OE5, el comportamiento integrado bajo las cuatro condiciones de evidencia, se cumplió parcialmente. Sobre las ejecuciones que debían terminar en abstención, nueve de tres ventanas bien diagnosticadas sin contar la condición con distractor y filtro, el sistema no explicó ninguna; una política que se abstuviera siempre obtendría el mismo cero, y lo que distingue al sistema es que, sobre los cinco casos con evidencia completa, explica tres. Las dos abstenciones innecesarias no tienen la misma causa: una procede solo de la confianza del modelo y la otra también de la falta de soporte documental. La abstención con evidencia retirada está determinada por la construcción de la condición; el contraste que pone a prueba el criterio es el de la evidencia parcial. El criterio que produce estas cifras se revisó dos veces sobre los mismos casos. La condición con distractor, con el filtro de motor activo, no añadía en ninguno de los tres fallos un distractor que la condición parcial no tuviera —la causa medida es que dos de las tres tenían la misma configuración que la parcial, no el filtro de motor— y</w:t>
+        <w:numPr>
+          <w:ilvl w:val="1"/>
+          <w:numId w:val="907"/>
+        </w:numPr>
+        <w:pStyle w:val="Ttulosubapartado"/>
+      </w:pPr>
+      <w:bookmarkStart w:id="163" w:name="_2c92354b528d7092e2e5b5fe6a55c9d3444ef8e"/>
+      <w:r>
+        <w:t xml:space="preserve">OE3 · Diagnóstico, confianza y señales que lo sostienen</w:t>
+      </w:r>
+      <w:bookmarkEnd w:id="163"/>
+    </w:p>
+    <w:p>
+      <w:pPr>
+        <w:pStyle w:val="Normal"/>
+      </w:pPr>
+      <w:r>
+        <w:t xml:space="preserve">Se cumplió parcialmente. Sobre validación, el bosque aleatorio alcanza una exactitud de 0,878 frente a 0,286 de la clase mayoritaria, y su confianza, infraconfiada en origen, queda calibrada, con un error de calibración que baja de 0,144 a 0,085. Con este volumen de datos el modelo temporal no aportó ventaja sobre el tabular, y la formulación original de la subpregunta, que la pedía, no se cumplió. La atribución describe con señales coherentes con el mecanismo la fuga de vacío, el termostato y la sonda; en la deriva del caudalímetro señala las correcciones de combustible y no el caudal, y en el fallo de encendido incluye entre sus seis señales principales cuatro que el mecanismo no justifica, aunque con menos peso que las declaradas. Dos de los errores del diagnóstico admiten una lectura más precisa desde la expresión efectiva del fallo: cinco de las catorce ventanas del termostato no contienen ninguna señal observable de él, y ninguna de las del fallo de encendido lo expresa por completo, de modo que parte de lo que el modelo no detecta es evidencia que no está.</w:t>
+      </w:r>
+    </w:p>
+    <w:p>
+      <w:pPr>
+        <w:numPr>
+          <w:ilvl w:val="1"/>
+          <w:numId w:val="907"/>
+        </w:numPr>
+        <w:pStyle w:val="Ttulosubapartado"/>
+      </w:pPr>
+      <w:bookmarkStart w:id="164" w:name="_204e438ce8602ed8c5955bf55a60edef982c916"/>
+      <w:r>
+        <w:t xml:space="preserve">OE4 · Recuperación y verificación de la evidencia</w:t>
+      </w:r>
+      <w:bookmarkEnd w:id="164"/>
+    </w:p>
+    <w:p>
+      <w:pPr>
+        <w:pStyle w:val="Normal"/>
+      </w:pPr>
+      <w:r>
+        <w:t xml:space="preserve">Se cumplió parcialmente, sobre los diecisiete casos anotados. Toda afirmación que el verificador admite conserva la observación que la origina y los fragmentos aplicables que superaron sus comprobaciones de soporte; si esas comprobaciones coinciden con un juicio independiente sobre lo que cada fragmento sostiene no se ha medido, porque el conjunto anotado no incluye las afirmaciones admisibles. Sin guía por código de avería, ninguna estrategia de recuperación encuentra el procedimiento relevante en todos los casos puntuados; guiada por el código asociado al diagnóstico, lo encuentra en los cinco, y ese resultado no cambió al corregir el índice documental y reejecutar. El modelo de lenguaje no cita nada que no se le haya entregado, pero cita fragmentos aplicables que el verificador no aceptó, y su adaptador se ajustó con ventanas que incluyen las de tres casos evaluados. Que las comprobaciones del verificador coincidan con lo que un fragmento sostiene de verdad no se ha medido de forma independiente.</w:t>
+      </w:r>
+    </w:p>
+    <w:p>
+      <w:pPr>
+        <w:numPr>
+          <w:ilvl w:val="1"/>
+          <w:numId w:val="907"/>
+        </w:numPr>
+        <w:pStyle w:val="Ttulosubapartado"/>
+      </w:pPr>
+      <w:bookmarkStart w:id="165" w:name="_2fad8aa7627bd63e1994181dcc2390c9523ee73"/>
+      <w:r>
+        <w:t xml:space="preserve">OE5 · Comportamiento integrado bajo cada condición de evidencia</w:t>
+      </w:r>
+      <w:bookmarkEnd w:id="165"/>
+    </w:p>
+    <w:p>
+      <w:pPr>
+        <w:pStyle w:val="Normal"/>
+      </w:pPr>
+      <w:r>
+        <w:t xml:space="preserve">Se cumplió parcialmente. Sobre las ejecuciones que debían terminar en abstención, nueve de tres ventanas bien diagnosticadas sin contar la condición con distractor y filtro, el sistema no explicó ninguna; una política que se abstuviera siempre obtendría el mismo cero, y lo que distingue al sistema es que, sobre los cinco casos con evidencia completa, explica tres. Las dos abstenciones innecesarias no tienen la misma causa: una procede solo de la confianza del modelo y la otra también de la falta de soporte documental. La abstención con evidencia retirada está determinada por la construcción de la condición; el contraste que pone a prueba el criterio es el de la evidencia parcial. El criterio que produce estas cifras se revisó dos veces sobre los mismos casos. La condición con distractor, con el filtro de motor activo, no añadía en ninguno de los tres fallos un distractor que la condición parcial no tuviera —la causa medida es que dos de las tres tenían la misma configuración que la parcial, no el filtro de motor— y</w:t>
       </w:r>
       <w:r>
         <w:t xml:space="preserve"> </w:t>
@@ -23788,6 +25320,20 @@
     </w:p>
     <w:p>
       <w:pPr>
+        <w:numPr>
+          <w:ilvl w:val="1"/>
+          <w:numId w:val="907"/>
+        </w:numPr>
+        <w:pStyle w:val="Ttulosubapartado"/>
+      </w:pPr>
+      <w:bookmarkStart w:id="166" w:name="_45b34389a8752bc935525e629af3a9cea947331"/>
+      <w:r>
+        <w:t xml:space="preserve">Lo que cada componente aporta</w:t>
+      </w:r>
+      <w:bookmarkEnd w:id="166"/>
+    </w:p>
+    <w:p>
+      <w:pPr>
         <w:pStyle w:val="Normal"/>
       </w:pPr>
       <w:r>
@@ -23799,71 +25345,21 @@
         <w:pStyle w:val="Normal"/>
       </w:pPr>
       <w:r>
-        <w:t xml:space="preserve">La segunda versión de la política de suficiencia, medida en los tres modos, no cambia ninguna de las diecisiete decisiones y mejora el control de aplicabilidad ante un diagnóstico incorrecto: en el escenario adverso deja de aceptar como soporte afirmaciones construidas para un diagnóstico equivocado. Se adoptará como canónica en la evaluación final, de modo que los resultados anteriores quedan bajo la política previa y la evaluación final bajo la nueva, cada uno con su registro.</w:t>
-      </w:r>
-    </w:p>
-    <w:p>
-      <w:pPr>
-        <w:pStyle w:val="Normal"/>
-      </w:pPr>
-      <w:r>
-        <w:t xml:space="preserve">En cuanto al objetivo general, la evaluación experimental del agente está hecha en parte. Sobre datos sintéticos de un vehículo, sobre ventanas bien diagnosticadas y sobre la partición de validación, los resultados indican que las afirmaciones que el verificador admite mantienen una correspondencia registrada con la observación y los fragmentos que las sostienen, y que el agente se abstiene cuando la evidencia documental falta o no sostiene lo que se afirma, sin haber explicado ninguno de los casos evaluados en los que debía abstenerse. Esa respuesta parcial no alcanza tres cosas que la pregunta de investigación también contiene. No alcanza a la explicación que redacta el modelo de lenguaje, cuya correspondencia con la evidencia verificada es más débil. No alcanza al rechazo de evidencia aparentemente pertinente pero no aplicable, que el diseño actual no permite interpretar. Y no alcanza al comportamiento ante un diagnóstico erróneo, examinado solo en un escenario de dos ventanas anterior a la corrección del índice. Con la regla fijada en el capítulo 4, esa situación corresponde a una pregunta parcialmente sostenida, calificación provisional que descansa en cifras de desarrollo sobre validación. Lo que la evaluación final añade, medida el 12 de octubre de 2026 sobre el conjunto de prueba y con la política de suficiencia ya corregida, es que el comportamiento se mantiene fuera de los casos con que el criterio se ajustó: ninguna de las catorce ejecuciones que debían terminar en abstención terminó en explicación, y la cobertura con evidencia completa fue de seis sobre diez. Con esos denominadores, el intervalo de Wilson al 95 % de la falsa confianza va de 0 a 0,215, un límite que depende del nivel de confianza elegido y del modelo estadístico empleado, y que supone una independencia entre ejecuciones que estas no tienen. Lo medido es que en esa muestra no ocurrió, no que no pueda ocurrir; la distancia entre las dos frases es la que separa una observación de una garantía operativa, y este trabajo solo tiene lo primero. La contribución de los componentes ya está medida con las ablaciones. El rediseño de la condición con distractor no formaba parte de esa evaluación final y</w:t>
-      </w:r>
-      <w:r>
-        <w:t xml:space="preserve"> </w:t>
-      </w:r>
-      <w:r>
-        <w:rPr>
-          <w:b/>
-          <w:bCs/>
-        </w:rPr>
-        <w:t xml:space="preserve">se ejecutó aparte, el 13 de octubre de 2026</w:t>
-      </w:r>
-      <w:r>
-        <w:t xml:space="preserve">, con los cuatro requisitos de alcanzabilidad comprobados antes de observar ningún veredicto. En los tres casos construidos el sistema se abstuvo, y el motivo registrado fue la insuficiencia de la evidencia y no la falta de confianza en el diagnóstico: las confianzas, entre 0,908 y 1,000, estaban por encima del umbral. El distractor llegó al verificador clasificado como plenamente aplicable —del motor correcto y con el código del fallo—, de modo que ni el filtro de motor ni el validador de aplicabilidad intervinieron: lo que rechazó la evidencia fue la comprobación de que el fragmento hablara de la señal observada. Con tres situaciones construidas, el resultado describe esas tres y</w:t>
-      </w:r>
-      <w:r>
-        <w:t xml:space="preserve"> </w:t>
-      </w:r>
-      <w:r>
-        <w:rPr>
-          <w:b/>
-          <w:bCs/>
-        </w:rPr>
-        <w:t xml:space="preserve">no estima ninguna tasa</w:t>
-      </w:r>
-      <w:r>
-        <w:t xml:space="preserve">; PI.4 pasa de no tener respuesta interpretable a tener una medición acotada a sus casos. La calificación de parcialmente sostenida no se mueve por ello: P1 la refuerza en PI.4 y el hallazgo sobre la fidelidad numérica de las explicaciones la debilita en PI.2. La Figura 6.2 reúne los cinco objetivos específicos con la evidencia que los sostiene y el estado en que quedan.</w:t>
-      </w:r>
-    </w:p>
-    <w:p>
-      <w:pPr>
-        <w:pStyle w:val="CitaLiteralAPA"/>
-      </w:pPr>
-      <w:r>
-        <w:rPr>
-          <w:b/>
-          <w:bCs/>
-        </w:rPr>
-        <w:t xml:space="preserve">Corrección del 13 de octubre de 2026.</w:t>
-      </w:r>
-      <w:r>
-        <w:t xml:space="preserve"> </w:t>
-      </w:r>
-      <w:r>
-        <w:t xml:space="preserve">Este párrafo decía antes: «queda como trabajo posterior: mientras no se haga, PI.4 seguirá sin poder interpretarse». El rediseño se ejecutó el 13 de octubre de 2026 con resultado publicado. Corrección</w:t>
-      </w:r>
-      <w:r>
-        <w:t xml:space="preserve"> </w:t>
-      </w:r>
-      <w:r>
-        <w:rPr>
-          <w:rStyle w:val="VerbatimChar"/>
-        </w:rPr>
-        <w:t xml:space="preserve">F-5</w:t>
-      </w:r>
-      <w:r>
-        <w:t xml:space="preserve">.</w:t>
+        <w:t xml:space="preserve">La segunda versión de la política de suficiencia, medida en los tres modos, no cambia ninguna de las diecisiete decisiones y mejora el control de aplicabilidad ante un diagnóstico incorrecto: en el escenario adverso deja de aceptar como soporte afirmaciones construidas para un diagnóstico equivocado. Se adoptó como canónica en la evaluación final del 12 de octubre de 2026, de modo que los resultados anteriores quedan bajo la política previa y la evaluación final bajo la nueva, cada uno con su registro.</w:t>
+      </w:r>
+    </w:p>
+    <w:p>
+      <w:pPr>
+        <w:pStyle w:val="Normal"/>
+      </w:pPr>
+      <w:r>
+        <w:t xml:space="preserve">Los cinco objetivos, con la evidencia que sostiene cada uno y el estado en que quedan, se reúnen en</w:t>
+      </w:r>
+      <w:r>
+        <w:t xml:space="preserve"> </w:t>
+      </w:r>
+      <w:r>
+        <w:t xml:space="preserve">la Figura 6.2.</w:t>
       </w:r>
     </w:p>
     <w:p>
@@ -23889,18 +25385,18 @@
           <wp:inline>
             <wp:extent cx="5361014" cy="3428235"/>
             <wp:effectExtent b="0" l="0" r="0" t="0"/>
-            <wp:docPr descr="Los cinco objetivos específicos, con los experimentos que los miden y su estado: OE1 cumplido y los otros cuatro cumplidos parcialmente." title="" id="157" name="Picture"/>
+            <wp:docPr descr="Los cinco objetivos específicos, con los experimentos que los miden y su estado: OE1 cumplido y los otros cuatro cumplidos parcialmente." title="" id="168" name="Picture"/>
             <a:graphic>
               <a:graphicData uri="http://schemas.openxmlformats.org/drawingml/2006/picture">
                 <pic:pic>
                   <pic:nvPicPr>
-                    <pic:cNvPr descr="../../artifacts/figures/memoria/FIG-6-02_objetivos_y_evidencia.png" id="158" name="Picture"/>
+                    <pic:cNvPr descr="../../artifacts/figures/memoria/FIG-6-02_objetivos_y_evidencia.png" id="169" name="Picture"/>
                     <pic:cNvPicPr>
                       <a:picLocks noChangeArrowheads="1" noChangeAspect="1"/>
                     </pic:cNvPicPr>
                   </pic:nvPicPr>
                   <pic:blipFill>
-                    <a:blip r:embed="rId156"/>
+                    <a:blip r:embed="rId167"/>
                     <a:stretch>
                       <a:fillRect/>
                     </a:stretch>
@@ -23997,11 +25493,398 @@
         </w:numPr>
         <w:pStyle w:val="TtuloApartado"/>
       </w:pPr>
-      <w:bookmarkStart w:id="159" w:name="_abc527d437527ea60fa9520fa4ad104aa094e74"/>
+      <w:bookmarkStart w:id="170" w:name="_c6c390915eec22efd04f927b9f0680a1fb845b8"/>
+      <w:r>
+        <w:t xml:space="preserve">Respuesta a la pregunta de investigación</w:t>
+      </w:r>
+      <w:bookmarkEnd w:id="170"/>
+    </w:p>
+    <w:p>
+      <w:pPr>
+        <w:pStyle w:val="Normal"/>
+      </w:pPr>
+      <w:r>
+        <w:t xml:space="preserve">La pregunta del capítulo 1 tiene seis partes, y conviene responderlas por separado antes de</w:t>
+      </w:r>
+      <w:r>
+        <w:t xml:space="preserve"> </w:t>
+      </w:r>
+      <w:r>
+        <w:t xml:space="preserve">calificar el conjunto. Todo lo que sigue se refiere a telemetría sintética de un vehículo y a</w:t>
+      </w:r>
+      <w:r>
+        <w:t xml:space="preserve"> </w:t>
+      </w:r>
+      <w:r>
+        <w:t xml:space="preserve">ventanas que el modelo diagnostica correctamente.</w:t>
+      </w:r>
+    </w:p>
+    <w:p>
+      <w:pPr>
+        <w:pStyle w:val="Normal"/>
+      </w:pPr>
+      <w:r>
+        <w:rPr>
+          <w:b/>
+          <w:bCs/>
+        </w:rPr>
+        <w:t xml:space="preserve">El diagnóstico a partir de la telemetría.</w:t>
+      </w:r>
+      <w:r>
+        <w:t xml:space="preserve"> </w:t>
+      </w:r>
+      <w:r>
+        <w:t xml:space="preserve">El bosque aleatorio alcanza 0,878 de exactitud sobre</w:t>
+      </w:r>
+      <w:r>
+        <w:t xml:space="preserve"> </w:t>
+      </w:r>
+      <w:r>
+        <w:t xml:space="preserve">validación, frente al 0,286 de la clase mayoritaria, con la confianza calibrada. Es suficiente para</w:t>
+      </w:r>
+      <w:r>
+        <w:t xml:space="preserve"> </w:t>
+      </w:r>
+      <w:r>
+        <w:t xml:space="preserve">que el resto del recorrido tenga sobre qué operar, y no alcanza a un modelo temporal: con este</w:t>
+      </w:r>
+      <w:r>
+        <w:t xml:space="preserve"> </w:t>
+      </w:r>
+      <w:r>
+        <w:t xml:space="preserve">volumen no aportó ventaja.</w:t>
+      </w:r>
+    </w:p>
+    <w:p>
+      <w:pPr>
+        <w:pStyle w:val="Normal"/>
+      </w:pPr>
+      <w:r>
+        <w:rPr>
+          <w:b/>
+          <w:bCs/>
+        </w:rPr>
+        <w:t xml:space="preserve">La trazabilidad de las afirmaciones.</w:t>
+      </w:r>
+      <w:r>
+        <w:t xml:space="preserve"> </w:t>
+      </w:r>
+      <w:r>
+        <w:t xml:space="preserve">Toda afirmación que el verificador admite conserva la</w:t>
+      </w:r>
+      <w:r>
+        <w:t xml:space="preserve"> </w:t>
+      </w:r>
+      <w:r>
+        <w:t xml:space="preserve">observación que la origina y los fragmentos que la sostienen, y cada comprobación queda registrada</w:t>
+      </w:r>
+      <w:r>
+        <w:t xml:space="preserve"> </w:t>
+      </w:r>
+      <w:r>
+        <w:t xml:space="preserve">por separado. La respuesta es afirmativa, con una precisión que importa: se cumple</w:t>
+      </w:r>
+      <w:r>
+        <w:t xml:space="preserve"> </w:t>
+      </w:r>
+      <w:r>
+        <w:rPr>
+          <w:b/>
+          <w:bCs/>
+        </w:rPr>
+        <w:t xml:space="preserve">por</w:t>
+      </w:r>
+      <w:r>
+        <w:rPr>
+          <w:b/>
+          <w:bCs/>
+        </w:rPr>
+        <w:t xml:space="preserve"> </w:t>
+      </w:r>
+      <w:r>
+        <w:rPr>
+          <w:b/>
+          <w:bCs/>
+        </w:rPr>
+        <w:t xml:space="preserve">construcción</w:t>
+      </w:r>
+      <w:r>
+        <w:t xml:space="preserve"> </w:t>
+      </w:r>
+      <w:r>
+        <w:t xml:space="preserve">del recorrido.</w:t>
+      </w:r>
+    </w:p>
+    <w:p>
+      <w:pPr>
+        <w:pStyle w:val="Normal"/>
+      </w:pPr>
+      <w:r>
+        <w:rPr>
+          <w:b/>
+          <w:bCs/>
+        </w:rPr>
+        <w:t xml:space="preserve">La verificación del soporte documental.</w:t>
+      </w:r>
+      <w:r>
+        <w:t xml:space="preserve"> </w:t>
+      </w:r>
+      <w:r>
+        <w:t xml:space="preserve">No está medida de forma independiente. Que los</w:t>
+      </w:r>
+      <w:r>
+        <w:t xml:space="preserve"> </w:t>
+      </w:r>
+      <w:r>
+        <w:t xml:space="preserve">fragmentos citados sostengan lo afirmado lo establecen las comprobaciones deterministas del propio</w:t>
+      </w:r>
+      <w:r>
+        <w:t xml:space="preserve"> </w:t>
+      </w:r>
+      <w:r>
+        <w:t xml:space="preserve">verificador; si coinciden con el juicio de un lector experto no se ha comprobado, porque el</w:t>
+      </w:r>
+      <w:r>
+        <w:t xml:space="preserve"> </w:t>
+      </w:r>
+      <w:r>
+        <w:t xml:space="preserve">conjunto anotado no incluye qué afirmaciones serían admisibles en cada caso. Es el vacío que el</w:t>
+      </w:r>
+      <w:r>
+        <w:t xml:space="preserve"> </w:t>
+      </w:r>
+      <w:r>
+        <w:t xml:space="preserve">capítulo 3 identificaba, y queda abordado y no medido.</w:t>
+      </w:r>
+    </w:p>
+    <w:p>
+      <w:pPr>
+        <w:pStyle w:val="Normal"/>
+      </w:pPr>
+      <w:r>
+        <w:rPr>
+          <w:b/>
+          <w:bCs/>
+        </w:rPr>
+        <w:t xml:space="preserve">La suficiencia de la evidencia.</w:t>
+      </w:r>
+      <w:r>
+        <w:t xml:space="preserve"> </w:t>
+      </w:r>
+      <w:r>
+        <w:t xml:space="preserve">El criterio distingue las tres situaciones que debía distinguir:</w:t>
+      </w:r>
+      <w:r>
+        <w:t xml:space="preserve"> </w:t>
+      </w:r>
+      <w:r>
+        <w:t xml:space="preserve">que no haya documentación, que la haya y no cubra lo afirmado, y que la cubra. La prueba más</w:t>
+      </w:r>
+      <w:r>
+        <w:t xml:space="preserve"> </w:t>
+      </w:r>
+      <w:r>
+        <w:t xml:space="preserve">informativa no es la de la evidencia retirada, que produce la abstención por construcción, sino la</w:t>
+      </w:r>
+      <w:r>
+        <w:t xml:space="preserve"> </w:t>
+      </w:r>
+      <w:r>
+        <w:t xml:space="preserve">de la evidencia parcial, donde hay entre cinco y siete fragmentos aplicables y el sistema se</w:t>
+      </w:r>
+      <w:r>
+        <w:t xml:space="preserve"> </w:t>
+      </w:r>
+      <w:r>
+        <w:t xml:space="preserve">abstiene igual.</w:t>
+      </w:r>
+    </w:p>
+    <w:p>
+      <w:pPr>
+        <w:pStyle w:val="Normal"/>
+      </w:pPr>
+      <w:r>
+        <w:rPr>
+          <w:b/>
+          <w:bCs/>
+        </w:rPr>
+        <w:t xml:space="preserve">La abstención.</w:t>
+      </w:r>
+      <w:r>
+        <w:t xml:space="preserve"> </w:t>
+      </w:r>
+      <w:r>
+        <w:t xml:space="preserve">Sobre el conjunto de prueba, ninguna de las catorce ejecuciones que debían</w:t>
+      </w:r>
+      <w:r>
+        <w:t xml:space="preserve"> </w:t>
+      </w:r>
+      <w:r>
+        <w:t xml:space="preserve">terminar en abstención terminó en explicación, y la cobertura con evidencia completa fue de seis</w:t>
+      </w:r>
+      <w:r>
+        <w:t xml:space="preserve"> </w:t>
+      </w:r>
+      <w:r>
+        <w:t xml:space="preserve">sobre diez. El sistema no se abstiene siempre, que es el desenlace trivial que habría refutado el</w:t>
+      </w:r>
+      <w:r>
+        <w:t xml:space="preserve"> </w:t>
+      </w:r>
+      <w:r>
+        <w:t xml:space="preserve">resultado. El intervalo de Wilson al 95 % de esa falsa confianza nula llega hasta 0,215, y las</w:t>
+      </w:r>
+      <w:r>
+        <w:t xml:space="preserve"> </w:t>
+      </w:r>
+      <w:r>
+        <w:t xml:space="preserve">catorce ejecuciones proceden de siete ventanas, de modo que el intervalo real es más ancho: lo</w:t>
+      </w:r>
+      <w:r>
+        <w:t xml:space="preserve"> </w:t>
+      </w:r>
+      <w:r>
+        <w:t xml:space="preserve">medido es que en esa muestra no ocurrió, no que no pueda ocurrir.</w:t>
+      </w:r>
+    </w:p>
+    <w:p>
+      <w:pPr>
+        <w:pStyle w:val="Normal"/>
+      </w:pPr>
+      <w:r>
+        <w:rPr>
+          <w:b/>
+          <w:bCs/>
+        </w:rPr>
+        <w:t xml:space="preserve">Las limitaciones de la explicación generada.</w:t>
+      </w:r>
+      <w:r>
+        <w:t xml:space="preserve"> </w:t>
+      </w:r>
+      <w:r>
+        <w:t xml:space="preserve">Aquí la respuesta se debilita. El modelo de</w:t>
+      </w:r>
+      <w:r>
+        <w:t xml:space="preserve"> </w:t>
+      </w:r>
+      <w:r>
+        <w:t xml:space="preserve">lenguaje respeta el veredicto y no cita nada que no haya recibido, pero cita fragmentos que el</w:t>
+      </w:r>
+      <w:r>
+        <w:t xml:space="preserve"> </w:t>
+      </w:r>
+      <w:r>
+        <w:t xml:space="preserve">verificador no aceptó, y siete de sus treinta y cinco salidas contienen al menos una cifra que el</w:t>
+      </w:r>
+      <w:r>
+        <w:t xml:space="preserve"> </w:t>
+      </w:r>
+      <w:r>
+        <w:t xml:space="preserve">verificador no produjo. Ninguna de las tasas cambia por ello, porque las produce el verificador</w:t>
+      </w:r>
+      <w:r>
+        <w:t xml:space="preserve"> </w:t>
+      </w:r>
+      <w:r>
+        <w:t xml:space="preserve">determinista; lo que no está garantizado es que el texto que el usuario lee diga los números que el</w:t>
+      </w:r>
+      <w:r>
+        <w:t xml:space="preserve"> </w:t>
+      </w:r>
+      <w:r>
+        <w:t xml:space="preserve">sistema calculó.</w:t>
+      </w:r>
+    </w:p>
+    <w:p>
+      <w:pPr>
+        <w:pStyle w:val="Normal"/>
+      </w:pPr>
+      <w:r>
+        <w:t xml:space="preserve">Con la regla que el capítulo 4 fijó, la respuesta a la pregunta de investigación es</w:t>
+      </w:r>
+      <w:r>
+        <w:t xml:space="preserve"> </w:t>
+      </w:r>
+      <w:r>
+        <w:rPr>
+          <w:b/>
+          <w:bCs/>
+        </w:rPr>
+        <w:t xml:space="preserve">parcialmente</w:t>
+      </w:r>
+      <w:r>
+        <w:rPr>
+          <w:b/>
+          <w:bCs/>
+        </w:rPr>
+        <w:t xml:space="preserve"> </w:t>
+      </w:r>
+      <w:r>
+        <w:rPr>
+          <w:b/>
+          <w:bCs/>
+        </w:rPr>
+        <w:t xml:space="preserve">sostenida</w:t>
+      </w:r>
+      <w:r>
+        <w:t xml:space="preserve">. La calificación descansa en que tres de las seis partes tienen medición sobre el</w:t>
+      </w:r>
+      <w:r>
+        <w:t xml:space="preserve"> </w:t>
+      </w:r>
+      <w:r>
+        <w:t xml:space="preserve">conjunto de prueba, una se cumple por construcción, una está medida sobre tres casos construidos y</w:t>
+      </w:r>
+      <w:r>
+        <w:t xml:space="preserve"> </w:t>
+      </w:r>
+      <w:r>
+        <w:t xml:space="preserve">la última señala un defecto no resuelto. El rediseño de la condición con distractor la refuerza en</w:t>
+      </w:r>
+      <w:r>
+        <w:t xml:space="preserve"> </w:t>
+      </w:r>
+      <w:r>
+        <w:t xml:space="preserve">su parte de evidencia impertinente —en los tres casos el sistema se abstuvo, y el motivo registrado</w:t>
+      </w:r>
+      <w:r>
+        <w:t xml:space="preserve"> </w:t>
+      </w:r>
+      <w:r>
+        <w:t xml:space="preserve">fue la insuficiencia de la evidencia y no la baja confianza, con confianzas entre 0,908 y 1,000— y</w:t>
+      </w:r>
+      <w:r>
+        <w:t xml:space="preserve"> </w:t>
+      </w:r>
+      <w:r>
+        <w:t xml:space="preserve">el hallazgo sobre la fidelidad numérica la debilita en su parte de trazabilidad. Las dos cosas se</w:t>
+      </w:r>
+      <w:r>
+        <w:t xml:space="preserve"> </w:t>
+      </w:r>
+      <w:r>
+        <w:t xml:space="preserve">compensan en la calificación y no se anulan: son defectos y méritos distintos, y conviene no</w:t>
+      </w:r>
+      <w:r>
+        <w:t xml:space="preserve"> </w:t>
+      </w:r>
+      <w:r>
+        <w:t xml:space="preserve">sumarlos.</w:t>
+      </w:r>
+    </w:p>
+    <w:p>
+      <w:pPr>
+        <w:numPr>
+          <w:ilvl w:val="0"/>
+          <w:numId w:val="907"/>
+        </w:numPr>
+        <w:pStyle w:val="TtuloApartado"/>
+      </w:pPr>
+      <w:bookmarkStart w:id="171" w:name="_abc527d437527ea60fa9520fa4ad104aa094e74"/>
       <w:r>
         <w:t xml:space="preserve">Contribuciones del trabajo</w:t>
       </w:r>
-      <w:bookmarkEnd w:id="159"/>
+      <w:bookmarkEnd w:id="171"/>
     </w:p>
     <w:p>
       <w:pPr>
@@ -24031,11 +25914,11 @@
         </w:numPr>
         <w:pStyle w:val="Ttulosubapartado"/>
       </w:pPr>
-      <w:bookmarkStart w:id="160" w:name="_f18aa2cc1edcc17b466673d0ef3785ca041ac66"/>
+      <w:bookmarkStart w:id="172" w:name="_f18aa2cc1edcc17b466673d0ef3785ca041ac66"/>
       <w:r>
         <w:t xml:space="preserve">Contribuciones técnicas</w:t>
       </w:r>
-      <w:bookmarkEnd w:id="160"/>
+      <w:bookmarkEnd w:id="172"/>
     </w:p>
     <w:p>
       <w:pPr>
@@ -24143,11 +26026,11 @@
         </w:numPr>
         <w:pStyle w:val="Ttulosubapartado"/>
       </w:pPr>
-      <w:bookmarkStart w:id="161" w:name="_858a404ef0ad9b07b3f0e1c4cf6aaa4d1312966"/>
+      <w:bookmarkStart w:id="173" w:name="_858a404ef0ad9b07b3f0e1c4cf6aaa4d1312966"/>
       <w:r>
         <w:t xml:space="preserve">Contribuciones experimentales</w:t>
       </w:r>
-      <w:bookmarkEnd w:id="161"/>
+      <w:bookmarkEnd w:id="173"/>
     </w:p>
     <w:p>
       <w:pPr>
@@ -24434,11 +26317,11 @@
         </w:numPr>
         <w:pStyle w:val="Ttulosubapartado"/>
       </w:pPr>
-      <w:bookmarkStart w:id="162" w:name="_9151abc5c5a6a374b306237e7747b9d162ea641"/>
+      <w:bookmarkStart w:id="174" w:name="_9151abc5c5a6a374b306237e7747b9d162ea641"/>
       <w:r>
         <w:t xml:space="preserve">Contribución metodológica, complementaria y acotada</w:t>
       </w:r>
-      <w:bookmarkEnd w:id="162"/>
+      <w:bookmarkEnd w:id="174"/>
     </w:p>
     <w:p>
       <w:pPr>
@@ -24704,11 +26587,11 @@
         </w:numPr>
         <w:pStyle w:val="Ttulosubapartado"/>
       </w:pPr>
-      <w:bookmarkStart w:id="163" w:name="_0eb85088bab5c5a235e713ea5e681d5a93db4d7"/>
+      <w:bookmarkStart w:id="175" w:name="_0eb85088bab5c5a235e713ea5e681d5a93db4d7"/>
       <w:r>
         <w:t xml:space="preserve">Limitaciones de las contribuciones</w:t>
       </w:r>
-      <w:bookmarkEnd w:id="163"/>
+      <w:bookmarkEnd w:id="175"/>
     </w:p>
     <w:p>
       <w:pPr>
@@ -24950,11 +26833,11 @@
         </w:numPr>
         <w:pStyle w:val="TtuloApartado"/>
       </w:pPr>
-      <w:bookmarkStart w:id="164" w:name="_limitaciones"/>
+      <w:bookmarkStart w:id="176" w:name="_limitaciones"/>
       <w:r>
         <w:t xml:space="preserve">Limitaciones</w:t>
       </w:r>
-      <w:bookmarkEnd w:id="164"/>
+      <w:bookmarkEnd w:id="176"/>
     </w:p>
     <w:p>
       <w:pPr>
@@ -25033,18 +26916,18 @@
           <wp:inline>
             <wp:extent cx="5364072" cy="4718793"/>
             <wp:effectExtent b="0" l="0" r="0" t="0"/>
-            <wp:docPr descr="Plano de falsa confianza contra abstención innecesaria: el verificador queda en 0 de 9 y 2 de 5; abstenerse siempre, en 0 de 9 y 5 de 5; explicar siempre que el modelo confía, en 9 de 9 y 2 de 5." title="" id="166" name="Picture"/>
+            <wp:docPr descr="Plano de falsa confianza contra abstención innecesaria: el verificador queda en 0 de 9 y 2 de 5; abstenerse siempre, en 0 de 9 y 5 de 5; explicar siempre que el modelo confía, en 9 de 9 y 2 de 5." title="" id="178" name="Picture"/>
             <a:graphic>
               <a:graphicData uri="http://schemas.openxmlformats.org/drawingml/2006/picture">
                 <pic:pic>
                   <pic:nvPicPr>
-                    <pic:cNvPr descr="../../artifacts/figures/memoria/FIG-6-03_compromiso_cobertura_abstencion.png" id="167" name="Picture"/>
+                    <pic:cNvPr descr="../../artifacts/figures/memoria/FIG-6-03_compromiso_cobertura_abstencion.png" id="179" name="Picture"/>
                     <pic:cNvPicPr>
                       <a:picLocks noChangeArrowheads="1" noChangeAspect="1"/>
                     </pic:cNvPicPr>
                   </pic:nvPicPr>
                   <pic:blipFill>
-                    <a:blip r:embed="rId165"/>
+                    <a:blip r:embed="rId177"/>
                     <a:stretch>
                       <a:fillRect/>
                     </a:stretch>
@@ -25199,11 +27082,11 @@
         </w:numPr>
         <w:pStyle w:val="TtuloApartado"/>
       </w:pPr>
-      <w:bookmarkStart w:id="168" w:name="_prospectiva"/>
+      <w:bookmarkStart w:id="180" w:name="_prospectiva"/>
       <w:r>
         <w:t xml:space="preserve">Prospectiva</w:t>
       </w:r>
-      <w:bookmarkEnd w:id="168"/>
+      <w:bookmarkEnd w:id="180"/>
     </w:p>
     <w:p>
       <w:pPr>
@@ -25269,11 +27152,11 @@
         </w:numPr>
         <w:pStyle w:val="TtuloApartado"/>
       </w:pPr>
-      <w:bookmarkStart w:id="169" w:name="_aa4c6f09aa999eafce77a8153cd11976f457860"/>
+      <w:bookmarkStart w:id="181" w:name="_aa4c6f09aa999eafce77a8153cd11976f457860"/>
       <w:r>
         <w:t xml:space="preserve">Consideraciones finales</w:t>
       </w:r>
-      <w:bookmarkEnd w:id="169"/>
+      <w:bookmarkEnd w:id="181"/>
     </w:p>
     <w:p>
       <w:pPr>
@@ -25303,11 +27186,11 @@
       <w:pPr>
         <w:pStyle w:val="Ttulo1"/>
       </w:pPr>
-      <w:bookmarkStart w:id="170" w:name="_bibliografía"/>
+      <w:bookmarkStart w:id="182" w:name="_bibliografía"/>
       <w:r>
         <w:t xml:space="preserve">Bibliografía</w:t>
       </w:r>
-      <w:bookmarkEnd w:id="170"/>
+      <w:bookmarkEnd w:id="182"/>
     </w:p>
     <w:p>
       <w:pPr>
@@ -26171,11 +28054,11 @@
       <w:pPr>
         <w:pStyle w:val="Ttulo1"/>
       </w:pPr>
-      <w:bookmarkStart w:id="171" w:name="_anexos"/>
+      <w:bookmarkStart w:id="183" w:name="_anexos"/>
       <w:r>
         <w:t xml:space="preserve">Anexos</w:t>
       </w:r>
-      <w:bookmarkEnd w:id="171"/>
+      <w:bookmarkEnd w:id="183"/>
     </w:p>
     <w:p>
       <w:pPr>
@@ -26274,11 +28157,11 @@
       <w:pPr>
         <w:pStyle w:val="Ttulo1"/>
       </w:pPr>
-      <w:bookmarkStart w:id="172" w:name="_5082f3c942e6bfb1fda2504becaff3627eadee1"/>
+      <w:bookmarkStart w:id="184" w:name="_5082f3c942e6bfb1fda2504becaff3627eadee1"/>
       <w:r>
         <w:t xml:space="preserve">Anexo A · Arquitectura y datos experimentales</w:t>
       </w:r>
-      <w:bookmarkEnd w:id="172"/>
+      <w:bookmarkEnd w:id="184"/>
     </w:p>
     <w:p>
       <w:pPr>
@@ -26340,11 +28223,11 @@
         </w:numPr>
         <w:pStyle w:val="TtuloApartado"/>
       </w:pPr>
-      <w:bookmarkStart w:id="173" w:name="_346125ca19ecd2944f51dd8524395bede94f04f"/>
+      <w:bookmarkStart w:id="185" w:name="_346125ca19ecd2944f51dd8524395bede94f04f"/>
       <w:r>
         <w:t xml:space="preserve">A.1 · La arquitectura, en una línea por etapa</w:t>
       </w:r>
-      <w:bookmarkEnd w:id="173"/>
+      <w:bookmarkEnd w:id="185"/>
     </w:p>
     <w:p>
       <w:pPr>
@@ -26779,11 +28662,11 @@
         </w:numPr>
         <w:pStyle w:val="TtuloApartado"/>
       </w:pPr>
-      <w:bookmarkStart w:id="174" w:name="_8667d1e0b9d498a4cfddb1f1d3481e29df04289"/>
+      <w:bookmarkStart w:id="186" w:name="_8667d1e0b9d498a4cfddb1f1d3481e29df04289"/>
       <w:r>
         <w:t xml:space="preserve">A.2 · Las doce señales OBD-II</w:t>
       </w:r>
-      <w:bookmarkEnd w:id="174"/>
+      <w:bookmarkEnd w:id="186"/>
     </w:p>
     <w:p>
       <w:pPr>
@@ -27489,11 +29372,11 @@
         </w:numPr>
         <w:pStyle w:val="TtuloApartado"/>
       </w:pPr>
-      <w:bookmarkStart w:id="175" w:name="_9c75383ba58c1cde92da93b11502cc9c7531986"/>
+      <w:bookmarkStart w:id="187" w:name="_9c75383ba58c1cde92da93b11502cc9c7531986"/>
       <w:r>
         <w:t xml:space="preserve">A.3 · Las cinco condiciones de fallo</w:t>
       </w:r>
-      <w:bookmarkEnd w:id="175"/>
+      <w:bookmarkEnd w:id="187"/>
     </w:p>
     <w:p>
       <w:pPr>
@@ -28056,11 +29939,11 @@
         </w:numPr>
         <w:pStyle w:val="TtuloApartado"/>
       </w:pPr>
-      <w:bookmarkStart w:id="176" w:name="_657486341536a495a6da5c96d73aa0960eb5ee7"/>
+      <w:bookmarkStart w:id="188" w:name="_657486341536a495a6da5c96d73aa0960eb5ee7"/>
       <w:r>
         <w:t xml:space="preserve">A.4 · La calibración contra el manual de taller</w:t>
       </w:r>
-      <w:bookmarkEnd w:id="176"/>
+      <w:bookmarkEnd w:id="188"/>
     </w:p>
     <w:p>
       <w:pPr>
@@ -28395,11 +30278,11 @@
         </w:numPr>
         <w:pStyle w:val="TtuloApartado"/>
       </w:pPr>
-      <w:bookmarkStart w:id="177" w:name="_3b3805a77353db1de84b04a9b6ee9aa5706318b"/>
+      <w:bookmarkStart w:id="189" w:name="_3b3805a77353db1de84b04a9b6ee9aa5706318b"/>
       <w:r>
         <w:t xml:space="preserve">A.5 · Los tres conjuntos, y cuál se puede reconstruir</w:t>
       </w:r>
-      <w:bookmarkEnd w:id="177"/>
+      <w:bookmarkEnd w:id="189"/>
     </w:p>
     <w:p>
       <w:pPr>
@@ -28935,11 +30818,11 @@
         </w:numPr>
         <w:pStyle w:val="TtuloApartado"/>
       </w:pPr>
-      <w:bookmarkStart w:id="178" w:name="_f4952d2743fd56100637acd1cb039ea6b96f53d"/>
+      <w:bookmarkStart w:id="190" w:name="_f4952d2743fd56100637acd1cb039ea6b96f53d"/>
       <w:r>
         <w:t xml:space="preserve">A.6 · La señal testigo de cada condición</w:t>
       </w:r>
-      <w:bookmarkEnd w:id="178"/>
+      <w:bookmarkEnd w:id="190"/>
     </w:p>
     <w:p>
       <w:pPr>
@@ -28978,18 +30861,18 @@
           <wp:inline>
             <wp:extent cx="5397500" cy="6870198"/>
             <wp:effectExtent b="0" l="0" r="0" t="0"/>
-            <wp:docPr descr="Cinco paneles, uno por condición: antes de la marca de entrada del fallo las dos series coinciden exactamente, y la divergencia posterior es el efecto de la condición." title="" id="180" name="Picture"/>
+            <wp:docPr descr="Cinco paneles, uno por condición: antes de la marca de entrada del fallo las dos series coinciden exactamente, y la divergencia posterior es el efecto de la condición." title="" id="192" name="Picture"/>
             <a:graphic>
               <a:graphicData uri="http://schemas.openxmlformats.org/drawingml/2006/picture">
                 <pic:pic>
                   <pic:nvPicPr>
-                    <pic:cNvPr descr="../../artifacts/figures/memoria/FIG-A-01_series_normal_vs_fallo.png" id="181" name="Picture"/>
+                    <pic:cNvPr descr="../../artifacts/figures/memoria/FIG-A-01_series_normal_vs_fallo.png" id="193" name="Picture"/>
                     <pic:cNvPicPr>
                       <a:picLocks noChangeArrowheads="1" noChangeAspect="1"/>
                     </pic:cNvPicPr>
                   </pic:nvPicPr>
                   <pic:blipFill>
-                    <a:blip r:embed="rId179"/>
+                    <a:blip r:embed="rId191"/>
                     <a:stretch>
                       <a:fillRect/>
                     </a:stretch>
@@ -29215,11 +31098,11 @@
         </w:numPr>
         <w:pStyle w:val="TtuloApartado"/>
       </w:pPr>
-      <w:bookmarkStart w:id="182" w:name="_0cd64653c162df5921d3e22283b02d9be08e4fb"/>
+      <w:bookmarkStart w:id="194" w:name="_0cd64653c162df5921d3e22283b02d9be08e4fb"/>
       <w:r>
         <w:t xml:space="preserve">A.7 · La misma comparación, ahora sobre el conjunto canónico</w:t>
       </w:r>
-      <w:bookmarkEnd w:id="182"/>
+      <w:bookmarkEnd w:id="194"/>
     </w:p>
     <w:p>
       <w:pPr>
@@ -29298,18 +31181,18 @@
           <wp:inline>
             <wp:extent cx="5364072" cy="6553709"/>
             <wp:effectExtent b="0" l="0" r="0" t="0"/>
-            <wp:docPr descr="Cinco paneles, uno por condición, cada uno con dos series superpuestas: la sesión con el fallo y la misma sesión sin él. Antes de la marca de entrada las dos coinciden exactamente. Después, el ajuste a largo plazo se separa en la fuga de vacío y en la deriva del caudalímetro, la temperatura del refrigerante se estanca en el termostato, la oscilación de la sonda se amortigua hasta una banda estrecha, y en el fallo de encendido las dos series siguen coincidiendo salvo en dieciséis muestras." title="" id="184" name="Picture"/>
+            <wp:docPr descr="Cinco paneles, uno por condición, cada uno con dos series superpuestas: la sesión con el fallo y la misma sesión sin él. Antes de la marca de entrada las dos coinciden exactamente. Después, el ajuste a largo plazo se separa en la fuga de vacío y en la deriva del caudalímetro, la temperatura del refrigerante se estanca en el termostato, la oscilación de la sonda se amortigua hasta una banda estrecha, y en el fallo de encendido las dos series siguen coincidiendo salvo en dieciséis muestras." title="" id="196" name="Picture"/>
             <a:graphic>
               <a:graphicData uri="http://schemas.openxmlformats.org/drawingml/2006/picture">
                 <pic:pic>
                   <pic:nvPicPr>
-                    <pic:cNvPr descr="../../artifacts/figures/memoria/FIG-A-02_pareja_contrafactual.png" id="185" name="Picture"/>
+                    <pic:cNvPr descr="../../artifacts/figures/memoria/FIG-A-02_pareja_contrafactual.png" id="197" name="Picture"/>
                     <pic:cNvPicPr>
                       <a:picLocks noChangeArrowheads="1" noChangeAspect="1"/>
                     </pic:cNvPicPr>
                   </pic:nvPicPr>
                   <pic:blipFill>
-                    <a:blip r:embed="rId183"/>
+                    <a:blip r:embed="rId195"/>
                     <a:stretch>
                       <a:fillRect/>
                     </a:stretch>
@@ -29687,11 +31570,11 @@
       <w:pPr>
         <w:pStyle w:val="Ttulo1"/>
       </w:pPr>
-      <w:bookmarkStart w:id="186" w:name="_45e509d14ce2f8e03d3f13cfd8915ae0f578989"/>
+      <w:bookmarkStart w:id="198" w:name="_45e509d14ce2f8e03d3f13cfd8915ae0f578989"/>
       <w:r>
         <w:t xml:space="preserve">Anexo B · Evidencia experimental complementaria</w:t>
       </w:r>
-      <w:bookmarkEnd w:id="186"/>
+      <w:bookmarkEnd w:id="198"/>
     </w:p>
     <w:p>
       <w:pPr>
@@ -29755,11 +31638,11 @@
         </w:numPr>
         <w:pStyle w:val="TtuloApartado"/>
       </w:pPr>
-      <w:bookmarkStart w:id="187" w:name="_a39c305f8452d34f67a0c3b120991d9a9cce91f"/>
+      <w:bookmarkStart w:id="199" w:name="_a39c305f8452d34f67a0c3b120991d9a9cce91f"/>
       <w:r>
         <w:t xml:space="preserve">B.1 · Qué estatuto tiene cada resultado</w:t>
       </w:r>
-      <w:bookmarkEnd w:id="187"/>
+      <w:bookmarkEnd w:id="199"/>
     </w:p>
     <w:p>
       <w:pPr>
@@ -30179,11 +32062,11 @@
         </w:numPr>
         <w:pStyle w:val="TtuloApartado"/>
       </w:pPr>
-      <w:bookmarkStart w:id="188" w:name="_c9c10af7f2dcaca9913c8b4f523ceb3bb4cc99c"/>
+      <w:bookmarkStart w:id="200" w:name="_c9c10af7f2dcaca9913c8b4f523ceb3bb4cc99c"/>
       <w:r>
         <w:t xml:space="preserve">B.2 · El rendimiento por condición de los dos modelos</w:t>
       </w:r>
-      <w:bookmarkEnd w:id="188"/>
+      <w:bookmarkEnd w:id="200"/>
     </w:p>
     <w:p>
       <w:pPr>
@@ -30222,18 +32105,18 @@
           <wp:inline>
             <wp:extent cx="5351839" cy="4718793"/>
             <wp:effectExtent b="0" l="0" r="0" t="0"/>
-            <wp:docPr descr="Dos paneles: a la izquierda el F1 de cada condición para el bosque y la red; a la derecha su diferencia, con la red ganando solo en el termostato por 0,032 y perdiendo en las otras cinco, hasta 0,167 en el fallo de encendido." title="" id="190" name="Picture"/>
+            <wp:docPr descr="Dos paneles: a la izquierda el F1 de cada condición para el bosque y la red; a la derecha su diferencia, con la red ganando solo en el termostato por 0,032 y perdiendo en las otras cinco, hasta 0,167 en el fallo de encendido." title="" id="202" name="Picture"/>
             <a:graphic>
               <a:graphicData uri="http://schemas.openxmlformats.org/drawingml/2006/picture">
                 <pic:pic>
                   <pic:nvPicPr>
-                    <pic:cNvPr descr="../../artifacts/figures/memoria/FIG-B-01_f1_por_clase.png" id="191" name="Picture"/>
+                    <pic:cNvPr descr="../../artifacts/figures/memoria/FIG-B-01_f1_por_clase.png" id="203" name="Picture"/>
                     <pic:cNvPicPr>
                       <a:picLocks noChangeArrowheads="1" noChangeAspect="1"/>
                     </pic:cNvPicPr>
                   </pic:nvPicPr>
                   <pic:blipFill>
-                    <a:blip r:embed="rId189"/>
+                    <a:blip r:embed="rId201"/>
                     <a:stretch>
                       <a:fillRect/>
                     </a:stretch>
@@ -30872,11 +32755,11 @@
         </w:numPr>
         <w:pStyle w:val="TtuloApartado"/>
       </w:pPr>
-      <w:bookmarkStart w:id="192" w:name="_efd196228a47300a2db9af74479686f4d854794"/>
+      <w:bookmarkStart w:id="204" w:name="_efd196228a47300a2db9af74479686f4d854794"/>
       <w:r>
         <w:t xml:space="preserve">B.3 · Dónde se apoya el modelo, condición a condición</w:t>
       </w:r>
-      <w:bookmarkEnd w:id="192"/>
+      <w:bookmarkEnd w:id="204"/>
     </w:p>
     <w:p>
       <w:pPr>
@@ -31315,11 +33198,11 @@
         </w:numPr>
         <w:pStyle w:val="TtuloApartado"/>
       </w:pPr>
-      <w:bookmarkStart w:id="193" w:name="_61081aab223e9317eb772ed20d287ada9f7496b"/>
+      <w:bookmarkStart w:id="205" w:name="_61081aab223e9317eb772ed20d287ada9f7496b"/>
       <w:r>
         <w:t xml:space="preserve">B.4 · El barrido del umbral de suficiencia</w:t>
       </w:r>
-      <w:bookmarkEnd w:id="193"/>
+      <w:bookmarkEnd w:id="205"/>
     </w:p>
     <w:p>
       <w:pPr>
@@ -31456,11 +33339,11 @@
         </w:numPr>
         <w:pStyle w:val="TtuloApartado"/>
       </w:pPr>
-      <w:bookmarkStart w:id="194" w:name="_50d858f85cf7555200468b2bb49abb9249698c3"/>
+      <w:bookmarkStart w:id="206" w:name="_50d858f85cf7555200468b2bb49abb9249698c3"/>
       <w:r>
         <w:t xml:space="preserve">B.5 · Las cinco aperturas del conjunto de prueba</w:t>
       </w:r>
-      <w:bookmarkEnd w:id="194"/>
+      <w:bookmarkEnd w:id="206"/>
     </w:p>
     <w:p>
       <w:pPr>
@@ -31807,11 +33690,11 @@
         </w:numPr>
         <w:pStyle w:val="TtuloApartado"/>
       </w:pPr>
-      <w:bookmarkStart w:id="195" w:name="_854f7bc650c45e01dd4fb07419e14d27e37c41b"/>
+      <w:bookmarkStart w:id="207" w:name="_854f7bc650c45e01dd4fb07419e14d27e37c41b"/>
       <w:r>
         <w:t xml:space="preserve">B.6 · Qué separa las dos averías de mezcla pobre</w:t>
       </w:r>
-      <w:bookmarkEnd w:id="195"/>
+      <w:bookmarkEnd w:id="207"/>
     </w:p>
     <w:p>
       <w:pPr>
@@ -32547,11 +34430,11 @@
       <w:pPr>
         <w:pStyle w:val="Ttulo1"/>
       </w:pPr>
-      <w:bookmarkStart w:id="196" w:name="_abcaf046201c9c68fccc55a6b785525beec9806"/>
+      <w:bookmarkStart w:id="208" w:name="_abcaf046201c9c68fccc55a6b785525beec9806"/>
       <w:r>
         <w:t xml:space="preserve">Anexo C · Reproducibilidad</w:t>
       </w:r>
-      <w:bookmarkEnd w:id="196"/>
+      <w:bookmarkEnd w:id="208"/>
     </w:p>
     <w:p>
       <w:pPr>
@@ -32601,11 +34484,11 @@
         </w:numPr>
         <w:pStyle w:val="TtuloApartado"/>
       </w:pPr>
-      <w:bookmarkStart w:id="197" w:name="_662edf990d91f7466776c3c6928c8a88c5ceeda"/>
+      <w:bookmarkStart w:id="209" w:name="_662edf990d91f7466776c3c6928c8a88c5ceeda"/>
       <w:r>
         <w:t xml:space="preserve">C.1 · Qué hace falta</w:t>
       </w:r>
-      <w:bookmarkEnd w:id="197"/>
+      <w:bookmarkEnd w:id="209"/>
     </w:p>
     <w:p>
       <w:pPr>
@@ -32812,11 +34695,11 @@
         </w:numPr>
         <w:pStyle w:val="TtuloApartado"/>
       </w:pPr>
-      <w:bookmarkStart w:id="198" w:name="_bd0629c71b4220a71a686c3b1b3abcf1c357ac4"/>
+      <w:bookmarkStart w:id="210" w:name="_bd0629c71b4220a71a686c3b1b3abcf1c357ac4"/>
       <w:r>
         <w:t xml:space="preserve">C.2 · Las cinco órdenes</w:t>
       </w:r>
-      <w:bookmarkEnd w:id="198"/>
+      <w:bookmarkEnd w:id="210"/>
     </w:p>
     <w:p>
       <w:pPr>
@@ -33065,11 +34948,11 @@
         </w:numPr>
         <w:pStyle w:val="TtuloApartado"/>
       </w:pPr>
-      <w:bookmarkStart w:id="199" w:name="_f99443d628ede90f30244d7d3dd267b1f4bed0b"/>
+      <w:bookmarkStart w:id="211" w:name="_f99443d628ede90f30244d7d3dd267b1f4bed0b"/>
       <w:r>
         <w:t xml:space="preserve">C.3 · Los notebooks</w:t>
       </w:r>
-      <w:bookmarkEnd w:id="199"/>
+      <w:bookmarkEnd w:id="211"/>
     </w:p>
     <w:p>
       <w:pPr>
@@ -33465,11 +35348,11 @@
         </w:numPr>
         <w:pStyle w:val="TtuloApartado"/>
       </w:pPr>
-      <w:bookmarkStart w:id="200" w:name="_bd97170dc8f9a70e1be9ea0068248f5d10cc2e4"/>
+      <w:bookmarkStart w:id="212" w:name="_bd97170dc8f9a70e1be9ea0068248f5d10cc2e4"/>
       <w:r>
         <w:t xml:space="preserve">C.4 · Los guiones de verificación</w:t>
       </w:r>
-      <w:bookmarkEnd w:id="200"/>
+      <w:bookmarkEnd w:id="212"/>
     </w:p>
     <w:p>
       <w:pPr>
@@ -33693,11 +35576,11 @@
         </w:numPr>
         <w:pStyle w:val="TtuloApartado"/>
       </w:pPr>
-      <w:bookmarkStart w:id="201" w:name="_7dec08523f00dfbd6fb93cbe3c71ec155298ff7"/>
+      <w:bookmarkStart w:id="213" w:name="_7dec08523f00dfbd6fb93cbe3c71ec155298ff7"/>
       <w:r>
         <w:t xml:space="preserve">C.5 · Lo que no se puede reproducir, y por qué</w:t>
       </w:r>
-      <w:bookmarkEnd w:id="201"/>
+      <w:bookmarkEnd w:id="213"/>
     </w:p>
     <w:p>
       <w:pPr>
@@ -33982,11 +35865,11 @@
         </w:numPr>
         <w:pStyle w:val="TtuloApartado"/>
       </w:pPr>
-      <w:bookmarkStart w:id="202" w:name="_32e3a7affebedc81d94399c442897d2474f4593"/>
+      <w:bookmarkStart w:id="214" w:name="_32e3a7affebedc81d94399c442897d2474f4593"/>
       <w:r>
         <w:t xml:space="preserve">C.6 · De la referencia académica al artefacto del repositorio</w:t>
       </w:r>
-      <w:bookmarkEnd w:id="202"/>
+      <w:bookmarkEnd w:id="214"/>
     </w:p>
     <w:p>
       <w:pPr>

</xml_diff>

<commit_message>
entrega: memoria con el capítulo 6 revisado
</commit_message>
<xml_diff>
--- a/memoria/memoria.docx
+++ b/memoria/memoria.docx
@@ -1948,7 +1948,7 @@
         <w:rPr>
           <w:sz w:val="18"/>
         </w:rPr>
-        <w:t>Generado desde el commit 38a0fd3 con cambios sin confirmar del repositorio del trabajo.</w:t>
+        <w:t>Generado desde el commit 2daf978 del repositorio del trabajo.</w:t>
       </w:r>
     </w:p>
     <w:p>
@@ -3207,7 +3207,7 @@
         </w:tabs>
       </w:pPr>
       <w:r>
-        <w:t xml:space="preserve">OE1 · Delimitación del vacío en la literatura</w:t>
+        <w:t xml:space="preserve">OE1 · Delimitación del vacío en el estado del conocimiento</w:t>
       </w:r>
       <w:r>
         <w:tab/>
@@ -3298,7 +3298,7 @@
         <w:tab/>
       </w:r>
       <w:r>
-        <w:t>117</w:t>
+        <w:t>118</w:t>
       </w:r>
     </w:p>
     <w:p>
@@ -3434,7 +3434,7 @@
         <w:tab/>
       </w:r>
       <w:r>
-        <w:t>127</w:t>
+        <w:t>128</w:t>
       </w:r>
     </w:p>
     <w:p>
@@ -3468,7 +3468,7 @@
         <w:tab/>
       </w:r>
       <w:r>
-        <w:t>129</w:t>
+        <w:t>130</w:t>
       </w:r>
     </w:p>
     <w:p>
@@ -3485,7 +3485,7 @@
         <w:tab/>
       </w:r>
       <w:r>
-        <w:t>134</w:t>
+        <w:t>135</w:t>
       </w:r>
     </w:p>
     <w:p>
@@ -3519,7 +3519,7 @@
         <w:tab/>
       </w:r>
       <w:r>
-        <w:t>135</w:t>
+        <w:t>136</w:t>
       </w:r>
     </w:p>
     <w:p>
@@ -3536,7 +3536,7 @@
         <w:tab/>
       </w:r>
       <w:r>
-        <w:t>136</w:t>
+        <w:t>137</w:t>
       </w:r>
     </w:p>
     <w:p>
@@ -3570,7 +3570,7 @@
         <w:tab/>
       </w:r>
       <w:r>
-        <w:t>137</w:t>
+        <w:t>138</w:t>
       </w:r>
     </w:p>
     <w:p>
@@ -3587,7 +3587,7 @@
         <w:tab/>
       </w:r>
       <w:r>
-        <w:t>138</w:t>
+        <w:t>139</w:t>
       </w:r>
     </w:p>
     <w:p>
@@ -3604,7 +3604,7 @@
         <w:tab/>
       </w:r>
       <w:r>
-        <w:t>139</w:t>
+        <w:t>140</w:t>
       </w:r>
     </w:p>
     <w:p>
@@ -3621,7 +3621,7 @@
         <w:tab/>
       </w:r>
       <w:r>
-        <w:t>141</w:t>
+        <w:t>142</w:t>
       </w:r>
     </w:p>
     <w:p>
@@ -3638,7 +3638,7 @@
         <w:tab/>
       </w:r>
       <w:r>
-        <w:t>144</w:t>
+        <w:t>145</w:t>
       </w:r>
     </w:p>
     <w:p>
@@ -3655,7 +3655,7 @@
         <w:tab/>
       </w:r>
       <w:r>
-        <w:t>144</w:t>
+        <w:t>145</w:t>
       </w:r>
     </w:p>
     <w:p>
@@ -3672,7 +3672,7 @@
         <w:tab/>
       </w:r>
       <w:r>
-        <w:t>145</w:t>
+        <w:t>146</w:t>
       </w:r>
     </w:p>
     <w:p>
@@ -3689,7 +3689,7 @@
         <w:tab/>
       </w:r>
       <w:r>
-        <w:t>147</w:t>
+        <w:t>148</w:t>
       </w:r>
     </w:p>
     <w:p>
@@ -3706,7 +3706,7 @@
         <w:tab/>
       </w:r>
       <w:r>
-        <w:t>148</w:t>
+        <w:t>149</w:t>
       </w:r>
     </w:p>
     <w:p>
@@ -3723,7 +3723,7 @@
         <w:tab/>
       </w:r>
       <w:r>
-        <w:t>148</w:t>
+        <w:t>149</w:t>
       </w:r>
     </w:p>
     <w:p>
@@ -3740,7 +3740,7 @@
         <w:tab/>
       </w:r>
       <w:r>
-        <w:t>149</w:t>
+        <w:t>150</w:t>
       </w:r>
     </w:p>
     <w:p>
@@ -3757,7 +3757,7 @@
         <w:tab/>
       </w:r>
       <w:r>
-        <w:t>150</w:t>
+        <w:t>151</w:t>
       </w:r>
     </w:p>
     <w:p>
@@ -3774,7 +3774,7 @@
         <w:tab/>
       </w:r>
       <w:r>
-        <w:t>150</w:t>
+        <w:t>151</w:t>
       </w:r>
     </w:p>
     <w:p>
@@ -3791,7 +3791,7 @@
         <w:tab/>
       </w:r>
       <w:r>
-        <w:t>150</w:t>
+        <w:t>151</w:t>
       </w:r>
     </w:p>
     <w:p>
@@ -3808,7 +3808,7 @@
         <w:tab/>
       </w:r>
       <w:r>
-        <w:t>151</w:t>
+        <w:t>152</w:t>
       </w:r>
     </w:p>
     <w:p>
@@ -3825,7 +3825,7 @@
         <w:tab/>
       </w:r>
       <w:r>
-        <w:t>151</w:t>
+        <w:t>152</w:t>
       </w:r>
     </w:p>
     <w:p>
@@ -3842,7 +3842,7 @@
         <w:tab/>
       </w:r>
       <w:r>
-        <w:t>152</w:t>
+        <w:t>153</w:t>
       </w:r>
     </w:p>
     <w:p>
@@ -3859,7 +3859,7 @@
         <w:tab/>
       </w:r>
       <w:r>
-        <w:t>152</w:t>
+        <w:t>153</w:t>
       </w:r>
     </w:p>
     <w:p>
@@ -4262,7 +4262,7 @@
         <w:tab/>
       </w:r>
       <w:r>
-        <w:t>140</w:t>
+        <w:t>141</w:t>
       </w:r>
     </w:p>
     <w:p>
@@ -4279,7 +4279,7 @@
         <w:tab/>
       </w:r>
       <w:r>
-        <w:t>142</w:t>
+        <w:t>143</w:t>
       </w:r>
     </w:p>
     <w:p>
@@ -4296,7 +4296,7 @@
         <w:tab/>
       </w:r>
       <w:r>
-        <w:t>146</w:t>
+        <w:t>147</w:t>
       </w:r>
     </w:p>
     <w:p>
@@ -4750,7 +4750,7 @@
         <w:tab/>
       </w:r>
       <w:r>
-        <w:t>135</w:t>
+        <w:t>136</w:t>
       </w:r>
     </w:p>
     <w:p>
@@ -4767,7 +4767,7 @@
         <w:tab/>
       </w:r>
       <w:r>
-        <w:t>136</w:t>
+        <w:t>137</w:t>
       </w:r>
     </w:p>
     <w:p>
@@ -4818,7 +4818,7 @@
         <w:tab/>
       </w:r>
       <w:r>
-        <w:t>138</w:t>
+        <w:t>139</w:t>
       </w:r>
     </w:p>
     <w:p>
@@ -4835,7 +4835,7 @@
         <w:tab/>
       </w:r>
       <w:r>
-        <w:t>144</w:t>
+        <w:t>145</w:t>
       </w:r>
     </w:p>
     <w:p>
@@ -4852,7 +4852,7 @@
         <w:tab/>
       </w:r>
       <w:r>
-        <w:t>147</w:t>
+        <w:t>148</w:t>
       </w:r>
     </w:p>
     <w:p>
@@ -4869,7 +4869,7 @@
         <w:tab/>
       </w:r>
       <w:r>
-        <w:t>147</w:t>
+        <w:t>148</w:t>
       </w:r>
     </w:p>
     <w:p>
@@ -4886,7 +4886,7 @@
         <w:tab/>
       </w:r>
       <w:r>
-        <w:t>148</w:t>
+        <w:t>149</w:t>
       </w:r>
     </w:p>
     <w:p>
@@ -4903,7 +4903,7 @@
         <w:tab/>
       </w:r>
       <w:r>
-        <w:t>149</w:t>
+        <w:t>150</w:t>
       </w:r>
     </w:p>
     <w:p>
@@ -4920,7 +4920,7 @@
         <w:tab/>
       </w:r>
       <w:r>
-        <w:t>150</w:t>
+        <w:t>151</w:t>
       </w:r>
     </w:p>
     <w:p>
@@ -4937,7 +4937,7 @@
         <w:tab/>
       </w:r>
       <w:r>
-        <w:t>151</w:t>
+        <w:t>152</w:t>
       </w:r>
     </w:p>
     <w:p>
@@ -4954,7 +4954,7 @@
         <w:tab/>
       </w:r>
       <w:r>
-        <w:t>151</w:t>
+        <w:t>152</w:t>
       </w:r>
     </w:p>
     <w:p>
@@ -4971,7 +4971,7 @@
         <w:tab/>
       </w:r>
       <w:r>
-        <w:t>152</w:t>
+        <w:t>153</w:t>
       </w:r>
     </w:p>
     <w:p>
@@ -4988,7 +4988,7 @@
         <w:tab/>
       </w:r>
       <w:r>
-        <w:t>153</w:t>
+        <w:t>154</w:t>
       </w:r>
     </w:p>
     <w:p>
@@ -5261,7 +5261,7 @@
         <w:pStyle w:val="Normal"/>
       </w:pPr>
       <w:r>
-        <w:t xml:space="preserve">La diferencia entre esas dos preguntas no es de matiz. Una respuesta correcta puede construirse sobre citas que no dicen lo que se les atribuye, y el lector no tiene forma de notarlo. La abstención, cuando aparece en los trabajos revisados, se trata además como una disposición del modelo de lenguaje —se le pide que reconozca su ignorancia— y no como una propiedad de la evidencia disponible, que es donde este trabajo la sitúa. Existe literatura sobre la robustez de la recuperación frente a documentos irrelevantes, pero en dominios generales; no se encontró esa medición sobre documentación técnica de vehículo con evidencia incorrecta procedente del mismo fabricante y de otro motor, que es la forma exacta que el problema toma aquí. El capítulo 3 desarrolla estos cuatro frentes y delimita el vacío con el detalle que la revisión permite.</w:t>
+        <w:t xml:space="preserve">La diferencia entre esas dos preguntas no es de matiz. Una respuesta correcta puede construirse sobre citas que no dicen lo que se les atribuye, y el lector no tiene forma de notarlo. La abstención, cuando aparece en los trabajos revisados, se trata además como una disposición del modelo de lenguaje —se le pide que reconozca su ignorancia— y no como una propiedad de la evidencia disponible, que es donde este trabajo la sitúa. Existe trabajos sobre la robustez de la recuperación frente a documentos irrelevantes, pero en dominios generales; no se encontró esa medición sobre documentación técnica de vehículo con evidencia incorrecta procedente del mismo fabricante y de otro motor, que es la forma exacta que el problema toma aquí. El capítulo 3 desarrolla estos cuatro frentes y delimita el vacío con el detalle que la revisión permite.</w:t>
       </w:r>
     </w:p>
     <w:p>
@@ -7044,7 +7044,7 @@
         <w:t xml:space="preserve"> </w:t>
       </w:r>
       <w:r>
-        <w:t xml:space="preserve">problema esté sin resolver en la literatura, sino que no se identificó resuelto</w:t>
+        <w:t xml:space="preserve">problema esté sin resolver en el estado del conocimiento, sino que no se identificó resuelto</w:t>
       </w:r>
       <w:r>
         <w:t xml:space="preserve"> </w:t>
@@ -25011,9 +25011,9 @@
         </w:numPr>
         <w:pStyle w:val="Ttulosubapartado"/>
       </w:pPr>
-      <w:bookmarkStart w:id="161" w:name="_c572760902e32d7e74cd4790704555cf1269854"/>
-      <w:r>
-        <w:t xml:space="preserve">OE1 · Delimitación del vacío en la literatura</w:t>
+      <w:bookmarkStart w:id="161" w:name="_d29dc16f20b7d11d12c2279e6fd04e3539296d9"/>
+      <w:r>
+        <w:t xml:space="preserve">OE1 · Delimitación del vacío en el estado del conocimiento</w:t>
       </w:r>
       <w:bookmarkEnd w:id="161"/>
     </w:p>
@@ -25022,7 +25022,17 @@
         <w:pStyle w:val="Normal"/>
       </w:pPr>
       <w:r>
-        <w:t xml:space="preserve">Se cumplió en el alcance declarado. La revisión, inspirada en PRISMA pero sin su flujo formal, sin protocolo registrado y sin cribado por duplicado, delimitó el vacío en cuatro frentes y fundamentó las tres decisiones de diseño del capítulo 1; esos límites están declarados en el capítulo 3.</w:t>
+        <w:rPr>
+          <w:b/>
+          <w:bCs/>
+        </w:rPr>
+        <w:t xml:space="preserve">Grado de cumplimiento: cumplido dentro del alcance declarado.</w:t>
+      </w:r>
+      <w:r>
+        <w:t xml:space="preserve"> </w:t>
+      </w:r>
+      <w:r>
+        <w:t xml:space="preserve">La revisión, inspirada en PRISMA pero sin su flujo formal, sin protocolo registrado y sin cribado por duplicado, delimitó el vacío en cuatro frentes y fundamentó las tres decisiones de diseño del capítulo 1; esos límites están declarados en el capítulo 3.</w:t>
       </w:r>
     </w:p>
     <w:p>
@@ -25044,7 +25054,14 @@
         <w:pStyle w:val="Normal"/>
       </w:pPr>
       <w:r>
-        <w:t xml:space="preserve">Se cumplió parcialmente, y solo sobre telemetría sintética. El generador es determinista, los conjuntos se reparten por sesión,</w:t>
+        <w:rPr>
+          <w:b/>
+          <w:bCs/>
+        </w:rPr>
+        <w:t xml:space="preserve">Grado de cumplimiento: parcialmente cumplido</w:t>
+      </w:r>
+      <w:r>
+        <w:t xml:space="preserve">, y solo sobre telemetría sintética. El generador es determinista, los conjuntos se reparten por sesión,</w:t>
       </w:r>
       <w:r>
         <w:t xml:space="preserve"> </w:t>
@@ -25228,7 +25245,14 @@
         <w:pStyle w:val="Normal"/>
       </w:pPr>
       <w:r>
-        <w:t xml:space="preserve">Se cumplió parcialmente. Sobre validación, el bosque aleatorio alcanza una exactitud de 0,878 frente a 0,286 de la clase mayoritaria, y su confianza, infraconfiada en origen, queda calibrada, con un error de calibración que baja de 0,144 a 0,085. Con este volumen de datos el modelo temporal no aportó ventaja sobre el tabular, y la formulación original de la subpregunta, que la pedía, no se cumplió. La atribución describe con señales coherentes con el mecanismo la fuga de vacío, el termostato y la sonda; en la deriva del caudalímetro señala las correcciones de combustible y no el caudal, y en el fallo de encendido incluye entre sus seis señales principales cuatro que el mecanismo no justifica, aunque con menos peso que las declaradas. Dos de los errores del diagnóstico admiten una lectura más precisa desde la expresión efectiva del fallo: cinco de las catorce ventanas del termostato no contienen ninguna señal observable de él, y ninguna de las del fallo de encendido lo expresa por completo, de modo que parte de lo que el modelo no detecta es evidencia que no está.</w:t>
+        <w:rPr>
+          <w:b/>
+          <w:bCs/>
+        </w:rPr>
+        <w:t xml:space="preserve">Grado de cumplimiento: cumplido dentro del alcance experimental</w:t>
+      </w:r>
+      <w:r>
+        <w:t xml:space="preserve">, con la salvedad que cierra este apartado. Sobre validación, el bosque aleatorio alcanza una exactitud de 0,878 frente a 0,286 de la clase mayoritaria, y su confianza, infraconfiada en origen, queda calibrada, con un error de calibración que baja de 0,144 a 0,085. Con este volumen de datos el modelo temporal no aportó ventaja sobre el tabular, y la formulación original de la subpregunta, que la pedía, no se cumplió. La atribución describe con señales coherentes con el mecanismo la fuga de vacío, el termostato y la sonda; en la deriva del caudalímetro señala las correcciones de combustible y no el caudal, y en el fallo de encendido incluye entre sus seis señales principales cuatro que el mecanismo no justifica, aunque con menos peso que las declaradas. Dos de los errores del diagnóstico admiten una lectura más precisa desde la expresión efectiva del fallo: cinco de las catorce ventanas del termostato no contienen ninguna señal observable de él, y ninguna de las del fallo de encendido lo expresa por completo, de modo que parte de lo que el modelo no detecta es evidencia que no está.</w:t>
       </w:r>
     </w:p>
     <w:p>
@@ -25250,7 +25274,17 @@
         <w:pStyle w:val="Normal"/>
       </w:pPr>
       <w:r>
-        <w:t xml:space="preserve">Se cumplió parcialmente, sobre los diecisiete casos anotados. Toda afirmación que el verificador admite conserva la observación que la origina y los fragmentos aplicables que superaron sus comprobaciones de soporte; si esas comprobaciones coinciden con un juicio independiente sobre lo que cada fragmento sostiene no se ha medido, porque el conjunto anotado no incluye las afirmaciones admisibles. Sin guía por código de avería, ninguna estrategia de recuperación encuentra el procedimiento relevante en todos los casos puntuados; guiada por el código asociado al diagnóstico, lo encuentra en los cinco, y ese resultado no cambió al corregir el índice documental y reejecutar. El modelo de lenguaje no cita nada que no se le haya entregado, pero cita fragmentos aplicables que el verificador no aceptó, y su adaptador se ajustó con ventanas que incluyen las de tres casos evaluados. Que las comprobaciones del verificador coincidan con lo que un fragmento sostiene de verdad no se ha medido de forma independiente.</w:t>
+        <w:rPr>
+          <w:b/>
+          <w:bCs/>
+        </w:rPr>
+        <w:t xml:space="preserve">Grado de cumplimiento: parcialmente cumplido; la verificación del soporte queda pendiente de validación independiente.</w:t>
+      </w:r>
+      <w:r>
+        <w:t xml:space="preserve"> </w:t>
+      </w:r>
+      <w:r>
+        <w:t xml:space="preserve">Sobre los diecisiete casos anotados: Toda afirmación que el verificador admite conserva la observación que la origina y los fragmentos aplicables que superaron sus comprobaciones de soporte; si esas comprobaciones coinciden con un juicio independiente sobre lo que cada fragmento sostiene no se ha medido, porque el conjunto anotado no incluye las afirmaciones admisibles. Sin guía por código de avería, ninguna estrategia de recuperación encuentra el procedimiento relevante en todos los casos puntuados; guiada por el código asociado al diagnóstico, lo encuentra en los cinco, y ese resultado no cambió al corregir el índice documental y reejecutar. El modelo de lenguaje no cita nada que no se le haya entregado, pero cita fragmentos aplicables que el verificador no aceptó, y su adaptador se ajustó con ventanas que incluyen las de tres casos evaluados. Que las comprobaciones del verificador coincidan con lo que un fragmento sostiene de verdad no se ha medido de forma independiente.</w:t>
       </w:r>
     </w:p>
     <w:p>
@@ -25272,7 +25306,17 @@
         <w:pStyle w:val="Normal"/>
       </w:pPr>
       <w:r>
-        <w:t xml:space="preserve">Se cumplió parcialmente. Sobre las ejecuciones que debían terminar en abstención, nueve de tres ventanas bien diagnosticadas sin contar la condición con distractor y filtro, el sistema no explicó ninguna; una política que se abstuviera siempre obtendría el mismo cero, y lo que distingue al sistema es que, sobre los cinco casos con evidencia completa, explica tres. Las dos abstenciones innecesarias no tienen la misma causa: una procede solo de la confianza del modelo y la otra también de la falta de soporte documental. La abstención con evidencia retirada está determinada por la construcción de la condición; el contraste que pone a prueba el criterio es el de la evidencia parcial. El criterio que produce estas cifras se revisó dos veces sobre los mismos casos. La condición con distractor, con el filtro de motor activo, no añadía en ninguno de los tres fallos un distractor que la condición parcial no tuviera —la causa medida es que dos de las tres tenían la misma configuración que la parcial, no el filtro de motor— y</w:t>
+        <w:rPr>
+          <w:b/>
+          <w:bCs/>
+        </w:rPr>
+        <w:t xml:space="preserve">Grado de cumplimiento: cumplido dentro del alcance experimental.</w:t>
+      </w:r>
+      <w:r>
+        <w:t xml:space="preserve"> </w:t>
+      </w:r>
+      <w:r>
+        <w:t xml:space="preserve">Sobre las ejecuciones que debían terminar en abstención, nueve de tres ventanas bien diagnosticadas sin contar la condición con distractor y filtro, el sistema no explicó ninguna; una política que se abstuviera siempre obtendría el mismo cero, y lo que distingue al sistema es que, sobre los cinco casos con evidencia completa, explica tres. Las dos abstenciones innecesarias no tienen la misma causa: una procede solo de la confianza del modelo y la otra también de la falta de soporte documental. La abstención con evidencia retirada está determinada por la construcción de la condición; el contraste que pone a prueba el criterio es el de la evidencia parcial. El criterio que produce estas cifras se revisó dos veces sobre los mismos casos. La condición con distractor, con el filtro de motor activo, no añadía en ninguno de los tres fallos un distractor que la condición parcial no tuviera —la causa medida es que dos de las tres tenían la misma configuración que la parcial, no el filtro de motor— y</w:t>
       </w:r>
       <w:r>
         <w:t xml:space="preserve"> </w:t>
@@ -27076,6 +27120,57 @@
     </w:p>
     <w:p>
       <w:pPr>
+        <w:pStyle w:val="Normal"/>
+      </w:pPr>
+      <w:r>
+        <w:t xml:space="preserve">Hay una última condición que afecta a todas las cifras de decisión y que conviene no dejar</w:t>
+      </w:r>
+      <w:r>
+        <w:t xml:space="preserve"> </w:t>
+      </w:r>
+      <w:r>
+        <w:t xml:space="preserve">implícita:</w:t>
+      </w:r>
+      <w:r>
+        <w:t xml:space="preserve"> </w:t>
+      </w:r>
+      <w:r>
+        <w:rPr>
+          <w:b/>
+          <w:bCs/>
+        </w:rPr>
+        <w:t xml:space="preserve">las ejecuciones no son independientes entre sí</w:t>
+      </w:r>
+      <w:r>
+        <w:t xml:space="preserve">. Las treinta y cinco de la evaluación</w:t>
+      </w:r>
+      <w:r>
+        <w:t xml:space="preserve"> </w:t>
+      </w:r>
+      <w:r>
+        <w:t xml:space="preserve">final proceden de ocho ventanas y repiten casos entre los tres estratos; las diecisiete de</w:t>
+      </w:r>
+      <w:r>
+        <w:t xml:space="preserve"> </w:t>
+      </w:r>
+      <w:r>
+        <w:t xml:space="preserve">validación, de cinco ventanas. Cualquier intervalo calculado como si cada ejecución aportara</w:t>
+      </w:r>
+      <w:r>
+        <w:t xml:space="preserve"> </w:t>
+      </w:r>
+      <w:r>
+        <w:t xml:space="preserve">información nueva resulta más estrecho de lo que debería, y por eso los recuentos se publican con</w:t>
+      </w:r>
+      <w:r>
+        <w:t xml:space="preserve"> </w:t>
+      </w:r>
+      <w:r>
+        <w:t xml:space="preserve">su numerador y su denominador en lugar de como tasas.</w:t>
+      </w:r>
+    </w:p>
+    <w:p>
+      <w:pPr>
         <w:numPr>
           <w:ilvl w:val="0"/>
           <w:numId w:val="907"/>
@@ -27126,6 +27221,138 @@
       </w:pPr>
       <w:r>
         <w:t xml:space="preserve">Hace falta también ampliar los casos anotados y hacerlos más difíciles: fallos simultáneos, evidencia que se contradice en parte, documentación que parece pertinente pero corresponde a otra configuración, construida de modo que la condición con evidencia parcial no la contenga ya, y situaciones en las que más de una hipótesis encaja con la misma telemetría. Ese último caso es el que menos se ha explorado y el que más dice sobre cuándo el sistema debería abstenerse en lugar de elegir.</w:t>
+      </w:r>
+    </w:p>
+    <w:p>
+      <w:pPr>
+        <w:pStyle w:val="Normal"/>
+      </w:pPr>
+      <w:r>
+        <w:t xml:space="preserve">Tres líneas salen directamente de los límites que este trabajo encontró en sí mismo, y por eso</w:t>
+      </w:r>
+      <w:r>
+        <w:t xml:space="preserve"> </w:t>
+      </w:r>
+      <w:r>
+        <w:t xml:space="preserve">tienen prioridad sobre las anteriores. La primera es someter a</w:t>
+      </w:r>
+      <w:r>
+        <w:t xml:space="preserve"> </w:t>
+      </w:r>
+      <w:r>
+        <w:rPr>
+          <w:b/>
+          <w:bCs/>
+        </w:rPr>
+        <w:t xml:space="preserve">juicio independiente</w:t>
+      </w:r>
+      <w:r>
+        <w:t xml:space="preserve"> </w:t>
+      </w:r>
+      <w:r>
+        <w:t xml:space="preserve">la</w:t>
+      </w:r>
+      <w:r>
+        <w:t xml:space="preserve"> </w:t>
+      </w:r>
+      <w:r>
+        <w:t xml:space="preserve">correspondencia entre cada afirmación y su evidencia: anotar, para un conjunto de casos, qué</w:t>
+      </w:r>
+      <w:r>
+        <w:t xml:space="preserve"> </w:t>
+      </w:r>
+      <w:r>
+        <w:t xml:space="preserve">afirmaciones serían admisibles según un lector con formación en mecánica, y contrastar ese juicio</w:t>
+      </w:r>
+      <w:r>
+        <w:t xml:space="preserve"> </w:t>
+      </w:r>
+      <w:r>
+        <w:t xml:space="preserve">con el veredicto del verificador. Es lo único que convertiría la trazabilidad, que hoy se cumple</w:t>
+      </w:r>
+      <w:r>
+        <w:t xml:space="preserve"> </w:t>
+      </w:r>
+      <w:r>
+        <w:t xml:space="preserve">por construcción, en una propiedad medida.</w:t>
+      </w:r>
+    </w:p>
+    <w:p>
+      <w:pPr>
+        <w:pStyle w:val="Normal"/>
+      </w:pPr>
+      <w:r>
+        <w:t xml:space="preserve">La segunda es cerrar el hueco de la</w:t>
+      </w:r>
+      <w:r>
+        <w:t xml:space="preserve"> </w:t>
+      </w:r>
+      <w:r>
+        <w:rPr>
+          <w:b/>
+          <w:bCs/>
+        </w:rPr>
+        <w:t xml:space="preserve">fidelidad numérica</w:t>
+      </w:r>
+      <w:r>
+        <w:t xml:space="preserve">. El validador determinista que el</w:t>
+      </w:r>
+      <w:r>
+        <w:t xml:space="preserve"> </w:t>
+      </w:r>
+      <w:r>
+        <w:t xml:space="preserve">capítulo 5 describe está diseñado y sin implementar: comprobaría, antes de dar una salida por</w:t>
+      </w:r>
+      <w:r>
+        <w:t xml:space="preserve"> </w:t>
+      </w:r>
+      <w:r>
+        <w:t xml:space="preserve">válida, el nombre de la métrica, su valor, el umbral, el operador de comparación, la procedencia</w:t>
+      </w:r>
+      <w:r>
+        <w:t xml:space="preserve"> </w:t>
+      </w:r>
+      <w:r>
+        <w:t xml:space="preserve">del número y la coherencia entre lo que el texto dice y lo que los datos estructurados contienen.</w:t>
+      </w:r>
+      <w:r>
+        <w:t xml:space="preserve"> </w:t>
+      </w:r>
+      <w:r>
+        <w:t xml:space="preserve">Su evaluación exigiría un conjunto que el ajuste del redactor no haya visto.</w:t>
+      </w:r>
+    </w:p>
+    <w:p>
+      <w:pPr>
+        <w:pStyle w:val="Normal"/>
+      </w:pPr>
+      <w:r>
+        <w:t xml:space="preserve">La tercera es</w:t>
+      </w:r>
+      <w:r>
+        <w:t xml:space="preserve"> </w:t>
+      </w:r>
+      <w:r>
+        <w:rPr>
+          <w:b/>
+          <w:bCs/>
+        </w:rPr>
+        <w:t xml:space="preserve">reajustar el adaptador sin contaminación</w:t>
+      </w:r>
+      <w:r>
+        <w:t xml:space="preserve">, con ejemplos generados por la</w:t>
+      </w:r>
+      <w:r>
+        <w:t xml:space="preserve"> </w:t>
+      </w:r>
+      <w:r>
+        <w:t xml:space="preserve">recuperación ya corregida y con ventanas disjuntas de las evaluadas, y volver a medir. Hasta que</w:t>
+      </w:r>
+      <w:r>
+        <w:t xml:space="preserve"> </w:t>
+      </w:r>
+      <w:r>
+        <w:t xml:space="preserve">eso ocurra, cualquier cifra sobre la redacción arrastra la advertencia que el capítulo 5 declara.</w:t>
       </w:r>
     </w:p>
     <w:p>

</xml_diff>

<commit_message>
entrega: memoria de la segunda entrega, con la comparación desarrollada
</commit_message>
<xml_diff>
--- a/memoria/memoria.docx
+++ b/memoria/memoria.docx
@@ -1948,7 +1948,7 @@
         <w:rPr>
           <w:sz w:val="18"/>
         </w:rPr>
-        <w:t>Generado desde el commit 2daf978 del repositorio del trabajo.</w:t>
+        <w:t>Generado desde el commit 2daf978 con cambios sin confirmar del repositorio del trabajo.</w:t>
       </w:r>
     </w:p>
     <w:p>
@@ -3139,7 +3139,7 @@
         </w:tabs>
       </w:pPr>
       <w:r>
-        <w:t xml:space="preserve">El patrón que atraviesa el trabajo</w:t>
+        <w:t xml:space="preserve">El patrón que aparece en los resultados</w:t>
       </w:r>
       <w:r>
         <w:tab/>
@@ -3162,7 +3162,7 @@
         <w:tab/>
       </w:r>
       <w:r>
-        <w:t>112</w:t>
+        <w:t>113</w:t>
       </w:r>
     </w:p>
     <w:p>
@@ -3179,7 +3179,7 @@
         <w:tab/>
       </w:r>
       <w:r>
-        <w:t>113</w:t>
+        <w:t>114</w:t>
       </w:r>
     </w:p>
     <w:p>
@@ -3196,7 +3196,7 @@
         <w:tab/>
       </w:r>
       <w:r>
-        <w:t>115</w:t>
+        <w:t>116</w:t>
       </w:r>
     </w:p>
     <w:p>
@@ -3213,7 +3213,7 @@
         <w:tab/>
       </w:r>
       <w:r>
-        <w:t>115</w:t>
+        <w:t>116</w:t>
       </w:r>
     </w:p>
     <w:p>
@@ -3230,7 +3230,7 @@
         <w:tab/>
       </w:r>
       <w:r>
-        <w:t>115</w:t>
+        <w:t>116</w:t>
       </w:r>
     </w:p>
     <w:p>
@@ -3247,7 +3247,7 @@
         <w:tab/>
       </w:r>
       <w:r>
-        <w:t>116</w:t>
+        <w:t>117</w:t>
       </w:r>
     </w:p>
     <w:p>
@@ -3264,7 +3264,7 @@
         <w:tab/>
       </w:r>
       <w:r>
-        <w:t>116</w:t>
+        <w:t>117</w:t>
       </w:r>
     </w:p>
     <w:p>
@@ -3281,7 +3281,7 @@
         <w:tab/>
       </w:r>
       <w:r>
-        <w:t>117</w:t>
+        <w:t>118</w:t>
       </w:r>
     </w:p>
     <w:p>
@@ -3298,7 +3298,7 @@
         <w:tab/>
       </w:r>
       <w:r>
-        <w:t>118</w:t>
+        <w:t>119</w:t>
       </w:r>
     </w:p>
     <w:p>
@@ -3315,7 +3315,7 @@
         <w:tab/>
       </w:r>
       <w:r>
-        <w:t>120</w:t>
+        <w:t>121</w:t>
       </w:r>
     </w:p>
     <w:p>
@@ -3326,13 +3326,30 @@
         </w:tabs>
       </w:pPr>
       <w:r>
+        <w:t xml:space="preserve">Comparación con los trabajos revisados</w:t>
+      </w:r>
+      <w:r>
+        <w:tab/>
+      </w:r>
+      <w:r>
+        <w:t>122</w:t>
+      </w:r>
+    </w:p>
+    <w:p>
+      <w:pPr>
+        <w:pStyle w:val="TDC2"/>
+        <w:tabs>
+          <w:tab w:val="right" w:leader="dot" w:pos="8505"/>
+        </w:tabs>
+      </w:pPr>
+      <w:r>
         <w:t xml:space="preserve">Contribuciones del trabajo</w:t>
       </w:r>
       <w:r>
         <w:tab/>
       </w:r>
       <w:r>
-        <w:t>121</w:t>
+        <w:t>125</w:t>
       </w:r>
     </w:p>
     <w:p>
@@ -3349,7 +3366,7 @@
         <w:tab/>
       </w:r>
       <w:r>
-        <w:t>121</w:t>
+        <w:t>125</w:t>
       </w:r>
     </w:p>
     <w:p>
@@ -3366,7 +3383,7 @@
         <w:tab/>
       </w:r>
       <w:r>
-        <w:t>122</w:t>
+        <w:t>125</w:t>
       </w:r>
     </w:p>
     <w:p>
@@ -3383,7 +3400,7 @@
         <w:tab/>
       </w:r>
       <w:r>
-        <w:t>123</w:t>
+        <w:t>126</w:t>
       </w:r>
     </w:p>
     <w:p>
@@ -3400,7 +3417,7 @@
         <w:tab/>
       </w:r>
       <w:r>
-        <w:t>124</w:t>
+        <w:t>127</w:t>
       </w:r>
     </w:p>
     <w:p>
@@ -3417,7 +3434,7 @@
         <w:tab/>
       </w:r>
       <w:r>
-        <w:t>124</w:t>
+        <w:t>127</w:t>
       </w:r>
     </w:p>
     <w:p>
@@ -3434,7 +3451,7 @@
         <w:tab/>
       </w:r>
       <w:r>
-        <w:t>128</w:t>
+        <w:t>131</w:t>
       </w:r>
     </w:p>
     <w:p>
@@ -3451,7 +3468,7 @@
         <w:tab/>
       </w:r>
       <w:r>
-        <w:t>129</w:t>
+        <w:t>133</w:t>
       </w:r>
     </w:p>
     <w:p>
@@ -3468,7 +3485,7 @@
         <w:tab/>
       </w:r>
       <w:r>
-        <w:t>130</w:t>
+        <w:t>134</w:t>
       </w:r>
     </w:p>
     <w:p>
@@ -3485,7 +3502,7 @@
         <w:tab/>
       </w:r>
       <w:r>
-        <w:t>135</w:t>
+        <w:t>139</w:t>
       </w:r>
     </w:p>
     <w:p>
@@ -3502,7 +3519,7 @@
         <w:tab/>
       </w:r>
       <w:r>
-        <w:t>135</w:t>
+        <w:t>139</w:t>
       </w:r>
     </w:p>
     <w:p>
@@ -3519,7 +3536,7 @@
         <w:tab/>
       </w:r>
       <w:r>
-        <w:t>136</w:t>
+        <w:t>140</w:t>
       </w:r>
     </w:p>
     <w:p>
@@ -3536,7 +3553,7 @@
         <w:tab/>
       </w:r>
       <w:r>
-        <w:t>137</w:t>
+        <w:t>141</w:t>
       </w:r>
     </w:p>
     <w:p>
@@ -3553,7 +3570,7 @@
         <w:tab/>
       </w:r>
       <w:r>
-        <w:t>137</w:t>
+        <w:t>141</w:t>
       </w:r>
     </w:p>
     <w:p>
@@ -3570,7 +3587,7 @@
         <w:tab/>
       </w:r>
       <w:r>
-        <w:t>138</w:t>
+        <w:t>142</w:t>
       </w:r>
     </w:p>
     <w:p>
@@ -3587,7 +3604,7 @@
         <w:tab/>
       </w:r>
       <w:r>
-        <w:t>139</w:t>
+        <w:t>143</w:t>
       </w:r>
     </w:p>
     <w:p>
@@ -3604,7 +3621,7 @@
         <w:tab/>
       </w:r>
       <w:r>
-        <w:t>140</w:t>
+        <w:t>144</w:t>
       </w:r>
     </w:p>
     <w:p>
@@ -3621,7 +3638,7 @@
         <w:tab/>
       </w:r>
       <w:r>
-        <w:t>142</w:t>
+        <w:t>146</w:t>
       </w:r>
     </w:p>
     <w:p>
@@ -3638,7 +3655,7 @@
         <w:tab/>
       </w:r>
       <w:r>
-        <w:t>145</w:t>
+        <w:t>149</w:t>
       </w:r>
     </w:p>
     <w:p>
@@ -3655,7 +3672,7 @@
         <w:tab/>
       </w:r>
       <w:r>
-        <w:t>145</w:t>
+        <w:t>149</w:t>
       </w:r>
     </w:p>
     <w:p>
@@ -3672,7 +3689,7 @@
         <w:tab/>
       </w:r>
       <w:r>
-        <w:t>146</w:t>
+        <w:t>150</w:t>
       </w:r>
     </w:p>
     <w:p>
@@ -3689,7 +3706,7 @@
         <w:tab/>
       </w:r>
       <w:r>
-        <w:t>148</w:t>
+        <w:t>152</w:t>
       </w:r>
     </w:p>
     <w:p>
@@ -3706,7 +3723,7 @@
         <w:tab/>
       </w:r>
       <w:r>
-        <w:t>149</w:t>
+        <w:t>153</w:t>
       </w:r>
     </w:p>
     <w:p>
@@ -3723,7 +3740,7 @@
         <w:tab/>
       </w:r>
       <w:r>
-        <w:t>149</w:t>
+        <w:t>153</w:t>
       </w:r>
     </w:p>
     <w:p>
@@ -3740,7 +3757,7 @@
         <w:tab/>
       </w:r>
       <w:r>
-        <w:t>150</w:t>
+        <w:t>154</w:t>
       </w:r>
     </w:p>
     <w:p>
@@ -3757,7 +3774,7 @@
         <w:tab/>
       </w:r>
       <w:r>
-        <w:t>151</w:t>
+        <w:t>155</w:t>
       </w:r>
     </w:p>
     <w:p>
@@ -3774,7 +3791,7 @@
         <w:tab/>
       </w:r>
       <w:r>
-        <w:t>151</w:t>
+        <w:t>155</w:t>
       </w:r>
     </w:p>
     <w:p>
@@ -3791,7 +3808,7 @@
         <w:tab/>
       </w:r>
       <w:r>
-        <w:t>151</w:t>
+        <w:t>155</w:t>
       </w:r>
     </w:p>
     <w:p>
@@ -3808,7 +3825,7 @@
         <w:tab/>
       </w:r>
       <w:r>
-        <w:t>152</w:t>
+        <w:t>156</w:t>
       </w:r>
     </w:p>
     <w:p>
@@ -3825,7 +3842,7 @@
         <w:tab/>
       </w:r>
       <w:r>
-        <w:t>152</w:t>
+        <w:t>156</w:t>
       </w:r>
     </w:p>
     <w:p>
@@ -3842,7 +3859,7 @@
         <w:tab/>
       </w:r>
       <w:r>
-        <w:t>153</w:t>
+        <w:t>157</w:t>
       </w:r>
     </w:p>
     <w:p>
@@ -3859,7 +3876,7 @@
         <w:tab/>
       </w:r>
       <w:r>
-        <w:t>153</w:t>
+        <w:t>157</w:t>
       </w:r>
     </w:p>
     <w:p>
@@ -4211,7 +4228,7 @@
         <w:tab/>
       </w:r>
       <w:r>
-        <w:t>114</w:t>
+        <w:t>115</w:t>
       </w:r>
     </w:p>
     <w:p>
@@ -4228,7 +4245,7 @@
         <w:tab/>
       </w:r>
       <w:r>
-        <w:t>119</w:t>
+        <w:t>120</w:t>
       </w:r>
     </w:p>
     <w:p>
@@ -4245,7 +4262,7 @@
         <w:tab/>
       </w:r>
       <w:r>
-        <w:t>126</w:t>
+        <w:t>129</w:t>
       </w:r>
     </w:p>
     <w:p>
@@ -4262,7 +4279,7 @@
         <w:tab/>
       </w:r>
       <w:r>
-        <w:t>141</w:t>
+        <w:t>145</w:t>
       </w:r>
     </w:p>
     <w:p>
@@ -4279,7 +4296,7 @@
         <w:tab/>
       </w:r>
       <w:r>
-        <w:t>143</w:t>
+        <w:t>147</w:t>
       </w:r>
     </w:p>
     <w:p>
@@ -4296,7 +4313,7 @@
         <w:tab/>
       </w:r>
       <w:r>
-        <w:t>147</w:t>
+        <w:t>151</w:t>
       </w:r>
     </w:p>
     <w:p>
@@ -4750,7 +4767,7 @@
         <w:tab/>
       </w:r>
       <w:r>
-        <w:t>136</w:t>
+        <w:t>140</w:t>
       </w:r>
     </w:p>
     <w:p>
@@ -4767,7 +4784,7 @@
         <w:tab/>
       </w:r>
       <w:r>
-        <w:t>137</w:t>
+        <w:t>141</w:t>
       </w:r>
     </w:p>
     <w:p>
@@ -4784,7 +4801,7 @@
         <w:tab/>
       </w:r>
       <w:r>
-        <w:t>137</w:t>
+        <w:t>141</w:t>
       </w:r>
     </w:p>
     <w:p>
@@ -4801,7 +4818,7 @@
         <w:tab/>
       </w:r>
       <w:r>
-        <w:t>138</w:t>
+        <w:t>142</w:t>
       </w:r>
     </w:p>
     <w:p>
@@ -4818,7 +4835,7 @@
         <w:tab/>
       </w:r>
       <w:r>
-        <w:t>139</w:t>
+        <w:t>143</w:t>
       </w:r>
     </w:p>
     <w:p>
@@ -4835,7 +4852,7 @@
         <w:tab/>
       </w:r>
       <w:r>
-        <w:t>145</w:t>
+        <w:t>149</w:t>
       </w:r>
     </w:p>
     <w:p>
@@ -4852,7 +4869,7 @@
         <w:tab/>
       </w:r>
       <w:r>
-        <w:t>148</w:t>
+        <w:t>152</w:t>
       </w:r>
     </w:p>
     <w:p>
@@ -4869,7 +4886,7 @@
         <w:tab/>
       </w:r>
       <w:r>
-        <w:t>148</w:t>
+        <w:t>152</w:t>
       </w:r>
     </w:p>
     <w:p>
@@ -4886,7 +4903,7 @@
         <w:tab/>
       </w:r>
       <w:r>
-        <w:t>149</w:t>
+        <w:t>153</w:t>
       </w:r>
     </w:p>
     <w:p>
@@ -4903,7 +4920,7 @@
         <w:tab/>
       </w:r>
       <w:r>
-        <w:t>150</w:t>
+        <w:t>154</w:t>
       </w:r>
     </w:p>
     <w:p>
@@ -4920,7 +4937,7 @@
         <w:tab/>
       </w:r>
       <w:r>
-        <w:t>151</w:t>
+        <w:t>155</w:t>
       </w:r>
     </w:p>
     <w:p>
@@ -4937,7 +4954,7 @@
         <w:tab/>
       </w:r>
       <w:r>
-        <w:t>152</w:t>
+        <w:t>156</w:t>
       </w:r>
     </w:p>
     <w:p>
@@ -4954,7 +4971,7 @@
         <w:tab/>
       </w:r>
       <w:r>
-        <w:t>152</w:t>
+        <w:t>156</w:t>
       </w:r>
     </w:p>
     <w:p>
@@ -4971,7 +4988,7 @@
         <w:tab/>
       </w:r>
       <w:r>
-        <w:t>153</w:t>
+        <w:t>157</w:t>
       </w:r>
     </w:p>
     <w:p>
@@ -4988,7 +5005,7 @@
         <w:tab/>
       </w:r>
       <w:r>
-        <w:t>154</w:t>
+        <w:t>158</w:t>
       </w:r>
     </w:p>
     <w:p>
@@ -15588,7 +15605,7 @@
         <w:t xml:space="preserve"> </w:t>
       </w:r>
       <w:r>
-        <w:t xml:space="preserve">cada ventana, de modo que la coincidencia de los dos recuentos es, por ahora, una coincidencia</w:t>
+        <w:t xml:space="preserve">cada ventana, de modo que la coincidencia de los dos recuentos es una coincidencia</w:t>
       </w:r>
       <w:r>
         <w:t xml:space="preserve"> </w:t>
@@ -24480,9 +24497,9 @@
         </w:numPr>
         <w:pStyle w:val="Ttulosubapartado"/>
       </w:pPr>
-      <w:bookmarkStart w:id="154" w:name="_978f06f89d85a2d9ff8a92b4947fdc8b2e8c741"/>
-      <w:r>
-        <w:t xml:space="preserve">El patrón que atraviesa el trabajo</w:t>
+      <w:bookmarkStart w:id="154" w:name="_8b4c1a42aa9c4371ad5c693bab9794b58ea2a95"/>
+      <w:r>
+        <w:t xml:space="preserve">El patrón que aparece en los resultados</w:t>
       </w:r>
       <w:bookmarkEnd w:id="154"/>
     </w:p>
@@ -24491,109 +24508,753 @@
         <w:pStyle w:val="Normal"/>
       </w:pPr>
       <w:r>
-        <w:t xml:space="preserve">Varios de los errores relevantes se detectaron mirando cifras que no cuadraban, no ejecutando</w:t>
-      </w:r>
-      <w:r>
-        <w:t xml:space="preserve"> </w:t>
-      </w:r>
-      <w:r>
-        <w:t xml:space="preserve">pruebas automáticas: una exactitud de cero por un tipo de dato, una puntuación de fusión en otra</w:t>
-      </w:r>
-      <w:r>
-        <w:t xml:space="preserve"> </w:t>
-      </w:r>
-      <w:r>
-        <w:t xml:space="preserve">escala, una condición sin evidencia que seguía explicando, un código genérico que hacía parecer que</w:t>
-      </w:r>
-      <w:r>
-        <w:t xml:space="preserve"> </w:t>
-      </w:r>
-      <w:r>
-        <w:t xml:space="preserve">la evidencia no existía, un efecto aparente del idioma que el filtro tapaba, un esquema que</w:t>
-      </w:r>
-      <w:r>
-        <w:t xml:space="preserve"> </w:t>
-      </w:r>
-      <w:r>
-        <w:t xml:space="preserve">rechazaba respuestas correctas, un índice que mezclaba dos espacios vectoriales.</w:t>
-      </w:r>
-    </w:p>
-    <w:p>
-      <w:pPr>
-        <w:pStyle w:val="Normal"/>
-      </w:pPr>
-      <w:r>
-        <w:t xml:space="preserve">Cada uno quedó registrado con la consecuencia que habría tenido de no detectarse, y varios habrían</w:t>
-      </w:r>
-      <w:r>
-        <w:t xml:space="preserve"> </w:t>
-      </w:r>
-      <w:r>
-        <w:t xml:space="preserve">producido resultados falsos de apariencia correcta. Es la misma observación que motiva la pregunta</w:t>
-      </w:r>
-      <w:r>
-        <w:t xml:space="preserve"> </w:t>
-      </w:r>
-      <w:r>
-        <w:t xml:space="preserve">de investigación, aplicada al propio proceso de investigarla: la evidencia aparente no sobrevive</w:t>
-      </w:r>
-      <w:r>
-        <w:t xml:space="preserve"> </w:t>
-      </w:r>
-      <w:r>
-        <w:t xml:space="preserve">siempre al escrutinio, y quien no distinga entre</w:t>
-      </w:r>
-      <w:r>
-        <w:t xml:space="preserve"> </w:t>
-      </w:r>
-      <w:r>
-        <w:rPr>
-          <w:b/>
-          <w:bCs/>
-        </w:rPr>
-        <w:t xml:space="preserve">tener una referencia</w:t>
-      </w:r>
-      <w:r>
-        <w:t xml:space="preserve"> </w:t>
-      </w:r>
-      <w:r>
-        <w:t xml:space="preserve">y</w:t>
-      </w:r>
-      <w:r>
-        <w:t xml:space="preserve"> </w:t>
-      </w:r>
-      <w:r>
-        <w:rPr>
-          <w:b/>
-          <w:bCs/>
-        </w:rPr>
-        <w:t xml:space="preserve">tener soporte</w:t>
-      </w:r>
-      <w:r>
-        <w:t xml:space="preserve"> </w:t>
-      </w:r>
-      <w:r>
-        <w:t xml:space="preserve">—un sistema o un investigador— producirá afirmaciones con referencia y sin soporte.</w:t>
-      </w:r>
-    </w:p>
-    <w:p>
-      <w:pPr>
-        <w:pStyle w:val="Normal"/>
-      </w:pPr>
-      <w:r>
-        <w:t xml:space="preserve">Queda pendiente la comparación con los trabajos del capítulo 3, que el capítulo 6 aborda sobre los</w:t>
-      </w:r>
-      <w:r>
-        <w:t xml:space="preserve"> </w:t>
-      </w:r>
-      <w:r>
-        <w:t xml:space="preserve">resultados finales, y la variante de recuperación léxica que la enmienda de las ablaciones declara y</w:t>
-      </w:r>
-      <w:r>
-        <w:t xml:space="preserve"> </w:t>
-      </w:r>
-      <w:r>
-        <w:t xml:space="preserve">que quedó inconclusa.</w:t>
+        <w:t xml:space="preserve">Hay una observación que no pertenece a ninguna subpregunta y que atraviesa todas. Varios de los</w:t>
+      </w:r>
+      <w:r>
+        <w:t xml:space="preserve"> </w:t>
+      </w:r>
+      <w:r>
+        <w:t xml:space="preserve">defectos que este trabajo tuvo que corregir</w:t>
+      </w:r>
+      <w:r>
+        <w:t xml:space="preserve"> </w:t>
+      </w:r>
+      <w:r>
+        <w:rPr>
+          <w:b/>
+          <w:bCs/>
+        </w:rPr>
+        <w:t xml:space="preserve">no los detectó ninguna prueba automática</w:t>
+      </w:r>
+      <w:r>
+        <w:t xml:space="preserve">: los</w:t>
+      </w:r>
+      <w:r>
+        <w:t xml:space="preserve"> </w:t>
+      </w:r>
+      <w:r>
+        <w:t xml:space="preserve">detectó una cifra que no cuadraba. Y lo que los hace relevantes para la discusión, y no para un</w:t>
+      </w:r>
+      <w:r>
+        <w:t xml:space="preserve"> </w:t>
+      </w:r>
+      <w:r>
+        <w:t xml:space="preserve">registro de incidencias, es que todos tienen la misma forma: produjeron una salida de apariencia</w:t>
+      </w:r>
+      <w:r>
+        <w:t xml:space="preserve"> </w:t>
+      </w:r>
+      <w:r>
+        <w:t xml:space="preserve">válida.</w:t>
+      </w:r>
+    </w:p>
+    <w:p>
+      <w:pPr>
+        <w:pStyle w:val="Normal"/>
+      </w:pPr>
+      <w:r>
+        <w:rPr>
+          <w:b/>
+          <w:bCs/>
+        </w:rPr>
+        <w:t xml:space="preserve">Una salida válida y una interpretación respaldada no son lo mismo.</w:t>
+      </w:r>
+      <w:r>
+        <w:t xml:space="preserve"> </w:t>
+      </w:r>
+      <w:r>
+        <w:t xml:space="preserve">Un número con el formato</w:t>
+      </w:r>
+      <w:r>
+        <w:t xml:space="preserve"> </w:t>
+      </w:r>
+      <w:r>
+        <w:t xml:space="preserve">correcto, un documento recuperado con el código correcto, una respuesta que pasa la validación de</w:t>
+      </w:r>
+      <w:r>
+        <w:t xml:space="preserve"> </w:t>
+      </w:r>
+      <w:r>
+        <w:t xml:space="preserve">esquema: las tres cosas parecen evidencia y ninguna lo es por sí sola. Los siete casos que siguen</w:t>
+      </w:r>
+      <w:r>
+        <w:t xml:space="preserve"> </w:t>
+      </w:r>
+      <w:r>
+        <w:t xml:space="preserve">son instancias de ese mismo patrón, y conviene leerlos por su consecuencia metodológica y no por su</w:t>
+      </w:r>
+      <w:r>
+        <w:t xml:space="preserve"> </w:t>
+      </w:r>
+      <w:r>
+        <w:t xml:space="preserve">cronología.</w:t>
+      </w:r>
+    </w:p>
+    <w:p>
+      <w:pPr>
+        <w:pStyle w:val="Normal"/>
+      </w:pPr>
+      <w:r>
+        <w:rPr>
+          <w:b/>
+          <w:bCs/>
+        </w:rPr>
+        <w:t xml:space="preserve">Incompatibilidad de tipos de datos.</w:t>
+      </w:r>
+      <w:r>
+        <w:t xml:space="preserve"> </w:t>
+      </w:r>
+      <w:r>
+        <w:t xml:space="preserve">Una exactitud de cero que no era un modelo malo, sino una</w:t>
+      </w:r>
+      <w:r>
+        <w:t xml:space="preserve"> </w:t>
+      </w:r>
+      <w:r>
+        <w:t xml:space="preserve">comparación entre valores que nunca podían coincidir.</w:t>
+      </w:r>
+      <w:r>
+        <w:t xml:space="preserve"> </w:t>
+      </w:r>
+      <w:r>
+        <w:rPr>
+          <w:i/>
+          <w:iCs/>
+        </w:rPr>
+        <w:t xml:space="preserve">Consecuencia experimental:</w:t>
+      </w:r>
+      <w:r>
+        <w:t xml:space="preserve"> </w:t>
+      </w:r>
+      <w:r>
+        <w:t xml:space="preserve">la métrica era</w:t>
+      </w:r>
+      <w:r>
+        <w:t xml:space="preserve"> </w:t>
+      </w:r>
+      <w:r>
+        <w:t xml:space="preserve">interpretable y falsa.</w:t>
+      </w:r>
+      <w:r>
+        <w:t xml:space="preserve"> </w:t>
+      </w:r>
+      <w:r>
+        <w:rPr>
+          <w:i/>
+          <w:iCs/>
+        </w:rPr>
+        <w:t xml:space="preserve">Corrección:</w:t>
+      </w:r>
+      <w:r>
+        <w:t xml:space="preserve"> </w:t>
+      </w:r>
+      <w:r>
+        <w:t xml:space="preserve">se igualaron los tipos en el punto de comparación.</w:t>
+      </w:r>
+      <w:r>
+        <w:t xml:space="preserve"> </w:t>
+      </w:r>
+      <w:r>
+        <w:rPr>
+          <w:i/>
+          <w:iCs/>
+        </w:rPr>
+        <w:t xml:space="preserve">Limitación residual:</w:t>
+      </w:r>
+      <w:r>
+        <w:t xml:space="preserve"> </w:t>
+      </w:r>
+      <w:r>
+        <w:t xml:space="preserve">ninguna comprobación garantiza hoy que dos magnitudes comparadas sean</w:t>
+      </w:r>
+      <w:r>
+        <w:t xml:space="preserve"> </w:t>
+      </w:r>
+      <w:r>
+        <w:t xml:space="preserve">comparables; lo que hay es la costumbre de desconfiar de un cero exacto.</w:t>
+      </w:r>
+    </w:p>
+    <w:p>
+      <w:pPr>
+        <w:pStyle w:val="Normal"/>
+      </w:pPr>
+      <w:r>
+        <w:rPr>
+          <w:b/>
+          <w:bCs/>
+        </w:rPr>
+        <w:t xml:space="preserve">Escalas de puntuación incompatibles.</w:t>
+      </w:r>
+      <w:r>
+        <w:t xml:space="preserve"> </w:t>
+      </w:r>
+      <w:r>
+        <w:t xml:space="preserve">Una puntuación de fusión calculada sobre dos escalas</w:t>
+      </w:r>
+      <w:r>
+        <w:t xml:space="preserve"> </w:t>
+      </w:r>
+      <w:r>
+        <w:t xml:space="preserve">distintas producía un orden plausible y equivocado.</w:t>
+      </w:r>
+      <w:r>
+        <w:t xml:space="preserve"> </w:t>
+      </w:r>
+      <w:r>
+        <w:rPr>
+          <w:i/>
+          <w:iCs/>
+        </w:rPr>
+        <w:t xml:space="preserve">Consecuencia:</w:t>
+      </w:r>
+      <w:r>
+        <w:t xml:space="preserve"> </w:t>
+      </w:r>
+      <w:r>
+        <w:t xml:space="preserve">el orden de los documentos</w:t>
+      </w:r>
+      <w:r>
+        <w:t xml:space="preserve"> </w:t>
+      </w:r>
+      <w:r>
+        <w:t xml:space="preserve">recuperados no era el que las métricas declaraban.</w:t>
+      </w:r>
+      <w:r>
+        <w:t xml:space="preserve"> </w:t>
+      </w:r>
+      <w:r>
+        <w:rPr>
+          <w:i/>
+          <w:iCs/>
+        </w:rPr>
+        <w:t xml:space="preserve">Corrección:</w:t>
+      </w:r>
+      <w:r>
+        <w:t xml:space="preserve"> </w:t>
+      </w:r>
+      <w:r>
+        <w:t xml:space="preserve">se normalizó antes de fundir.</w:t>
+      </w:r>
+      <w:r>
+        <w:t xml:space="preserve"> </w:t>
+      </w:r>
+      <w:r>
+        <w:rPr>
+          <w:i/>
+          <w:iCs/>
+        </w:rPr>
+        <w:t xml:space="preserve">Limitación residual:</w:t>
+      </w:r>
+      <w:r>
+        <w:t xml:space="preserve"> </w:t>
+      </w:r>
+      <w:r>
+        <w:t xml:space="preserve">el valor absoluto de las puntuaciones anteriores a la corrección no es</w:t>
+      </w:r>
+      <w:r>
+        <w:t xml:space="preserve"> </w:t>
+      </w:r>
+      <w:r>
+        <w:t xml:space="preserve">comparable con el posterior, y por eso los registros conservan las dos versiones.</w:t>
+      </w:r>
+    </w:p>
+    <w:p>
+      <w:pPr>
+        <w:pStyle w:val="Normal"/>
+      </w:pPr>
+      <w:r>
+        <w:rPr>
+          <w:b/>
+          <w:bCs/>
+        </w:rPr>
+        <w:t xml:space="preserve">Evidencia aparentemente insuficiente.</w:t>
+      </w:r>
+      <w:r>
+        <w:t xml:space="preserve"> </w:t>
+      </w:r>
+      <w:r>
+        <w:t xml:space="preserve">Una condición que debía quedarse sin documentación seguía</w:t>
+      </w:r>
+      <w:r>
+        <w:t xml:space="preserve"> </w:t>
+      </w:r>
+      <w:r>
+        <w:t xml:space="preserve">explicando, porque la evidencia que debía haberse retirado seguía alcanzable por otra vía.</w:t>
+      </w:r>
+      <w:r>
+        <w:t xml:space="preserve"> </w:t>
+      </w:r>
+      <w:r>
+        <w:rPr>
+          <w:i/>
+          <w:iCs/>
+        </w:rPr>
+        <w:t xml:space="preserve">Consecuencia:</w:t>
+      </w:r>
+      <w:r>
+        <w:t xml:space="preserve"> </w:t>
+      </w:r>
+      <w:r>
+        <w:t xml:space="preserve">la condición no manipulaba lo que decía manipular.</w:t>
+      </w:r>
+      <w:r>
+        <w:t xml:space="preserve"> </w:t>
+      </w:r>
+      <w:r>
+        <w:rPr>
+          <w:i/>
+          <w:iCs/>
+        </w:rPr>
+        <w:t xml:space="preserve">Corrección:</w:t>
+      </w:r>
+      <w:r>
+        <w:t xml:space="preserve"> </w:t>
+      </w:r>
+      <w:r>
+        <w:t xml:space="preserve">se retiró del</w:t>
+      </w:r>
+      <w:r>
+        <w:t xml:space="preserve"> </w:t>
+      </w:r>
+      <w:r>
+        <w:t xml:space="preserve">índice y se comprobó la alcanzabilidad antes de ejecutar.</w:t>
+      </w:r>
+      <w:r>
+        <w:t xml:space="preserve"> </w:t>
+      </w:r>
+      <w:r>
+        <w:rPr>
+          <w:i/>
+          <w:iCs/>
+        </w:rPr>
+        <w:t xml:space="preserve">Limitación residual:</w:t>
+      </w:r>
+      <w:r>
+        <w:t xml:space="preserve"> </w:t>
+      </w:r>
+      <w:r>
+        <w:t xml:space="preserve">esa comprobación</w:t>
+      </w:r>
+      <w:r>
+        <w:t xml:space="preserve"> </w:t>
+      </w:r>
+      <w:r>
+        <w:t xml:space="preserve">previa es hoy obligatoria en el protocolo, y es la que el rediseño del distractor aplicó.</w:t>
+      </w:r>
+    </w:p>
+    <w:p>
+      <w:pPr>
+        <w:pStyle w:val="Normal"/>
+      </w:pPr>
+      <w:r>
+        <w:rPr>
+          <w:b/>
+          <w:bCs/>
+        </w:rPr>
+        <w:t xml:space="preserve">Códigos de avería genéricos.</w:t>
+      </w:r>
+      <w:r>
+        <w:t xml:space="preserve"> </w:t>
+      </w:r>
+      <w:r>
+        <w:t xml:space="preserve">Un código demasiado general hacía parecer que no existía</w:t>
+      </w:r>
+      <w:r>
+        <w:t xml:space="preserve"> </w:t>
+      </w:r>
+      <w:r>
+        <w:t xml:space="preserve">documentación aplicable cuando sí existía.</w:t>
+      </w:r>
+      <w:r>
+        <w:t xml:space="preserve"> </w:t>
+      </w:r>
+      <w:r>
+        <w:rPr>
+          <w:i/>
+          <w:iCs/>
+        </w:rPr>
+        <w:t xml:space="preserve">Consecuencia:</w:t>
+      </w:r>
+      <w:r>
+        <w:t xml:space="preserve"> </w:t>
+      </w:r>
+      <w:r>
+        <w:t xml:space="preserve">una abstención correcta por el motivo</w:t>
+      </w:r>
+      <w:r>
+        <w:t xml:space="preserve"> </w:t>
+      </w:r>
+      <w:r>
+        <w:t xml:space="preserve">equivocado, que es indistinguible de la correcta si solo se mira el veredicto.</w:t>
+      </w:r>
+      <w:r>
+        <w:t xml:space="preserve"> </w:t>
+      </w:r>
+      <w:r>
+        <w:rPr>
+          <w:i/>
+          <w:iCs/>
+        </w:rPr>
+        <w:t xml:space="preserve">Corrección:</w:t>
+      </w:r>
+      <w:r>
+        <w:t xml:space="preserve"> </w:t>
+      </w:r>
+      <w:r>
+        <w:t xml:space="preserve">se</w:t>
+      </w:r>
+      <w:r>
+        <w:t xml:space="preserve"> </w:t>
+      </w:r>
+      <w:r>
+        <w:t xml:space="preserve">acotó el código al que el fallo declara.</w:t>
+      </w:r>
+      <w:r>
+        <w:t xml:space="preserve"> </w:t>
+      </w:r>
+      <w:r>
+        <w:rPr>
+          <w:i/>
+          <w:iCs/>
+        </w:rPr>
+        <w:t xml:space="preserve">Limitación residual:</w:t>
+      </w:r>
+      <w:r>
+        <w:t xml:space="preserve"> </w:t>
+      </w:r>
+      <w:r>
+        <w:t xml:space="preserve">el motivo registrado de cada</w:t>
+      </w:r>
+      <w:r>
+        <w:t xml:space="preserve"> </w:t>
+      </w:r>
+      <w:r>
+        <w:t xml:space="preserve">abstención es, desde entonces, parte del resultado y no un detalle de implementación.</w:t>
+      </w:r>
+    </w:p>
+    <w:p>
+      <w:pPr>
+        <w:pStyle w:val="Normal"/>
+      </w:pPr>
+      <w:r>
+        <w:rPr>
+          <w:b/>
+          <w:bCs/>
+        </w:rPr>
+        <w:t xml:space="preserve">Validación de esquemas.</w:t>
+      </w:r>
+      <w:r>
+        <w:t xml:space="preserve"> </w:t>
+      </w:r>
+      <w:r>
+        <w:t xml:space="preserve">Un esquema demasiado estricto rechazaba respuestas correctas.</w:t>
+      </w:r>
+      <w:r>
+        <w:t xml:space="preserve"> </w:t>
+      </w:r>
+      <w:r>
+        <w:rPr>
+          <w:i/>
+          <w:iCs/>
+        </w:rPr>
+        <w:t xml:space="preserve">Consecuencia:</w:t>
+      </w:r>
+      <w:r>
+        <w:t xml:space="preserve"> </w:t>
+      </w:r>
+      <w:r>
+        <w:t xml:space="preserve">una tasa de fallo que medía el esquema y no el sistema.</w:t>
+      </w:r>
+      <w:r>
+        <w:t xml:space="preserve"> </w:t>
+      </w:r>
+      <w:r>
+        <w:rPr>
+          <w:i/>
+          <w:iCs/>
+        </w:rPr>
+        <w:t xml:space="preserve">Corrección:</w:t>
+      </w:r>
+      <w:r>
+        <w:t xml:space="preserve"> </w:t>
+      </w:r>
+      <w:r>
+        <w:t xml:space="preserve">se relajó a lo</w:t>
+      </w:r>
+      <w:r>
+        <w:t xml:space="preserve"> </w:t>
+      </w:r>
+      <w:r>
+        <w:t xml:space="preserve">que el contrato exige.</w:t>
+      </w:r>
+      <w:r>
+        <w:t xml:space="preserve"> </w:t>
+      </w:r>
+      <w:r>
+        <w:rPr>
+          <w:i/>
+          <w:iCs/>
+        </w:rPr>
+        <w:t xml:space="preserve">Limitación residual:</w:t>
+      </w:r>
+      <w:r>
+        <w:t xml:space="preserve"> </w:t>
+      </w:r>
+      <w:r>
+        <w:t xml:space="preserve">una validación de forma no dice nada sobre el</w:t>
+      </w:r>
+      <w:r>
+        <w:t xml:space="preserve"> </w:t>
+      </w:r>
+      <w:r>
+        <w:t xml:space="preserve">contenido, y el hallazgo sobre la fidelidad numérica lo confirma: siete salidas pasaron el esquema</w:t>
+      </w:r>
+      <w:r>
+        <w:t xml:space="preserve"> </w:t>
+      </w:r>
+      <w:r>
+        <w:t xml:space="preserve">llevando dentro una cifra que el verificador nunca produjo.</w:t>
+      </w:r>
+    </w:p>
+    <w:p>
+      <w:pPr>
+        <w:pStyle w:val="Normal"/>
+      </w:pPr>
+      <w:r>
+        <w:rPr>
+          <w:b/>
+          <w:bCs/>
+        </w:rPr>
+        <w:t xml:space="preserve">Filtrado documental.</w:t>
+      </w:r>
+      <w:r>
+        <w:t xml:space="preserve"> </w:t>
+      </w:r>
+      <w:r>
+        <w:t xml:space="preserve">Un filtro por motor ocultaba un efecto aparente del idioma y, al mismo</w:t>
+      </w:r>
+      <w:r>
+        <w:t xml:space="preserve"> </w:t>
+      </w:r>
+      <w:r>
+        <w:t xml:space="preserve">tiempo, impedía que la condición con distractor introdujera el distractor.</w:t>
+      </w:r>
+      <w:r>
+        <w:t xml:space="preserve"> </w:t>
+      </w:r>
+      <w:r>
+        <w:rPr>
+          <w:i/>
+          <w:iCs/>
+        </w:rPr>
+        <w:t xml:space="preserve">Consecuencia:</w:t>
+      </w:r>
+      <w:r>
+        <w:t xml:space="preserve"> </w:t>
+      </w:r>
+      <w:r>
+        <w:t xml:space="preserve">dos</w:t>
+      </w:r>
+      <w:r>
+        <w:t xml:space="preserve"> </w:t>
+      </w:r>
+      <w:r>
+        <w:t xml:space="preserve">mediciones distintas quedaron sin interpretar.</w:t>
+      </w:r>
+      <w:r>
+        <w:t xml:space="preserve"> </w:t>
+      </w:r>
+      <w:r>
+        <w:rPr>
+          <w:i/>
+          <w:iCs/>
+        </w:rPr>
+        <w:t xml:space="preserve">Corrección:</w:t>
+      </w:r>
+      <w:r>
+        <w:t xml:space="preserve"> </w:t>
+      </w:r>
+      <w:r>
+        <w:t xml:space="preserve">se midió sin filtro y se rediseñó la</w:t>
+      </w:r>
+      <w:r>
+        <w:t xml:space="preserve"> </w:t>
+      </w:r>
+      <w:r>
+        <w:t xml:space="preserve">condición.</w:t>
+      </w:r>
+      <w:r>
+        <w:t xml:space="preserve"> </w:t>
+      </w:r>
+      <w:r>
+        <w:rPr>
+          <w:i/>
+          <w:iCs/>
+        </w:rPr>
+        <w:t xml:space="preserve">Limitación residual:</w:t>
+      </w:r>
+      <w:r>
+        <w:t xml:space="preserve"> </w:t>
+      </w:r>
+      <w:r>
+        <w:t xml:space="preserve">el rediseño descansa en tres casos construidos.</w:t>
+      </w:r>
+    </w:p>
+    <w:p>
+      <w:pPr>
+        <w:pStyle w:val="Normal"/>
+      </w:pPr>
+      <w:r>
+        <w:rPr>
+          <w:b/>
+          <w:bCs/>
+        </w:rPr>
+        <w:t xml:space="preserve">Espacios vectoriales incompatibles.</w:t>
+      </w:r>
+      <w:r>
+        <w:t xml:space="preserve"> </w:t>
+      </w:r>
+      <w:r>
+        <w:t xml:space="preserve">Un índice que mezclaba dos espacios producía recuperaciones</w:t>
+      </w:r>
+      <w:r>
+        <w:t xml:space="preserve"> </w:t>
+      </w:r>
+      <w:r>
+        <w:t xml:space="preserve">razonables y mal ordenadas.</w:t>
+      </w:r>
+      <w:r>
+        <w:t xml:space="preserve"> </w:t>
+      </w:r>
+      <w:r>
+        <w:rPr>
+          <w:i/>
+          <w:iCs/>
+        </w:rPr>
+        <w:t xml:space="preserve">Consecuencia:</w:t>
+      </w:r>
+      <w:r>
+        <w:t xml:space="preserve"> </w:t>
+      </w:r>
+      <w:r>
+        <w:t xml:space="preserve">las cifras de recuperación anteriores a la corrección no</w:t>
+      </w:r>
+      <w:r>
+        <w:t xml:space="preserve"> </w:t>
+      </w:r>
+      <w:r>
+        <w:t xml:space="preserve">son comparables con las posteriores, y el ajuste del redactor se hizo con ejemplos generados por la</w:t>
+      </w:r>
+      <w:r>
+        <w:t xml:space="preserve"> </w:t>
+      </w:r>
+      <w:r>
+        <w:t xml:space="preserve">recuperación anterior.</w:t>
+      </w:r>
+      <w:r>
+        <w:t xml:space="preserve"> </w:t>
+      </w:r>
+      <w:r>
+        <w:rPr>
+          <w:i/>
+          <w:iCs/>
+        </w:rPr>
+        <w:t xml:space="preserve">Corrección:</w:t>
+      </w:r>
+      <w:r>
+        <w:t xml:space="preserve"> </w:t>
+      </w:r>
+      <w:r>
+        <w:t xml:space="preserve">se reconstruyó el índice y se reejecutó la recuperación.</w:t>
+      </w:r>
+      <w:r>
+        <w:t xml:space="preserve"> </w:t>
+      </w:r>
+      <w:r>
+        <w:rPr>
+          <w:i/>
+          <w:iCs/>
+        </w:rPr>
+        <w:t xml:space="preserve">Limitación residual:</w:t>
+      </w:r>
+      <w:r>
+        <w:t xml:space="preserve"> </w:t>
+      </w:r>
+      <w:r>
+        <w:t xml:space="preserve">la contaminación del adaptador</w:t>
+      </w:r>
+      <w:r>
+        <w:t xml:space="preserve"> </w:t>
+      </w:r>
+      <w:r>
+        <w:rPr>
+          <w:b/>
+          <w:bCs/>
+        </w:rPr>
+        <w:t xml:space="preserve">no se ha corregido</w:t>
+      </w:r>
+      <w:r>
+        <w:t xml:space="preserve">, porque exigiría</w:t>
+      </w:r>
+      <w:r>
+        <w:t xml:space="preserve"> </w:t>
+      </w:r>
+      <w:r>
+        <w:t xml:space="preserve">reajustarlo, y queda declarada entre las limitaciones.</w:t>
+      </w:r>
+    </w:p>
+    <w:p>
+      <w:pPr>
+        <w:pStyle w:val="Normal"/>
+      </w:pPr>
+      <w:r>
+        <w:rPr>
+          <w:b/>
+          <w:bCs/>
+        </w:rPr>
+        <w:t xml:space="preserve">Lo que esto significa para la pregunta de investigación.</w:t>
+      </w:r>
+      <w:r>
+        <w:t xml:space="preserve"> </w:t>
+      </w:r>
+      <w:r>
+        <w:t xml:space="preserve">El trabajo pregunta si un sistema puede</w:t>
+      </w:r>
+      <w:r>
+        <w:t xml:space="preserve"> </w:t>
+      </w:r>
+      <w:r>
+        <w:t xml:space="preserve">distinguir entre tener una referencia y tener soporte. Los siete casos anteriores muestran que esa</w:t>
+      </w:r>
+      <w:r>
+        <w:t xml:space="preserve"> </w:t>
+      </w:r>
+      <w:r>
+        <w:t xml:space="preserve">distinción no es solo el objeto de estudio: es también la condición de que el estudio mida algo. Un</w:t>
+      </w:r>
+      <w:r>
+        <w:t xml:space="preserve"> </w:t>
+      </w:r>
+      <w:r>
+        <w:t xml:space="preserve">procedimiento experimental que no la aplique sobre sí mismo producirá cifras con referencia y sin</w:t>
+      </w:r>
+      <w:r>
+        <w:t xml:space="preserve"> </w:t>
+      </w:r>
+      <w:r>
+        <w:t xml:space="preserve">soporte, igual que el sistema que examina. De ahí que cada corrección quede fechada, con su</w:t>
+      </w:r>
+      <w:r>
+        <w:t xml:space="preserve"> </w:t>
+      </w:r>
+      <w:r>
+        <w:t xml:space="preserve">consecuencia si no se hubiera detectado, y que los registros conserven las versiones anteriores en</w:t>
+      </w:r>
+      <w:r>
+        <w:t xml:space="preserve"> </w:t>
+      </w:r>
+      <w:r>
+        <w:t xml:space="preserve">lugar de sustituirlas.</w:t>
       </w:r>
     </w:p>
     <w:p>
@@ -25924,11 +26585,697 @@
         </w:numPr>
         <w:pStyle w:val="TtuloApartado"/>
       </w:pPr>
-      <w:bookmarkStart w:id="171" w:name="_abc527d437527ea60fa9520fa4ad104aa094e74"/>
+      <w:bookmarkStart w:id="171" w:name="_815d43c319da4d019a2c15f9e193075aa1ef490"/>
+      <w:r>
+        <w:t xml:space="preserve">Comparación con los trabajos revisados</w:t>
+      </w:r>
+      <w:bookmarkEnd w:id="171"/>
+    </w:p>
+    <w:p>
+      <w:pPr>
+        <w:pStyle w:val="Normal"/>
+      </w:pPr>
+      <w:r>
+        <w:t xml:space="preserve">El capítulo 3 ordenó la revisión en seis frentes y señaló, para cada uno, qué establece y qué deja</w:t>
+      </w:r>
+      <w:r>
+        <w:t xml:space="preserve"> </w:t>
+      </w:r>
+      <w:r>
+        <w:t xml:space="preserve">sin medir. Conviene volver sobre esa tabla con los resultados delante, porque es lo que separa una</w:t>
+      </w:r>
+      <w:r>
+        <w:t xml:space="preserve"> </w:t>
+      </w:r>
+      <w:r>
+        <w:t xml:space="preserve">aportación de una repetición.</w:t>
+      </w:r>
+    </w:p>
+    <w:p>
+      <w:pPr>
+        <w:pStyle w:val="Normal"/>
+      </w:pPr>
+      <w:r>
+        <w:rPr>
+          <w:b/>
+          <w:bCs/>
+        </w:rPr>
+        <w:t xml:space="preserve">Diagnóstico sobre telemetría de vehículo.</w:t>
+      </w:r>
+      <w:r>
+        <w:t xml:space="preserve"> </w:t>
+      </w:r>
+      <w:r>
+        <w:t xml:space="preserve">Michailidis et al. (2025), Rimpas et al. (2020),</w:t>
+      </w:r>
+      <w:r>
+        <w:t xml:space="preserve"> </w:t>
+      </w:r>
+      <w:r>
+        <w:t xml:space="preserve">Jun et al. (2025), Prytz et al. (2015), Hossain et al. (2024) y Abboush et al. (2026) establecen que</w:t>
+      </w:r>
+      <w:r>
+        <w:t xml:space="preserve"> </w:t>
+      </w:r>
+      <w:r>
+        <w:t xml:space="preserve">la telemetría embarcada sostiene la detección y la clasificación de averías. El resultado de este</w:t>
+      </w:r>
+      <w:r>
+        <w:t xml:space="preserve"> </w:t>
+      </w:r>
+      <w:r>
+        <w:t xml:space="preserve">trabajo —0,878 de exactitud frente a 0,286 de la clase mayoritaria—</w:t>
+      </w:r>
+      <w:r>
+        <w:t xml:space="preserve"> </w:t>
+      </w:r>
+      <w:r>
+        <w:rPr>
+          <w:b/>
+          <w:bCs/>
+        </w:rPr>
+        <w:t xml:space="preserve">no mejora nada de lo que esos</w:t>
+      </w:r>
+      <w:r>
+        <w:rPr>
+          <w:b/>
+          <w:bCs/>
+        </w:rPr>
+        <w:t xml:space="preserve"> </w:t>
+      </w:r>
+      <w:r>
+        <w:rPr>
+          <w:b/>
+          <w:bCs/>
+        </w:rPr>
+        <w:t xml:space="preserve">estudios ya muestran</w:t>
+      </w:r>
+      <w:r>
+        <w:t xml:space="preserve">, y además se obtiene sobre telemetría sintética de un solo vehículo. No es</w:t>
+      </w:r>
+      <w:r>
+        <w:t xml:space="preserve"> </w:t>
+      </w:r>
+      <w:r>
+        <w:t xml:space="preserve">una aportación: es la condición previa que el resto del recorrido necesitaba, y se declara como tal.</w:t>
+      </w:r>
+      <w:r>
+        <w:t xml:space="preserve"> </w:t>
+      </w:r>
+      <w:r>
+        <w:t xml:space="preserve">Lo que esos trabajos no miden es la</w:t>
+      </w:r>
+      <w:r>
+        <w:t xml:space="preserve"> </w:t>
+      </w:r>
+      <w:r>
+        <w:rPr>
+          <w:b/>
+          <w:bCs/>
+        </w:rPr>
+        <w:t xml:space="preserve">explicación</w:t>
+      </w:r>
+      <w:r>
+        <w:t xml:space="preserve"> </w:t>
+      </w:r>
+      <w:r>
+        <w:t xml:space="preserve">del diagnóstico; su salida es una clase o una</w:t>
+      </w:r>
+      <w:r>
+        <w:t xml:space="preserve"> </w:t>
+      </w:r>
+      <w:r>
+        <w:t xml:space="preserve">puntuación, y qué la sostiene documentalmente queda fuera de su objeto.</w:t>
+      </w:r>
+    </w:p>
+    <w:p>
+      <w:pPr>
+        <w:pStyle w:val="Normal"/>
+      </w:pPr>
+      <w:r>
+        <w:rPr>
+          <w:b/>
+          <w:bCs/>
+        </w:rPr>
+        <w:t xml:space="preserve">Explicabilidad.</w:t>
+      </w:r>
+      <w:r>
+        <w:t xml:space="preserve"> </w:t>
+      </w:r>
+      <w:r>
+        <w:t xml:space="preserve">Lundberg y Lee (2017) establecen un método de atribución consistente, y</w:t>
+      </w:r>
+      <w:r>
+        <w:t xml:space="preserve"> </w:t>
+      </w:r>
+      <w:r>
+        <w:t xml:space="preserve">Brusa et al. (2023), Haque et al. (2025), Li y van Leeuwen (2023) y Lu et al. (2025) lo aplican al</w:t>
+      </w:r>
+      <w:r>
+        <w:t xml:space="preserve"> </w:t>
+      </w:r>
+      <w:r>
+        <w:t xml:space="preserve">diagnóstico. Ninguno mide si lo atribuido</w:t>
+      </w:r>
+      <w:r>
+        <w:t xml:space="preserve"> </w:t>
+      </w:r>
+      <w:r>
+        <w:rPr>
+          <w:b/>
+          <w:bCs/>
+        </w:rPr>
+        <w:t xml:space="preserve">basta</w:t>
+      </w:r>
+      <w:r>
+        <w:t xml:space="preserve"> </w:t>
+      </w:r>
+      <w:r>
+        <w:t xml:space="preserve">para justificar la hipótesis. Este trabajo añade</w:t>
+      </w:r>
+      <w:r>
+        <w:t xml:space="preserve"> </w:t>
+      </w:r>
+      <w:r>
+        <w:t xml:space="preserve">una medición sobre ese hueco, y su resultado es negativo: la ablación</w:t>
+      </w:r>
+      <w:r>
+        <w:t xml:space="preserve"> </w:t>
+      </w:r>
+      <w:r>
+        <w:rPr>
+          <w:rStyle w:val="VerbatimChar"/>
+        </w:rPr>
+        <w:t xml:space="preserve">A1</w:t>
+      </w:r>
+      <w:r>
+        <w:t xml:space="preserve"> </w:t>
+      </w:r>
+      <w:r>
+        <w:t xml:space="preserve">sustituye la atribución</w:t>
+      </w:r>
+      <w:r>
+        <w:t xml:space="preserve"> </w:t>
+      </w:r>
+      <w:r>
+        <w:t xml:space="preserve">por un criterio estadístico simple y</w:t>
+      </w:r>
+      <w:r>
+        <w:t xml:space="preserve"> </w:t>
+      </w:r>
+      <w:r>
+        <w:rPr>
+          <w:b/>
+          <w:bCs/>
+        </w:rPr>
+        <w:t xml:space="preserve">no cambia ninguna de las dos tasas de error</w:t>
+      </w:r>
+      <w:r>
+        <w:t xml:space="preserve"> </w:t>
+      </w:r>
+      <w:r>
+        <w:t xml:space="preserve">ni ninguna</w:t>
+      </w:r>
+      <w:r>
+        <w:t xml:space="preserve"> </w:t>
+      </w:r>
+      <w:r>
+        <w:t xml:space="preserve">decisión. La atribución, en este recorrido, explica la predicción y no interviene en la decisión de</w:t>
+      </w:r>
+      <w:r>
+        <w:t xml:space="preserve"> </w:t>
+      </w:r>
+      <w:r>
+        <w:t xml:space="preserve">explicar o callarse. Es un resultado que conviene no suavizar, porque contradice la expectativa con</w:t>
+      </w:r>
+      <w:r>
+        <w:t xml:space="preserve"> </w:t>
+      </w:r>
+      <w:r>
+        <w:t xml:space="preserve">que se incorporó.</w:t>
+      </w:r>
+    </w:p>
+    <w:p>
+      <w:pPr>
+        <w:pStyle w:val="Normal"/>
+      </w:pPr>
+      <w:r>
+        <w:rPr>
+          <w:b/>
+          <w:bCs/>
+        </w:rPr>
+        <w:t xml:space="preserve">Recuperación aumentada sobre documentación técnica.</w:t>
+      </w:r>
+      <w:r>
+        <w:t xml:space="preserve"> </w:t>
+      </w:r>
+      <w:r>
+        <w:t xml:space="preserve">Lewis et al. (2020) y Gao et al. (2023)</w:t>
+      </w:r>
+      <w:r>
+        <w:t xml:space="preserve"> </w:t>
+      </w:r>
+      <w:r>
+        <w:t xml:space="preserve">establecen el patrón, y Nam et al. (2025), Mahale et al. (2025), Lin y Miao (2025), Khan et al.</w:t>
+      </w:r>
+      <w:r>
+        <w:t xml:space="preserve"> </w:t>
+      </w:r>
+      <w:r>
+        <w:t xml:space="preserve">(2024) y Das et al. (2025) lo llevan a documentación técnica y a diagnóstico. Lo que no miden es la</w:t>
+      </w:r>
+      <w:r>
+        <w:t xml:space="preserve"> </w:t>
+      </w:r>
+      <w:r>
+        <w:t xml:space="preserve">correspondencia</w:t>
+      </w:r>
+      <w:r>
+        <w:t xml:space="preserve"> </w:t>
+      </w:r>
+      <w:r>
+        <w:rPr>
+          <w:b/>
+          <w:bCs/>
+        </w:rPr>
+        <w:t xml:space="preserve">afirmación a afirmación</w:t>
+      </w:r>
+      <w:r>
+        <w:t xml:space="preserve"> </w:t>
+      </w:r>
+      <w:r>
+        <w:t xml:space="preserve">con la evidencia concreta, ni el comportamiento cuando</w:t>
+      </w:r>
+      <w:r>
+        <w:t xml:space="preserve"> </w:t>
+      </w:r>
+      <w:r>
+        <w:t xml:space="preserve">la documentación recuperada está incompleta o ausente. El banco de pruebas con evidencia manipulada</w:t>
+      </w:r>
+      <w:r>
+        <w:t xml:space="preserve"> </w:t>
+      </w:r>
+      <w:r>
+        <w:t xml:space="preserve">—completa, parcial, retirada y con distractor— se dirige a ese segundo hueco, y mide algo que los</w:t>
+      </w:r>
+      <w:r>
+        <w:t xml:space="preserve"> </w:t>
+      </w:r>
+      <w:r>
+        <w:t xml:space="preserve">trabajos revisados no plantean: que con cinco a siete fragmentos aplicables delante el sistema se</w:t>
+      </w:r>
+      <w:r>
+        <w:t xml:space="preserve"> </w:t>
+      </w:r>
+      <w:r>
+        <w:t xml:space="preserve">abstenga igual, porque ninguno cubre lo que se quería afirmar. La aportación está en el</w:t>
+      </w:r>
+      <w:r>
+        <w:t xml:space="preserve"> </w:t>
+      </w:r>
+      <w:r>
+        <w:t xml:space="preserve">procedimiento de medición, no en el mecanismo de recuperación, que es el conocido.</w:t>
+      </w:r>
+    </w:p>
+    <w:p>
+      <w:pPr>
+        <w:pStyle w:val="Normal"/>
+      </w:pPr>
+      <w:r>
+        <w:rPr>
+          <w:b/>
+          <w:bCs/>
+        </w:rPr>
+        <w:t xml:space="preserve">Alucinación y su mitigación.</w:t>
+      </w:r>
+      <w:r>
+        <w:t xml:space="preserve"> </w:t>
+      </w:r>
+      <w:r>
+        <w:t xml:space="preserve">Shuster et al. (2021) establecen que la recuperación reduce la</w:t>
+      </w:r>
+      <w:r>
+        <w:t xml:space="preserve"> </w:t>
+      </w:r>
+      <w:r>
+        <w:t xml:space="preserve">alucinación y Béchard y Marquez Ayala (2024) que el formato estructurado la reduce más. Ji et al.</w:t>
+      </w:r>
+      <w:r>
+        <w:t xml:space="preserve"> </w:t>
+      </w:r>
+      <w:r>
+        <w:t xml:space="preserve">(2023) delimitan el fenómeno. Ninguno mide si esa reducción</w:t>
+      </w:r>
+      <w:r>
+        <w:t xml:space="preserve"> </w:t>
+      </w:r>
+      <w:r>
+        <w:rPr>
+          <w:b/>
+          <w:bCs/>
+        </w:rPr>
+        <w:t xml:space="preserve">basta</w:t>
+      </w:r>
+      <w:r>
+        <w:t xml:space="preserve">. Aquí hay una medición directa</w:t>
+      </w:r>
+      <w:r>
+        <w:t xml:space="preserve"> </w:t>
+      </w:r>
+      <w:r>
+        <w:t xml:space="preserve">sobre ese punto, y es la más incómoda del trabajo:</w:t>
+      </w:r>
+      <w:r>
+        <w:t xml:space="preserve"> </w:t>
+      </w:r>
+      <w:r>
+        <w:rPr>
+          <w:b/>
+          <w:bCs/>
+        </w:rPr>
+        <w:t xml:space="preserve">siete de las treinta y cinco salidas</w:t>
+      </w:r>
+      <w:r>
+        <w:t xml:space="preserve"> </w:t>
+      </w:r>
+      <w:r>
+        <w:t xml:space="preserve">del</w:t>
+      </w:r>
+      <w:r>
+        <w:t xml:space="preserve"> </w:t>
+      </w:r>
+      <w:r>
+        <w:t xml:space="preserve">redactor contienen al menos una cifra que el verificador no produjo, y lo hacen</w:t>
+      </w:r>
+      <w:r>
+        <w:t xml:space="preserve"> </w:t>
+      </w:r>
+      <w:r>
+        <w:rPr>
+          <w:b/>
+          <w:bCs/>
+        </w:rPr>
+        <w:t xml:space="preserve">teniendo</w:t>
+      </w:r>
+      <w:r>
+        <w:t xml:space="preserve"> </w:t>
+      </w:r>
+      <w:r>
+        <w:t xml:space="preserve">recuperación y</w:t>
+      </w:r>
+      <w:r>
+        <w:t xml:space="preserve"> </w:t>
+      </w:r>
+      <w:r>
+        <w:rPr>
+          <w:b/>
+          <w:bCs/>
+        </w:rPr>
+        <w:t xml:space="preserve">teniendo</w:t>
+      </w:r>
+      <w:r>
+        <w:t xml:space="preserve"> </w:t>
+      </w:r>
+      <w:r>
+        <w:t xml:space="preserve">salida estructurada. Las dos mitigaciones que esos trabajos acreditan</w:t>
+      </w:r>
+      <w:r>
+        <w:t xml:space="preserve"> </w:t>
+      </w:r>
+      <w:r>
+        <w:t xml:space="preserve">estaban activas y no impidieron el defecto. Ninguna tasa del sistema cambia por ello, porque las</w:t>
+      </w:r>
+      <w:r>
+        <w:t xml:space="preserve"> </w:t>
+      </w:r>
+      <w:r>
+        <w:t xml:space="preserve">produce el verificador determinista; lo que queda sin garantizar es que el texto que el usuario lee</w:t>
+      </w:r>
+      <w:r>
+        <w:t xml:space="preserve"> </w:t>
+      </w:r>
+      <w:r>
+        <w:t xml:space="preserve">diga los números que el sistema calculó.</w:t>
+      </w:r>
+    </w:p>
+    <w:p>
+      <w:pPr>
+        <w:pStyle w:val="Normal"/>
+      </w:pPr>
+      <w:r>
+        <w:rPr>
+          <w:b/>
+          <w:bCs/>
+        </w:rPr>
+        <w:t xml:space="preserve">Abstención.</w:t>
+      </w:r>
+      <w:r>
+        <w:t xml:space="preserve"> </w:t>
+      </w:r>
+      <w:r>
+        <w:t xml:space="preserve">Chow (1970) y Geifman y El-Yaniv (2017) establecen que no responder es una salida</w:t>
+      </w:r>
+      <w:r>
+        <w:t xml:space="preserve"> </w:t>
+      </w:r>
+      <w:r>
+        <w:t xml:space="preserve">legítima cuya calidad se mide por la relación entre riesgo y cobertura. Los dos operan sobre el</w:t>
+      </w:r>
+      <w:r>
+        <w:t xml:space="preserve"> </w:t>
+      </w:r>
+      <w:r>
+        <w:t xml:space="preserve">propio clasificador: la decisión de abstenerse se toma con la confianza del modelo. Este trabajo la</w:t>
+      </w:r>
+      <w:r>
+        <w:t xml:space="preserve"> </w:t>
+      </w:r>
+      <w:r>
+        <w:t xml:space="preserve">desplaza fuera del modelo, a un verificador determinista que examina evidencia documental, y mide</w:t>
+      </w:r>
+      <w:r>
+        <w:t xml:space="preserve"> </w:t>
+      </w:r>
+      <w:r>
+        <w:t xml:space="preserve">qué pasa: sobre el conjunto de prueba, ninguna de las catorce ejecuciones que debían callarse</w:t>
+      </w:r>
+      <w:r>
+        <w:t xml:space="preserve"> </w:t>
+      </w:r>
+      <w:r>
+        <w:t xml:space="preserve">terminó en explicación, al precio de dos abstenciones innecesarias de ocho. La ablación</w:t>
+      </w:r>
+      <w:r>
+        <w:t xml:space="preserve"> </w:t>
+      </w:r>
+      <w:r>
+        <w:rPr>
+          <w:rStyle w:val="VerbatimChar"/>
+        </w:rPr>
+        <w:t xml:space="preserve">A4</w:t>
+      </w:r>
+      <w:r>
+        <w:t xml:space="preserve"> </w:t>
+      </w:r>
+      <w:r>
+        <w:t xml:space="preserve">indica</w:t>
+      </w:r>
+      <w:r>
+        <w:t xml:space="preserve"> </w:t>
+      </w:r>
+      <w:r>
+        <w:t xml:space="preserve">dónde está el mecanismo: con una puerta de confianza sola —que es el esquema de los trabajos</w:t>
+      </w:r>
+      <w:r>
+        <w:t xml:space="preserve"> </w:t>
+      </w:r>
+      <w:r>
+        <w:t xml:space="preserve">revisados— la falsa confianza aparece en las nueve ejecuciones. El desplazamiento de la decisión</w:t>
+      </w:r>
+      <w:r>
+        <w:t xml:space="preserve"> </w:t>
+      </w:r>
+      <w:r>
+        <w:t xml:space="preserve">fuera del modelo es la diferencia, y está medida en una sola configuración.</w:t>
+      </w:r>
+    </w:p>
+    <w:p>
+      <w:pPr>
+        <w:pStyle w:val="Normal"/>
+      </w:pPr>
+      <w:r>
+        <w:rPr>
+          <w:b/>
+          <w:bCs/>
+        </w:rPr>
+        <w:t xml:space="preserve">Calibración de la confianza.</w:t>
+      </w:r>
+      <w:r>
+        <w:t xml:space="preserve"> </w:t>
+      </w:r>
+      <w:r>
+        <w:t xml:space="preserve">Guo et al. (2017), Niculescu-Mizil y Caruana (2005),</w:t>
+      </w:r>
+      <w:r>
+        <w:t xml:space="preserve"> </w:t>
+      </w:r>
+      <w:r>
+        <w:t xml:space="preserve">Zadrozny y Elkan (2002) y Naeini et al. (2015) establecen que la probabilidad declarada por un</w:t>
+      </w:r>
+      <w:r>
+        <w:t xml:space="preserve"> </w:t>
+      </w:r>
+      <w:r>
+        <w:t xml:space="preserve">clasificador no coincide con su acierto y cómo corregirlo. Ninguno examina esa confianza como</w:t>
+      </w:r>
+      <w:r>
+        <w:t xml:space="preserve"> </w:t>
+      </w:r>
+      <w:r>
+        <w:rPr>
+          <w:b/>
+          <w:bCs/>
+        </w:rPr>
+        <w:t xml:space="preserve">puerta de decisión junto a evidencia documental</w:t>
+      </w:r>
+      <w:r>
+        <w:t xml:space="preserve">. Aquí la calibración —de 0,144 a 0,085 de error—</w:t>
+      </w:r>
+      <w:r>
+        <w:t xml:space="preserve"> </w:t>
+      </w:r>
+      <w:r>
+        <w:t xml:space="preserve">alimenta esa puerta, y la medición añade algo que esos trabajos no plantean: una confianza bien</w:t>
+      </w:r>
+      <w:r>
+        <w:t xml:space="preserve"> </w:t>
+      </w:r>
+      <w:r>
+        <w:t xml:space="preserve">calibrada y alta</w:t>
+      </w:r>
+      <w:r>
+        <w:t xml:space="preserve"> </w:t>
+      </w:r>
+      <w:r>
+        <w:rPr>
+          <w:b/>
+          <w:bCs/>
+        </w:rPr>
+        <w:t xml:space="preserve">no basta</w:t>
+      </w:r>
+      <w:r>
+        <w:t xml:space="preserve">, porque en la ablación que retira el criterio documental el sistema</w:t>
+      </w:r>
+      <w:r>
+        <w:t xml:space="preserve"> </w:t>
+      </w:r>
+      <w:r>
+        <w:t xml:space="preserve">explica con confianza las nueve ejecuciones que debían terminar calladas.</w:t>
+      </w:r>
+    </w:p>
+    <w:p>
+      <w:pPr>
+        <w:pStyle w:val="Normal"/>
+      </w:pPr>
+      <w:r>
+        <w:rPr>
+          <w:b/>
+          <w:bCs/>
+        </w:rPr>
+        <w:t xml:space="preserve">Dónde este trabajo queda por debajo de lo revisado.</w:t>
+      </w:r>
+      <w:r>
+        <w:t xml:space="preserve"> </w:t>
+      </w:r>
+      <w:r>
+        <w:t xml:space="preserve">En un punto, y conviene decirlo. Varios de</w:t>
+      </w:r>
+      <w:r>
+        <w:t xml:space="preserve"> </w:t>
+      </w:r>
+      <w:r>
+        <w:t xml:space="preserve">los trabajos sobre recuperación evalúan sus salidas contra un juicio humano o contra conjuntos</w:t>
+      </w:r>
+      <w:r>
+        <w:t xml:space="preserve"> </w:t>
+      </w:r>
+      <w:r>
+        <w:t xml:space="preserve">anotados con respuestas de referencia. Aquí la correspondencia entre una afirmación y su evidencia</w:t>
+      </w:r>
+      <w:r>
+        <w:t xml:space="preserve"> </w:t>
+      </w:r>
+      <w:r>
+        <w:t xml:space="preserve">la establecen las comprobaciones del propio verificador, y no se ha contrastado con un lector</w:t>
+      </w:r>
+      <w:r>
+        <w:t xml:space="preserve"> </w:t>
+      </w:r>
+      <w:r>
+        <w:t xml:space="preserve">externo. La trazabilidad se cumple por construcción; medirla exigiría la anotación que la</w:t>
+      </w:r>
+      <w:r>
+        <w:t xml:space="preserve"> </w:t>
+      </w:r>
+      <w:r>
+        <w:t xml:space="preserve">prospectiva propone como primera línea.</w:t>
+      </w:r>
+    </w:p>
+    <w:p>
+      <w:pPr>
+        <w:pStyle w:val="Normal"/>
+      </w:pPr>
+      <w:r>
+        <w:rPr>
+          <w:b/>
+          <w:bCs/>
+        </w:rPr>
+        <w:t xml:space="preserve">Lo que no es nuevo, dicho sin rodeos.</w:t>
+      </w:r>
+      <w:r>
+        <w:t xml:space="preserve"> </w:t>
+      </w:r>
+      <w:r>
+        <w:t xml:space="preserve">Ni la recuperación aumentada, ni la atribución por valores</w:t>
+      </w:r>
+      <w:r>
+        <w:t xml:space="preserve"> </w:t>
+      </w:r>
+      <w:r>
+        <w:t xml:space="preserve">de Shapley, ni la calibración isotónica, ni la abstención como salida legítima: los cuatro están</w:t>
+      </w:r>
+      <w:r>
+        <w:t xml:space="preserve"> </w:t>
+      </w:r>
+      <w:r>
+        <w:t xml:space="preserve">descritos en los trabajos revisados y aquí se integran. Lo que no se encontró en ellos es la</w:t>
+      </w:r>
+      <w:r>
+        <w:t xml:space="preserve"> </w:t>
+      </w:r>
+      <w:r>
+        <w:t xml:space="preserve">medición conjunta —qué ocurre cuando un sistema que diagnostica bien recibe evidencia documental</w:t>
+      </w:r>
+      <w:r>
+        <w:t xml:space="preserve"> </w:t>
+      </w:r>
+      <w:r>
+        <w:t xml:space="preserve">manipulada y tiene que decidir si explica—, y es ahí donde este trabajo aporta.</w:t>
+      </w:r>
+    </w:p>
+    <w:p>
+      <w:pPr>
+        <w:numPr>
+          <w:ilvl w:val="0"/>
+          <w:numId w:val="907"/>
+        </w:numPr>
+        <w:pStyle w:val="TtuloApartado"/>
+      </w:pPr>
+      <w:bookmarkStart w:id="172" w:name="_abc527d437527ea60fa9520fa4ad104aa094e74"/>
       <w:r>
         <w:t xml:space="preserve">Contribuciones del trabajo</w:t>
       </w:r>
-      <w:bookmarkEnd w:id="171"/>
+      <w:bookmarkEnd w:id="172"/>
     </w:p>
     <w:p>
       <w:pPr>
@@ -25958,11 +27305,11 @@
         </w:numPr>
         <w:pStyle w:val="Ttulosubapartado"/>
       </w:pPr>
-      <w:bookmarkStart w:id="172" w:name="_f18aa2cc1edcc17b466673d0ef3785ca041ac66"/>
+      <w:bookmarkStart w:id="173" w:name="_f18aa2cc1edcc17b466673d0ef3785ca041ac66"/>
       <w:r>
         <w:t xml:space="preserve">Contribuciones técnicas</w:t>
       </w:r>
-      <w:bookmarkEnd w:id="172"/>
+      <w:bookmarkEnd w:id="173"/>
     </w:p>
     <w:p>
       <w:pPr>
@@ -26070,11 +27417,11 @@
         </w:numPr>
         <w:pStyle w:val="Ttulosubapartado"/>
       </w:pPr>
-      <w:bookmarkStart w:id="173" w:name="_858a404ef0ad9b07b3f0e1c4cf6aaa4d1312966"/>
+      <w:bookmarkStart w:id="174" w:name="_858a404ef0ad9b07b3f0e1c4cf6aaa4d1312966"/>
       <w:r>
         <w:t xml:space="preserve">Contribuciones experimentales</w:t>
       </w:r>
-      <w:bookmarkEnd w:id="173"/>
+      <w:bookmarkEnd w:id="174"/>
     </w:p>
     <w:p>
       <w:pPr>
@@ -26361,11 +27708,11 @@
         </w:numPr>
         <w:pStyle w:val="Ttulosubapartado"/>
       </w:pPr>
-      <w:bookmarkStart w:id="174" w:name="_9151abc5c5a6a374b306237e7747b9d162ea641"/>
+      <w:bookmarkStart w:id="175" w:name="_9151abc5c5a6a374b306237e7747b9d162ea641"/>
       <w:r>
         <w:t xml:space="preserve">Contribución metodológica, complementaria y acotada</w:t>
       </w:r>
-      <w:bookmarkEnd w:id="174"/>
+      <w:bookmarkEnd w:id="175"/>
     </w:p>
     <w:p>
       <w:pPr>
@@ -26631,11 +27978,11 @@
         </w:numPr>
         <w:pStyle w:val="Ttulosubapartado"/>
       </w:pPr>
-      <w:bookmarkStart w:id="175" w:name="_0eb85088bab5c5a235e713ea5e681d5a93db4d7"/>
+      <w:bookmarkStart w:id="176" w:name="_0eb85088bab5c5a235e713ea5e681d5a93db4d7"/>
       <w:r>
         <w:t xml:space="preserve">Limitaciones de las contribuciones</w:t>
       </w:r>
-      <w:bookmarkEnd w:id="175"/>
+      <w:bookmarkEnd w:id="176"/>
     </w:p>
     <w:p>
       <w:pPr>
@@ -26877,11 +28224,11 @@
         </w:numPr>
         <w:pStyle w:val="TtuloApartado"/>
       </w:pPr>
-      <w:bookmarkStart w:id="176" w:name="_limitaciones"/>
+      <w:bookmarkStart w:id="177" w:name="_limitaciones"/>
       <w:r>
         <w:t xml:space="preserve">Limitaciones</w:t>
       </w:r>
-      <w:bookmarkEnd w:id="176"/>
+      <w:bookmarkEnd w:id="177"/>
     </w:p>
     <w:p>
       <w:pPr>
@@ -26960,18 +28307,18 @@
           <wp:inline>
             <wp:extent cx="5364072" cy="4718793"/>
             <wp:effectExtent b="0" l="0" r="0" t="0"/>
-            <wp:docPr descr="Plano de falsa confianza contra abstención innecesaria: el verificador queda en 0 de 9 y 2 de 5; abstenerse siempre, en 0 de 9 y 5 de 5; explicar siempre que el modelo confía, en 9 de 9 y 2 de 5." title="" id="178" name="Picture"/>
+            <wp:docPr descr="Plano de falsa confianza contra abstención innecesaria: el verificador queda en 0 de 9 y 2 de 5; abstenerse siempre, en 0 de 9 y 5 de 5; explicar siempre que el modelo confía, en 9 de 9 y 2 de 5." title="" id="179" name="Picture"/>
             <a:graphic>
               <a:graphicData uri="http://schemas.openxmlformats.org/drawingml/2006/picture">
                 <pic:pic>
                   <pic:nvPicPr>
-                    <pic:cNvPr descr="../../artifacts/figures/memoria/FIG-6-03_compromiso_cobertura_abstencion.png" id="179" name="Picture"/>
+                    <pic:cNvPr descr="../../artifacts/figures/memoria/FIG-6-03_compromiso_cobertura_abstencion.png" id="180" name="Picture"/>
                     <pic:cNvPicPr>
                       <a:picLocks noChangeArrowheads="1" noChangeAspect="1"/>
                     </pic:cNvPicPr>
                   </pic:nvPicPr>
                   <pic:blipFill>
-                    <a:blip r:embed="rId177"/>
+                    <a:blip r:embed="rId178"/>
                     <a:stretch>
                       <a:fillRect/>
                     </a:stretch>
@@ -27123,6 +28470,111 @@
         <w:pStyle w:val="Normal"/>
       </w:pPr>
       <w:r>
+        <w:t xml:space="preserve">Una de las cuatro ablaciones</w:t>
+      </w:r>
+      <w:r>
+        <w:t xml:space="preserve"> </w:t>
+      </w:r>
+      <w:r>
+        <w:rPr>
+          <w:b/>
+          <w:bCs/>
+        </w:rPr>
+        <w:t xml:space="preserve">quedó inconclusa y no se repitió</w:t>
+      </w:r>
+      <w:r>
+        <w:t xml:space="preserve">. La variante</w:t>
+      </w:r>
+      <w:r>
+        <w:t xml:space="preserve"> </w:t>
+      </w:r>
+      <w:r>
+        <w:rPr>
+          <w:rStyle w:val="VerbatimChar"/>
+        </w:rPr>
+        <w:t xml:space="preserve">A2</w:t>
+      </w:r>
+      <w:r>
+        <w:t xml:space="preserve"> </w:t>
+      </w:r>
+      <w:r>
+        <w:t xml:space="preserve">debía medir qué</w:t>
+      </w:r>
+      <w:r>
+        <w:t xml:space="preserve"> </w:t>
+      </w:r>
+      <w:r>
+        <w:t xml:space="preserve">aporta la ruta semántica de recuperación sustituyéndola por una ruta léxica, y la ruta léxica no</w:t>
+      </w:r>
+      <w:r>
+        <w:t xml:space="preserve"> </w:t>
+      </w:r>
+      <w:r>
+        <w:t xml:space="preserve">recuperó nada: la consulta que recibe está redactada en prosa, y una búsqueda por términos sobre un</w:t>
+      </w:r>
+      <w:r>
+        <w:t xml:space="preserve"> </w:t>
+      </w:r>
+      <w:r>
+        <w:t xml:space="preserve">manual de taller indexado por códigos y componentes no encuentra con ella. Lo que no pudo medirse,</w:t>
+      </w:r>
+      <w:r>
+        <w:t xml:space="preserve"> </w:t>
+      </w:r>
+      <w:r>
+        <w:t xml:space="preserve">por tanto, es</w:t>
+      </w:r>
+      <w:r>
+        <w:t xml:space="preserve"> </w:t>
+      </w:r>
+      <w:r>
+        <w:rPr>
+          <w:b/>
+          <w:bCs/>
+        </w:rPr>
+        <w:t xml:space="preserve">cuánto de la ventaja de la recuperación se debe a la vía semántica y cuánto a que la</w:t>
+      </w:r>
+      <w:r>
+        <w:rPr>
+          <w:b/>
+          <w:bCs/>
+        </w:rPr>
+        <w:t xml:space="preserve"> </w:t>
+      </w:r>
+      <w:r>
+        <w:rPr>
+          <w:b/>
+          <w:bCs/>
+        </w:rPr>
+        <w:t xml:space="preserve">consulta vaya guiada por el código de avería</w:t>
+      </w:r>
+      <w:r>
+        <w:t xml:space="preserve">. La conclusión que queda acotada es la de E12: el</w:t>
+      </w:r>
+      <w:r>
+        <w:t xml:space="preserve"> </w:t>
+      </w:r>
+      <w:r>
+        <w:t xml:space="preserve">salto de cero a cinco casos de cinco se observa entre la consulta en prosa y la consulta guiada,</w:t>
+      </w:r>
+      <w:r>
+        <w:t xml:space="preserve"> </w:t>
+      </w:r>
+      <w:r>
+        <w:t xml:space="preserve">pero no está repartido entre esos dos factores. Repetirla exigiría formular una consulta léxica</w:t>
+      </w:r>
+      <w:r>
+        <w:t xml:space="preserve"> </w:t>
+      </w:r>
+      <w:r>
+        <w:t xml:space="preserve">equivalente, que es una medición nueva y no una reejecución, y por eso no se hizo.</w:t>
+      </w:r>
+    </w:p>
+    <w:p>
+      <w:pPr>
+        <w:pStyle w:val="Normal"/>
+      </w:pPr>
+      <w:r>
         <w:t xml:space="preserve">Hay una última condición que afecta a todas las cifras de decisión y que conviene no dejar</w:t>
       </w:r>
       <w:r>
@@ -27177,11 +28629,11 @@
         </w:numPr>
         <w:pStyle w:val="TtuloApartado"/>
       </w:pPr>
-      <w:bookmarkStart w:id="180" w:name="_prospectiva"/>
+      <w:bookmarkStart w:id="181" w:name="_prospectiva"/>
       <w:r>
         <w:t xml:space="preserve">Prospectiva</w:t>
       </w:r>
-      <w:bookmarkEnd w:id="180"/>
+      <w:bookmarkEnd w:id="181"/>
     </w:p>
     <w:p>
       <w:pPr>
@@ -27320,6 +28772,63 @@
       </w:r>
       <w:r>
         <w:t xml:space="preserve">Su evaluación exigiría un conjunto que el ajuste del redactor no haya visto.</w:t>
+      </w:r>
+    </w:p>
+    <w:p>
+      <w:pPr>
+        <w:pStyle w:val="Normal"/>
+      </w:pPr>
+      <w:r>
+        <w:t xml:space="preserve">A esas tres se añade una cuarta, menor en alcance y bien delimitada:</w:t>
+      </w:r>
+      <w:r>
+        <w:t xml:space="preserve"> </w:t>
+      </w:r>
+      <w:r>
+        <w:rPr>
+          <w:b/>
+          <w:bCs/>
+        </w:rPr>
+        <w:t xml:space="preserve">completar la ablación</w:t>
+      </w:r>
+      <w:r>
+        <w:rPr>
+          <w:b/>
+          <w:bCs/>
+        </w:rPr>
+        <w:t xml:space="preserve"> </w:t>
+      </w:r>
+      <w:r>
+        <w:rPr>
+          <w:rStyle w:val="VerbatimChar"/>
+          <w:b/>
+          <w:bCs/>
+        </w:rPr>
+        <w:t xml:space="preserve">A2</w:t>
+      </w:r>
+      <w:r>
+        <w:t xml:space="preserve"> </w:t>
+      </w:r>
+      <w:r>
+        <w:t xml:space="preserve">con una consulta léxica formulada en los términos que un índice por palabras necesita —códigos,</w:t>
+      </w:r>
+      <w:r>
+        <w:t xml:space="preserve"> </w:t>
+      </w:r>
+      <w:r>
+        <w:t xml:space="preserve">componentes y nombres de señal en lugar de prosa—, para separar la contribución de la vía semántica</w:t>
+      </w:r>
+      <w:r>
+        <w:t xml:space="preserve"> </w:t>
+      </w:r>
+      <w:r>
+        <w:t xml:space="preserve">de la de la guía por código de avería. Es una medición nueva, no una reejecución, y de ella depende</w:t>
+      </w:r>
+      <w:r>
+        <w:t xml:space="preserve"> </w:t>
+      </w:r>
+      <w:r>
+        <w:t xml:space="preserve">que la ventaja de recuperación observada pueda atribuirse.</w:t>
       </w:r>
     </w:p>
     <w:p>
@@ -27379,11 +28888,11 @@
         </w:numPr>
         <w:pStyle w:val="TtuloApartado"/>
       </w:pPr>
-      <w:bookmarkStart w:id="181" w:name="_aa4c6f09aa999eafce77a8153cd11976f457860"/>
+      <w:bookmarkStart w:id="182" w:name="_aa4c6f09aa999eafce77a8153cd11976f457860"/>
       <w:r>
         <w:t xml:space="preserve">Consideraciones finales</w:t>
       </w:r>
-      <w:bookmarkEnd w:id="181"/>
+      <w:bookmarkEnd w:id="182"/>
     </w:p>
     <w:p>
       <w:pPr>
@@ -27413,11 +28922,11 @@
       <w:pPr>
         <w:pStyle w:val="Ttulo1"/>
       </w:pPr>
-      <w:bookmarkStart w:id="182" w:name="_bibliografía"/>
+      <w:bookmarkStart w:id="183" w:name="_bibliografía"/>
       <w:r>
         <w:t xml:space="preserve">Bibliografía</w:t>
       </w:r>
-      <w:bookmarkEnd w:id="182"/>
+      <w:bookmarkEnd w:id="183"/>
     </w:p>
     <w:p>
       <w:pPr>
@@ -28281,11 +29790,11 @@
       <w:pPr>
         <w:pStyle w:val="Ttulo1"/>
       </w:pPr>
-      <w:bookmarkStart w:id="183" w:name="_anexos"/>
+      <w:bookmarkStart w:id="184" w:name="_anexos"/>
       <w:r>
         <w:t xml:space="preserve">Anexos</w:t>
       </w:r>
-      <w:bookmarkEnd w:id="183"/>
+      <w:bookmarkEnd w:id="184"/>
     </w:p>
     <w:p>
       <w:pPr>
@@ -28384,11 +29893,11 @@
       <w:pPr>
         <w:pStyle w:val="Ttulo1"/>
       </w:pPr>
-      <w:bookmarkStart w:id="184" w:name="_5082f3c942e6bfb1fda2504becaff3627eadee1"/>
+      <w:bookmarkStart w:id="185" w:name="_5082f3c942e6bfb1fda2504becaff3627eadee1"/>
       <w:r>
         <w:t xml:space="preserve">Anexo A · Arquitectura y datos experimentales</w:t>
       </w:r>
-      <w:bookmarkEnd w:id="184"/>
+      <w:bookmarkEnd w:id="185"/>
     </w:p>
     <w:p>
       <w:pPr>
@@ -28450,11 +29959,11 @@
         </w:numPr>
         <w:pStyle w:val="TtuloApartado"/>
       </w:pPr>
-      <w:bookmarkStart w:id="185" w:name="_346125ca19ecd2944f51dd8524395bede94f04f"/>
+      <w:bookmarkStart w:id="186" w:name="_346125ca19ecd2944f51dd8524395bede94f04f"/>
       <w:r>
         <w:t xml:space="preserve">A.1 · La arquitectura, en una línea por etapa</w:t>
       </w:r>
-      <w:bookmarkEnd w:id="185"/>
+      <w:bookmarkEnd w:id="186"/>
     </w:p>
     <w:p>
       <w:pPr>
@@ -28889,11 +30398,11 @@
         </w:numPr>
         <w:pStyle w:val="TtuloApartado"/>
       </w:pPr>
-      <w:bookmarkStart w:id="186" w:name="_8667d1e0b9d498a4cfddb1f1d3481e29df04289"/>
+      <w:bookmarkStart w:id="187" w:name="_8667d1e0b9d498a4cfddb1f1d3481e29df04289"/>
       <w:r>
         <w:t xml:space="preserve">A.2 · Las doce señales OBD-II</w:t>
       </w:r>
-      <w:bookmarkEnd w:id="186"/>
+      <w:bookmarkEnd w:id="187"/>
     </w:p>
     <w:p>
       <w:pPr>
@@ -29599,11 +31108,11 @@
         </w:numPr>
         <w:pStyle w:val="TtuloApartado"/>
       </w:pPr>
-      <w:bookmarkStart w:id="187" w:name="_9c75383ba58c1cde92da93b11502cc9c7531986"/>
+      <w:bookmarkStart w:id="188" w:name="_9c75383ba58c1cde92da93b11502cc9c7531986"/>
       <w:r>
         <w:t xml:space="preserve">A.3 · Las cinco condiciones de fallo</w:t>
       </w:r>
-      <w:bookmarkEnd w:id="187"/>
+      <w:bookmarkEnd w:id="188"/>
     </w:p>
     <w:p>
       <w:pPr>
@@ -30166,11 +31675,11 @@
         </w:numPr>
         <w:pStyle w:val="TtuloApartado"/>
       </w:pPr>
-      <w:bookmarkStart w:id="188" w:name="_657486341536a495a6da5c96d73aa0960eb5ee7"/>
+      <w:bookmarkStart w:id="189" w:name="_657486341536a495a6da5c96d73aa0960eb5ee7"/>
       <w:r>
         <w:t xml:space="preserve">A.4 · La calibración contra el manual de taller</w:t>
       </w:r>
-      <w:bookmarkEnd w:id="188"/>
+      <w:bookmarkEnd w:id="189"/>
     </w:p>
     <w:p>
       <w:pPr>
@@ -30505,11 +32014,11 @@
         </w:numPr>
         <w:pStyle w:val="TtuloApartado"/>
       </w:pPr>
-      <w:bookmarkStart w:id="189" w:name="_3b3805a77353db1de84b04a9b6ee9aa5706318b"/>
+      <w:bookmarkStart w:id="190" w:name="_3b3805a77353db1de84b04a9b6ee9aa5706318b"/>
       <w:r>
         <w:t xml:space="preserve">A.5 · Los tres conjuntos, y cuál se puede reconstruir</w:t>
       </w:r>
-      <w:bookmarkEnd w:id="189"/>
+      <w:bookmarkEnd w:id="190"/>
     </w:p>
     <w:p>
       <w:pPr>
@@ -31045,11 +32554,11 @@
         </w:numPr>
         <w:pStyle w:val="TtuloApartado"/>
       </w:pPr>
-      <w:bookmarkStart w:id="190" w:name="_f4952d2743fd56100637acd1cb039ea6b96f53d"/>
+      <w:bookmarkStart w:id="191" w:name="_f4952d2743fd56100637acd1cb039ea6b96f53d"/>
       <w:r>
         <w:t xml:space="preserve">A.6 · La señal testigo de cada condición</w:t>
       </w:r>
-      <w:bookmarkEnd w:id="190"/>
+      <w:bookmarkEnd w:id="191"/>
     </w:p>
     <w:p>
       <w:pPr>
@@ -31088,18 +32597,18 @@
           <wp:inline>
             <wp:extent cx="5397500" cy="6870198"/>
             <wp:effectExtent b="0" l="0" r="0" t="0"/>
-            <wp:docPr descr="Cinco paneles, uno por condición: antes de la marca de entrada del fallo las dos series coinciden exactamente, y la divergencia posterior es el efecto de la condición." title="" id="192" name="Picture"/>
+            <wp:docPr descr="Cinco paneles, uno por condición: antes de la marca de entrada del fallo las dos series coinciden exactamente, y la divergencia posterior es el efecto de la condición." title="" id="193" name="Picture"/>
             <a:graphic>
               <a:graphicData uri="http://schemas.openxmlformats.org/drawingml/2006/picture">
                 <pic:pic>
                   <pic:nvPicPr>
-                    <pic:cNvPr descr="../../artifacts/figures/memoria/FIG-A-01_series_normal_vs_fallo.png" id="193" name="Picture"/>
+                    <pic:cNvPr descr="../../artifacts/figures/memoria/FIG-A-01_series_normal_vs_fallo.png" id="194" name="Picture"/>
                     <pic:cNvPicPr>
                       <a:picLocks noChangeArrowheads="1" noChangeAspect="1"/>
                     </pic:cNvPicPr>
                   </pic:nvPicPr>
                   <pic:blipFill>
-                    <a:blip r:embed="rId191"/>
+                    <a:blip r:embed="rId192"/>
                     <a:stretch>
                       <a:fillRect/>
                     </a:stretch>
@@ -31325,11 +32834,11 @@
         </w:numPr>
         <w:pStyle w:val="TtuloApartado"/>
       </w:pPr>
-      <w:bookmarkStart w:id="194" w:name="_0cd64653c162df5921d3e22283b02d9be08e4fb"/>
+      <w:bookmarkStart w:id="195" w:name="_0cd64653c162df5921d3e22283b02d9be08e4fb"/>
       <w:r>
         <w:t xml:space="preserve">A.7 · La misma comparación, ahora sobre el conjunto canónico</w:t>
       </w:r>
-      <w:bookmarkEnd w:id="194"/>
+      <w:bookmarkEnd w:id="195"/>
     </w:p>
     <w:p>
       <w:pPr>
@@ -31408,18 +32917,18 @@
           <wp:inline>
             <wp:extent cx="5364072" cy="6553709"/>
             <wp:effectExtent b="0" l="0" r="0" t="0"/>
-            <wp:docPr descr="Cinco paneles, uno por condición, cada uno con dos series superpuestas: la sesión con el fallo y la misma sesión sin él. Antes de la marca de entrada las dos coinciden exactamente. Después, el ajuste a largo plazo se separa en la fuga de vacío y en la deriva del caudalímetro, la temperatura del refrigerante se estanca en el termostato, la oscilación de la sonda se amortigua hasta una banda estrecha, y en el fallo de encendido las dos series siguen coincidiendo salvo en dieciséis muestras." title="" id="196" name="Picture"/>
+            <wp:docPr descr="Cinco paneles, uno por condición, cada uno con dos series superpuestas: la sesión con el fallo y la misma sesión sin él. Antes de la marca de entrada las dos coinciden exactamente. Después, el ajuste a largo plazo se separa en la fuga de vacío y en la deriva del caudalímetro, la temperatura del refrigerante se estanca en el termostato, la oscilación de la sonda se amortigua hasta una banda estrecha, y en el fallo de encendido las dos series siguen coincidiendo salvo en dieciséis muestras." title="" id="197" name="Picture"/>
             <a:graphic>
               <a:graphicData uri="http://schemas.openxmlformats.org/drawingml/2006/picture">
                 <pic:pic>
                   <pic:nvPicPr>
-                    <pic:cNvPr descr="../../artifacts/figures/memoria/FIG-A-02_pareja_contrafactual.png" id="197" name="Picture"/>
+                    <pic:cNvPr descr="../../artifacts/figures/memoria/FIG-A-02_pareja_contrafactual.png" id="198" name="Picture"/>
                     <pic:cNvPicPr>
                       <a:picLocks noChangeArrowheads="1" noChangeAspect="1"/>
                     </pic:cNvPicPr>
                   </pic:nvPicPr>
                   <pic:blipFill>
-                    <a:blip r:embed="rId195"/>
+                    <a:blip r:embed="rId196"/>
                     <a:stretch>
                       <a:fillRect/>
                     </a:stretch>
@@ -31797,11 +33306,11 @@
       <w:pPr>
         <w:pStyle w:val="Ttulo1"/>
       </w:pPr>
-      <w:bookmarkStart w:id="198" w:name="_45e509d14ce2f8e03d3f13cfd8915ae0f578989"/>
+      <w:bookmarkStart w:id="199" w:name="_45e509d14ce2f8e03d3f13cfd8915ae0f578989"/>
       <w:r>
         <w:t xml:space="preserve">Anexo B · Evidencia experimental complementaria</w:t>
       </w:r>
-      <w:bookmarkEnd w:id="198"/>
+      <w:bookmarkEnd w:id="199"/>
     </w:p>
     <w:p>
       <w:pPr>
@@ -31865,11 +33374,11 @@
         </w:numPr>
         <w:pStyle w:val="TtuloApartado"/>
       </w:pPr>
-      <w:bookmarkStart w:id="199" w:name="_a39c305f8452d34f67a0c3b120991d9a9cce91f"/>
+      <w:bookmarkStart w:id="200" w:name="_a39c305f8452d34f67a0c3b120991d9a9cce91f"/>
       <w:r>
         <w:t xml:space="preserve">B.1 · Qué estatuto tiene cada resultado</w:t>
       </w:r>
-      <w:bookmarkEnd w:id="199"/>
+      <w:bookmarkEnd w:id="200"/>
     </w:p>
     <w:p>
       <w:pPr>
@@ -32289,11 +33798,11 @@
         </w:numPr>
         <w:pStyle w:val="TtuloApartado"/>
       </w:pPr>
-      <w:bookmarkStart w:id="200" w:name="_c9c10af7f2dcaca9913c8b4f523ceb3bb4cc99c"/>
+      <w:bookmarkStart w:id="201" w:name="_c9c10af7f2dcaca9913c8b4f523ceb3bb4cc99c"/>
       <w:r>
         <w:t xml:space="preserve">B.2 · El rendimiento por condición de los dos modelos</w:t>
       </w:r>
-      <w:bookmarkEnd w:id="200"/>
+      <w:bookmarkEnd w:id="201"/>
     </w:p>
     <w:p>
       <w:pPr>
@@ -32332,18 +33841,18 @@
           <wp:inline>
             <wp:extent cx="5351839" cy="4718793"/>
             <wp:effectExtent b="0" l="0" r="0" t="0"/>
-            <wp:docPr descr="Dos paneles: a la izquierda el F1 de cada condición para el bosque y la red; a la derecha su diferencia, con la red ganando solo en el termostato por 0,032 y perdiendo en las otras cinco, hasta 0,167 en el fallo de encendido." title="" id="202" name="Picture"/>
+            <wp:docPr descr="Dos paneles: a la izquierda el F1 de cada condición para el bosque y la red; a la derecha su diferencia, con la red ganando solo en el termostato por 0,032 y perdiendo en las otras cinco, hasta 0,167 en el fallo de encendido." title="" id="203" name="Picture"/>
             <a:graphic>
               <a:graphicData uri="http://schemas.openxmlformats.org/drawingml/2006/picture">
                 <pic:pic>
                   <pic:nvPicPr>
-                    <pic:cNvPr descr="../../artifacts/figures/memoria/FIG-B-01_f1_por_clase.png" id="203" name="Picture"/>
+                    <pic:cNvPr descr="../../artifacts/figures/memoria/FIG-B-01_f1_por_clase.png" id="204" name="Picture"/>
                     <pic:cNvPicPr>
                       <a:picLocks noChangeArrowheads="1" noChangeAspect="1"/>
                     </pic:cNvPicPr>
                   </pic:nvPicPr>
                   <pic:blipFill>
-                    <a:blip r:embed="rId201"/>
+                    <a:blip r:embed="rId202"/>
                     <a:stretch>
                       <a:fillRect/>
                     </a:stretch>
@@ -32982,11 +34491,11 @@
         </w:numPr>
         <w:pStyle w:val="TtuloApartado"/>
       </w:pPr>
-      <w:bookmarkStart w:id="204" w:name="_efd196228a47300a2db9af74479686f4d854794"/>
+      <w:bookmarkStart w:id="205" w:name="_efd196228a47300a2db9af74479686f4d854794"/>
       <w:r>
         <w:t xml:space="preserve">B.3 · Dónde se apoya el modelo, condición a condición</w:t>
       </w:r>
-      <w:bookmarkEnd w:id="204"/>
+      <w:bookmarkEnd w:id="205"/>
     </w:p>
     <w:p>
       <w:pPr>
@@ -33425,11 +34934,11 @@
         </w:numPr>
         <w:pStyle w:val="TtuloApartado"/>
       </w:pPr>
-      <w:bookmarkStart w:id="205" w:name="_61081aab223e9317eb772ed20d287ada9f7496b"/>
+      <w:bookmarkStart w:id="206" w:name="_61081aab223e9317eb772ed20d287ada9f7496b"/>
       <w:r>
         <w:t xml:space="preserve">B.4 · El barrido del umbral de suficiencia</w:t>
       </w:r>
-      <w:bookmarkEnd w:id="205"/>
+      <w:bookmarkEnd w:id="206"/>
     </w:p>
     <w:p>
       <w:pPr>
@@ -33566,11 +35075,11 @@
         </w:numPr>
         <w:pStyle w:val="TtuloApartado"/>
       </w:pPr>
-      <w:bookmarkStart w:id="206" w:name="_50d858f85cf7555200468b2bb49abb9249698c3"/>
+      <w:bookmarkStart w:id="207" w:name="_50d858f85cf7555200468b2bb49abb9249698c3"/>
       <w:r>
         <w:t xml:space="preserve">B.5 · Las cinco aperturas del conjunto de prueba</w:t>
       </w:r>
-      <w:bookmarkEnd w:id="206"/>
+      <w:bookmarkEnd w:id="207"/>
     </w:p>
     <w:p>
       <w:pPr>
@@ -33917,11 +35426,11 @@
         </w:numPr>
         <w:pStyle w:val="TtuloApartado"/>
       </w:pPr>
-      <w:bookmarkStart w:id="207" w:name="_854f7bc650c45e01dd4fb07419e14d27e37c41b"/>
+      <w:bookmarkStart w:id="208" w:name="_854f7bc650c45e01dd4fb07419e14d27e37c41b"/>
       <w:r>
         <w:t xml:space="preserve">B.6 · Qué separa las dos averías de mezcla pobre</w:t>
       </w:r>
-      <w:bookmarkEnd w:id="207"/>
+      <w:bookmarkEnd w:id="208"/>
     </w:p>
     <w:p>
       <w:pPr>
@@ -34657,11 +36166,11 @@
       <w:pPr>
         <w:pStyle w:val="Ttulo1"/>
       </w:pPr>
-      <w:bookmarkStart w:id="208" w:name="_abcaf046201c9c68fccc55a6b785525beec9806"/>
+      <w:bookmarkStart w:id="209" w:name="_abcaf046201c9c68fccc55a6b785525beec9806"/>
       <w:r>
         <w:t xml:space="preserve">Anexo C · Reproducibilidad</w:t>
       </w:r>
-      <w:bookmarkEnd w:id="208"/>
+      <w:bookmarkEnd w:id="209"/>
     </w:p>
     <w:p>
       <w:pPr>
@@ -34711,11 +36220,11 @@
         </w:numPr>
         <w:pStyle w:val="TtuloApartado"/>
       </w:pPr>
-      <w:bookmarkStart w:id="209" w:name="_662edf990d91f7466776c3c6928c8a88c5ceeda"/>
+      <w:bookmarkStart w:id="210" w:name="_662edf990d91f7466776c3c6928c8a88c5ceeda"/>
       <w:r>
         <w:t xml:space="preserve">C.1 · Qué hace falta</w:t>
       </w:r>
-      <w:bookmarkEnd w:id="209"/>
+      <w:bookmarkEnd w:id="210"/>
     </w:p>
     <w:p>
       <w:pPr>
@@ -34922,11 +36431,11 @@
         </w:numPr>
         <w:pStyle w:val="TtuloApartado"/>
       </w:pPr>
-      <w:bookmarkStart w:id="210" w:name="_bd0629c71b4220a71a686c3b1b3abcf1c357ac4"/>
+      <w:bookmarkStart w:id="211" w:name="_bd0629c71b4220a71a686c3b1b3abcf1c357ac4"/>
       <w:r>
         <w:t xml:space="preserve">C.2 · Las cinco órdenes</w:t>
       </w:r>
-      <w:bookmarkEnd w:id="210"/>
+      <w:bookmarkEnd w:id="211"/>
     </w:p>
     <w:p>
       <w:pPr>
@@ -35175,11 +36684,11 @@
         </w:numPr>
         <w:pStyle w:val="TtuloApartado"/>
       </w:pPr>
-      <w:bookmarkStart w:id="211" w:name="_f99443d628ede90f30244d7d3dd267b1f4bed0b"/>
+      <w:bookmarkStart w:id="212" w:name="_f99443d628ede90f30244d7d3dd267b1f4bed0b"/>
       <w:r>
         <w:t xml:space="preserve">C.3 · Los notebooks</w:t>
       </w:r>
-      <w:bookmarkEnd w:id="211"/>
+      <w:bookmarkEnd w:id="212"/>
     </w:p>
     <w:p>
       <w:pPr>
@@ -35575,11 +37084,11 @@
         </w:numPr>
         <w:pStyle w:val="TtuloApartado"/>
       </w:pPr>
-      <w:bookmarkStart w:id="212" w:name="_bd97170dc8f9a70e1be9ea0068248f5d10cc2e4"/>
+      <w:bookmarkStart w:id="213" w:name="_bd97170dc8f9a70e1be9ea0068248f5d10cc2e4"/>
       <w:r>
         <w:t xml:space="preserve">C.4 · Los guiones de verificación</w:t>
       </w:r>
-      <w:bookmarkEnd w:id="212"/>
+      <w:bookmarkEnd w:id="213"/>
     </w:p>
     <w:p>
       <w:pPr>
@@ -35803,11 +37312,11 @@
         </w:numPr>
         <w:pStyle w:val="TtuloApartado"/>
       </w:pPr>
-      <w:bookmarkStart w:id="213" w:name="_7dec08523f00dfbd6fb93cbe3c71ec155298ff7"/>
+      <w:bookmarkStart w:id="214" w:name="_7dec08523f00dfbd6fb93cbe3c71ec155298ff7"/>
       <w:r>
         <w:t xml:space="preserve">C.5 · Lo que no se puede reproducir, y por qué</w:t>
       </w:r>
-      <w:bookmarkEnd w:id="213"/>
+      <w:bookmarkEnd w:id="214"/>
     </w:p>
     <w:p>
       <w:pPr>
@@ -36092,11 +37601,11 @@
         </w:numPr>
         <w:pStyle w:val="TtuloApartado"/>
       </w:pPr>
-      <w:bookmarkStart w:id="214" w:name="_32e3a7affebedc81d94399c442897d2474f4593"/>
+      <w:bookmarkStart w:id="215" w:name="_32e3a7affebedc81d94399c442897d2474f4593"/>
       <w:r>
         <w:t xml:space="preserve">C.6 · De la referencia académica al artefacto del repositorio</w:t>
       </w:r>
-      <w:bookmarkEnd w:id="214"/>
+      <w:bookmarkEnd w:id="215"/>
     </w:p>
     <w:p>
       <w:pPr>

</xml_diff>

<commit_message>
entrega: memoria sin las redundancias que solapaban la función de sus apartados
Once correcciones de redundancia, ninguna de contenido científico. La que no
era redundancia: los capítulos 5 y 6 daban tres y cinco abstenciones con cifra
ajena; el 5 pasa al recuento alineado motivo con motivo.

Verificado por inventario de cifras y citas: 428 cifras distintas antes y
después, 121 citas sin pérdida, ningún resultado ni denominador alterado.
</commit_message>
<xml_diff>
--- a/memoria/memoria.docx
+++ b/memoria/memoria.docx
@@ -1948,7 +1948,7 @@
         <w:rPr>
           <w:sz w:val="18"/>
         </w:rPr>
-        <w:t>Generado desde el commit d97cd77 del repositorio del trabajo.</w:t>
+        <w:t>Generado desde el commit 947e375 del repositorio del trabajo.</w:t>
       </w:r>
     </w:p>
     <w:p>
@@ -2176,7 +2176,7 @@
         <w:tab/>
       </w:r>
       <w:r>
-        <w:t>26</w:t>
+        <w:t>25</w:t>
       </w:r>
     </w:p>
     <w:p>
@@ -2295,7 +2295,7 @@
         <w:tab/>
       </w:r>
       <w:r>
-        <w:t>30</w:t>
+        <w:t>29</w:t>
       </w:r>
     </w:p>
     <w:p>
@@ -2499,7 +2499,7 @@
         <w:tab/>
       </w:r>
       <w:r>
-        <w:t>43</w:t>
+        <w:t>42</w:t>
       </w:r>
     </w:p>
     <w:p>
@@ -3026,7 +3026,7 @@
         <w:tab/>
       </w:r>
       <w:r>
-        <w:t>107</w:t>
+        <w:t>108</w:t>
       </w:r>
     </w:p>
     <w:p>
@@ -3077,7 +3077,7 @@
         <w:tab/>
       </w:r>
       <w:r>
-        <w:t>109</w:t>
+        <w:t>110</w:t>
       </w:r>
     </w:p>
     <w:p>
@@ -3094,7 +3094,7 @@
         <w:tab/>
       </w:r>
       <w:r>
-        <w:t>110</w:t>
+        <w:t>111</w:t>
       </w:r>
     </w:p>
     <w:p>
@@ -3128,7 +3128,7 @@
         <w:tab/>
       </w:r>
       <w:r>
-        <w:t>112</w:t>
+        <w:t>113</w:t>
       </w:r>
     </w:p>
     <w:p>
@@ -3145,7 +3145,7 @@
         <w:tab/>
       </w:r>
       <w:r>
-        <w:t>113</w:t>
+        <w:t>114</w:t>
       </w:r>
     </w:p>
     <w:p>
@@ -3162,7 +3162,7 @@
         <w:tab/>
       </w:r>
       <w:r>
-        <w:t>115</w:t>
+        <w:t>116</w:t>
       </w:r>
     </w:p>
     <w:p>
@@ -3179,7 +3179,7 @@
         <w:tab/>
       </w:r>
       <w:r>
-        <w:t>116</w:t>
+        <w:t>117</w:t>
       </w:r>
     </w:p>
     <w:p>
@@ -3196,7 +3196,7 @@
         <w:tab/>
       </w:r>
       <w:r>
-        <w:t>118</w:t>
+        <w:t>119</w:t>
       </w:r>
     </w:p>
     <w:p>
@@ -3213,7 +3213,7 @@
         <w:tab/>
       </w:r>
       <w:r>
-        <w:t>118</w:t>
+        <w:t>119</w:t>
       </w:r>
     </w:p>
     <w:p>
@@ -3230,7 +3230,7 @@
         <w:tab/>
       </w:r>
       <w:r>
-        <w:t>118</w:t>
+        <w:t>119</w:t>
       </w:r>
     </w:p>
     <w:p>
@@ -3247,7 +3247,7 @@
         <w:tab/>
       </w:r>
       <w:r>
-        <w:t>119</w:t>
+        <w:t>120</w:t>
       </w:r>
     </w:p>
     <w:p>
@@ -3264,7 +3264,7 @@
         <w:tab/>
       </w:r>
       <w:r>
-        <w:t>119</w:t>
+        <w:t>120</w:t>
       </w:r>
     </w:p>
     <w:p>
@@ -3281,7 +3281,7 @@
         <w:tab/>
       </w:r>
       <w:r>
-        <w:t>120</w:t>
+        <w:t>121</w:t>
       </w:r>
     </w:p>
     <w:p>
@@ -3298,7 +3298,7 @@
         <w:tab/>
       </w:r>
       <w:r>
-        <w:t>121</w:t>
+        <w:t>122</w:t>
       </w:r>
     </w:p>
     <w:p>
@@ -3315,7 +3315,7 @@
         <w:tab/>
       </w:r>
       <w:r>
-        <w:t>123</w:t>
+        <w:t>124</w:t>
       </w:r>
     </w:p>
     <w:p>
@@ -3332,7 +3332,7 @@
         <w:tab/>
       </w:r>
       <w:r>
-        <w:t>125</w:t>
+        <w:t>126</w:t>
       </w:r>
     </w:p>
     <w:p>
@@ -3349,7 +3349,7 @@
         <w:tab/>
       </w:r>
       <w:r>
-        <w:t>127</w:t>
+        <w:t>128</w:t>
       </w:r>
     </w:p>
     <w:p>
@@ -3366,7 +3366,7 @@
         <w:tab/>
       </w:r>
       <w:r>
-        <w:t>127</w:t>
+        <w:t>129</w:t>
       </w:r>
     </w:p>
     <w:p>
@@ -3383,7 +3383,7 @@
         <w:tab/>
       </w:r>
       <w:r>
-        <w:t>128</w:t>
+        <w:t>129</w:t>
       </w:r>
     </w:p>
     <w:p>
@@ -3400,7 +3400,7 @@
         <w:tab/>
       </w:r>
       <w:r>
-        <w:t>129</w:t>
+        <w:t>130</w:t>
       </w:r>
     </w:p>
     <w:p>
@@ -3417,7 +3417,7 @@
         <w:tab/>
       </w:r>
       <w:r>
-        <w:t>130</w:t>
+        <w:t>131</w:t>
       </w:r>
     </w:p>
     <w:p>
@@ -3434,7 +3434,7 @@
         <w:tab/>
       </w:r>
       <w:r>
-        <w:t>130</w:t>
+        <w:t>131</w:t>
       </w:r>
     </w:p>
     <w:p>
@@ -3468,7 +3468,7 @@
         <w:tab/>
       </w:r>
       <w:r>
-        <w:t>137</w:t>
+        <w:t>138</w:t>
       </w:r>
     </w:p>
     <w:p>
@@ -3485,7 +3485,7 @@
         <w:tab/>
       </w:r>
       <w:r>
-        <w:t>137</w:t>
+        <w:t>138</w:t>
       </w:r>
     </w:p>
     <w:p>
@@ -3502,7 +3502,7 @@
         <w:tab/>
       </w:r>
       <w:r>
-        <w:t>142</w:t>
+        <w:t>143</w:t>
       </w:r>
     </w:p>
     <w:p>
@@ -3519,7 +3519,7 @@
         <w:tab/>
       </w:r>
       <w:r>
-        <w:t>143</w:t>
+        <w:t>144</w:t>
       </w:r>
     </w:p>
     <w:p>
@@ -3536,7 +3536,7 @@
         <w:tab/>
       </w:r>
       <w:r>
-        <w:t>143</w:t>
+        <w:t>144</w:t>
       </w:r>
     </w:p>
     <w:p>
@@ -3553,7 +3553,7 @@
         <w:tab/>
       </w:r>
       <w:r>
-        <w:t>144</w:t>
+        <w:t>145</w:t>
       </w:r>
     </w:p>
     <w:p>
@@ -3570,7 +3570,7 @@
         <w:tab/>
       </w:r>
       <w:r>
-        <w:t>145</w:t>
+        <w:t>146</w:t>
       </w:r>
     </w:p>
     <w:p>
@@ -3587,7 +3587,7 @@
         <w:tab/>
       </w:r>
       <w:r>
-        <w:t>145</w:t>
+        <w:t>146</w:t>
       </w:r>
     </w:p>
     <w:p>
@@ -3604,7 +3604,7 @@
         <w:tab/>
       </w:r>
       <w:r>
-        <w:t>146</w:t>
+        <w:t>147</w:t>
       </w:r>
     </w:p>
     <w:p>
@@ -3621,7 +3621,7 @@
         <w:tab/>
       </w:r>
       <w:r>
-        <w:t>147</w:t>
+        <w:t>148</w:t>
       </w:r>
     </w:p>
     <w:p>
@@ -3638,7 +3638,7 @@
         <w:tab/>
       </w:r>
       <w:r>
-        <w:t>149</w:t>
+        <w:t>150</w:t>
       </w:r>
     </w:p>
     <w:p>
@@ -3655,7 +3655,7 @@
         <w:tab/>
       </w:r>
       <w:r>
-        <w:t>152</w:t>
+        <w:t>153</w:t>
       </w:r>
     </w:p>
     <w:p>
@@ -3672,7 +3672,7 @@
         <w:tab/>
       </w:r>
       <w:r>
-        <w:t>152</w:t>
+        <w:t>153</w:t>
       </w:r>
     </w:p>
     <w:p>
@@ -3689,7 +3689,7 @@
         <w:tab/>
       </w:r>
       <w:r>
-        <w:t>153</w:t>
+        <w:t>154</w:t>
       </w:r>
     </w:p>
     <w:p>
@@ -3706,7 +3706,7 @@
         <w:tab/>
       </w:r>
       <w:r>
-        <w:t>155</w:t>
+        <w:t>156</w:t>
       </w:r>
     </w:p>
     <w:p>
@@ -3723,7 +3723,7 @@
         <w:tab/>
       </w:r>
       <w:r>
-        <w:t>156</w:t>
+        <w:t>157</w:t>
       </w:r>
     </w:p>
     <w:p>
@@ -3740,7 +3740,7 @@
         <w:tab/>
       </w:r>
       <w:r>
-        <w:t>156</w:t>
+        <w:t>157</w:t>
       </w:r>
     </w:p>
     <w:p>
@@ -3757,7 +3757,7 @@
         <w:tab/>
       </w:r>
       <w:r>
-        <w:t>157</w:t>
+        <w:t>158</w:t>
       </w:r>
     </w:p>
     <w:p>
@@ -3774,7 +3774,7 @@
         <w:tab/>
       </w:r>
       <w:r>
-        <w:t>158</w:t>
+        <w:t>159</w:t>
       </w:r>
     </w:p>
     <w:p>
@@ -3791,7 +3791,7 @@
         <w:tab/>
       </w:r>
       <w:r>
-        <w:t>159</w:t>
+        <w:t>161</w:t>
       </w:r>
     </w:p>
     <w:p>
@@ -3808,7 +3808,7 @@
         <w:tab/>
       </w:r>
       <w:r>
-        <w:t>160</w:t>
+        <w:t>161</w:t>
       </w:r>
     </w:p>
     <w:p>
@@ -3825,7 +3825,7 @@
         <w:tab/>
       </w:r>
       <w:r>
-        <w:t>160</w:t>
+        <w:t>161</w:t>
       </w:r>
     </w:p>
     <w:p>
@@ -3842,7 +3842,7 @@
         <w:tab/>
       </w:r>
       <w:r>
-        <w:t>160</w:t>
+        <w:t>161</w:t>
       </w:r>
     </w:p>
     <w:p>
@@ -3859,7 +3859,7 @@
         <w:tab/>
       </w:r>
       <w:r>
-        <w:t>161</w:t>
+        <w:t>162</w:t>
       </w:r>
     </w:p>
     <w:p>
@@ -3876,7 +3876,7 @@
         <w:tab/>
       </w:r>
       <w:r>
-        <w:t>161</w:t>
+        <w:t>162</w:t>
       </w:r>
     </w:p>
     <w:p>
@@ -3893,7 +3893,7 @@
         <w:tab/>
       </w:r>
       <w:r>
-        <w:t>162</w:t>
+        <w:t>163</w:t>
       </w:r>
     </w:p>
     <w:p>
@@ -4245,7 +4245,7 @@
         <w:tab/>
       </w:r>
       <w:r>
-        <w:t>117</w:t>
+        <w:t>118</w:t>
       </w:r>
     </w:p>
     <w:p>
@@ -4262,7 +4262,7 @@
         <w:tab/>
       </w:r>
       <w:r>
-        <w:t>122</w:t>
+        <w:t>123</w:t>
       </w:r>
     </w:p>
     <w:p>
@@ -4279,7 +4279,7 @@
         <w:tab/>
       </w:r>
       <w:r>
-        <w:t>132</w:t>
+        <w:t>133</w:t>
       </w:r>
     </w:p>
     <w:p>
@@ -4296,7 +4296,7 @@
         <w:tab/>
       </w:r>
       <w:r>
-        <w:t>148</w:t>
+        <w:t>149</w:t>
       </w:r>
     </w:p>
     <w:p>
@@ -4313,7 +4313,7 @@
         <w:tab/>
       </w:r>
       <w:r>
-        <w:t>150</w:t>
+        <w:t>151</w:t>
       </w:r>
     </w:p>
     <w:p>
@@ -4330,7 +4330,7 @@
         <w:tab/>
       </w:r>
       <w:r>
-        <w:t>154</w:t>
+        <w:t>155</w:t>
       </w:r>
     </w:p>
     <w:p>
@@ -4495,7 +4495,7 @@
         <w:tab/>
       </w:r>
       <w:r>
-        <w:t>44</w:t>
+        <w:t>43</w:t>
       </w:r>
     </w:p>
     <w:p>
@@ -4784,7 +4784,7 @@
         <w:tab/>
       </w:r>
       <w:r>
-        <w:t>143</w:t>
+        <w:t>144</w:t>
       </w:r>
     </w:p>
     <w:p>
@@ -4801,7 +4801,7 @@
         <w:tab/>
       </w:r>
       <w:r>
-        <w:t>144</w:t>
+        <w:t>145</w:t>
       </w:r>
     </w:p>
     <w:p>
@@ -4818,7 +4818,7 @@
         <w:tab/>
       </w:r>
       <w:r>
-        <w:t>145</w:t>
+        <w:t>146</w:t>
       </w:r>
     </w:p>
     <w:p>
@@ -4835,7 +4835,7 @@
         <w:tab/>
       </w:r>
       <w:r>
-        <w:t>146</w:t>
+        <w:t>147</w:t>
       </w:r>
     </w:p>
     <w:p>
@@ -4852,7 +4852,7 @@
         <w:tab/>
       </w:r>
       <w:r>
-        <w:t>146</w:t>
+        <w:t>147</w:t>
       </w:r>
     </w:p>
     <w:p>
@@ -4869,7 +4869,7 @@
         <w:tab/>
       </w:r>
       <w:r>
-        <w:t>152</w:t>
+        <w:t>153</w:t>
       </w:r>
     </w:p>
     <w:p>
@@ -4886,7 +4886,7 @@
         <w:tab/>
       </w:r>
       <w:r>
-        <w:t>155</w:t>
+        <w:t>156</w:t>
       </w:r>
     </w:p>
     <w:p>
@@ -4903,7 +4903,7 @@
         <w:tab/>
       </w:r>
       <w:r>
-        <w:t>155</w:t>
+        <w:t>156</w:t>
       </w:r>
     </w:p>
     <w:p>
@@ -4920,7 +4920,7 @@
         <w:tab/>
       </w:r>
       <w:r>
-        <w:t>156</w:t>
+        <w:t>157</w:t>
       </w:r>
     </w:p>
     <w:p>
@@ -4937,7 +4937,7 @@
         <w:tab/>
       </w:r>
       <w:r>
-        <w:t>157</w:t>
+        <w:t>158</w:t>
       </w:r>
     </w:p>
     <w:p>
@@ -4954,7 +4954,7 @@
         <w:tab/>
       </w:r>
       <w:r>
-        <w:t>158</w:t>
+        <w:t>159</w:t>
       </w:r>
     </w:p>
     <w:p>
@@ -4971,7 +4971,7 @@
         <w:tab/>
       </w:r>
       <w:r>
-        <w:t>158</w:t>
+        <w:t>160</w:t>
       </w:r>
     </w:p>
     <w:p>
@@ -4988,7 +4988,7 @@
         <w:tab/>
       </w:r>
       <w:r>
-        <w:t>160</w:t>
+        <w:t>161</w:t>
       </w:r>
     </w:p>
     <w:p>
@@ -5005,7 +5005,7 @@
         <w:tab/>
       </w:r>
       <w:r>
-        <w:t>160</w:t>
+        <w:t>162</w:t>
       </w:r>
     </w:p>
     <w:p>
@@ -5022,7 +5022,7 @@
         <w:tab/>
       </w:r>
       <w:r>
-        <w:t>161</w:t>
+        <w:t>162</w:t>
       </w:r>
     </w:p>
     <w:p>
@@ -5039,7 +5039,7 @@
         <w:tab/>
       </w:r>
       <w:r>
-        <w:t>161</w:t>
+        <w:t>162</w:t>
       </w:r>
     </w:p>
     <w:p>
@@ -5056,7 +5056,7 @@
         <w:tab/>
       </w:r>
       <w:r>
-        <w:t>162</w:t>
+        <w:t>163</w:t>
       </w:r>
     </w:p>
     <w:p>
@@ -5337,15 +5337,15 @@
         <w:pStyle w:val="Normal"/>
       </w:pPr>
       <w:r>
-        <w:t xml:space="preserve">Conviene situar dónde se detiene lo revisado, porque de ahí sale la pregunta. Los trabajos que diagnostican a partir de OBD-II clasifican estados, detectan anomalías y atribuyen la predicción a unas señales u otras, y ese es su punto final: no se identificó, entre los revisados, una evaluación en la que esas observaciones alimenten un diagnóstico que deba después contrastarse con documentación antes de darse por bueno. Del lado de los modelos de lenguaje con recuperación sobre documentación técnica ocurre algo simétrico: los mecanismos para anclar una respuesta en documentos existen y funcionan, pero lo que se mide es si la respuesta final es correcta, no si cada afirmación que la compone puede seguirse hasta el fragmento que la sostiene.</w:t>
-      </w:r>
-    </w:p>
-    <w:p>
-      <w:pPr>
-        <w:pStyle w:val="Normal"/>
-      </w:pPr>
-      <w:r>
-        <w:t xml:space="preserve">La diferencia entre esas dos preguntas no es de matiz. Una respuesta correcta puede construirse sobre citas que no dicen lo que se les atribuye, y el lector no tiene forma de notarlo. La abstención, cuando aparece en los trabajos revisados, se trata además como una disposición del modelo de lenguaje —se le pide que reconozca su ignorancia— y no como una propiedad de la evidencia disponible, que es donde este trabajo la sitúa. Existe trabajos sobre la robustez de la recuperación frente a documentos irrelevantes, pero en dominios generales; no se encontró esa medición sobre documentación técnica de vehículo con evidencia incorrecta procedente del mismo fabricante y de otro motor, que es la forma exacta que el problema toma aquí. El capítulo 3 desarrolla estos cuatro frentes y delimita el vacío con el detalle que la revisión permite.</w:t>
+        <w:t xml:space="preserve">La pregunta nace de dónde se detiene lo revisado. El diagnóstico sobre OBD-II llega hasta la predicción y su atribución; la recuperación aumentada sabe anclar una respuesta en documentos, y mide si la respuesta es correcta. Entre las dos cosas queda sin medir algo intermedio: si cada afirmación que compone la explicación puede seguirse hasta el fragmento que la sostiene, y si el sistema reconoce cuándo ese fragmento no alcanza.</w:t>
+      </w:r>
+    </w:p>
+    <w:p>
+      <w:pPr>
+        <w:pStyle w:val="Normal"/>
+      </w:pPr>
+      <w:r>
+        <w:t xml:space="preserve">Esa diferencia no es de matiz, y es la que justifica el trabajo. Una respuesta correcta puede construirse sobre citas que no dicen lo que se les atribuye, y el lector no tiene forma de notarlo. La abstención, además, suele plantearse como una disposición del modelo de lenguaje —se le pide que reconozca su ignorancia— y no como una propiedad de la evidencia disponible, que es donde este trabajo la sitúa. El capítulo 3 desarrolla los cuatro frentes de esa delimitación, con el alcance que la revisión permite y la salvedad de qué parte de la novedad es más estrecha de lo que parece.</w:t>
       </w:r>
     </w:p>
     <w:p>
@@ -21270,13 +21270,141 @@
         <w:t xml:space="preserve"> </w:t>
       </w:r>
       <w:r>
-        <w:t xml:space="preserve">evidencia documental no la sostiene. Las limitaciones son tres. La ablación de la recuperación</w:t>
-      </w:r>
-      <w:r>
-        <w:t xml:space="preserve"> </w:t>
-      </w:r>
-      <w:r>
-        <w:t xml:space="preserve">semántica quedó</w:t>
+        <w:t xml:space="preserve">evidencia documental no la sostiene.</w:t>
+      </w:r>
+    </w:p>
+    <w:p>
+      <w:pPr>
+        <w:pStyle w:val="Normal"/>
+      </w:pPr>
+      <w:r>
+        <w:t xml:space="preserve">Tres condiciones acotan la lectura de la figura. La barra de la</w:t>
+      </w:r>
+      <w:r>
+        <w:t xml:space="preserve"> </w:t>
+      </w:r>
+      <w:r>
+        <w:t xml:space="preserve">ablación de la recuperación semántica</w:t>
+      </w:r>
+      <w:r>
+        <w:t xml:space="preserve"> </w:t>
+      </w:r>
+      <w:r>
+        <w:rPr>
+          <w:b/>
+          <w:bCs/>
+        </w:rPr>
+        <w:t xml:space="preserve">no es un cero medido</w:t>
+      </w:r>
+      <w:r>
+        <w:t xml:space="preserve">, porque esa ablación quedó inconclusa</w:t>
+      </w:r>
+      <w:r>
+        <w:t xml:space="preserve"> </w:t>
+      </w:r>
+      <w:r>
+        <w:t xml:space="preserve">por un defecto de la consulta que se examina más abajo. Los denominadores son de tres y cinco</w:t>
+      </w:r>
+      <w:r>
+        <w:t xml:space="preserve"> </w:t>
+      </w:r>
+      <w:r>
+        <w:t xml:space="preserve">ventanas independientes. Y las cuatro ablaciones se miden sobre el conjunto con el que el criterio</w:t>
+      </w:r>
+      <w:r>
+        <w:t xml:space="preserve"> </w:t>
+      </w:r>
+      <w:r>
+        <w:t xml:space="preserve">fue ajustado. Para la pregunta de investigación, la figura es la que atribuye el comportamiento</w:t>
+      </w:r>
+      <w:r>
+        <w:t xml:space="preserve"> </w:t>
+      </w:r>
+      <w:r>
+        <w:t xml:space="preserve">observado a una pieza concreta del diseño, y la que deja claro que esa pieza no es la explicabilidad</w:t>
+      </w:r>
+      <w:r>
+        <w:t xml:space="preserve"> </w:t>
+      </w:r>
+      <w:r>
+        <w:t xml:space="preserve">del modelo sino la verificación del soporte documental.</w:t>
+      </w:r>
+    </w:p>
+    <w:p>
+      <w:pPr>
+        <w:pStyle w:val="Normal"/>
+      </w:pPr>
+      <w:r>
+        <w:t xml:space="preserve">El cero de la atribución admite una lectura equivocada y conviene fijar la estrecha. Que</w:t>
+      </w:r>
+      <w:r>
+        <w:t xml:space="preserve"> </w:t>
+      </w:r>
+      <w:r>
+        <w:t xml:space="preserve">sustituirla por una desviación tipificada no cambie ninguna decisión ni ningún conjunto de evidencia</w:t>
+      </w:r>
+      <w:r>
+        <w:t xml:space="preserve"> </w:t>
+      </w:r>
+      <w:r>
+        <w:t xml:space="preserve">tiene su explicación en el diseño: la recuperación la guía el diagnóstico y no la atribución, y el</w:t>
+      </w:r>
+      <w:r>
+        <w:t xml:space="preserve"> </w:t>
+      </w:r>
+      <w:r>
+        <w:t xml:space="preserve">soporte se comprueba sobre la señal y no sobre el estadístico, de modo que dos rutas que eligen</w:t>
+      </w:r>
+      <w:r>
+        <w:t xml:space="preserve"> </w:t>
+      </w:r>
+      <w:r>
+        <w:t xml:space="preserve">distintos descriptores de las mismas señales llegan al mismo sitio. Lo que el resultado dice es, por</w:t>
+      </w:r>
+      <w:r>
+        <w:t xml:space="preserve"> </w:t>
+      </w:r>
+      <w:r>
+        <w:t xml:space="preserve">tanto, que la atribución</w:t>
+      </w:r>
+      <w:r>
+        <w:t xml:space="preserve"> </w:t>
+      </w:r>
+      <w:r>
+        <w:rPr>
+          <w:b/>
+          <w:bCs/>
+        </w:rPr>
+        <w:t xml:space="preserve">no interviene en la política de abstención</w:t>
+      </w:r>
+      <w:r>
+        <w:t xml:space="preserve">. Lo que no dice es nada</w:t>
+      </w:r>
+      <w:r>
+        <w:t xml:space="preserve"> </w:t>
+      </w:r>
+      <w:r>
+        <w:t xml:space="preserve">sobre el otro plano en que trabaja, el de la trazabilidad: es la que nombra qué señal, con qué</w:t>
+      </w:r>
+      <w:r>
+        <w:t xml:space="preserve"> </w:t>
+      </w:r>
+      <w:r>
+        <w:t xml:space="preserve">estadístico, en qué dirección y en qué ventana temporal sostiene cada afirmación, y es lo que el</w:t>
+      </w:r>
+      <w:r>
+        <w:t xml:space="preserve"> </w:t>
+      </w:r>
+      <w:r>
+        <w:t xml:space="preserve">lector de la explicación recibe y puede comprobar. Esa dimensión no se ha evaluado aquí.</w:t>
+      </w:r>
+    </w:p>
+    <w:p>
+      <w:pPr>
+        <w:pStyle w:val="Normal"/>
+      </w:pPr>
+      <w:r>
+        <w:t xml:space="preserve">La ablación de la recuperación semántica quedó</w:t>
       </w:r>
       <w:r>
         <w:t xml:space="preserve"> </w:t>
@@ -21289,149 +21417,6 @@
         <w:t xml:space="preserve">inconclusa</w:t>
       </w:r>
       <w:r>
-        <w:t xml:space="preserve"> </w:t>
-      </w:r>
-      <w:r>
-        <w:t xml:space="preserve">y su barra no debe leerse como un cero medido: la ruta léxica no</w:t>
-      </w:r>
-      <w:r>
-        <w:t xml:space="preserve"> </w:t>
-      </w:r>
-      <w:r>
-        <w:t xml:space="preserve">recuperó nada porque la consulta en prosa exige que sus treinta términos aparezcan en el mismo</w:t>
-      </w:r>
-      <w:r>
-        <w:t xml:space="preserve"> </w:t>
-      </w:r>
-      <w:r>
-        <w:t xml:space="preserve">fragmento, y eso no aísla la contribución de la similitud semántica. Los denominadores son de tres y</w:t>
-      </w:r>
-      <w:r>
-        <w:t xml:space="preserve"> </w:t>
-      </w:r>
-      <w:r>
-        <w:t xml:space="preserve">cinco ventanas independientes. Y las cuatro ablaciones se miden sobre el conjunto con el que el</w:t>
-      </w:r>
-      <w:r>
-        <w:t xml:space="preserve"> </w:t>
-      </w:r>
-      <w:r>
-        <w:t xml:space="preserve">criterio fue ajustado. Para la pregunta de investigación, la figura es la que atribuye el</w:t>
-      </w:r>
-      <w:r>
-        <w:t xml:space="preserve"> </w:t>
-      </w:r>
-      <w:r>
-        <w:t xml:space="preserve">comportamiento observado a una pieza concreta del diseño, y la que deja claro que esa pieza no es la</w:t>
-      </w:r>
-      <w:r>
-        <w:t xml:space="preserve"> </w:t>
-      </w:r>
-      <w:r>
-        <w:t xml:space="preserve">explicabilidad del modelo sino la verificación del soporte documental.</w:t>
-      </w:r>
-    </w:p>
-    <w:p>
-      <w:pPr>
-        <w:pStyle w:val="Normal"/>
-      </w:pPr>
-      <w:r>
-        <w:t xml:space="preserve">Sustituir la atribución por un criterio estadístico simple no cambió ninguna decisión ni ningún</w:t>
-      </w:r>
-      <w:r>
-        <w:t xml:space="preserve"> </w:t>
-      </w:r>
-      <w:r>
-        <w:t xml:space="preserve">conjunto de evidencia. La explicación está en el diseño: la recuperación la guía el diagnóstico y</w:t>
-      </w:r>
-      <w:r>
-        <w:t xml:space="preserve"> </w:t>
-      </w:r>
-      <w:r>
-        <w:t xml:space="preserve">no la atribución, y el soporte se comprueba sobre la señal y no sobre el estadístico, de modo que</w:t>
-      </w:r>
-      <w:r>
-        <w:t xml:space="preserve"> </w:t>
-      </w:r>
-      <w:r>
-        <w:t xml:space="preserve">dos rutas que eligen distintos descriptores de las mismas señales llegan al mismo sitio.</w:t>
-      </w:r>
-    </w:p>
-    <w:p>
-      <w:pPr>
-        <w:pStyle w:val="Normal"/>
-      </w:pPr>
-      <w:r>
-        <w:t xml:space="preserve">La lectura correcta de ese cero es estrecha y conviene fijarla, porque admite una mala. La</w:t>
-      </w:r>
-      <w:r>
-        <w:t xml:space="preserve"> </w:t>
-      </w:r>
-      <w:r>
-        <w:t xml:space="preserve">atribución</w:t>
-      </w:r>
-      <w:r>
-        <w:t xml:space="preserve"> </w:t>
-      </w:r>
-      <w:r>
-        <w:rPr>
-          <w:b/>
-          <w:bCs/>
-        </w:rPr>
-        <w:t xml:space="preserve">no interviene en la política de abstención</w:t>
-      </w:r>
-      <w:r>
-        <w:t xml:space="preserve">: para decidir si se explica o no, en</w:t>
-      </w:r>
-      <w:r>
-        <w:t xml:space="preserve"> </w:t>
-      </w:r>
-      <w:r>
-        <w:t xml:space="preserve">esta muestra, es sustituible por un criterio estadístico simple. Su contribución está en otro</w:t>
-      </w:r>
-      <w:r>
-        <w:t xml:space="preserve"> </w:t>
-      </w:r>
-      <w:r>
-        <w:t xml:space="preserve">plano, el de la trazabilidad y la explicación de la predicción: es la que nombra qué señal, con</w:t>
-      </w:r>
-      <w:r>
-        <w:t xml:space="preserve"> </w:t>
-      </w:r>
-      <w:r>
-        <w:t xml:space="preserve">qué estadístico, en qué dirección y en qué ventana temporal sostiene cada afirmación, y es lo que</w:t>
-      </w:r>
-      <w:r>
-        <w:t xml:space="preserve"> </w:t>
-      </w:r>
-      <w:r>
-        <w:t xml:space="preserve">el lector de la explicación recibe y puede comprobar. Esa dimensión no se ha evaluado aquí, y el</w:t>
-      </w:r>
-      <w:r>
-        <w:t xml:space="preserve"> </w:t>
-      </w:r>
-      <w:r>
-        <w:t xml:space="preserve">resultado de la ablación no dice nada sobre ella.</w:t>
-      </w:r>
-    </w:p>
-    <w:p>
-      <w:pPr>
-        <w:pStyle w:val="Normal"/>
-      </w:pPr>
-      <w:r>
-        <w:t xml:space="preserve">La ablación de la recuperación semántica quedó</w:t>
-      </w:r>
-      <w:r>
-        <w:t xml:space="preserve"> </w:t>
-      </w:r>
-      <w:r>
-        <w:rPr>
-          <w:b/>
-          <w:bCs/>
-        </w:rPr>
-        <w:t xml:space="preserve">inconclusa</w:t>
-      </w:r>
-      <w:r>
         <w:t xml:space="preserve">, y conviene decir por qué. La ruta</w:t>
       </w:r>
       <w:r>
@@ -21504,136 +21489,81 @@
         <w:pStyle w:val="Normal"/>
       </w:pPr>
       <w:r>
-        <w:t xml:space="preserve">Las dos ablaciones de la regla de decisión son las que dan sentido al criterio compuesto, y lo que</w:t>
-      </w:r>
-      <w:r>
-        <w:t xml:space="preserve"> </w:t>
-      </w:r>
-      <w:r>
-        <w:t xml:space="preserve">muestran se enuncia mejor al revés de como suele pensarse un sistema de diagnóstico:</w:t>
-      </w:r>
-      <w:r>
-        <w:t xml:space="preserve"> </w:t>
-      </w:r>
-      <w:r>
-        <w:rPr>
-          <w:b/>
-          <w:bCs/>
-        </w:rPr>
-        <w:t xml:space="preserve">una</w:t>
-      </w:r>
-      <w:r>
-        <w:rPr>
-          <w:b/>
-          <w:bCs/>
-        </w:rPr>
-        <w:t xml:space="preserve"> </w:t>
-      </w:r>
-      <w:r>
-        <w:rPr>
-          <w:b/>
-          <w:bCs/>
-        </w:rPr>
-        <w:t xml:space="preserve">confianza diagnóstica alta no basta para sostener una explicación si la evidencia documental no la</w:t>
-      </w:r>
-      <w:r>
-        <w:rPr>
-          <w:b/>
-          <w:bCs/>
-        </w:rPr>
-        <w:t xml:space="preserve"> </w:t>
-      </w:r>
-      <w:r>
-        <w:rPr>
-          <w:b/>
-          <w:bCs/>
-        </w:rPr>
-        <w:t xml:space="preserve">sostiene</w:t>
-      </w:r>
-      <w:r>
-        <w:t xml:space="preserve">. Con una puerta de confianza sola, el sistema explica</w:t>
-      </w:r>
-      <w:r>
-        <w:t xml:space="preserve"> </w:t>
-      </w:r>
-      <w:r>
-        <w:rPr>
-          <w:b/>
-          <w:bCs/>
-        </w:rPr>
-        <w:t xml:space="preserve">las doce ejecuciones que debían</w:t>
-      </w:r>
-      <w:r>
-        <w:rPr>
-          <w:b/>
-          <w:bCs/>
-        </w:rPr>
-        <w:t xml:space="preserve"> </w:t>
-      </w:r>
-      <w:r>
-        <w:rPr>
-          <w:b/>
-          <w:bCs/>
-        </w:rPr>
-        <w:t xml:space="preserve">terminar en abstención</w:t>
-      </w:r>
-      <w:r>
-        <w:t xml:space="preserve">, incluidas las tres en que la recuperación no devuelve ningún fragmento:</w:t>
-      </w:r>
-      <w:r>
-        <w:t xml:space="preserve"> </w:t>
-      </w:r>
-      <w:r>
-        <w:t xml:space="preserve">la confianza del modelo mide cuán seguro está de su diagnóstico y no sabe nada de si el manual lo</w:t>
-      </w:r>
-      <w:r>
-        <w:t xml:space="preserve"> </w:t>
-      </w:r>
-      <w:r>
-        <w:t xml:space="preserve">documenta. Sin criterio compuesto pero con la exigencia de que exista algún fragmento aplicable,</w:t>
-      </w:r>
-      <w:r>
-        <w:t xml:space="preserve"> </w:t>
-      </w:r>
-      <w:r>
-        <w:t xml:space="preserve">las explicaciones sin soporte bajan a</w:t>
-      </w:r>
-      <w:r>
-        <w:t xml:space="preserve"> </w:t>
-      </w:r>
-      <w:r>
-        <w:rPr>
-          <w:b/>
-          <w:bCs/>
-        </w:rPr>
-        <w:t xml:space="preserve">seis de nueve</w:t>
-      </w:r>
-      <w:r>
-        <w:t xml:space="preserve">, nueve de doce contando la condición con</w:t>
-      </w:r>
-      <w:r>
-        <w:t xml:space="preserve"> </w:t>
-      </w:r>
-      <w:r>
-        <w:t xml:space="preserve">distractor y filtro: tener documentación delante tampoco equivale a tener soporte. Las cifras de</w:t>
-      </w:r>
-      <w:r>
-        <w:t xml:space="preserve"> </w:t>
-      </w:r>
-      <w:r>
-        <w:t xml:space="preserve">la puerta de confianza sola coinciden celda a celda con la política de referencia que la Tabla 5.6</w:t>
-      </w:r>
-      <w:r>
-        <w:t xml:space="preserve"> </w:t>
-      </w:r>
-      <w:r>
-        <w:t xml:space="preserve">publica, calculada por otro camino; el pre-registro fijaba que una discrepancia obligaría a parar,</w:t>
-      </w:r>
-      <w:r>
-        <w:t xml:space="preserve"> </w:t>
-      </w:r>
-      <w:r>
-        <w:t xml:space="preserve">y no la hubo.</w:t>
+        <w:t xml:space="preserve">Dos detalles de las ablaciones de la regla de decisión merecen quedar registrados, porque la figura</w:t>
+      </w:r>
+      <w:r>
+        <w:t xml:space="preserve"> </w:t>
+      </w:r>
+      <w:r>
+        <w:t xml:space="preserve">no los muestra. El primero: contando también la condición con distractor y filtro, la puerta de</w:t>
+      </w:r>
+      <w:r>
+        <w:t xml:space="preserve"> </w:t>
+      </w:r>
+      <w:r>
+        <w:t xml:space="preserve">confianza sola explica</w:t>
+      </w:r>
+      <w:r>
+        <w:t xml:space="preserve"> </w:t>
+      </w:r>
+      <w:r>
+        <w:rPr>
+          <w:b/>
+          <w:bCs/>
+        </w:rPr>
+        <w:t xml:space="preserve">las doce ejecuciones que debían terminar en abstención</w:t>
+      </w:r>
+      <w:r>
+        <w:t xml:space="preserve">, incluidas las</w:t>
+      </w:r>
+      <w:r>
+        <w:t xml:space="preserve"> </w:t>
+      </w:r>
+      <w:r>
+        <w:t xml:space="preserve">tres en que la recuperación no devuelve ningún fragmento —la confianza del modelo mide cuán seguro</w:t>
+      </w:r>
+      <w:r>
+        <w:t xml:space="preserve"> </w:t>
+      </w:r>
+      <w:r>
+        <w:t xml:space="preserve">está de su diagnóstico y no sabe nada de si el manual lo documenta—, y la exigencia de que exista</w:t>
+      </w:r>
+      <w:r>
+        <w:t xml:space="preserve"> </w:t>
+      </w:r>
+      <w:r>
+        <w:t xml:space="preserve">algún fragmento aplicable las deja en</w:t>
+      </w:r>
+      <w:r>
+        <w:t xml:space="preserve"> </w:t>
+      </w:r>
+      <w:r>
+        <w:rPr>
+          <w:b/>
+          <w:bCs/>
+        </w:rPr>
+        <w:t xml:space="preserve">nueve de doce</w:t>
+      </w:r>
+      <w:r>
+        <w:t xml:space="preserve">. El segundo: las cifras de la puerta de</w:t>
+      </w:r>
+      <w:r>
+        <w:t xml:space="preserve"> </w:t>
+      </w:r>
+      <w:r>
+        <w:t xml:space="preserve">confianza sola coinciden celda a celda con la política de referencia que la Tabla 5.6 publica,</w:t>
+      </w:r>
+      <w:r>
+        <w:t xml:space="preserve"> </w:t>
+      </w:r>
+      <w:r>
+        <w:t xml:space="preserve">calculada por otro camino; el pre-registro fijaba que una discrepancia obligaría a parar, y no la</w:t>
+      </w:r>
+      <w:r>
+        <w:t xml:space="preserve"> </w:t>
+      </w:r>
+      <w:r>
+        <w:t xml:space="preserve">hubo.</w:t>
       </w:r>
     </w:p>
     <w:p>
@@ -23362,13 +23292,86 @@
         <w:t xml:space="preserve">verificador no produjo</w:t>
       </w:r>
       <w:r>
-        <w:t xml:space="preserve">: tres de veintiséis motivos de abstención y ocho de veintisiete</w:t>
-      </w:r>
-      <w:r>
-        <w:t xml:space="preserve"> </w:t>
-      </w:r>
-      <w:r>
-        <w:t xml:space="preserve">afirmaciones. El peor caso escribe «cobertura 0.852 &lt; 0.90» donde el verificador había escrito</w:t>
+        <w:t xml:space="preserve">. Las ocho afirmaciones afectadas, de veintisiete, son</w:t>
+      </w:r>
+      <w:r>
+        <w:t xml:space="preserve"> </w:t>
+      </w:r>
+      <w:r>
+        <w:rPr>
+          <w:b/>
+          <w:bCs/>
+        </w:rPr>
+        <w:t xml:space="preserve">seis distintas sobre</w:t>
+      </w:r>
+      <w:r>
+        <w:rPr>
+          <w:b/>
+          <w:bCs/>
+        </w:rPr>
+        <w:t xml:space="preserve"> </w:t>
+      </w:r>
+      <w:r>
+        <w:rPr>
+          <w:b/>
+          <w:bCs/>
+        </w:rPr>
+        <w:t xml:space="preserve">tres ventanas</w:t>
+      </w:r>
+      <w:r>
+        <w:t xml:space="preserve"> </w:t>
+      </w:r>
+      <w:r>
+        <w:t xml:space="preserve">—dos repiten su ventana en el estrato comparativo—: dos truncan el valor y cuatro</w:t>
+      </w:r>
+      <w:r>
+        <w:t xml:space="preserve"> </w:t>
+      </w:r>
+      <w:r>
+        <w:t xml:space="preserve">alteran un dígito del cuarto o quinto decimal, con un desvío máximo del 0,099 % que no cambia la</w:t>
+      </w:r>
+      <w:r>
+        <w:t xml:space="preserve"> </w:t>
+      </w:r>
+      <w:r>
+        <w:t xml:space="preserve">señal, el estadístico, el signo ni la ventana, de modo que ninguna contradice la observación que</w:t>
+      </w:r>
+      <w:r>
+        <w:t xml:space="preserve"> </w:t>
+      </w:r>
+      <w:r>
+        <w:t xml:space="preserve">cita. En los motivos de abstención el recuento es de</w:t>
+      </w:r>
+      <w:r>
+        <w:t xml:space="preserve"> </w:t>
+      </w:r>
+      <w:r>
+        <w:rPr>
+          <w:b/>
+          <w:bCs/>
+        </w:rPr>
+        <w:t xml:space="preserve">cinco de veintiséis</w:t>
+      </w:r>
+      <w:r>
+        <w:t xml:space="preserve">: cuatro citan como</w:t>
+      </w:r>
+      <w:r>
+        <w:t xml:space="preserve"> </w:t>
+      </w:r>
+      <w:r>
+        <w:t xml:space="preserve">umbral de la confianza el 0,80 cuando el aplicado es 0,79, sin que la comparación deje de ser</w:t>
+      </w:r>
+      <w:r>
+        <w:t xml:space="preserve"> </w:t>
+      </w:r>
+      <w:r>
+        <w:t xml:space="preserve">cierta, y uno escribe un valor y un umbral que no figuran en el registro del caso. El peor caso</w:t>
+      </w:r>
+      <w:r>
+        <w:t xml:space="preserve"> </w:t>
+      </w:r>
+      <w:r>
+        <w:t xml:space="preserve">escribe «cobertura 0.852 &lt; 0.90» donde el verificador había escrito</w:t>
       </w:r>
       <w:r>
         <w:t xml:space="preserve"> </w:t>
@@ -26817,19 +26820,40 @@
         <w:t xml:space="preserve"> </w:t>
       </w:r>
       <w:r>
-        <w:t xml:space="preserve">resultado. El intervalo de Wilson al 95 % de esa falsa confianza nula llega hasta 0,215, y las</w:t>
-      </w:r>
-      <w:r>
-        <w:t xml:space="preserve"> </w:t>
-      </w:r>
-      <w:r>
-        <w:t xml:space="preserve">catorce ejecuciones proceden de siete ventanas, de modo que el intervalo real es más ancho: lo</w:t>
-      </w:r>
-      <w:r>
-        <w:t xml:space="preserve"> </w:t>
-      </w:r>
-      <w:r>
-        <w:t xml:space="preserve">medido es que en esa muestra no ocurrió, no que no pueda ocurrir.</w:t>
+        <w:t xml:space="preserve">resultado. El cero tiene el alcance que su denominador permite: con una confianza del 95 % es</w:t>
+      </w:r>
+      <w:r>
+        <w:t xml:space="preserve"> </w:t>
+      </w:r>
+      <w:r>
+        <w:t xml:space="preserve">compatible con una tasa de hasta 0,215, y las catorce ejecuciones no son independientes entre sí. Responde que</w:t>
+      </w:r>
+      <w:r>
+        <w:t xml:space="preserve"> </w:t>
+      </w:r>
+      <w:r>
+        <w:rPr>
+          <w:b/>
+          <w:bCs/>
+        </w:rPr>
+        <w:t xml:space="preserve">en esa muestra no</w:t>
+      </w:r>
+      <w:r>
+        <w:rPr>
+          <w:b/>
+          <w:bCs/>
+        </w:rPr>
+        <w:t xml:space="preserve"> </w:t>
+      </w:r>
+      <w:r>
+        <w:rPr>
+          <w:b/>
+          <w:bCs/>
+        </w:rPr>
+        <w:t xml:space="preserve">ocurrió</w:t>
+      </w:r>
+      <w:r>
+        <w:t xml:space="preserve">, no que no pueda ocurrir.</w:t>
       </w:r>
     </w:p>
     <w:p>
@@ -26865,37 +26889,50 @@
         <w:t xml:space="preserve"> </w:t>
       </w:r>
       <w:r>
-        <w:t xml:space="preserve">verificador no produjo. Esas siete no son del mismo tipo. Seis afirmaciones distintas transcriben</w:t>
-      </w:r>
-      <w:r>
-        <w:t xml:space="preserve"> </w:t>
-      </w:r>
-      <w:r>
-        <w:t xml:space="preserve">con un dígito distinto el valor de la observación que citan —desvío máximo del 0,099 %, sin cambio</w:t>
-      </w:r>
-      <w:r>
-        <w:t xml:space="preserve"> </w:t>
-      </w:r>
-      <w:r>
-        <w:t xml:space="preserve">de señal, de estadístico, de signo ni de ventana—, y cinco abstenciones justifican su decisión con</w:t>
-      </w:r>
-      <w:r>
-        <w:t xml:space="preserve"> </w:t>
-      </w:r>
-      <w:r>
-        <w:t xml:space="preserve">una cifra que el verificador no registró: cuatro citan mal el umbral aplicado y una escribe un valor</w:t>
-      </w:r>
-      <w:r>
-        <w:t xml:space="preserve"> </w:t>
-      </w:r>
-      <w:r>
-        <w:t xml:space="preserve">y un umbral que no figuran en el registro del caso, en una frase aritméticamente cierta que no se</w:t>
-      </w:r>
-      <w:r>
-        <w:t xml:space="preserve"> </w:t>
-      </w:r>
-      <w:r>
-        <w:t xml:space="preserve">refiere a nada. Ninguna de las tasas cambia por ello, porque las produce el verificador</w:t>
+        <w:t xml:space="preserve">verificador no produjo. Para la respuesta importan dos cosas de esas siete. La primera es que</w:t>
+      </w:r>
+      <w:r>
+        <w:t xml:space="preserve"> </w:t>
+      </w:r>
+      <w:r>
+        <w:rPr>
+          <w:b/>
+          <w:bCs/>
+        </w:rPr>
+        <w:t xml:space="preserve">ninguna contradice la evidencia que cita</w:t>
+      </w:r>
+      <w:r>
+        <w:t xml:space="preserve">: las afirmaciones afectadas transcriben mal un decimal</w:t>
+      </w:r>
+      <w:r>
+        <w:t xml:space="preserve"> </w:t>
+      </w:r>
+      <w:r>
+        <w:t xml:space="preserve">del valor que citan correctamente, con un desvío que no cambia la señal, el estadístico, el signo ni</w:t>
+      </w:r>
+      <w:r>
+        <w:t xml:space="preserve"> </w:t>
+      </w:r>
+      <w:r>
+        <w:t xml:space="preserve">la ventana, y por eso la subpregunta sobre la trazabilidad cumple su criterio. La segunda es que el</w:t>
+      </w:r>
+      <w:r>
+        <w:t xml:space="preserve"> </w:t>
+      </w:r>
+      <w:r>
+        <w:t xml:space="preserve">defecto se concentra en los motivos de abstención, donde una frase llega a comparar un valor y un</w:t>
+      </w:r>
+      <w:r>
+        <w:t xml:space="preserve"> </w:t>
+      </w:r>
+      <w:r>
+        <w:t xml:space="preserve">umbral que no figuran en el registro del caso. Ninguna de las tasas cambia por ello, porque las</w:t>
+      </w:r>
+      <w:r>
+        <w:t xml:space="preserve"> </w:t>
+      </w:r>
+      <w:r>
+        <w:t xml:space="preserve">produce el verificador</w:t>
       </w:r>
       <w:r>
         <w:t xml:space="preserve"> </w:t>
@@ -28553,150 +28590,77 @@
         <w:pStyle w:val="Normal"/>
       </w:pPr>
       <w:r>
-        <w:t xml:space="preserve">Las cuatro contribuciones experimentales dejan de ser válidas fuera de las condiciones en que se</w:t>
-      </w:r>
-      <w:r>
-        <w:t xml:space="preserve"> </w:t>
-      </w:r>
-      <w:r>
-        <w:t xml:space="preserve">obtuvieron, y conviene nombrarlas juntas. Todas proceden de</w:t>
-      </w:r>
-      <w:r>
-        <w:t xml:space="preserve"> </w:t>
-      </w:r>
-      <w:r>
-        <w:rPr>
-          <w:b/>
-          <w:bCs/>
-        </w:rPr>
-        <w:t xml:space="preserve">un vehículo</w:t>
-      </w:r>
-      <w:r>
-        <w:t xml:space="preserve">, de</w:t>
-      </w:r>
-      <w:r>
-        <w:t xml:space="preserve"> </w:t>
-      </w:r>
-      <w:r>
-        <w:rPr>
-          <w:b/>
-          <w:bCs/>
-        </w:rPr>
-        <w:t xml:space="preserve">telemetría</w:t>
-      </w:r>
-      <w:r>
-        <w:rPr>
-          <w:b/>
-          <w:bCs/>
-        </w:rPr>
-        <w:t xml:space="preserve"> </w:t>
-      </w:r>
-      <w:r>
-        <w:rPr>
-          <w:b/>
-          <w:bCs/>
-        </w:rPr>
-        <w:t xml:space="preserve">sintética</w:t>
-      </w:r>
-      <w:r>
-        <w:t xml:space="preserve"> </w:t>
-      </w:r>
-      <w:r>
-        <w:t xml:space="preserve">y de un</w:t>
-      </w:r>
-      <w:r>
-        <w:t xml:space="preserve"> </w:t>
-      </w:r>
-      <w:r>
-        <w:rPr>
-          <w:b/>
-          <w:bCs/>
-        </w:rPr>
-        <w:t xml:space="preserve">catálogo cerrado de cinco fallos</w:t>
-      </w:r>
-      <w:r>
-        <w:t xml:space="preserve">. Las unidades independientes son pocas: tres</w:t>
-      </w:r>
-      <w:r>
-        <w:t xml:space="preserve"> </w:t>
-      </w:r>
-      <w:r>
-        <w:t xml:space="preserve">y cinco ventanas en validación, siete y ocho en prueba, tres casos en el rediseño del distractor.</w:t>
-      </w:r>
-      <w:r>
-        <w:t xml:space="preserve"> </w:t>
-      </w:r>
-      <w:r>
-        <w:t xml:space="preserve">El criterio que produce las cifras de decisión</w:t>
-      </w:r>
-      <w:r>
-        <w:t xml:space="preserve"> </w:t>
-      </w:r>
-      <w:r>
-        <w:rPr>
-          <w:b/>
-          <w:bCs/>
-        </w:rPr>
-        <w:t xml:space="preserve">se revisó dos veces sobre los mismos casos con los</w:t>
-      </w:r>
-      <w:r>
-        <w:rPr>
-          <w:b/>
-          <w:bCs/>
-        </w:rPr>
-        <w:t xml:space="preserve"> </w:t>
-      </w:r>
-      <w:r>
-        <w:rPr>
-          <w:b/>
-          <w:bCs/>
-        </w:rPr>
-        <w:t xml:space="preserve">que se evalúa</w:t>
-      </w:r>
-      <w:r>
-        <w:t xml:space="preserve">, y el modelo de lenguaje se ajustó con ventanas que incluyen las de tres de los</w:t>
-      </w:r>
-      <w:r>
-        <w:t xml:space="preserve"> </w:t>
-      </w:r>
-      <w:r>
-        <w:t xml:space="preserve">casos en que se le mide. Las ventanas evaluadas son ventanas que el modelo diagnostica</w:t>
-      </w:r>
-      <w:r>
-        <w:t xml:space="preserve"> </w:t>
-      </w:r>
-      <w:r>
-        <w:t xml:space="preserve">correctamente, de modo que las tasas describen el comportamiento del agente</w:t>
-      </w:r>
-      <w:r>
-        <w:t xml:space="preserve"> </w:t>
-      </w:r>
-      <w:r>
-        <w:rPr>
-          <w:b/>
-          <w:bCs/>
-        </w:rPr>
-        <w:t xml:space="preserve">cuando el diagnóstico</w:t>
-      </w:r>
-      <w:r>
-        <w:rPr>
-          <w:b/>
-          <w:bCs/>
-        </w:rPr>
-        <w:t xml:space="preserve"> </w:t>
-      </w:r>
-      <w:r>
-        <w:rPr>
-          <w:b/>
-          <w:bCs/>
-        </w:rPr>
-        <w:t xml:space="preserve">de partida es acertado</w:t>
-      </w:r>
-      <w:r>
-        <w:t xml:space="preserve"> </w:t>
-      </w:r>
-      <w:r>
-        <w:t xml:space="preserve">y deben leerse como cota superior.</w:t>
+        <w:t xml:space="preserve">La frontera más dura de las cuatro contribuciones experimentales no es la procedencia de los datos,</w:t>
+      </w:r>
+      <w:r>
+        <w:t xml:space="preserve"> </w:t>
+      </w:r>
+      <w:r>
+        <w:t xml:space="preserve">que el apartado de limitaciones desarrolla, sino</w:t>
+      </w:r>
+      <w:r>
+        <w:t xml:space="preserve"> </w:t>
+      </w:r>
+      <w:r>
+        <w:rPr>
+          <w:b/>
+          <w:bCs/>
+        </w:rPr>
+        <w:t xml:space="preserve">cuántas unidades independientes las sostienen</w:t>
+      </w:r>
+      <w:r>
+        <w:t xml:space="preserve">:</w:t>
+      </w:r>
+      <w:r>
+        <w:t xml:space="preserve"> </w:t>
+      </w:r>
+      <w:r>
+        <w:t xml:space="preserve">tres y cinco ventanas en validación, siete y ocho en prueba, y tres casos construidos en el rediseño</w:t>
+      </w:r>
+      <w:r>
+        <w:t xml:space="preserve"> </w:t>
+      </w:r>
+      <w:r>
+        <w:t xml:space="preserve">del distractor. Con esos números, lo que las cuatro aportan es un comportamiento observado en casos</w:t>
+      </w:r>
+      <w:r>
+        <w:t xml:space="preserve"> </w:t>
+      </w:r>
+      <w:r>
+        <w:t xml:space="preserve">nombrables, no una estimación. A eso se añade que las ventanas evaluadas son ventanas que el modelo</w:t>
+      </w:r>
+      <w:r>
+        <w:t xml:space="preserve"> </w:t>
+      </w:r>
+      <w:r>
+        <w:t xml:space="preserve">diagnostica correctamente, de modo que las tasas describen al agente</w:t>
+      </w:r>
+      <w:r>
+        <w:t xml:space="preserve"> </w:t>
+      </w:r>
+      <w:r>
+        <w:rPr>
+          <w:b/>
+          <w:bCs/>
+        </w:rPr>
+        <w:t xml:space="preserve">cuando el diagnóstico de</w:t>
+      </w:r>
+      <w:r>
+        <w:rPr>
+          <w:b/>
+          <w:bCs/>
+        </w:rPr>
+        <w:t xml:space="preserve"> </w:t>
+      </w:r>
+      <w:r>
+        <w:rPr>
+          <w:b/>
+          <w:bCs/>
+        </w:rPr>
+        <w:t xml:space="preserve">partida es acertado</w:t>
+      </w:r>
+      <w:r>
+        <w:t xml:space="preserve">.</w:t>
       </w:r>
     </w:p>
     <w:p>
@@ -28831,7 +28795,23 @@
         <w:pStyle w:val="Normal"/>
       </w:pPr>
       <w:r>
-        <w:t xml:space="preserve">Los diecisiete casos del agente se construyeron sobre ventanas que el modelo clasifica correctamente, y las anotaciones y consultas se redactaron conociendo el fallo de cada caso. Las tasas de decisión describen, por eso, el comportamiento del agente cuando el diagnóstico de partida es acertado, y deben leerse como cota superior; el comportamiento ante un diagnóstico erróneo solo se ha observado en un escenario adverso de dos ventanas, registrado antes de corregir el índice documental.</w:t>
+        <w:t xml:space="preserve">El comportamiento del agente ante un</w:t>
+      </w:r>
+      <w:r>
+        <w:t xml:space="preserve"> </w:t>
+      </w:r>
+      <w:r>
+        <w:rPr>
+          <w:b/>
+          <w:bCs/>
+        </w:rPr>
+        <w:t xml:space="preserve">diagnóstico de partida erróneo</w:t>
+      </w:r>
+      <w:r>
+        <w:t xml:space="preserve"> </w:t>
+      </w:r>
+      <w:r>
+        <w:t xml:space="preserve">solo se ha observado en un escenario adverso de dos ventanas, registrado antes de corregir el índice documental. Esa es la cara desconocida de la cota superior que el capítulo 5 declara al presentar las cifras: los diecisiete casos se construyeron sobre ventanas bien clasificadas, y las anotaciones y consultas se redactaron conociendo el fallo de cada una.</w:t>
       </w:r>
     </w:p>
     <w:p>
@@ -29026,115 +29006,73 @@
         <w:t xml:space="preserve"> </w:t>
       </w:r>
       <w:r>
-        <w:t xml:space="preserve">no a ninguna cifra, y conviene enunciarla con el detalle que tiene. Los criterios de las cuatro</w:t>
-      </w:r>
-      <w:r>
-        <w:t xml:space="preserve"> </w:t>
-      </w:r>
-      <w:r>
-        <w:t xml:space="preserve">subpreguntas se escribieron el 1 de septiembre de 2026, antes de entrenar ningún modelo, y tres de</w:t>
-      </w:r>
-      <w:r>
-        <w:t xml:space="preserve"> </w:t>
-      </w:r>
-      <w:r>
-        <w:t xml:space="preserve">los cuatro se reformularon el día siguiente, cuando ya se conocían la línea base, el modelo</w:t>
-      </w:r>
-      <w:r>
-        <w:t xml:space="preserve"> </w:t>
-      </w:r>
-      <w:r>
-        <w:t xml:space="preserve">temporal, la evaluación de la recuperación y una primera medición de la suficiencia. La</w:t>
-      </w:r>
-      <w:r>
-        <w:t xml:space="preserve"> </w:t>
-      </w:r>
-      <w:r>
-        <w:t xml:space="preserve">reformulación tiene una justificación que se sostiene y un momento que no. Se sostiene porque los</w:t>
-      </w:r>
-      <w:r>
-        <w:t xml:space="preserve"> </w:t>
-      </w:r>
-      <w:r>
-        <w:t xml:space="preserve">tres criterios originales eran inaplicables tal como estaban escritos: el de PI.1 exigía un margen</w:t>
-      </w:r>
-      <w:r>
-        <w:t xml:space="preserve"> </w:t>
-      </w:r>
-      <w:r>
-        <w:t xml:space="preserve">«no atribuible al azar» y el diseño ejecutó una sola corrida por modelo, sin réplicas ni intervalos,</w:t>
-      </w:r>
-      <w:r>
-        <w:t xml:space="preserve"> </w:t>
-      </w:r>
-      <w:r>
-        <w:t xml:space="preserve">de modo que ese margen no podía evaluarse; los de PI.2 y PI.3 remitían a umbrales numéricos que la</w:t>
-      </w:r>
-      <w:r>
-        <w:t xml:space="preserve"> </w:t>
-      </w:r>
-      <w:r>
-        <w:t xml:space="preserve">primera versión dejó deliberadamente en blanco y que nunca llegaron a escribirse. No se sostiene el</w:t>
-      </w:r>
-      <w:r>
-        <w:t xml:space="preserve"> </w:t>
-      </w:r>
-      <w:r>
-        <w:t xml:space="preserve">momento: la reformulación de PI.1 se escribió un día después de medirse que el modelo temporal no</w:t>
-      </w:r>
-      <w:r>
-        <w:t xml:space="preserve"> </w:t>
-      </w:r>
-      <w:r>
-        <w:t xml:space="preserve">superaba al bosque aleatorio, que es justamente el resultado que el criterio original habría</w:t>
-      </w:r>
-      <w:r>
-        <w:t xml:space="preserve"> </w:t>
-      </w:r>
-      <w:r>
-        <w:t xml:space="preserve">suspendido, y no se acompañó entonces de ningún registro de la enmienda. La consecuencia es doble.</w:t>
-      </w:r>
-      <w:r>
-        <w:t xml:space="preserve"> </w:t>
-      </w:r>
-      <w:r>
-        <w:t xml:space="preserve">Los tres criterios pasaron de una exigencia cuantitativa y comparada a una cualitativa y</w:t>
-      </w:r>
-      <w:r>
-        <w:t xml:space="preserve"> </w:t>
-      </w:r>
-      <w:r>
-        <w:t xml:space="preserve">existencial, de modo que el trabajo responde a una pregunta más estrecha que la que el</w:t>
-      </w:r>
-      <w:r>
-        <w:t xml:space="preserve"> </w:t>
-      </w:r>
-      <w:r>
-        <w:t xml:space="preserve">pre-registro planteaba; y la fuerza confirmatoria del dictamen queda disminuida en una cantidad que</w:t>
-      </w:r>
-      <w:r>
-        <w:t xml:space="preserve"> </w:t>
-      </w:r>
-      <w:r>
-        <w:t xml:space="preserve">no puede cuantificarse. Con los criterios originales no existiría, además, ningún valor aplicable de</w:t>
-      </w:r>
-      <w:r>
-        <w:t xml:space="preserve"> </w:t>
-      </w:r>
-      <w:r>
-        <w:t xml:space="preserve">la regla de respuesta global, porque la calificación parcial exige que PI.1 se cumpla y PI.1 no se</w:t>
-      </w:r>
-      <w:r>
-        <w:t xml:space="preserve"> </w:t>
-      </w:r>
-      <w:r>
-        <w:t xml:space="preserve">cumplía: es un hueco de la primera versión que se declara en lugar de resolverse eligiendo el valor</w:t>
-      </w:r>
-      <w:r>
-        <w:t xml:space="preserve"> </w:t>
-      </w:r>
-      <w:r>
-        <w:t xml:space="preserve">más parecido.</w:t>
+        <w:t xml:space="preserve">no a ninguna cifra. Los criterios de las cuatro subpreguntas se escribieron el 1 de septiembre de</w:t>
+      </w:r>
+      <w:r>
+        <w:t xml:space="preserve"> </w:t>
+      </w:r>
+      <w:r>
+        <w:t xml:space="preserve">2026, antes de entrenar ningún modelo, y tres de los cuatro se reformularon el día siguiente, cuando</w:t>
+      </w:r>
+      <w:r>
+        <w:t xml:space="preserve"> </w:t>
+      </w:r>
+      <w:r>
+        <w:t xml:space="preserve">ya se conocían los primeros resultados; el de PI.1, un día después de medirse que el modelo temporal</w:t>
+      </w:r>
+      <w:r>
+        <w:t xml:space="preserve"> </w:t>
+      </w:r>
+      <w:r>
+        <w:t xml:space="preserve">no superaba al bosque aleatorio, que es el resultado que ese criterio habría suspendido. El anexo</w:t>
+      </w:r>
+      <w:r>
+        <w:t xml:space="preserve"> </w:t>
+      </w:r>
+      <w:r>
+        <w:t xml:space="preserve">compara las dos versiones de cada uno y explica por qué los tres originales eran inaplicables tal</w:t>
+      </w:r>
+      <w:r>
+        <w:t xml:space="preserve"> </w:t>
+      </w:r>
+      <w:r>
+        <w:t xml:space="preserve">como estaban escritos. Lo que importa aquí es la consecuencia, y es doble. Los tres criterios pasaron</w:t>
+      </w:r>
+      <w:r>
+        <w:t xml:space="preserve"> </w:t>
+      </w:r>
+      <w:r>
+        <w:t xml:space="preserve">de una exigencia cuantitativa y comparada a una cualitativa y existencial, de modo que el trabajo</w:t>
+      </w:r>
+      <w:r>
+        <w:t xml:space="preserve"> </w:t>
+      </w:r>
+      <w:r>
+        <w:t xml:space="preserve">responde a una pregunta más estrecha que la que el pre-registro planteaba; y la fuerza confirmatoria</w:t>
+      </w:r>
+      <w:r>
+        <w:t xml:space="preserve"> </w:t>
+      </w:r>
+      <w:r>
+        <w:t xml:space="preserve">del dictamen queda disminuida en una cantidad que no puede cuantificarse. Con los criterios</w:t>
+      </w:r>
+      <w:r>
+        <w:t xml:space="preserve"> </w:t>
+      </w:r>
+      <w:r>
+        <w:t xml:space="preserve">originales no existiría, además, ningún valor aplicable de la regla de respuesta global, porque la</w:t>
+      </w:r>
+      <w:r>
+        <w:t xml:space="preserve"> </w:t>
+      </w:r>
+      <w:r>
+        <w:t xml:space="preserve">calificación parcial exige que PI.1 se cumpla y PI.1 no se cumplía: es un hueco de la primera versión</w:t>
+      </w:r>
+      <w:r>
+        <w:t xml:space="preserve"> </w:t>
+      </w:r>
+      <w:r>
+        <w:t xml:space="preserve">que se declara en lugar de resolverse eligiendo el valor más parecido.</w:t>
       </w:r>
     </w:p>
     <w:p>
@@ -29479,31 +29417,31 @@
         <w:t xml:space="preserve">fidelidad numérica</w:t>
       </w:r>
       <w:r>
-        <w:t xml:space="preserve">. El validador determinista que el</w:t>
-      </w:r>
-      <w:r>
-        <w:t xml:space="preserve"> </w:t>
-      </w:r>
-      <w:r>
-        <w:t xml:space="preserve">capítulo 5 describe está diseñado y sin implementar: comprobaría, antes de dar una salida por</w:t>
-      </w:r>
-      <w:r>
-        <w:t xml:space="preserve"> </w:t>
-      </w:r>
-      <w:r>
-        <w:t xml:space="preserve">válida, el nombre de la métrica, su valor, el umbral, el operador de comparación, la procedencia</w:t>
-      </w:r>
-      <w:r>
-        <w:t xml:space="preserve"> </w:t>
-      </w:r>
-      <w:r>
-        <w:t xml:space="preserve">del número y la coherencia entre lo que el texto dice y lo que los datos estructurados contienen.</w:t>
-      </w:r>
-      <w:r>
-        <w:t xml:space="preserve"> </w:t>
-      </w:r>
-      <w:r>
-        <w:t xml:space="preserve">Su evaluación exigiría un conjunto que el ajuste del redactor no haya visto.</w:t>
+        <w:t xml:space="preserve">. El validador que el capítulo 5 describe</w:t>
+      </w:r>
+      <w:r>
+        <w:t xml:space="preserve"> </w:t>
+      </w:r>
+      <w:r>
+        <w:t xml:space="preserve">está diseñado y sin implementar, y lo que añadiría es una cuarta barrera que compruebe las cifras y</w:t>
+      </w:r>
+      <w:r>
+        <w:t xml:space="preserve"> </w:t>
+      </w:r>
+      <w:r>
+        <w:t xml:space="preserve">no solo los identificadores: una explicación cuya comparación numérica no se sostenga dejaría de</w:t>
+      </w:r>
+      <w:r>
+        <w:t xml:space="preserve"> </w:t>
+      </w:r>
+      <w:r>
+        <w:t xml:space="preserve">presentarse como válida. Su evaluación exigiría un conjunto que el ajuste del redactor no haya</w:t>
+      </w:r>
+      <w:r>
+        <w:t xml:space="preserve"> </w:t>
+      </w:r>
+      <w:r>
+        <w:t xml:space="preserve">visto, de modo que es una medición nueva y no una reejecución.</w:t>
       </w:r>
     </w:p>
     <w:p>
@@ -36090,52 +36028,104 @@
         <w:pStyle w:val="Normal"/>
       </w:pPr>
       <w:r>
-        <w:t xml:space="preserve">De las cinco aperturas, tres fueron intentos de la evaluación final —de los que el tercero es la</w:t>
-      </w:r>
-      <w:r>
-        <w:t xml:space="preserve"> </w:t>
-      </w:r>
-      <w:r>
-        <w:t xml:space="preserve">medición publicada—, una fue la comprobación pre-registrada de las ablaciones y una fue accidental y</w:t>
-      </w:r>
-      <w:r>
-        <w:t xml:space="preserve"> </w:t>
-      </w:r>
-      <w:r>
-        <w:t xml:space="preserve">solo leyó identificadores. En cuatro hubo exposición de etiquetas y de predicciones. Lo que sí se</w:t>
-      </w:r>
-      <w:r>
-        <w:t xml:space="preserve"> </w:t>
-      </w:r>
-      <w:r>
-        <w:t xml:space="preserve">sostiene, y se comprueba con una orden, es que</w:t>
-      </w:r>
-      <w:r>
-        <w:t xml:space="preserve"> </w:t>
-      </w:r>
-      <w:r>
-        <w:rPr>
-          <w:b/>
-          <w:bCs/>
-        </w:rPr>
-        <w:t xml:space="preserve">el instrumento no cambió entre la primera apertura</w:t>
-      </w:r>
-      <w:r>
-        <w:rPr>
-          <w:b/>
-          <w:bCs/>
-        </w:rPr>
-        <w:t xml:space="preserve"> </w:t>
-      </w:r>
-      <w:r>
-        <w:rPr>
-          <w:b/>
-          <w:bCs/>
-        </w:rPr>
-        <w:t xml:space="preserve">y la medición</w:t>
-      </w:r>
-      <w:r>
-        <w:t xml:space="preserve">: umbrales, casos elegibles, reglas de selección, política y código son los mismos.</w:t>
+        <w:t xml:space="preserve">Clasificadas con esa escala, las cinco aperturas que el capítulo 5 enumera se reparten así: los tres</w:t>
+      </w:r>
+      <w:r>
+        <w:t xml:space="preserve"> </w:t>
+      </w:r>
+      <w:r>
+        <w:t xml:space="preserve">intentos de la evaluación final y la comprobación de las ablaciones alcanzaron el</w:t>
+      </w:r>
+      <w:r>
+        <w:t xml:space="preserve"> </w:t>
+      </w:r>
+      <w:r>
+        <w:rPr>
+          <w:b/>
+          <w:bCs/>
+        </w:rPr>
+        <w:t xml:space="preserve">nivel 4</w:t>
+      </w:r>
+      <w:r>
+        <w:t xml:space="preserve">, y la</w:t>
+      </w:r>
+      <w:r>
+        <w:t xml:space="preserve"> </w:t>
+      </w:r>
+      <w:r>
+        <w:t xml:space="preserve">apertura accidental se detuvo en el</w:t>
+      </w:r>
+      <w:r>
+        <w:t xml:space="preserve"> </w:t>
+      </w:r>
+      <w:r>
+        <w:rPr>
+          <w:b/>
+          <w:bCs/>
+        </w:rPr>
+        <w:t xml:space="preserve">2</w:t>
+      </w:r>
+      <w:r>
+        <w:t xml:space="preserve">. El tercer intento alcanza además el nivel 5, y es el único</w:t>
+      </w:r>
+      <w:r>
+        <w:t xml:space="preserve"> </w:t>
+      </w:r>
+      <w:r>
+        <w:t xml:space="preserve">caso en que ese nivel es legítimo, porque esa apertura</w:t>
+      </w:r>
+      <w:r>
+        <w:t xml:space="preserve"> </w:t>
+      </w:r>
+      <w:r>
+        <w:rPr>
+          <w:b/>
+          <w:bCs/>
+        </w:rPr>
+        <w:t xml:space="preserve">era</w:t>
+      </w:r>
+      <w:r>
+        <w:t xml:space="preserve"> </w:t>
+      </w:r>
+      <w:r>
+        <w:t xml:space="preserve">la medición autorizada: utilizar su</w:t>
+      </w:r>
+      <w:r>
+        <w:t xml:space="preserve"> </w:t>
+      </w:r>
+      <w:r>
+        <w:t xml:space="preserve">resultado es a lo que se abrió. Que la comprobación de las ablaciones llegara al nivel 4 era</w:t>
+      </w:r>
+      <w:r>
+        <w:t xml:space="preserve"> </w:t>
+      </w:r>
+      <w:r>
+        <w:t xml:space="preserve">condición de su ejecución y no un descuido. Lo que sostiene la validez de lo medido, y se comprueba</w:t>
+      </w:r>
+      <w:r>
+        <w:t xml:space="preserve"> </w:t>
+      </w:r>
+      <w:r>
+        <w:t xml:space="preserve">con una orden, es que</w:t>
+      </w:r>
+      <w:r>
+        <w:t xml:space="preserve"> </w:t>
+      </w:r>
+      <w:r>
+        <w:rPr>
+          <w:b/>
+          <w:bCs/>
+        </w:rPr>
+        <w:t xml:space="preserve">el instrumento no cambió entre la primera apertura y la medición</w:t>
+      </w:r>
+      <w:r>
+        <w:t xml:space="preserve">: umbrales,</w:t>
+      </w:r>
+      <w:r>
+        <w:t xml:space="preserve"> </w:t>
+      </w:r>
+      <w:r>
+        <w:t xml:space="preserve">casos elegibles, reglas de selección, política y código son los mismos.</w:t>
       </w:r>
     </w:p>
     <w:p>

</xml_diff>

<commit_message>
entrega: el capítulo 5 incorpora el diagrama de fiabilidad y la curva del umbral
Dos figuras nuevas y una que sube del anexo. Las dos nuevas salen del registro
del barrido del umbral, que ya estaba en el paquete y cuya curva completa no se
había representado.

El diagrama de fiabilidad recupera, por diferencias de la curva acumulada, las
ventanas y los aciertos de cada tramo de confianza; la comprobación de que la
reconstrucción devuelve las 98 ventanas, los 86 aciertos y la exactitud del
registro del modelo es una función del paquete y el notebook la ejecuta antes de
dibujar.

El paquete pasa de 157 a 159 ficheros censados y de 238 a 242 comprobaciones.
</commit_message>
<xml_diff>
--- a/memoria/memoria.docx
+++ b/memoria/memoria.docx
@@ -1948,7 +1948,7 @@
         <w:rPr>
           <w:sz w:val="18"/>
         </w:rPr>
-        <w:t>Generado desde el commit 947e375 del repositorio del trabajo.</w:t>
+        <w:t>Generado desde el commit 18b7ba1 con cambios sin confirmar del repositorio del trabajo.</w:t>
       </w:r>
     </w:p>
     <w:p>
@@ -2924,7 +2924,7 @@
         <w:tab/>
       </w:r>
       <w:r>
-        <w:t>84</w:t>
+        <w:t>89</w:t>
       </w:r>
     </w:p>
     <w:p>
@@ -2941,7 +2941,7 @@
         <w:tab/>
       </w:r>
       <w:r>
-        <w:t>87</w:t>
+        <w:t>93</w:t>
       </w:r>
     </w:p>
     <w:p>
@@ -2958,7 +2958,7 @@
         <w:tab/>
       </w:r>
       <w:r>
-        <w:t>94</w:t>
+        <w:t>100</w:t>
       </w:r>
     </w:p>
     <w:p>
@@ -2975,7 +2975,7 @@
         <w:tab/>
       </w:r>
       <w:r>
-        <w:t>96</w:t>
+        <w:t>102</w:t>
       </w:r>
     </w:p>
     <w:p>
@@ -2992,7 +2992,7 @@
         <w:tab/>
       </w:r>
       <w:r>
-        <w:t>100</w:t>
+        <w:t>106</w:t>
       </w:r>
     </w:p>
     <w:p>
@@ -3009,7 +3009,7 @@
         <w:tab/>
       </w:r>
       <w:r>
-        <w:t>101</w:t>
+        <w:t>107</w:t>
       </w:r>
     </w:p>
     <w:p>
@@ -3026,7 +3026,7 @@
         <w:tab/>
       </w:r>
       <w:r>
-        <w:t>108</w:t>
+        <w:t>114</w:t>
       </w:r>
     </w:p>
     <w:p>
@@ -3043,7 +3043,7 @@
         <w:tab/>
       </w:r>
       <w:r>
-        <w:t>108</w:t>
+        <w:t>114</w:t>
       </w:r>
     </w:p>
     <w:p>
@@ -3060,7 +3060,7 @@
         <w:tab/>
       </w:r>
       <w:r>
-        <w:t>109</w:t>
+        <w:t>115</w:t>
       </w:r>
     </w:p>
     <w:p>
@@ -3077,7 +3077,7 @@
         <w:tab/>
       </w:r>
       <w:r>
-        <w:t>110</w:t>
+        <w:t>116</w:t>
       </w:r>
     </w:p>
     <w:p>
@@ -3094,7 +3094,7 @@
         <w:tab/>
       </w:r>
       <w:r>
-        <w:t>111</w:t>
+        <w:t>117</w:t>
       </w:r>
     </w:p>
     <w:p>
@@ -3111,7 +3111,7 @@
         <w:tab/>
       </w:r>
       <w:r>
-        <w:t>111</w:t>
+        <w:t>117</w:t>
       </w:r>
     </w:p>
     <w:p>
@@ -3128,7 +3128,7 @@
         <w:tab/>
       </w:r>
       <w:r>
-        <w:t>113</w:t>
+        <w:t>119</w:t>
       </w:r>
     </w:p>
     <w:p>
@@ -3145,7 +3145,7 @@
         <w:tab/>
       </w:r>
       <w:r>
-        <w:t>114</w:t>
+        <w:t>120</w:t>
       </w:r>
     </w:p>
     <w:p>
@@ -3162,7 +3162,7 @@
         <w:tab/>
       </w:r>
       <w:r>
-        <w:t>116</w:t>
+        <w:t>122</w:t>
       </w:r>
     </w:p>
     <w:p>
@@ -3179,7 +3179,7 @@
         <w:tab/>
       </w:r>
       <w:r>
-        <w:t>117</w:t>
+        <w:t>123</w:t>
       </w:r>
     </w:p>
     <w:p>
@@ -3196,7 +3196,7 @@
         <w:tab/>
       </w:r>
       <w:r>
-        <w:t>119</w:t>
+        <w:t>125</w:t>
       </w:r>
     </w:p>
     <w:p>
@@ -3213,7 +3213,7 @@
         <w:tab/>
       </w:r>
       <w:r>
-        <w:t>119</w:t>
+        <w:t>125</w:t>
       </w:r>
     </w:p>
     <w:p>
@@ -3230,7 +3230,7 @@
         <w:tab/>
       </w:r>
       <w:r>
-        <w:t>119</w:t>
+        <w:t>125</w:t>
       </w:r>
     </w:p>
     <w:p>
@@ -3247,7 +3247,7 @@
         <w:tab/>
       </w:r>
       <w:r>
-        <w:t>120</w:t>
+        <w:t>126</w:t>
       </w:r>
     </w:p>
     <w:p>
@@ -3264,7 +3264,7 @@
         <w:tab/>
       </w:r>
       <w:r>
-        <w:t>120</w:t>
+        <w:t>126</w:t>
       </w:r>
     </w:p>
     <w:p>
@@ -3281,7 +3281,7 @@
         <w:tab/>
       </w:r>
       <w:r>
-        <w:t>121</w:t>
+        <w:t>127</w:t>
       </w:r>
     </w:p>
     <w:p>
@@ -3298,7 +3298,7 @@
         <w:tab/>
       </w:r>
       <w:r>
-        <w:t>122</w:t>
+        <w:t>128</w:t>
       </w:r>
     </w:p>
     <w:p>
@@ -3315,7 +3315,7 @@
         <w:tab/>
       </w:r>
       <w:r>
-        <w:t>124</w:t>
+        <w:t>130</w:t>
       </w:r>
     </w:p>
     <w:p>
@@ -3332,7 +3332,7 @@
         <w:tab/>
       </w:r>
       <w:r>
-        <w:t>126</w:t>
+        <w:t>132</w:t>
       </w:r>
     </w:p>
     <w:p>
@@ -3349,7 +3349,7 @@
         <w:tab/>
       </w:r>
       <w:r>
-        <w:t>128</w:t>
+        <w:t>134</w:t>
       </w:r>
     </w:p>
     <w:p>
@@ -3366,7 +3366,7 @@
         <w:tab/>
       </w:r>
       <w:r>
-        <w:t>129</w:t>
+        <w:t>135</w:t>
       </w:r>
     </w:p>
     <w:p>
@@ -3383,7 +3383,7 @@
         <w:tab/>
       </w:r>
       <w:r>
-        <w:t>129</w:t>
+        <w:t>135</w:t>
       </w:r>
     </w:p>
     <w:p>
@@ -3400,7 +3400,7 @@
         <w:tab/>
       </w:r>
       <w:r>
-        <w:t>130</w:t>
+        <w:t>136</w:t>
       </w:r>
     </w:p>
     <w:p>
@@ -3417,7 +3417,7 @@
         <w:tab/>
       </w:r>
       <w:r>
-        <w:t>131</w:t>
+        <w:t>137</w:t>
       </w:r>
     </w:p>
     <w:p>
@@ -3434,7 +3434,7 @@
         <w:tab/>
       </w:r>
       <w:r>
-        <w:t>131</w:t>
+        <w:t>137</w:t>
       </w:r>
     </w:p>
     <w:p>
@@ -3451,7 +3451,7 @@
         <w:tab/>
       </w:r>
       <w:r>
-        <w:t>135</w:t>
+        <w:t>141</w:t>
       </w:r>
     </w:p>
     <w:p>
@@ -3468,7 +3468,7 @@
         <w:tab/>
       </w:r>
       <w:r>
-        <w:t>138</w:t>
+        <w:t>144</w:t>
       </w:r>
     </w:p>
     <w:p>
@@ -3485,7 +3485,7 @@
         <w:tab/>
       </w:r>
       <w:r>
-        <w:t>138</w:t>
+        <w:t>144</w:t>
       </w:r>
     </w:p>
     <w:p>
@@ -3502,7 +3502,7 @@
         <w:tab/>
       </w:r>
       <w:r>
-        <w:t>143</w:t>
+        <w:t>149</w:t>
       </w:r>
     </w:p>
     <w:p>
@@ -3519,7 +3519,7 @@
         <w:tab/>
       </w:r>
       <w:r>
-        <w:t>144</w:t>
+        <w:t>150</w:t>
       </w:r>
     </w:p>
     <w:p>
@@ -3536,7 +3536,7 @@
         <w:tab/>
       </w:r>
       <w:r>
-        <w:t>144</w:t>
+        <w:t>150</w:t>
       </w:r>
     </w:p>
     <w:p>
@@ -3553,7 +3553,7 @@
         <w:tab/>
       </w:r>
       <w:r>
-        <w:t>145</w:t>
+        <w:t>151</w:t>
       </w:r>
     </w:p>
     <w:p>
@@ -3570,7 +3570,7 @@
         <w:tab/>
       </w:r>
       <w:r>
-        <w:t>146</w:t>
+        <w:t>152</w:t>
       </w:r>
     </w:p>
     <w:p>
@@ -3587,7 +3587,7 @@
         <w:tab/>
       </w:r>
       <w:r>
-        <w:t>146</w:t>
+        <w:t>152</w:t>
       </w:r>
     </w:p>
     <w:p>
@@ -3604,7 +3604,7 @@
         <w:tab/>
       </w:r>
       <w:r>
-        <w:t>147</w:t>
+        <w:t>153</w:t>
       </w:r>
     </w:p>
     <w:p>
@@ -3621,7 +3621,7 @@
         <w:tab/>
       </w:r>
       <w:r>
-        <w:t>148</w:t>
+        <w:t>154</w:t>
       </w:r>
     </w:p>
     <w:p>
@@ -3638,7 +3638,7 @@
         <w:tab/>
       </w:r>
       <w:r>
-        <w:t>150</w:t>
+        <w:t>156</w:t>
       </w:r>
     </w:p>
     <w:p>
@@ -3655,7 +3655,7 @@
         <w:tab/>
       </w:r>
       <w:r>
-        <w:t>153</w:t>
+        <w:t>159</w:t>
       </w:r>
     </w:p>
     <w:p>
@@ -3672,7 +3672,7 @@
         <w:tab/>
       </w:r>
       <w:r>
-        <w:t>153</w:t>
+        <w:t>159</w:t>
       </w:r>
     </w:p>
     <w:p>
@@ -3689,7 +3689,7 @@
         <w:tab/>
       </w:r>
       <w:r>
-        <w:t>154</w:t>
+        <w:t>160</w:t>
       </w:r>
     </w:p>
     <w:p>
@@ -3706,7 +3706,7 @@
         <w:tab/>
       </w:r>
       <w:r>
-        <w:t>156</w:t>
+        <w:t>160</w:t>
       </w:r>
     </w:p>
     <w:p>
@@ -3723,7 +3723,7 @@
         <w:tab/>
       </w:r>
       <w:r>
-        <w:t>157</w:t>
+        <w:t>161</w:t>
       </w:r>
     </w:p>
     <w:p>
@@ -3740,7 +3740,7 @@
         <w:tab/>
       </w:r>
       <w:r>
-        <w:t>157</w:t>
+        <w:t>162</w:t>
       </w:r>
     </w:p>
     <w:p>
@@ -3757,7 +3757,7 @@
         <w:tab/>
       </w:r>
       <w:r>
-        <w:t>158</w:t>
+        <w:t>162</w:t>
       </w:r>
     </w:p>
     <w:p>
@@ -3774,7 +3774,7 @@
         <w:tab/>
       </w:r>
       <w:r>
-        <w:t>159</w:t>
+        <w:t>163</w:t>
       </w:r>
     </w:p>
     <w:p>
@@ -3791,7 +3791,7 @@
         <w:tab/>
       </w:r>
       <w:r>
-        <w:t>161</w:t>
+        <w:t>165</w:t>
       </w:r>
     </w:p>
     <w:p>
@@ -3808,7 +3808,7 @@
         <w:tab/>
       </w:r>
       <w:r>
-        <w:t>161</w:t>
+        <w:t>165</w:t>
       </w:r>
     </w:p>
     <w:p>
@@ -3825,7 +3825,7 @@
         <w:tab/>
       </w:r>
       <w:r>
-        <w:t>161</w:t>
+        <w:t>165</w:t>
       </w:r>
     </w:p>
     <w:p>
@@ -3842,7 +3842,7 @@
         <w:tab/>
       </w:r>
       <w:r>
-        <w:t>161</w:t>
+        <w:t>166</w:t>
       </w:r>
     </w:p>
     <w:p>
@@ -3859,7 +3859,7 @@
         <w:tab/>
       </w:r>
       <w:r>
-        <w:t>162</w:t>
+        <w:t>167</w:t>
       </w:r>
     </w:p>
     <w:p>
@@ -3876,7 +3876,7 @@
         <w:tab/>
       </w:r>
       <w:r>
-        <w:t>162</w:t>
+        <w:t>167</w:t>
       </w:r>
     </w:p>
     <w:p>
@@ -3893,7 +3893,7 @@
         <w:tab/>
       </w:r>
       <w:r>
-        <w:t>163</w:t>
+        <w:t>167</w:t>
       </w:r>
     </w:p>
     <w:p>
@@ -4035,13 +4035,13 @@
         </w:tabs>
       </w:pPr>
       <w:r>
-        <w:t xml:space="preserve">Figura 5.7. Comparación del rendimiento de los dos modelos entre los dos conjuntos sintéticos.</w:t>
+        <w:t xml:space="preserve">Figura 5.7. F1 por condición de los dos modelos de diagnóstico y diferencia entre ellos.</w:t>
       </w:r>
       <w:r>
         <w:tab/>
       </w:r>
       <w:r>
-        <w:t>74</w:t>
+        <w:t>75</w:t>
       </w:r>
     </w:p>
     <w:p>
@@ -4052,7 +4052,7 @@
         </w:tabs>
       </w:pPr>
       <w:r>
-        <w:t xml:space="preserve">Figura 5.8. Acierto del modelo en cada ventana del termostato bloqueado, frente a la temperatura media del refrigerante.</w:t>
+        <w:t xml:space="preserve">Figura 5.8. Comparación del rendimiento de los dos modelos entre los dos conjuntos sintéticos.</w:t>
       </w:r>
       <w:r>
         <w:tab/>
@@ -4069,13 +4069,13 @@
         </w:tabs>
       </w:pPr>
       <w:r>
-        <w:t xml:space="preserve">Figura 5.9. Expresión efectiva del fallo en cada ventana de validación, y ventanas que el modelo de diagnóstico falla.</w:t>
+        <w:t xml:space="preserve">Figura 5.9. Acierto del modelo en cada ventana del termostato bloqueado, frente a la temperatura media del refrigerante.</w:t>
       </w:r>
       <w:r>
         <w:tab/>
       </w:r>
       <w:r>
-        <w:t>77</w:t>
+        <w:t>78</w:t>
       </w:r>
     </w:p>
     <w:p>
@@ -4086,7 +4086,7 @@
         </w:tabs>
       </w:pPr>
       <w:r>
-        <w:t xml:space="preserve">Figura 5.10. De la señal al descriptor: una ventana de fallo de encendido y los números con que el modelo la recibe.</w:t>
+        <w:t xml:space="preserve">Figura 5.10. Expresión efectiva del fallo en cada ventana de validación, y ventanas que el modelo de diagnóstico falla.</w:t>
       </w:r>
       <w:r>
         <w:tab/>
@@ -4103,7 +4103,7 @@
         </w:tabs>
       </w:pPr>
       <w:r>
-        <w:t xml:space="preserve">Figura 5.11. Confianza declarada frente a acierto observado, antes y después de calibrar.</w:t>
+        <w:t xml:space="preserve">Figura 5.11. De la señal al descriptor: una ventana de fallo de encendido y los números con que el modelo la recibe.</w:t>
       </w:r>
       <w:r>
         <w:tab/>
@@ -4120,7 +4120,7 @@
         </w:tabs>
       </w:pPr>
       <w:r>
-        <w:t xml:space="preserve">Figura 5.12. Peso explicativo de cada señal por condición, frente a las señales que el generador declara.</w:t>
+        <w:t xml:space="preserve">Figura 5.12. Confianza declarada frente a acierto observado, antes y después de calibrar.</w:t>
       </w:r>
       <w:r>
         <w:tab/>
@@ -4137,7 +4137,7 @@
         </w:tabs>
       </w:pPr>
       <w:r>
-        <w:t xml:space="preserve">Figura 5.13. Recuperación del procedimiento relevante del manual según la estrategia de consulta.</w:t>
+        <w:t xml:space="preserve">Figura 5.13. Acierto observado por tramo de confianza calibrada, y número de ventanas de cada tramo.</w:t>
       </w:r>
       <w:r>
         <w:tab/>
@@ -4154,13 +4154,13 @@
         </w:tabs>
       </w:pPr>
       <w:r>
-        <w:t xml:space="preserve">Figura 5.14. Documentos aplicables recuperados y cobertura de afirmaciones alcanzada, por condición de evidencia.</w:t>
+        <w:t xml:space="preserve">Figura 5.14. Cobertura y precisión de la decisión diagnóstica frente al umbral de confianza, y el plano que forman.</w:t>
       </w:r>
       <w:r>
         <w:tab/>
       </w:r>
       <w:r>
-        <w:t>90</w:t>
+        <w:t>86</w:t>
       </w:r>
     </w:p>
     <w:p>
@@ -4171,13 +4171,13 @@
         </w:tabs>
       </w:pPr>
       <w:r>
-        <w:t xml:space="preserve">Figura 5.15. Falsa confianza y abstención innecesaria de la configuración canónica y de las cuatro ablaciones.</w:t>
+        <w:t xml:space="preserve">Figura 5.15. Peso explicativo de cada señal por condición, frente a las señales que el generador declara.</w:t>
       </w:r>
       <w:r>
         <w:tab/>
       </w:r>
       <w:r>
-        <w:t>97</w:t>
+        <w:t>88</w:t>
       </w:r>
     </w:p>
     <w:p>
@@ -4188,13 +4188,13 @@
         </w:tabs>
       </w:pPr>
       <w:r>
-        <w:t xml:space="preserve">Figura 5.16. Las tres cifras de la evaluación final, con su numerador y su denominador.</w:t>
+        <w:t xml:space="preserve">Figura 5.16. Recuperación del procedimiento relevante del manual según la estrategia de consulta.</w:t>
       </w:r>
       <w:r>
         <w:tab/>
       </w:r>
       <w:r>
-        <w:t>102</w:t>
+        <w:t>91</w:t>
       </w:r>
     </w:p>
     <w:p>
@@ -4205,13 +4205,13 @@
         </w:tabs>
       </w:pPr>
       <w:r>
-        <w:t xml:space="preserve">Figura 5.17. Decisión del sistema en cada una de las 22 ejecuciones del estrato operativo.</w:t>
+        <w:t xml:space="preserve">Figura 5.17. Documentos aplicables recuperados y cobertura de afirmaciones alcanzada, por condición de evidencia.</w:t>
       </w:r>
       <w:r>
         <w:tab/>
       </w:r>
       <w:r>
-        <w:t>103</w:t>
+        <w:t>96</w:t>
       </w:r>
     </w:p>
     <w:p>
@@ -4222,13 +4222,13 @@
         </w:tabs>
       </w:pPr>
       <w:r>
-        <w:t xml:space="preserve">Figura 5.18. Las 35 ejecuciones de la evaluación final, situadas respecto del umbral de confianza.</w:t>
+        <w:t xml:space="preserve">Figura 5.18. Falsa confianza y abstención innecesaria de la configuración canónica y de las cuatro ablaciones.</w:t>
       </w:r>
       <w:r>
         <w:tab/>
       </w:r>
       <w:r>
-        <w:t>105</w:t>
+        <w:t>103</w:t>
       </w:r>
     </w:p>
     <w:p>
@@ -4239,13 +4239,13 @@
         </w:tabs>
       </w:pPr>
       <w:r>
-        <w:t xml:space="preserve">Figura 6.1. Recorrido experimental, del dato OBD-II a la decisión de explicar o abstenerse.</w:t>
+        <w:t xml:space="preserve">Figura 5.19. Las tres cifras de la evaluación final, con su numerador y su denominador.</w:t>
       </w:r>
       <w:r>
         <w:tab/>
       </w:r>
       <w:r>
-        <w:t>118</w:t>
+        <w:t>108</w:t>
       </w:r>
     </w:p>
     <w:p>
@@ -4256,13 +4256,13 @@
         </w:tabs>
       </w:pPr>
       <w:r>
-        <w:t xml:space="preserve">Figura 6.2. Objetivos específicos, experimentos que los sostienen y estado de cumplimiento.</w:t>
+        <w:t xml:space="preserve">Figura 5.20. Decisión del sistema en cada una de las 22 ejecuciones del estrato operativo.</w:t>
       </w:r>
       <w:r>
         <w:tab/>
       </w:r>
       <w:r>
-        <w:t>123</w:t>
+        <w:t>109</w:t>
       </w:r>
     </w:p>
     <w:p>
@@ -4273,13 +4273,13 @@
         </w:tabs>
       </w:pPr>
       <w:r>
-        <w:t xml:space="preserve">Figura 6.3. Los dos errores del sistema y los de las dos políticas triviales, sobre los mismos casos.</w:t>
+        <w:t xml:space="preserve">Figura 5.21. Las 35 ejecuciones de la evaluación final, situadas respecto del umbral de confianza.</w:t>
       </w:r>
       <w:r>
         <w:tab/>
       </w:r>
       <w:r>
-        <w:t>133</w:t>
+        <w:t>111</w:t>
       </w:r>
     </w:p>
     <w:p>
@@ -4290,13 +4290,13 @@
         </w:tabs>
       </w:pPr>
       <w:r>
-        <w:t xml:space="preserve">Figura A.1. Señal testigo de cada condición de fallo, comparada con la misma sesión sin fallo.</w:t>
+        <w:t xml:space="preserve">Figura 6.1. Recorrido experimental, del dato OBD-II a la decisión de explicar o abstenerse.</w:t>
       </w:r>
       <w:r>
         <w:tab/>
       </w:r>
       <w:r>
-        <w:t>149</w:t>
+        <w:t>124</w:t>
       </w:r>
     </w:p>
     <w:p>
@@ -4307,13 +4307,13 @@
         </w:tabs>
       </w:pPr>
       <w:r>
-        <w:t xml:space="preserve">Figura A.2. La misma sesión con el fallo y sin él, por condición, sobre el conjunto canónico.</w:t>
+        <w:t xml:space="preserve">Figura 6.2. Objetivos específicos, experimentos que los sostienen y estado de cumplimiento.</w:t>
       </w:r>
       <w:r>
         <w:tab/>
       </w:r>
       <w:r>
-        <w:t>151</w:t>
+        <w:t>129</w:t>
       </w:r>
     </w:p>
     <w:p>
@@ -4324,42 +4324,13 @@
         </w:tabs>
       </w:pPr>
       <w:r>
-        <w:t xml:space="preserve">Figura B.1. F1 por condición de los dos modelos de diagnóstico y diferencia entre ellos.</w:t>
+        <w:t xml:space="preserve">Figura 6.3. Los dos errores del sistema y los de las dos políticas triviales, sobre los mismos casos.</w:t>
       </w:r>
       <w:r>
         <w:tab/>
       </w:r>
       <w:r>
-        <w:t>155</w:t>
-      </w:r>
-    </w:p>
-    <w:p>
-      <w:r>
-        <w:fldChar w:fldCharType="end"/>
-      </w:r>
-    </w:p>
-    <w:p>
-      <w:r>
-        <w:br w:type="page"/>
-      </w:r>
-    </w:p>
-    <w:p>
-      <w:pPr>
-        <w:pStyle w:val="TtuloTDC"/>
-      </w:pPr>
-      <w:r>
-        <w:t>ÍNDICE DE TABLAS</w:t>
-      </w:r>
-    </w:p>
-    <w:p>
-      <w:r>
-        <w:fldChar w:fldCharType="begin" w:dirty="true"/>
-      </w:r>
-      <w:r>
-        <w:instrText xml:space="preserve"> TOC \h \z \t "PieDeTabla;1" </w:instrText>
-      </w:r>
-      <w:r>
-        <w:fldChar w:fldCharType="separate"/>
+        <w:t>139</w:t>
       </w:r>
     </w:p>
     <w:p>
@@ -4370,13 +4341,13 @@
         </w:tabs>
       </w:pPr>
       <w:r>
-        <w:t xml:space="preserve">Tabla 2.1. Correspondencia entre los objetivos específicos y su estrategia de evaluación.</w:t>
+        <w:t xml:space="preserve">Figura A.1. Señal testigo de cada condición de fallo, comparada con la misma sesión sin fallo.</w:t>
       </w:r>
       <w:r>
         <w:tab/>
       </w:r>
       <w:r>
-        <w:t>24</w:t>
+        <w:t>155</w:t>
       </w:r>
     </w:p>
     <w:p>
@@ -4387,13 +4358,42 @@
         </w:tabs>
       </w:pPr>
       <w:r>
-        <w:t xml:space="preserve">Tabla 3.1. Qué establece cada frente de la revisión y qué deja sin medir.</w:t>
+        <w:t xml:space="preserve">Figura A.2. La misma sesión con el fallo y sin él, por condición, sobre el conjunto canónico.</w:t>
       </w:r>
       <w:r>
         <w:tab/>
       </w:r>
       <w:r>
-        <w:t>33</w:t>
+        <w:t>157</w:t>
+      </w:r>
+    </w:p>
+    <w:p>
+      <w:r>
+        <w:fldChar w:fldCharType="end"/>
+      </w:r>
+    </w:p>
+    <w:p>
+      <w:r>
+        <w:br w:type="page"/>
+      </w:r>
+    </w:p>
+    <w:p>
+      <w:pPr>
+        <w:pStyle w:val="TtuloTDC"/>
+      </w:pPr>
+      <w:r>
+        <w:t>ÍNDICE DE TABLAS</w:t>
+      </w:r>
+    </w:p>
+    <w:p>
+      <w:r>
+        <w:fldChar w:fldCharType="begin" w:dirty="true"/>
+      </w:r>
+      <w:r>
+        <w:instrText xml:space="preserve"> TOC \h \z \t "PieDeTabla;1" </w:instrText>
+      </w:r>
+      <w:r>
+        <w:fldChar w:fldCharType="separate"/>
       </w:r>
     </w:p>
     <w:p>
@@ -4404,13 +4404,13 @@
         </w:tabs>
       </w:pPr>
       <w:r>
-        <w:t xml:space="preserve">Tabla 4.1. Caracterización del vehículo de referencia y del corpus documental asociado.</w:t>
+        <w:t xml:space="preserve">Tabla 2.1. Correspondencia entre los objetivos específicos y su estrategia de evaluación.</w:t>
       </w:r>
       <w:r>
         <w:tab/>
       </w:r>
       <w:r>
-        <w:t>38</w:t>
+        <w:t>24</w:t>
       </w:r>
     </w:p>
     <w:p>
@@ -4421,13 +4421,13 @@
         </w:tabs>
       </w:pPr>
       <w:r>
-        <w:t xml:space="preserve">Tabla 4.2. Características de la muestra sintética de telemetría OBD-II.</w:t>
+        <w:t xml:space="preserve">Tabla 3.1. Qué establece cada frente de la revisión y qué deja sin medir.</w:t>
       </w:r>
       <w:r>
         <w:tab/>
       </w:r>
       <w:r>
-        <w:t>39</w:t>
+        <w:t>33</w:t>
       </w:r>
     </w:p>
     <w:p>
@@ -4438,13 +4438,13 @@
         </w:tabs>
       </w:pPr>
       <w:r>
-        <w:t xml:space="preserve">Tabla 4.3. Señales OBD-II utilizadas en el entorno experimental.</w:t>
+        <w:t xml:space="preserve">Tabla 4.1. Caracterización del vehículo de referencia y del corpus documental asociado.</w:t>
       </w:r>
       <w:r>
         <w:tab/>
       </w:r>
       <w:r>
-        <w:t>40</w:t>
+        <w:t>38</w:t>
       </w:r>
     </w:p>
     <w:p>
@@ -4455,13 +4455,13 @@
         </w:tabs>
       </w:pPr>
       <w:r>
-        <w:t xml:space="preserve">Tabla 4.4. Composición del corpus documental del vehículo de referencia.</w:t>
+        <w:t xml:space="preserve">Tabla 4.2. Características de la muestra sintética de telemetría OBD-II.</w:t>
       </w:r>
       <w:r>
         <w:tab/>
       </w:r>
       <w:r>
-        <w:t>41</w:t>
+        <w:t>39</w:t>
       </w:r>
     </w:p>
     <w:p>
@@ -4472,13 +4472,13 @@
         </w:tabs>
       </w:pPr>
       <w:r>
-        <w:t xml:space="preserve">Tabla 4.5. Correspondencia entre objetivos, fases experimentales, métricas y estado de ejecución.</w:t>
+        <w:t xml:space="preserve">Tabla 4.3. Señales OBD-II utilizadas en el entorno experimental.</w:t>
       </w:r>
       <w:r>
         <w:tab/>
       </w:r>
       <w:r>
-        <w:t>43</w:t>
+        <w:t>40</w:t>
       </w:r>
     </w:p>
     <w:p>
@@ -4489,13 +4489,13 @@
         </w:tabs>
       </w:pPr>
       <w:r>
-        <w:t xml:space="preserve">Tabla 4.6. Subpreguntas de investigación con sus desenlaces de sostenimiento y refutación.</w:t>
+        <w:t xml:space="preserve">Tabla 4.4. Composición del corpus documental del vehículo de referencia.</w:t>
       </w:r>
       <w:r>
         <w:tab/>
       </w:r>
       <w:r>
-        <w:t>43</w:t>
+        <w:t>41</w:t>
       </w:r>
     </w:p>
     <w:p>
@@ -4506,13 +4506,13 @@
         </w:tabs>
       </w:pPr>
       <w:r>
-        <w:t xml:space="preserve">Tabla 4.7. Condiciones experimentales de disponibilidad y pertinencia de la evidencia documental.</w:t>
+        <w:t xml:space="preserve">Tabla 4.5. Correspondencia entre objetivos, fases experimentales, métricas y estado de ejecución.</w:t>
       </w:r>
       <w:r>
         <w:tab/>
       </w:r>
       <w:r>
-        <w:t>45</w:t>
+        <w:t>43</w:t>
       </w:r>
     </w:p>
     <w:p>
@@ -4523,13 +4523,13 @@
         </w:tabs>
       </w:pPr>
       <w:r>
-        <w:t xml:space="preserve">Tabla 4.8. Agrupación en bloques de las veinte fases del plan experimental.</w:t>
+        <w:t xml:space="preserve">Tabla 4.6. Subpreguntas de investigación con sus desenlaces de sostenimiento y refutación.</w:t>
       </w:r>
       <w:r>
         <w:tab/>
       </w:r>
       <w:r>
-        <w:t>49</w:t>
+        <w:t>43</w:t>
       </w:r>
     </w:p>
     <w:p>
@@ -4540,13 +4540,13 @@
         </w:tabs>
       </w:pPr>
       <w:r>
-        <w:t xml:space="preserve">Tabla 4.9. Diseño de la fase de recuperación de información documental.</w:t>
+        <w:t xml:space="preserve">Tabla 4.7. Condiciones experimentales de disponibilidad y pertinencia de la evidencia documental.</w:t>
       </w:r>
       <w:r>
         <w:tab/>
       </w:r>
       <w:r>
-        <w:t>51</w:t>
+        <w:t>45</w:t>
       </w:r>
     </w:p>
     <w:p>
@@ -4557,13 +4557,13 @@
         </w:tabs>
       </w:pPr>
       <w:r>
-        <w:t xml:space="preserve">Tabla 4.10. Diseño de la fase de construcción de la explicación.</w:t>
+        <w:t xml:space="preserve">Tabla 4.8. Agrupación en bloques de las veinte fases del plan experimental.</w:t>
       </w:r>
       <w:r>
         <w:tab/>
       </w:r>
       <w:r>
-        <w:t>52</w:t>
+        <w:t>49</w:t>
       </w:r>
     </w:p>
     <w:p>
@@ -4574,13 +4574,13 @@
         </w:tabs>
       </w:pPr>
       <w:r>
-        <w:t xml:space="preserve">Tabla 4.11. Diseño de la fase de verificación del soporte documental.</w:t>
+        <w:t xml:space="preserve">Tabla 4.9. Diseño de la fase de recuperación de información documental.</w:t>
       </w:r>
       <w:r>
         <w:tab/>
       </w:r>
       <w:r>
-        <w:t>53</w:t>
+        <w:t>51</w:t>
       </w:r>
     </w:p>
     <w:p>
@@ -4591,13 +4591,13 @@
         </w:tabs>
       </w:pPr>
       <w:r>
-        <w:t xml:space="preserve">Tabla 4.12. Diseño de la fase de decisión entre explicar y abstenerse.</w:t>
+        <w:t xml:space="preserve">Tabla 4.10. Diseño de la fase de construcción de la explicación.</w:t>
       </w:r>
       <w:r>
         <w:tab/>
       </w:r>
       <w:r>
-        <w:t>54</w:t>
+        <w:t>52</w:t>
       </w:r>
     </w:p>
     <w:p>
@@ -4608,13 +4608,13 @@
         </w:tabs>
       </w:pPr>
       <w:r>
-        <w:t xml:space="preserve">Tabla 4.13. Unidades de análisis utilizadas en las métricas asociadas a OE4.</w:t>
+        <w:t xml:space="preserve">Tabla 4.11. Diseño de la fase de verificación del soporte documental.</w:t>
       </w:r>
       <w:r>
         <w:tab/>
       </w:r>
       <w:r>
-        <w:t>55</w:t>
+        <w:t>53</w:t>
       </w:r>
     </w:p>
     <w:p>
@@ -4625,13 +4625,13 @@
         </w:tabs>
       </w:pPr>
       <w:r>
-        <w:t xml:space="preserve">Tabla 4.14. Métricas utilizadas en la evaluación de la generación y validación de hipótesis.</w:t>
+        <w:t xml:space="preserve">Tabla 4.12. Diseño de la fase de decisión entre explicar y abstenerse.</w:t>
       </w:r>
       <w:r>
         <w:tab/>
       </w:r>
       <w:r>
-        <w:t>56</w:t>
+        <w:t>54</w:t>
       </w:r>
     </w:p>
     <w:p>
@@ -4642,13 +4642,13 @@
         </w:tabs>
       </w:pPr>
       <w:r>
-        <w:t xml:space="preserve">Tabla 5.1. Rendimiento del modelo de diagnóstico sobre la partición de validación.</w:t>
+        <w:t xml:space="preserve">Tabla 4.13. Unidades de análisis utilizadas en las métricas asociadas a OE4.</w:t>
       </w:r>
       <w:r>
         <w:tab/>
       </w:r>
       <w:r>
-        <w:t>71</w:t>
+        <w:t>55</w:t>
       </w:r>
     </w:p>
     <w:p>
@@ -4659,13 +4659,13 @@
         </w:tabs>
       </w:pPr>
       <w:r>
-        <w:t xml:space="preserve">Tabla 5.2. Calibración de la confianza del modelo de diagnóstico.</w:t>
+        <w:t xml:space="preserve">Tabla 4.14. Métricas utilizadas en la evaluación de la generación y validación de hipótesis.</w:t>
       </w:r>
       <w:r>
         <w:tab/>
       </w:r>
       <w:r>
-        <w:t>80</w:t>
+        <w:t>56</w:t>
       </w:r>
     </w:p>
     <w:p>
@@ -4676,13 +4676,13 @@
         </w:tabs>
       </w:pPr>
       <w:r>
-        <w:t xml:space="preserve">Tabla 5.3. Recuperación sobre el corpus documental por estrategia.</w:t>
+        <w:t xml:space="preserve">Tabla 5.1. Rendimiento del modelo de diagnóstico sobre la partición de validación.</w:t>
       </w:r>
       <w:r>
         <w:tab/>
       </w:r>
       <w:r>
-        <w:t>84</w:t>
+        <w:t>71</w:t>
       </w:r>
     </w:p>
     <w:p>
@@ -4693,13 +4693,13 @@
         </w:tabs>
       </w:pPr>
       <w:r>
-        <w:t xml:space="preserve">Tabla 5.4. Recuperación translingüe sin filtro por código de avería.</w:t>
+        <w:t xml:space="preserve">Tabla 5.2. Calibración de la confianza del modelo de diagnóstico.</w:t>
       </w:r>
       <w:r>
         <w:tab/>
       </w:r>
       <w:r>
-        <w:t>86</w:t>
+        <w:t>82</w:t>
       </w:r>
     </w:p>
     <w:p>
@@ -4710,13 +4710,13 @@
         </w:tabs>
       </w:pPr>
       <w:r>
-        <w:t xml:space="preserve">Tabla 5.5. Decisiones del verificador de suficiencia sobre los diecisiete casos anotados.</w:t>
+        <w:t xml:space="preserve">Tabla 5.3. Recuperación sobre el corpus documental por estrategia.</w:t>
       </w:r>
       <w:r>
         <w:tab/>
       </w:r>
       <w:r>
-        <w:t>88</w:t>
+        <w:t>89</w:t>
       </w:r>
     </w:p>
     <w:p>
@@ -4727,13 +4727,13 @@
         </w:tabs>
       </w:pPr>
       <w:r>
-        <w:t xml:space="preserve">Tabla 5.6. Falsa confianza y abstención innecesaria del sistema y de dos políticas de referencia.</w:t>
+        <w:t xml:space="preserve">Tabla 5.4. Recuperación translingüe sin filtro por código de avería.</w:t>
       </w:r>
       <w:r>
         <w:tab/>
       </w:r>
       <w:r>
-        <w:t>91</w:t>
+        <w:t>92</w:t>
       </w:r>
     </w:p>
     <w:p>
@@ -4744,13 +4744,13 @@
         </w:tabs>
       </w:pPr>
       <w:r>
-        <w:t xml:space="preserve">Tabla 5.7. Salidas del modelo de lenguaje por configuración.</w:t>
+        <w:t xml:space="preserve">Tabla 5.5. Decisiones del verificador de suficiencia sobre los diecisiete casos anotados.</w:t>
       </w:r>
       <w:r>
         <w:tab/>
       </w:r>
       <w:r>
-        <w:t>94</w:t>
+        <w:t>93</w:t>
       </w:r>
     </w:p>
     <w:p>
@@ -4761,13 +4761,13 @@
         </w:tabs>
       </w:pPr>
       <w:r>
-        <w:t xml:space="preserve">Tabla 5.8. Efecto de retirar o degradar cada componente.</w:t>
+        <w:t xml:space="preserve">Tabla 5.6. Falsa confianza y abstención innecesaria del sistema y de dos políticas de referencia.</w:t>
       </w:r>
       <w:r>
         <w:tab/>
       </w:r>
       <w:r>
-        <w:t>96</w:t>
+        <w:t>97</w:t>
       </w:r>
     </w:p>
     <w:p>
@@ -4778,13 +4778,13 @@
         </w:tabs>
       </w:pPr>
       <w:r>
-        <w:t xml:space="preserve">Tabla A.1. Etapas del recorrido experimental y experimento que mide cada una.</w:t>
+        <w:t xml:space="preserve">Tabla 5.7. Salidas del modelo de lenguaje por configuración.</w:t>
       </w:r>
       <w:r>
         <w:tab/>
       </w:r>
       <w:r>
-        <w:t>144</w:t>
+        <w:t>100</w:t>
       </w:r>
     </w:p>
     <w:p>
@@ -4795,13 +4795,13 @@
         </w:tabs>
       </w:pPr>
       <w:r>
-        <w:t xml:space="preserve">Tabla A.2. Las doce señales OBD-II, con su unidad y su rango físico.</w:t>
+        <w:t xml:space="preserve">Tabla 5.8. Efecto de retirar o degradar cada componente.</w:t>
       </w:r>
       <w:r>
         <w:tab/>
       </w:r>
       <w:r>
-        <w:t>145</w:t>
+        <w:t>102</w:t>
       </w:r>
     </w:p>
     <w:p>
@@ -4812,13 +4812,13 @@
         </w:tabs>
       </w:pPr>
       <w:r>
-        <w:t xml:space="preserve">Tabla A.3. Las cinco condiciones de fallo, con sus señales declaradas y su patrón temporal.</w:t>
+        <w:t xml:space="preserve">Tabla A.1. Etapas del recorrido experimental y experimento que mide cada una.</w:t>
       </w:r>
       <w:r>
         <w:tab/>
       </w:r>
       <w:r>
-        <w:t>146</w:t>
+        <w:t>150</w:t>
       </w:r>
     </w:p>
     <w:p>
@@ -4829,13 +4829,13 @@
         </w:tabs>
       </w:pPr>
       <w:r>
-        <w:t xml:space="preserve">Tabla A.4. Constantes del generador calibradas contra el manual de taller.</w:t>
+        <w:t xml:space="preserve">Tabla A.2. Las doce señales OBD-II, con su unidad y su rango físico.</w:t>
       </w:r>
       <w:r>
         <w:tab/>
       </w:r>
       <w:r>
-        <w:t>147</w:t>
+        <w:t>151</w:t>
       </w:r>
     </w:p>
     <w:p>
@@ -4846,13 +4846,13 @@
         </w:tabs>
       </w:pPr>
       <w:r>
-        <w:t xml:space="preserve">Tabla A.5. Los tres conjuntos sintéticos y su reconstructibilidad medida.</w:t>
+        <w:t xml:space="preserve">Tabla A.3. Las cinco condiciones de fallo, con sus señales declaradas y su patrón temporal.</w:t>
       </w:r>
       <w:r>
         <w:tab/>
       </w:r>
       <w:r>
-        <w:t>147</w:t>
+        <w:t>152</w:t>
       </w:r>
     </w:p>
     <w:p>
@@ -4863,7 +4863,7 @@
         </w:tabs>
       </w:pPr>
       <w:r>
-        <w:t xml:space="preserve">Tabla B.1. Estatuto de cada resultado del trabajo.</w:t>
+        <w:t xml:space="preserve">Tabla A.4. Constantes del generador calibradas contra el manual de taller.</w:t>
       </w:r>
       <w:r>
         <w:tab/>
@@ -4880,13 +4880,13 @@
         </w:tabs>
       </w:pPr>
       <w:r>
-        <w:t xml:space="preserve">Tabla B.2. F1 por condición de los dos modelos de diagnóstico.</w:t>
+        <w:t xml:space="preserve">Tabla A.5. Los tres conjuntos sintéticos y su reconstructibilidad medida.</w:t>
       </w:r>
       <w:r>
         <w:tab/>
       </w:r>
       <w:r>
-        <w:t>156</w:t>
+        <w:t>153</w:t>
       </w:r>
     </w:p>
     <w:p>
@@ -4897,13 +4897,13 @@
         </w:tabs>
       </w:pPr>
       <w:r>
-        <w:t xml:space="preserve">Tabla B.3. Señales en que se apoya el modelo, por diagnóstico.</w:t>
+        <w:t xml:space="preserve">Tabla B.1. Estatuto de cada resultado del trabajo.</w:t>
       </w:r>
       <w:r>
         <w:tab/>
       </w:r>
       <w:r>
-        <w:t>156</w:t>
+        <w:t>159</w:t>
       </w:r>
     </w:p>
     <w:p>
@@ -4914,13 +4914,13 @@
         </w:tabs>
       </w:pPr>
       <w:r>
-        <w:t xml:space="preserve">Tabla B.4. Los cinco niveles de apertura del conjunto de prueba.</w:t>
+        <w:t xml:space="preserve">Tabla B.2. F1 por condición de los dos modelos de diagnóstico.</w:t>
       </w:r>
       <w:r>
         <w:tab/>
       </w:r>
       <w:r>
-        <w:t>157</w:t>
+        <w:t>160</w:t>
       </w:r>
     </w:p>
     <w:p>
@@ -4931,13 +4931,13 @@
         </w:tabs>
       </w:pPr>
       <w:r>
-        <w:t xml:space="preserve">Tabla B.5. Separabilidad de los descriptores entre la fuga de vacío y la deriva del caudalímetro.</w:t>
+        <w:t xml:space="preserve">Tabla B.3. Señales en que se apoya el modelo, por diagnóstico.</w:t>
       </w:r>
       <w:r>
         <w:tab/>
       </w:r>
       <w:r>
-        <w:t>158</w:t>
+        <w:t>160</w:t>
       </w:r>
     </w:p>
     <w:p>
@@ -4948,13 +4948,13 @@
         </w:tabs>
       </w:pPr>
       <w:r>
-        <w:t xml:space="preserve">Tabla B.6. Cronología de los criterios de aceptación de las subpreguntas.</w:t>
+        <w:t xml:space="preserve">Tabla B.4. Los cinco niveles de apertura del conjunto de prueba.</w:t>
       </w:r>
       <w:r>
         <w:tab/>
       </w:r>
       <w:r>
-        <w:t>159</w:t>
+        <w:t>162</w:t>
       </w:r>
     </w:p>
     <w:p>
@@ -4965,13 +4965,13 @@
         </w:tabs>
       </w:pPr>
       <w:r>
-        <w:t xml:space="preserve">Tabla B.7. Criterio original y criterio vigente de cada subpregunta.</w:t>
+        <w:t xml:space="preserve">Tabla B.5. Separabilidad de los descriptores entre la fuga de vacío y la deriva del caudalímetro.</w:t>
       </w:r>
       <w:r>
         <w:tab/>
       </w:r>
       <w:r>
-        <w:t>160</w:t>
+        <w:t>163</w:t>
       </w:r>
     </w:p>
     <w:p>
@@ -4982,13 +4982,13 @@
         </w:tabs>
       </w:pPr>
       <w:r>
-        <w:t xml:space="preserve">Tabla C.1. Lo que hace falta para reejecutar el trabajo.</w:t>
+        <w:t xml:space="preserve">Tabla B.6. Cronología de los criterios de aceptación de las subpreguntas.</w:t>
       </w:r>
       <w:r>
         <w:tab/>
       </w:r>
       <w:r>
-        <w:t>161</w:t>
+        <w:t>164</w:t>
       </w:r>
     </w:p>
     <w:p>
@@ -4999,13 +4999,13 @@
         </w:tabs>
       </w:pPr>
       <w:r>
-        <w:t xml:space="preserve">Tabla C.2. Los siete notebooks entregados, con su modalidad.</w:t>
+        <w:t xml:space="preserve">Tabla B.7. Criterio original y criterio vigente de cada subpregunta.</w:t>
       </w:r>
       <w:r>
         <w:tab/>
       </w:r>
       <w:r>
-        <w:t>162</w:t>
+        <w:t>164</w:t>
       </w:r>
     </w:p>
     <w:p>
@@ -5016,13 +5016,13 @@
         </w:tabs>
       </w:pPr>
       <w:r>
-        <w:t xml:space="preserve">Tabla C.3. Guiones de verificación del repositorio.</w:t>
+        <w:t xml:space="preserve">Tabla C.1. Lo que hace falta para reejecutar el trabajo.</w:t>
       </w:r>
       <w:r>
         <w:tab/>
       </w:r>
       <w:r>
-        <w:t>162</w:t>
+        <w:t>165</w:t>
       </w:r>
     </w:p>
     <w:p>
@@ -5033,13 +5033,13 @@
         </w:tabs>
       </w:pPr>
       <w:r>
-        <w:t xml:space="preserve">Tabla C.4. Lo que no se puede reproducir, y por qué.</w:t>
+        <w:t xml:space="preserve">Tabla C.2. Los siete notebooks entregados, con su modalidad.</w:t>
       </w:r>
       <w:r>
         <w:tab/>
       </w:r>
       <w:r>
-        <w:t>162</w:t>
+        <w:t>166</w:t>
       </w:r>
     </w:p>
     <w:p>
@@ -5050,13 +5050,47 @@
         </w:tabs>
       </w:pPr>
       <w:r>
+        <w:t xml:space="preserve">Tabla C.3. Guiones de verificación del repositorio.</w:t>
+      </w:r>
+      <w:r>
+        <w:tab/>
+      </w:r>
+      <w:r>
+        <w:t>167</w:t>
+      </w:r>
+    </w:p>
+    <w:p>
+      <w:pPr>
+        <w:pStyle w:val="TDC1"/>
+        <w:tabs>
+          <w:tab w:val="right" w:leader="dot" w:pos="8505"/>
+        </w:tabs>
+      </w:pPr>
+      <w:r>
+        <w:t xml:space="preserve">Tabla C.4. Lo que no se puede reproducir, y por qué.</w:t>
+      </w:r>
+      <w:r>
+        <w:tab/>
+      </w:r>
+      <w:r>
+        <w:t>167</w:t>
+      </w:r>
+    </w:p>
+    <w:p>
+      <w:pPr>
+        <w:pStyle w:val="TDC1"/>
+        <w:tabs>
+          <w:tab w:val="right" w:leader="dot" w:pos="8505"/>
+        </w:tabs>
+      </w:pPr>
+      <w:r>
         <w:t xml:space="preserve">Tabla C.5. Correspondencia entre cada figura y tabla del documento y su artefacto en el repositorio.</w:t>
       </w:r>
       <w:r>
         <w:tab/>
       </w:r>
       <w:r>
-        <w:t>163</w:t>
+        <w:t>168</w:t>
       </w:r>
     </w:p>
     <w:p>
@@ -15083,19 +15117,35 @@
         <w:pStyle w:val="Normal"/>
       </w:pPr>
       <w:r>
-        <w:t xml:space="preserve">La comparación entre los dos conjuntos merece verse, porque es un resultado negativo que estuvo a</w:t>
-      </w:r>
-      <w:r>
-        <w:t xml:space="preserve"> </w:t>
-      </w:r>
-      <w:r>
-        <w:t xml:space="preserve">punto de leerse como positivo. La Figura 5.7 la presenta tal como es, con las dos variables que se</w:t>
-      </w:r>
-      <w:r>
-        <w:t xml:space="preserve"> </w:t>
-      </w:r>
-      <w:r>
-        <w:t xml:space="preserve">mueven a la vez nombradas en el propio eje.</w:t>
+        <w:t xml:space="preserve">Lo que la matriz no dice es</w:t>
+      </w:r>
+      <w:r>
+        <w:t xml:space="preserve"> </w:t>
+      </w:r>
+      <w:r>
+        <w:rPr>
+          <w:b/>
+          <w:bCs/>
+        </w:rPr>
+        <w:t xml:space="preserve">cuánto pesa cada condición</w:t>
+      </w:r>
+      <w:r>
+        <w:t xml:space="preserve"> </w:t>
+      </w:r>
+      <w:r>
+        <w:t xml:space="preserve">en la diferencia agregada entre los dos</w:t>
+      </w:r>
+      <w:r>
+        <w:t xml:space="preserve"> </w:t>
+      </w:r>
+      <w:r>
+        <w:t xml:space="preserve">modelos, y esa es la cifra que sostiene la elección del bosque para el resto del recorrido. La</w:t>
+      </w:r>
+      <w:r>
+        <w:t xml:space="preserve"> </w:t>
+      </w:r>
+      <w:r>
+        <w:t xml:space="preserve">Figura 5.7 la reparte.</w:t>
       </w:r>
     </w:p>
     <w:p>
@@ -15108,7 +15158,7 @@
           <w:b/>
           <w:bCs/>
         </w:rPr>
-        <w:t xml:space="preserve">Figura 5.7. Comparación del rendimiento de los dos modelos entre los dos conjuntos sintéticos.</w:t>
+        <w:t xml:space="preserve">Figura 5.7. F1 por condición de los dos modelos de diagnóstico y diferencia entre ellos.</w:t>
       </w:r>
     </w:p>
     <w:p>
@@ -15119,20 +15169,241 @@
       <w:r>
         <w:drawing>
           <wp:inline>
-            <wp:extent cx="5364072" cy="2834945"/>
+            <wp:extent cx="5351839" cy="4718793"/>
             <wp:effectExtent b="0" l="0" r="0" t="0"/>
-            <wp:docPr descr="Cuatro barras: con el conjunto de 72 sesiones y generador calibrado el bosque supera a la red; con el de 216 sesiones y generador sin calibrar el orden se invierte." title="" id="106" name="Picture"/>
+            <wp:docPr descr="Dos paneles: a la izquierda el F1 de cada condición para el bosque y la red; a la derecha su diferencia, con la red ganando solo en el termostato por 0,032 y perdiendo en las otras cinco, hasta 0,167 en el fallo de encendido." title="" id="106" name="Picture"/>
             <a:graphic>
               <a:graphicData uri="http://schemas.openxmlformats.org/drawingml/2006/picture">
                 <pic:pic>
                   <pic:nvPicPr>
-                    <pic:cNvPr descr="../../artifacts/figures/memoria/FIG-5-07_confusor_volumen.png" id="107" name="Picture"/>
+                    <pic:cNvPr descr="../../artifacts/figures/memoria/FIG-5-07_f1_por_clase.png" id="107" name="Picture"/>
                     <pic:cNvPicPr>
                       <a:picLocks noChangeArrowheads="1" noChangeAspect="1"/>
                     </pic:cNvPicPr>
                   </pic:nvPicPr>
                   <pic:blipFill>
                     <a:blip r:embed="rId105"/>
+                    <a:stretch>
+                      <a:fillRect/>
+                    </a:stretch>
+                  </pic:blipFill>
+                  <pic:spPr bwMode="auto">
+                    <a:xfrm>
+                      <a:off x="0" y="0"/>
+                      <a:ext cx="5351839" cy="4718793"/>
+                    </a:xfrm>
+                    <a:prstGeom prst="rect">
+                      <a:avLst/>
+                    </a:prstGeom>
+                    <a:noFill/>
+                    <a:ln w="9525">
+                      <a:noFill/>
+                      <a:headEnd/>
+                      <a:tailEnd/>
+                    </a:ln>
+                  </pic:spPr>
+                </pic:pic>
+              </a:graphicData>
+            </a:graphic>
+          </wp:inline>
+        </w:drawing>
+      </w:r>
+    </w:p>
+    <w:p>
+      <w:pPr>
+        <w:pStyle w:val="Normal"/>
+      </w:pPr>
+      <w:r>
+        <w:rPr>
+          <w:i/>
+          <w:iCs/>
+        </w:rPr>
+        <w:t xml:space="preserve">Fuente: elaboración propia. Experimentos: E6 y E7. Conjunto:</w:t>
+      </w:r>
+      <w:r>
+        <w:rPr>
+          <w:i/>
+          <w:iCs/>
+        </w:rPr>
+        <w:t xml:space="preserve"> </w:t>
+      </w:r>
+      <w:r>
+        <w:rPr>
+          <w:rStyle w:val="VerbatimChar"/>
+          <w:i/>
+          <w:iCs/>
+        </w:rPr>
+        <w:t xml:space="preserve">synthetic_v2</w:t>
+      </w:r>
+      <w:r>
+        <w:rPr>
+          <w:i/>
+          <w:iCs/>
+        </w:rPr>
+        <w:t xml:space="preserve">, partición de validación. Paneles: (a) F1 de cada condición para los dos modelos; (b) diferencia entre los dos, positiva cuando gana la red. Protocolo: una ejecución por modelo, semilla 20260901; n es el número de ventanas de la clase en validación.</w:t>
+      </w:r>
+    </w:p>
+    <w:p>
+      <w:pPr>
+        <w:pStyle w:val="Normal"/>
+      </w:pPr>
+      <w:r>
+        <w:t xml:space="preserve">La desventaja agregada de la red, 0,056 en F1 macro,</w:t>
+      </w:r>
+      <w:r>
+        <w:t xml:space="preserve"> </w:t>
+      </w:r>
+      <w:r>
+        <w:rPr>
+          <w:b/>
+          <w:bCs/>
+        </w:rPr>
+        <w:t xml:space="preserve">no se reparte</w:t>
+      </w:r>
+      <w:r>
+        <w:t xml:space="preserve">: se concentra. La red gana en</w:t>
+      </w:r>
+      <w:r>
+        <w:t xml:space="preserve"> </w:t>
+      </w:r>
+      <w:r>
+        <w:t xml:space="preserve">una sola condición, el termostato bloqueado, por 0,032, y pierde en las otras cinco, con el máximo</w:t>
+      </w:r>
+      <w:r>
+        <w:t xml:space="preserve"> </w:t>
+      </w:r>
+      <w:r>
+        <w:t xml:space="preserve">en el fallo de encendido, 0,167. Las dos condiciones que marcan la diferencia son precisamente las</w:t>
+      </w:r>
+      <w:r>
+        <w:t xml:space="preserve"> </w:t>
+      </w:r>
+      <w:r>
+        <w:t xml:space="preserve">dos que menos señal dejan, y son las mismas en las que el bosque comete sus doce omisiones. La</w:t>
+      </w:r>
+      <w:r>
+        <w:t xml:space="preserve"> </w:t>
+      </w:r>
+      <w:r>
+        <w:t xml:space="preserve">elección del bosque para el resto del recorrido se apoya, por tanto, en tres cosas y no en una</w:t>
+      </w:r>
+      <w:r>
+        <w:t xml:space="preserve"> </w:t>
+      </w:r>
+      <w:r>
+        <w:t xml:space="preserve">cifra: aventaja a la red en cinco de las seis condiciones, su confianza admite calibración isotónica</w:t>
+      </w:r>
+      <w:r>
+        <w:t xml:space="preserve"> </w:t>
+      </w:r>
+      <w:r>
+        <w:t xml:space="preserve">—la red no se recalibró—, y la dirección de su error es la que el verificador puede absorber. Las</w:t>
+      </w:r>
+      <w:r>
+        <w:t xml:space="preserve"> </w:t>
+      </w:r>
+      <w:r>
+        <w:t xml:space="preserve">limitaciones son las del capítulo y una propia: una ejecución por modelo, sin repeticiones ni</w:t>
+      </w:r>
+      <w:r>
+        <w:t xml:space="preserve"> </w:t>
+      </w:r>
+      <w:r>
+        <w:t xml:space="preserve">intervalos, y una diferencia de 0,032 sobre catorce ventanas equivale a</w:t>
+      </w:r>
+      <w:r>
+        <w:t xml:space="preserve"> </w:t>
+      </w:r>
+      <w:r>
+        <w:rPr>
+          <w:b/>
+          <w:bCs/>
+        </w:rPr>
+        <w:t xml:space="preserve">una ventana y media</w:t>
+      </w:r>
+      <w:r>
+        <w:t xml:space="preserve">, de</w:t>
+      </w:r>
+      <w:r>
+        <w:t xml:space="preserve"> </w:t>
+      </w:r>
+      <w:r>
+        <w:t xml:space="preserve">modo que la única condición en que la red gana es también la que menos sostiene esa ventaja. Para la</w:t>
+      </w:r>
+      <w:r>
+        <w:t xml:space="preserve"> </w:t>
+      </w:r>
+      <w:r>
+        <w:t xml:space="preserve">pregunta de investigación, esta figura no decide nada sobre la explicación ni sobre la abstención:</w:t>
+      </w:r>
+      <w:r>
+        <w:t xml:space="preserve"> </w:t>
+      </w:r>
+      <w:r>
+        <w:t xml:space="preserve">fija qué modelo produce el diagnóstico que después habrá que explicar, y con qué debilidades</w:t>
+      </w:r>
+      <w:r>
+        <w:t xml:space="preserve"> </w:t>
+      </w:r>
+      <w:r>
+        <w:t xml:space="preserve">conocidas.</w:t>
+      </w:r>
+    </w:p>
+    <w:p>
+      <w:pPr>
+        <w:pStyle w:val="Normal"/>
+      </w:pPr>
+      <w:r>
+        <w:t xml:space="preserve">La comparación entre los dos conjuntos merece verse, porque es un resultado negativo que estuvo a</w:t>
+      </w:r>
+      <w:r>
+        <w:t xml:space="preserve"> </w:t>
+      </w:r>
+      <w:r>
+        <w:t xml:space="preserve">punto de leerse como positivo. La Figura 5.8 la presenta tal como es, con las dos variables que se</w:t>
+      </w:r>
+      <w:r>
+        <w:t xml:space="preserve"> </w:t>
+      </w:r>
+      <w:r>
+        <w:t xml:space="preserve">mueven a la vez nombradas en el propio eje.</w:t>
+      </w:r>
+    </w:p>
+    <w:p>
+      <w:pPr>
+        <w:keepNext/>
+        <w:pStyle w:val="PieDeFigura"/>
+      </w:pPr>
+      <w:r>
+        <w:rPr>
+          <w:b/>
+          <w:bCs/>
+        </w:rPr>
+        <w:t xml:space="preserve">Figura 5.8. Comparación del rendimiento de los dos modelos entre los dos conjuntos sintéticos.</w:t>
+      </w:r>
+    </w:p>
+    <w:p>
+      <w:pPr>
+        <w:keepNext/>
+        <w:pStyle w:val="CaptionedFigure"/>
+      </w:pPr>
+      <w:r>
+        <w:drawing>
+          <wp:inline>
+            <wp:extent cx="5364072" cy="2834945"/>
+            <wp:effectExtent b="0" l="0" r="0" t="0"/>
+            <wp:docPr descr="Cuatro barras: con el conjunto de 72 sesiones y generador calibrado el bosque supera a la red; con el de 216 sesiones y generador sin calibrar el orden se invierte." title="" id="109" name="Picture"/>
+            <a:graphic>
+              <a:graphicData uri="http://schemas.openxmlformats.org/drawingml/2006/picture">
+                <pic:pic>
+                  <pic:nvPicPr>
+                    <pic:cNvPr descr="../../artifacts/figures/memoria/FIG-5-08_confusor_volumen.png" id="110" name="Picture"/>
+                    <pic:cNvPicPr>
+                      <a:picLocks noChangeArrowheads="1" noChangeAspect="1"/>
+                    </pic:cNvPicPr>
+                  </pic:nvPicPr>
+                  <pic:blipFill>
+                    <a:blip r:embed="rId108"/>
                     <a:stretch>
                       <a:fillRect/>
                     </a:stretch>
@@ -15366,7 +15637,7 @@
         <w:t xml:space="preserve"> </w:t>
       </w:r>
       <w:r>
-        <w:t xml:space="preserve">no impone nada y la señal del motor averiado es idéntica a la del sano. La Figura 5.8 cruza, para</w:t>
+        <w:t xml:space="preserve">no impone nada y la señal del motor averiado es idéntica a la del sano. La Figura 5.9 cruza, para</w:t>
       </w:r>
       <w:r>
         <w:t xml:space="preserve"> </w:t>
@@ -15391,7 +15662,7 @@
           <w:b/>
           <w:bCs/>
         </w:rPr>
-        <w:t xml:space="preserve">Figura 5.8. Acierto del modelo en cada ventana del termostato bloqueado, frente a la temperatura media del refrigerante.</w:t>
+        <w:t xml:space="preserve">Figura 5.9. Acierto del modelo en cada ventana del termostato bloqueado, frente a la temperatura media del refrigerante.</w:t>
       </w:r>
     </w:p>
     <w:p>
@@ -15404,18 +15675,18 @@
           <wp:inline>
             <wp:extent cx="5397500" cy="2630970"/>
             <wp:effectExtent b="0" l="0" r="0" t="0"/>
-            <wp:docPr descr="Catorce puntos: las cinco ventanas no detectadas están todas por debajo del techo de 71 °C que el fallo impone, y las nueve detectadas se agrupan junto a él." title="" id="109" name="Picture"/>
+            <wp:docPr descr="Catorce puntos: las cinco ventanas no detectadas están todas por debajo del techo de 71 °C que el fallo impone, y las nueve detectadas se agrupan junto a él." title="" id="112" name="Picture"/>
             <a:graphic>
               <a:graphicData uri="http://schemas.openxmlformats.org/drawingml/2006/picture">
                 <pic:pic>
                   <pic:nvPicPr>
-                    <pic:cNvPr descr="../../artifacts/figures/memoria/FIG-5-08_limite_evidencia_termostato.png" id="110" name="Picture"/>
+                    <pic:cNvPr descr="../../artifacts/figures/memoria/FIG-5-09_limite_evidencia_termostato.png" id="113" name="Picture"/>
                     <pic:cNvPicPr>
                       <a:picLocks noChangeArrowheads="1" noChangeAspect="1"/>
                     </pic:cNvPicPr>
                   </pic:nvPicPr>
                   <pic:blipFill>
-                    <a:blip r:embed="rId108"/>
+                    <a:blip r:embed="rId111"/>
                     <a:stretch>
                       <a:fillRect/>
                     </a:stretch>
@@ -15579,7 +15850,7 @@
         <w:t xml:space="preserve"> </w:t>
       </w:r>
       <w:r>
-        <w:t xml:space="preserve">señal. La Figura 5.9 presenta esa fracción ventana a ventana.</w:t>
+        <w:t xml:space="preserve">señal. La Figura 5.10 presenta esa fracción ventana a ventana.</w:t>
       </w:r>
     </w:p>
     <w:p>
@@ -15592,7 +15863,7 @@
           <w:b/>
           <w:bCs/>
         </w:rPr>
-        <w:t xml:space="preserve">Figura 5.9. Expresión efectiva del fallo en cada ventana de validación, y ventanas que el modelo de diagnóstico falla.</w:t>
+        <w:t xml:space="preserve">Figura 5.10. Expresión efectiva del fallo en cada ventana de validación, y ventanas que el modelo de diagnóstico falla.</w:t>
       </w:r>
     </w:p>
     <w:p>
@@ -15605,18 +15876,18 @@
           <wp:inline>
             <wp:extent cx="5397500" cy="6564041"/>
             <wp:effectExtent b="0" l="0" r="0" t="0"/>
-            <wp:docPr descr="A la izquierda, la fracción de cada ventana con señal observable: completa en la fuga, la deriva y la sonda; nula en cinco ventanas del termostato y casi nula en todas las del fallo de encendido. A la derecha, el recuento de ventanas sin señal junto al de ventanas falladas." title="" id="112" name="Picture"/>
+            <wp:docPr descr="A la izquierda, la fracción de cada ventana con señal observable: completa en la fuga, la deriva y la sonda; nula en cinco ventanas del termostato y casi nula en todas las del fallo de encendido. A la derecha, el recuento de ventanas sin señal junto al de ventanas falladas." title="" id="115" name="Picture"/>
             <a:graphic>
               <a:graphicData uri="http://schemas.openxmlformats.org/drawingml/2006/picture">
                 <pic:pic>
                   <pic:nvPicPr>
-                    <pic:cNvPr descr="../../artifacts/figures/memoria/FIG-5-09_expresion_del_fallo.png" id="113" name="Picture"/>
+                    <pic:cNvPr descr="../../artifacts/figures/memoria/FIG-5-10_expresion_del_fallo.png" id="116" name="Picture"/>
                     <pic:cNvPicPr>
                       <a:picLocks noChangeArrowheads="1" noChangeAspect="1"/>
                     </pic:cNvPicPr>
                   </pic:nvPicPr>
                   <pic:blipFill>
-                    <a:blip r:embed="rId111"/>
+                    <a:blip r:embed="rId114"/>
                     <a:stretch>
                       <a:fillRect/>
                     </a:stretch>
@@ -15782,7 +16053,7 @@
         <w:pStyle w:val="Normal"/>
       </w:pPr>
       <w:r>
-        <w:t xml:space="preserve">La Figura 5.9 cuenta qué fracción de cada ventana lleva señal, y deja sin responder una pregunta más</w:t>
+        <w:t xml:space="preserve">La Figura 5.10 cuenta qué fracción de cada ventana lleva señal, y deja sin responder una pregunta más</w:t>
       </w:r>
       <w:r>
         <w:t xml:space="preserve"> </w:t>
@@ -15839,7 +16110,7 @@
         <w:t xml:space="preserve"> </w:t>
       </w:r>
       <w:r>
-        <w:t xml:space="preserve">régimen y no el fallo. La Figura 5.10 recorre los tres pasos.</w:t>
+        <w:t xml:space="preserve">régimen y no el fallo. La Figura 5.11 recorre los tres pasos.</w:t>
       </w:r>
     </w:p>
     <w:p>
@@ -15852,7 +16123,7 @@
           <w:b/>
           <w:bCs/>
         </w:rPr>
-        <w:t xml:space="preserve">Figura 5.10. De la señal al descriptor: una ventana de fallo de encendido y los números con que el modelo la recibe.</w:t>
+        <w:t xml:space="preserve">Figura 5.11. De la señal al descriptor: una ventana de fallo de encendido y los números con que el modelo la recibe.</w:t>
       </w:r>
     </w:p>
     <w:p>
@@ -15865,18 +16136,18 @@
           <wp:inline>
             <wp:extent cx="5354897" cy="5819743"/>
             <wp:effectExtent b="0" l="0" r="0" t="0"/>
-            <wp:docPr descr="Tres paneles. Arriba, la sesión completa de régimen con la ventana de 120 segundos sombreada. En medio, esa ventana con su media y su banda de desviación típica, y las tres muestras que el fallo altera marcadas. Abajo, cinco descriptores de régimen de la ventana comparados con la mediana de las ventanas sin fallo del mismo régimen: la media se aparta menos de dos escalas robustas, mientras el mínimo se aparta casi diez." title="" id="115" name="Picture"/>
+            <wp:docPr descr="Tres paneles. Arriba, la sesión completa de régimen con la ventana de 120 segundos sombreada. En medio, esa ventana con su media y su banda de desviación típica, y las tres muestras que el fallo altera marcadas. Abajo, cinco descriptores de régimen de la ventana comparados con la mediana de las ventanas sin fallo del mismo régimen: la media se aparta menos de dos escalas robustas, mientras el mínimo se aparta casi diez." title="" id="118" name="Picture"/>
             <a:graphic>
               <a:graphicData uri="http://schemas.openxmlformats.org/drawingml/2006/picture">
                 <pic:pic>
                   <pic:nvPicPr>
-                    <pic:cNvPr descr="../../artifacts/figures/memoria/FIG-5-10_ventana_y_descriptor.png" id="116" name="Picture"/>
+                    <pic:cNvPr descr="../../artifacts/figures/memoria/FIG-5-11_ventana_y_descriptor.png" id="119" name="Picture"/>
                     <pic:cNvPicPr>
                       <a:picLocks noChangeArrowheads="1" noChangeAspect="1"/>
                     </pic:cNvPicPr>
                   </pic:nvPicPr>
                   <pic:blipFill>
-                    <a:blip r:embed="rId114"/>
+                    <a:blip r:embed="rId117"/>
                     <a:stretch>
                       <a:fillRect/>
                     </a:stretch>
@@ -16411,7 +16682,7 @@
         <w:t xml:space="preserve"> </w:t>
       </w:r>
       <w:r>
-        <w:t xml:space="preserve">probabilidad cruda. La Figura 5.11 sitúa las dos configuraciones en el plano que lo hace evidente.</w:t>
+        <w:t xml:space="preserve">probabilidad cruda. La Figura 5.12 sitúa las dos configuraciones en el plano que lo hace evidente.</w:t>
       </w:r>
     </w:p>
     <w:p>
@@ -16424,7 +16695,7 @@
           <w:b/>
           <w:bCs/>
         </w:rPr>
-        <w:t xml:space="preserve">Figura 5.11. Confianza declarada frente a acierto observado, antes y después de calibrar.</w:t>
+        <w:t xml:space="preserve">Figura 5.12. Confianza declarada frente a acierto observado, antes y después de calibrar.</w:t>
       </w:r>
     </w:p>
     <w:p>
@@ -16437,18 +16708,18 @@
           <wp:inline>
             <wp:extent cx="5367130" cy="4535301"/>
             <wp:effectExtent b="0" l="0" r="0" t="0"/>
-            <wp:docPr descr="Plano de confianza declarada contra acierto: el punto sin calibrar queda por encima de la diagonal, con confianza 0,738 y acierto 0,878; el calibrado queda sobre ella, con 0,886 y 0,878." title="" id="118" name="Picture"/>
+            <wp:docPr descr="Plano de confianza declarada contra acierto: el punto sin calibrar queda por encima de la diagonal, con confianza 0,738 y acierto 0,878; el calibrado queda sobre ella, con 0,886 y 0,878." title="" id="121" name="Picture"/>
             <a:graphic>
               <a:graphicData uri="http://schemas.openxmlformats.org/drawingml/2006/picture">
                 <pic:pic>
                   <pic:nvPicPr>
-                    <pic:cNvPr descr="../../artifacts/figures/memoria/FIG-5-11_calibracion.png" id="119" name="Picture"/>
+                    <pic:cNvPr descr="../../artifacts/figures/memoria/FIG-5-12_calibracion.png" id="122" name="Picture"/>
                     <pic:cNvPicPr>
                       <a:picLocks noChangeArrowheads="1" noChangeAspect="1"/>
                     </pic:cNvPicPr>
                   </pic:nvPicPr>
                   <pic:blipFill>
-                    <a:blip r:embed="rId117"/>
+                    <a:blip r:embed="rId120"/>
                     <a:stretch>
                       <a:fillRect/>
                     </a:stretch>
@@ -16566,25 +16837,19 @@
         <w:t xml:space="preserve"> </w:t>
       </w:r>
       <w:r>
-        <w:t xml:space="preserve">configuración es un resumen y no dice en qué tramos se concentra el error —la curva de fiabilidad</w:t>
-      </w:r>
-      <w:r>
-        <w:t xml:space="preserve"> </w:t>
-      </w:r>
-      <w:r>
-        <w:t xml:space="preserve">completa exigiría las predicciones por ventana, que el registro de E6 no guarda—, y el error de</w:t>
-      </w:r>
-      <w:r>
-        <w:t xml:space="preserve"> </w:t>
-      </w:r>
-      <w:r>
-        <w:t xml:space="preserve">calibración se calcula con diez tramos sobre 98 ventanas, de modo que cada tramo contiene muy pocas</w:t>
-      </w:r>
-      <w:r>
-        <w:t xml:space="preserve"> </w:t>
-      </w:r>
-      <w:r>
-        <w:t xml:space="preserve">predicciones y la cifra es frágil. Respecto de la pregunta de investigación, la figura justifica una</w:t>
+        <w:t xml:space="preserve">configuración es un resumen y no dice en qué tramos se concentra el error —la Figura 5.13 recupera</w:t>
+      </w:r>
+      <w:r>
+        <w:t xml:space="preserve"> </w:t>
+      </w:r>
+      <w:r>
+        <w:t xml:space="preserve">esa forma por otra vía—, y el error de calibración se calcula con diez tramos sobre 98 ventanas, de</w:t>
+      </w:r>
+      <w:r>
+        <w:t xml:space="preserve"> </w:t>
+      </w:r>
+      <w:r>
+        <w:t xml:space="preserve">modo que cada tramo contiene muy pocas predicciones y la cifra es frágil. Respecto de la pregunta de investigación, la figura justifica una</w:t>
       </w:r>
       <w:r>
         <w:t xml:space="preserve"> </w:t>
@@ -16610,19 +16875,43 @@
         <w:pStyle w:val="Normal"/>
       </w:pPr>
       <w:r>
-        <w:t xml:space="preserve">La atribución por valores de Shapley, calculada sobre dieciocho casos de validación con un fondo de cien ventanas sin fallo de entrenamiento, produce la evidencia observacional que las etapas posteriores consumen. Contrastada con las señales que el generador declara para cada fallo, se comporta de forma desigual. En la fuga de vacío, el termostato y la sonda de oxígeno, todas las señales atribuidas entre las seis principales son señales declaradas. En la deriva del caudalímetro el caudal medido no aparece: el modelo detecta el fallo por las correcciones de combustible, lo que coincide con el análisis exploratorio. En el fallo de encendido, cuatro de las seis señales principales no están declaradas para esa condición, entre ellas la temperatura del refrigerante, cuya separación aparente el estudio de ventana había situado por debajo del suelo de ruido; las dos señales declaradas que aparecen concentran, con todo, varias veces más importancia acumulada que las cuatro no declaradas. La atribución es fiel al modelo y, en ese fallo, mezcla el mecanismo del vehículo con señales que no le pertenecen. El registro de esta fase,</w:t>
-      </w:r>
-      <w:r>
-        <w:t xml:space="preserve"> </w:t>
-      </w:r>
-      <w:r>
-        <w:rPr>
-          <w:rStyle w:val="VerbatimChar"/>
-        </w:rPr>
-        <w:t xml:space="preserve">E9_xai_synthetic_v2.json</w:t>
-      </w:r>
-      <w:r>
-        <w:t xml:space="preserve">, es anterior a la obligatoriedad del identificador de versión. La Figura 5.12 recoge el reparto completo del peso explicativo.</w:t>
+        <w:t xml:space="preserve">Dónde se concentra ese error es una pregunta distinta de cuánto vale, y la responde la forma de la</w:t>
+      </w:r>
+      <w:r>
+        <w:t xml:space="preserve"> </w:t>
+      </w:r>
+      <w:r>
+        <w:t xml:space="preserve">calibración por tramos de confianza. El registro del modelo no conserva la confianza de cada</w:t>
+      </w:r>
+      <w:r>
+        <w:t xml:space="preserve"> </w:t>
+      </w:r>
+      <w:r>
+        <w:t xml:space="preserve">ventana, pero el barrido del umbral sí dejó una curva acumulada de la que esa forma se recupera: en</w:t>
+      </w:r>
+      <w:r>
+        <w:t xml:space="preserve"> </w:t>
+      </w:r>
+      <w:r>
+        <w:t xml:space="preserve">cada umbral consta cuántas ventanas quedan por encima y con qué precisión se decide entre ellas, y</w:t>
+      </w:r>
+      <w:r>
+        <w:t xml:space="preserve"> </w:t>
+      </w:r>
+      <w:r>
+        <w:t xml:space="preserve">restando umbrales consecutivos salen el número de ventanas y el número de aciertos de cada tramo. La</w:t>
+      </w:r>
+      <w:r>
+        <w:t xml:space="preserve"> </w:t>
+      </w:r>
+      <w:r>
+        <w:t xml:space="preserve">reconstrucción suma las 98 ventanas con 86 aciertos y devuelve una exactitud global de 0,877551,</w:t>
+      </w:r>
+      <w:r>
+        <w:t xml:space="preserve"> </w:t>
+      </w:r>
+      <w:r>
+        <w:t xml:space="preserve">que coincide dígito a dígito con la del registro del modelo. La Figura 5.13 la presenta.</w:t>
       </w:r>
     </w:p>
     <w:p>
@@ -16635,7 +16924,7 @@
           <w:b/>
           <w:bCs/>
         </w:rPr>
-        <w:t xml:space="preserve">Figura 5.12. Peso explicativo de cada señal por condición, frente a las señales que el generador declara.</w:t>
+        <w:t xml:space="preserve">Figura 5.13. Acierto observado por tramo de confianza calibrada, y número de ventanas de cada tramo.</w:t>
       </w:r>
     </w:p>
     <w:p>
@@ -16646,20 +16935,691 @@
       <w:r>
         <w:drawing>
           <wp:inline>
-            <wp:extent cx="5252056" cy="3974653"/>
+            <wp:extent cx="5364072" cy="4168318"/>
             <wp:effectExtent b="0" l="0" r="0" t="0"/>
-            <wp:docPr descr="Mapa de calor del peso de cada señal por condición, con un punto en las señales que la ficha del fallo declara: en la deriva del caudalímetro la columna del caudal está vacía y el peso recae en los dos ajustes de combustible." title="" id="121" name="Picture"/>
+            <wp:docPr descr="Diagrama de fiabilidad por tramos de 0,05: los cuatro tramos por encima de 0,80, que reúnen 81 de las 98 ventanas, quedan sobre la diagonal o encima de ella; los tramos inferiores, con cuatro ventanas o menos cada uno, oscilan entre 0 y 1." title="" id="124" name="Picture"/>
             <a:graphic>
               <a:graphicData uri="http://schemas.openxmlformats.org/drawingml/2006/picture">
                 <pic:pic>
                   <pic:nvPicPr>
-                    <pic:cNvPr descr="../../artifacts/figures/memoria/FIG-5-12_mapa_atribucion.png" id="122" name="Picture"/>
+                    <pic:cNvPr descr="../../artifacts/figures/memoria/FIG-5-13_fiabilidad.png" id="125" name="Picture"/>
                     <pic:cNvPicPr>
                       <a:picLocks noChangeArrowheads="1" noChangeAspect="1"/>
                     </pic:cNvPicPr>
                   </pic:nvPicPr>
                   <pic:blipFill>
-                    <a:blip r:embed="rId120"/>
+                    <a:blip r:embed="rId123"/>
+                    <a:stretch>
+                      <a:fillRect/>
+                    </a:stretch>
+                  </pic:blipFill>
+                  <pic:spPr bwMode="auto">
+                    <a:xfrm>
+                      <a:off x="0" y="0"/>
+                      <a:ext cx="5364072" cy="4168318"/>
+                    </a:xfrm>
+                    <a:prstGeom prst="rect">
+                      <a:avLst/>
+                    </a:prstGeom>
+                    <a:noFill/>
+                    <a:ln w="9525">
+                      <a:noFill/>
+                      <a:headEnd/>
+                      <a:tailEnd/>
+                    </a:ln>
+                  </pic:spPr>
+                </pic:pic>
+              </a:graphicData>
+            </a:graphic>
+          </wp:inline>
+        </w:drawing>
+      </w:r>
+    </w:p>
+    <w:p>
+      <w:pPr>
+        <w:pStyle w:val="Normal"/>
+      </w:pPr>
+      <w:r>
+        <w:rPr>
+          <w:i/>
+          <w:iCs/>
+        </w:rPr>
+        <w:t xml:space="preserve">Fuente: elaboración propia. Experimento: E6, calibrado en E15; los tramos se recuperan de la curva acumulada del barrido del umbral, E15b. Conjunto:</w:t>
+      </w:r>
+      <w:r>
+        <w:rPr>
+          <w:i/>
+          <w:iCs/>
+        </w:rPr>
+        <w:t xml:space="preserve"> </w:t>
+      </w:r>
+      <w:r>
+        <w:rPr>
+          <w:rStyle w:val="VerbatimChar"/>
+          <w:i/>
+          <w:iCs/>
+        </w:rPr>
+        <w:t xml:space="preserve">synthetic_v2</w:t>
+      </w:r>
+      <w:r>
+        <w:rPr>
+          <w:i/>
+          <w:iCs/>
+        </w:rPr>
+        <w:t xml:space="preserve">, partición de validación, 98 ventanas de 12 sesiones. Paneles: (a) acierto observado por tramo, con el número de ventanas sobre cada barra y la diagonal de calibración perfecta; (b) ventanas por tramo. Protocolo: los tramos se recuperan por diferencias entre umbrales consecutivos de la curva y se agrupan de 0,05 en 0,05; el trazado rayado marca los tramos con cuatro ventanas o menos. La confianza representada es la</w:t>
+      </w:r>
+      <w:r>
+        <w:rPr>
+          <w:i/>
+          <w:iCs/>
+        </w:rPr>
+        <w:t xml:space="preserve"> </w:t>
+      </w:r>
+      <w:r>
+        <w:rPr>
+          <w:b/>
+          <w:bCs/>
+          <w:i/>
+          <w:iCs/>
+        </w:rPr>
+        <w:t xml:space="preserve">calibrada</w:t>
+      </w:r>
+      <w:r>
+        <w:rPr>
+          <w:i/>
+          <w:iCs/>
+        </w:rPr>
+        <w:t xml:space="preserve">; la anterior a calibrar no se conservó por ventana.</w:t>
+      </w:r>
+    </w:p>
+    <w:p>
+      <w:pPr>
+        <w:pStyle w:val="Normal"/>
+      </w:pPr>
+      <w:r>
+        <w:t xml:space="preserve">Los cuatro tramos por encima de 0,80 reúnen</w:t>
+      </w:r>
+      <w:r>
+        <w:t xml:space="preserve"> </w:t>
+      </w:r>
+      <w:r>
+        <w:rPr>
+          <w:b/>
+          <w:bCs/>
+        </w:rPr>
+        <w:t xml:space="preserve">81 de las 98 ventanas</w:t>
+      </w:r>
+      <w:r>
+        <w:t xml:space="preserve"> </w:t>
+      </w:r>
+      <w:r>
+        <w:t xml:space="preserve">y quedan sobre la diagonal o</w:t>
+      </w:r>
+      <w:r>
+        <w:t xml:space="preserve"> </w:t>
+      </w:r>
+      <w:r>
+        <w:t xml:space="preserve">por encima de ella: donde el modelo opera, sigue prometiendo algo menos de lo que cumple, que es la</w:t>
+      </w:r>
+      <w:r>
+        <w:t xml:space="preserve"> </w:t>
+      </w:r>
+      <w:r>
+        <w:t xml:space="preserve">dirección segura. Por debajo de 0,80 la figura deja de describir el modelo y pasa a describir su</w:t>
+      </w:r>
+      <w:r>
+        <w:t xml:space="preserve"> </w:t>
+      </w:r>
+      <w:r>
+        <w:t xml:space="preserve">escasez: siete tramos con cuatro ventanas o menos, en los que una proporción salta entre 0 y 1</w:t>
+      </w:r>
+      <w:r>
+        <w:t xml:space="preserve"> </w:t>
+      </w:r>
+      <w:r>
+        <w:t xml:space="preserve">porque está calculada sobre una ventana o dos. El umbral de suficiencia, 0,79, cae justo en esa</w:t>
+      </w:r>
+      <w:r>
+        <w:t xml:space="preserve"> </w:t>
+      </w:r>
+      <w:r>
+        <w:t xml:space="preserve">frontera, y la figura explica por qué es defendible sin necesidad de apelar a la cifra agregada: por</w:t>
+      </w:r>
+      <w:r>
+        <w:t xml:space="preserve"> </w:t>
+      </w:r>
+      <w:r>
+        <w:t xml:space="preserve">encima de él la calibración se comporta; por debajo no hay observaciones para afirmar nada.</w:t>
+      </w:r>
+    </w:p>
+    <w:p>
+      <w:pPr>
+        <w:pStyle w:val="Normal"/>
+      </w:pPr>
+      <w:r>
+        <w:t xml:space="preserve">Tres límites, y el tercero es el que conviene no olvidar. La reconstrucción es exacta en lo que</w:t>
+      </w:r>
+      <w:r>
+        <w:t xml:space="preserve"> </w:t>
+      </w:r>
+      <w:r>
+        <w:t xml:space="preserve">cuenta —ventanas y aciertos por tramo— y</w:t>
+      </w:r>
+      <w:r>
+        <w:t xml:space="preserve"> </w:t>
+      </w:r>
+      <w:r>
+        <w:rPr>
+          <w:b/>
+          <w:bCs/>
+        </w:rPr>
+        <w:t xml:space="preserve">no conserva la confianza media dentro de cada tramo</w:t>
+      </w:r>
+      <w:r>
+        <w:t xml:space="preserve">, de</w:t>
+      </w:r>
+      <w:r>
+        <w:t xml:space="preserve"> </w:t>
+      </w:r>
+      <w:r>
+        <w:t xml:space="preserve">modo que cada barra ocupa su tramo en lugar de situarse en un punto. Solo existe para la confianza</w:t>
+      </w:r>
+      <w:r>
+        <w:t xml:space="preserve"> </w:t>
+      </w:r>
+      <w:r>
+        <w:t xml:space="preserve">calibrada. Y</w:t>
+      </w:r>
+      <w:r>
+        <w:t xml:space="preserve"> </w:t>
+      </w:r>
+      <w:r>
+        <w:rPr>
+          <w:b/>
+          <w:bCs/>
+        </w:rPr>
+        <w:t xml:space="preserve">de aquí no sale un error de calibración esperado</w:t>
+      </w:r>
+      <w:r>
+        <w:t xml:space="preserve">: agrupar de otro modo da otro</w:t>
+      </w:r>
+      <w:r>
+        <w:t xml:space="preserve"> </w:t>
+      </w:r>
+      <w:r>
+        <w:t xml:space="preserve">número, y el que vale sigue siendo el del registro, calculado sobre diez tramos. Para la pregunta de</w:t>
+      </w:r>
+      <w:r>
+        <w:t xml:space="preserve"> </w:t>
+      </w:r>
+      <w:r>
+        <w:t xml:space="preserve">investigación, la figura sostiene que la puerta de confianza del criterio de suficiencia opera en la</w:t>
+      </w:r>
+      <w:r>
+        <w:t xml:space="preserve"> </w:t>
+      </w:r>
+      <w:r>
+        <w:t xml:space="preserve">zona donde el instrumento está calibrado, que es la condición para que una abstención por confianza</w:t>
+      </w:r>
+      <w:r>
+        <w:t xml:space="preserve"> </w:t>
+      </w:r>
+      <w:r>
+        <w:t xml:space="preserve">signifique falta de evidencia y no ruido de medición.</w:t>
+      </w:r>
+    </w:p>
+    <w:p>
+      <w:pPr>
+        <w:pStyle w:val="Normal"/>
+      </w:pPr>
+      <w:r>
+        <w:t xml:space="preserve">Esa puerta de confianza tiene un precio, y conviene verlo medido. Subir el umbral gana precisión en</w:t>
+      </w:r>
+      <w:r>
+        <w:t xml:space="preserve"> </w:t>
+      </w:r>
+      <w:r>
+        <w:t xml:space="preserve">la decisión diagnóstica y pierde cobertura, y el barrido registró las dos magnitudes en 101 puntos</w:t>
+      </w:r>
+      <w:r>
+        <w:t xml:space="preserve"> </w:t>
+      </w:r>
+      <w:r>
+        <w:t xml:space="preserve">sobre validación, por ventana y por sesión. La Figura 5.14 lo presenta.</w:t>
+      </w:r>
+    </w:p>
+    <w:p>
+      <w:pPr>
+        <w:keepNext/>
+        <w:pStyle w:val="PieDeFigura"/>
+      </w:pPr>
+      <w:r>
+        <w:rPr>
+          <w:b/>
+          <w:bCs/>
+        </w:rPr>
+        <w:t xml:space="preserve">Figura 5.14. Cobertura y precisión de la decisión diagnóstica frente al umbral de confianza, y el plano que forman.</w:t>
+      </w:r>
+    </w:p>
+    <w:p>
+      <w:pPr>
+        <w:keepNext/>
+        <w:pStyle w:val="CaptionedFigure"/>
+      </w:pPr>
+      <w:r>
+        <w:drawing>
+          <wp:inline>
+            <wp:extent cx="5364072" cy="2975622"/>
+            <wp:effectExtent b="0" l="0" r="0" t="0"/>
+            <wp:docPr descr="Dos paneles: a la izquierda la cobertura cae y la precisión sube al aumentar el umbral, con los dos umbrales de la política marcados; a la derecha el plano de cobertura contra precisión, con los dos puntos de la política y sus barras de remuestreo." title="" id="127" name="Picture"/>
+            <a:graphic>
+              <a:graphicData uri="http://schemas.openxmlformats.org/drawingml/2006/picture">
+                <pic:pic>
+                  <pic:nvPicPr>
+                    <pic:cNvPr descr="../../artifacts/figures/memoria/FIG-5-14_riesgo_cobertura.png" id="128" name="Picture"/>
+                    <pic:cNvPicPr>
+                      <a:picLocks noChangeArrowheads="1" noChangeAspect="1"/>
+                    </pic:cNvPicPr>
+                  </pic:nvPicPr>
+                  <pic:blipFill>
+                    <a:blip r:embed="rId126"/>
+                    <a:stretch>
+                      <a:fillRect/>
+                    </a:stretch>
+                  </pic:blipFill>
+                  <pic:spPr bwMode="auto">
+                    <a:xfrm>
+                      <a:off x="0" y="0"/>
+                      <a:ext cx="5364072" cy="2975622"/>
+                    </a:xfrm>
+                    <a:prstGeom prst="rect">
+                      <a:avLst/>
+                    </a:prstGeom>
+                    <a:noFill/>
+                    <a:ln w="9525">
+                      <a:noFill/>
+                      <a:headEnd/>
+                      <a:tailEnd/>
+                    </a:ln>
+                  </pic:spPr>
+                </pic:pic>
+              </a:graphicData>
+            </a:graphic>
+          </wp:inline>
+        </w:drawing>
+      </w:r>
+    </w:p>
+    <w:p>
+      <w:pPr>
+        <w:pStyle w:val="Normal"/>
+      </w:pPr>
+      <w:r>
+        <w:rPr>
+          <w:i/>
+          <w:iCs/>
+        </w:rPr>
+        <w:t xml:space="preserve">Fuente: elaboración propia. Experimento: E15b, barrido del umbral de confianza. Conjunto:</w:t>
+      </w:r>
+      <w:r>
+        <w:rPr>
+          <w:i/>
+          <w:iCs/>
+        </w:rPr>
+        <w:t xml:space="preserve"> </w:t>
+      </w:r>
+      <w:r>
+        <w:rPr>
+          <w:rStyle w:val="VerbatimChar"/>
+          <w:i/>
+          <w:iCs/>
+        </w:rPr>
+        <w:t xml:space="preserve">synthetic_v2</w:t>
+      </w:r>
+      <w:r>
+        <w:rPr>
+          <w:i/>
+          <w:iCs/>
+        </w:rPr>
+        <w:t xml:space="preserve">, partición de validación, 98 ventanas de 12 sesiones; el conjunto de prueba no interviene. Paneles: (a) cobertura y precisión frente al umbral, por ventana y por sesión, con el umbral original 0,72, el vigente 0,79 y el objetivo de precisión 0,93; (b) el plano de cobertura contra precisión por ventana, con los dos umbrales de la política y los percentiles 5 y 95 de 1 000 remuestreos. Protocolo: los 101 puntos son los registrados; las líneas unen puntos medidos y no añaden observaciones.</w:t>
+      </w:r>
+    </w:p>
+    <w:p>
+      <w:pPr>
+        <w:pStyle w:val="Normal"/>
+      </w:pPr>
+      <w:r>
+        <w:t xml:space="preserve">Con el umbral vigente, la decisión diagnóstica cubre el 82,7 % de las ventanas con una precisión de</w:t>
+      </w:r>
+      <w:r>
+        <w:t xml:space="preserve"> </w:t>
+      </w:r>
+      <w:r>
+        <w:t xml:space="preserve">0,938; con el anterior, cubre el 87,8 % con 0,930. Cinco puntos de cobertura por menos de uno de</w:t>
+      </w:r>
+      <w:r>
+        <w:t xml:space="preserve"> </w:t>
+      </w:r>
+      <w:r>
+        <w:t xml:space="preserve">precisión: ese es el cambio que trajo la enmienda del umbral, y es pequeño. Lo que la figura añade a</w:t>
+      </w:r>
+      <w:r>
+        <w:t xml:space="preserve"> </w:t>
+      </w:r>
+      <w:r>
+        <w:t xml:space="preserve">esa aritmética son dos cosas que una tabla de dos filas no puede mostrar. La primera, que la curva</w:t>
+      </w:r>
+      <w:r>
+        <w:t xml:space="preserve"> </w:t>
+      </w:r>
+      <w:r>
+        <w:rPr>
+          <w:b/>
+          <w:bCs/>
+        </w:rPr>
+        <w:t xml:space="preserve">no es monótona</w:t>
+      </w:r>
+      <w:r>
+        <w:t xml:space="preserve">: en veintiuno de los cien pasos del barrido, subir el umbral</w:t>
+      </w:r>
+      <w:r>
+        <w:t xml:space="preserve"> </w:t>
+      </w:r>
+      <w:r>
+        <w:rPr>
+          <w:b/>
+          <w:bCs/>
+        </w:rPr>
+        <w:t xml:space="preserve">empeora</w:t>
+      </w:r>
+      <w:r>
+        <w:t xml:space="preserve"> </w:t>
+      </w:r>
+      <w:r>
+        <w:t xml:space="preserve">la</w:t>
+      </w:r>
+      <w:r>
+        <w:t xml:space="preserve"> </w:t>
+      </w:r>
+      <w:r>
+        <w:t xml:space="preserve">precisión en lugar de mejorarla. El caso más marcado está entre 0,91 y 0,92, donde la cobertura cae</w:t>
+      </w:r>
+      <w:r>
+        <w:t xml:space="preserve"> </w:t>
+      </w:r>
+      <w:r>
+        <w:t xml:space="preserve">del 58,2 % al 52,0 % y la precisión baja de 0,912 a 0,902; es decir, entre las seis ventanas que se</w:t>
+      </w:r>
+      <w:r>
+        <w:t xml:space="preserve"> </w:t>
+      </w:r>
+      <w:r>
+        <w:t xml:space="preserve">descartan hay más aciertos que errores. Un umbral de confianza no es un dial en el que más siempre</w:t>
+      </w:r>
+      <w:r>
+        <w:t xml:space="preserve"> </w:t>
+      </w:r>
+      <w:r>
+        <w:t xml:space="preserve">sea mejor. La segunda, que las barras de remuestreo de los dos umbrales de la política</w:t>
+      </w:r>
+      <w:r>
+        <w:t xml:space="preserve"> </w:t>
+      </w:r>
+      <w:r>
+        <w:rPr>
+          <w:b/>
+          <w:bCs/>
+        </w:rPr>
+        <w:t xml:space="preserve">se solapan</w:t>
+      </w:r>
+      <w:r>
+        <w:rPr>
+          <w:b/>
+          <w:bCs/>
+        </w:rPr>
+        <w:t xml:space="preserve"> </w:t>
+      </w:r>
+      <w:r>
+        <w:rPr>
+          <w:b/>
+          <w:bCs/>
+        </w:rPr>
+        <w:t xml:space="preserve">por completo</w:t>
+      </w:r>
+      <w:r>
+        <w:t xml:space="preserve"> </w:t>
+      </w:r>
+      <w:r>
+        <w:t xml:space="preserve">y llegan las dos hasta 1,0: con 98 ventanas procedentes de doce sesiones, los dos</w:t>
+      </w:r>
+      <w:r>
+        <w:t xml:space="preserve"> </w:t>
+      </w:r>
+      <w:r>
+        <w:t xml:space="preserve">puntos de operación son indistinguibles entre sí.</w:t>
+      </w:r>
+    </w:p>
+    <w:p>
+      <w:pPr>
+        <w:pStyle w:val="Normal"/>
+      </w:pPr>
+      <w:r>
+        <w:t xml:space="preserve">Cinco cosas que esta figura no dice, y conviene enunciarlas juntas porque la tentación de leerla</w:t>
+      </w:r>
+      <w:r>
+        <w:t xml:space="preserve"> </w:t>
+      </w:r>
+      <w:r>
+        <w:t xml:space="preserve">como una curva de operación del sistema es grande.</w:t>
+      </w:r>
+      <w:r>
+        <w:t xml:space="preserve"> </w:t>
+      </w:r>
+      <w:r>
+        <w:rPr>
+          <w:b/>
+          <w:bCs/>
+        </w:rPr>
+        <w:t xml:space="preserve">No describe la política de abstención del</w:t>
+      </w:r>
+      <w:r>
+        <w:rPr>
+          <w:b/>
+          <w:bCs/>
+        </w:rPr>
+        <w:t xml:space="preserve"> </w:t>
+      </w:r>
+      <w:r>
+        <w:rPr>
+          <w:b/>
+          <w:bCs/>
+        </w:rPr>
+        <w:t xml:space="preserve">agente</w:t>
+      </w:r>
+      <w:r>
+        <w:t xml:space="preserve">: el criterio de suficiencia es compuesto, confianza</w:t>
+      </w:r>
+      <w:r>
+        <w:t xml:space="preserve"> </w:t>
+      </w:r>
+      <w:r>
+        <w:rPr>
+          <w:b/>
+          <w:bCs/>
+        </w:rPr>
+        <w:t xml:space="preserve">y</w:t>
+      </w:r>
+      <w:r>
+        <w:t xml:space="preserve"> </w:t>
+      </w:r>
+      <w:r>
+        <w:t xml:space="preserve">soporte documental, y este barrido</w:t>
+      </w:r>
+      <w:r>
+        <w:t xml:space="preserve"> </w:t>
+      </w:r>
+      <w:r>
+        <w:t xml:space="preserve">mueve solo la mitad de confianza mientras la mitad documental permanece fija.</w:t>
+      </w:r>
+      <w:r>
+        <w:t xml:space="preserve"> </w:t>
+      </w:r>
+      <w:r>
+        <w:rPr>
+          <w:b/>
+          <w:bCs/>
+        </w:rPr>
+        <w:t xml:space="preserve">No es una</w:t>
+      </w:r>
+      <w:r>
+        <w:rPr>
+          <w:b/>
+          <w:bCs/>
+        </w:rPr>
+        <w:t xml:space="preserve"> </w:t>
+      </w:r>
+      <w:r>
+        <w:rPr>
+          <w:b/>
+          <w:bCs/>
+        </w:rPr>
+        <w:t xml:space="preserve">exploración de la política completa</w:t>
+      </w:r>
+      <w:r>
+        <w:t xml:space="preserve">, que exigiría barrer también la cobertura documental y no está</w:t>
+      </w:r>
+      <w:r>
+        <w:t xml:space="preserve"> </w:t>
+      </w:r>
+      <w:r>
+        <w:t xml:space="preserve">medida.</w:t>
+      </w:r>
+      <w:r>
+        <w:t xml:space="preserve"> </w:t>
+      </w:r>
+      <w:r>
+        <w:rPr>
+          <w:b/>
+          <w:bCs/>
+        </w:rPr>
+        <w:t xml:space="preserve">La elección del umbral sobre ella no fue un pre-registro ciego</w:t>
+      </w:r>
+      <w:r>
+        <w:t xml:space="preserve">: el criterio se escribió</w:t>
+      </w:r>
+      <w:r>
+        <w:t xml:space="preserve"> </w:t>
+      </w:r>
+      <w:r>
+        <w:t xml:space="preserve">antes del barrido y después de ver una tabla anterior de cuatro puntos, y así consta en el documento</w:t>
+      </w:r>
+      <w:r>
+        <w:t xml:space="preserve"> </w:t>
+      </w:r>
+      <w:r>
+        <w:t xml:space="preserve">que lo fija.</w:t>
+      </w:r>
+      <w:r>
+        <w:t xml:space="preserve"> </w:t>
+      </w:r>
+      <w:r>
+        <w:rPr>
+          <w:b/>
+          <w:bCs/>
+        </w:rPr>
+        <w:t xml:space="preserve">Las observaciones son dependientes</w:t>
+      </w:r>
+      <w:r>
+        <w:t xml:space="preserve">: 98 ventanas proceden de doce sesiones. Y</w:t>
+      </w:r>
+      <w:r>
+        <w:t xml:space="preserve"> </w:t>
+      </w:r>
+      <w:r>
+        <w:rPr>
+          <w:b/>
+          <w:bCs/>
+        </w:rPr>
+        <w:t xml:space="preserve">el</w:t>
+      </w:r>
+      <w:r>
+        <w:rPr>
+          <w:b/>
+          <w:bCs/>
+        </w:rPr>
+        <w:t xml:space="preserve"> </w:t>
+      </w:r>
+      <w:r>
+        <w:rPr>
+          <w:b/>
+          <w:bCs/>
+        </w:rPr>
+        <w:t xml:space="preserve">umbral no se revisa a la vista de esta figura</w:t>
+      </w:r>
+      <w:r>
+        <w:t xml:space="preserve">, que es análisis descriptivo posterior y no una</w:t>
+      </w:r>
+      <w:r>
+        <w:t xml:space="preserve"> </w:t>
+      </w:r>
+      <w:r>
+        <w:t xml:space="preserve">validación independiente.</w:t>
+      </w:r>
+    </w:p>
+    <w:p>
+      <w:pPr>
+        <w:pStyle w:val="Normal"/>
+      </w:pPr>
+      <w:r>
+        <w:t xml:space="preserve">La atribución por valores de Shapley, calculada sobre dieciocho casos de validación con un fondo de cien ventanas sin fallo de entrenamiento, produce la evidencia observacional que las etapas posteriores consumen. Contrastada con las señales que el generador declara para cada fallo, se comporta de forma desigual. En la fuga de vacío, el termostato y la sonda de oxígeno, todas las señales atribuidas entre las seis principales son señales declaradas. En la deriva del caudalímetro el caudal medido no aparece: el modelo detecta el fallo por las correcciones de combustible, lo que coincide con el análisis exploratorio. En el fallo de encendido, cuatro de las seis señales principales no están declaradas para esa condición, entre ellas la temperatura del refrigerante, cuya separación aparente el estudio de ventana había situado por debajo del suelo de ruido; las dos señales declaradas que aparecen concentran, con todo, varias veces más importancia acumulada que las cuatro no declaradas. La atribución es fiel al modelo y, en ese fallo, mezcla el mecanismo del vehículo con señales que no le pertenecen. El registro de esta fase,</w:t>
+      </w:r>
+      <w:r>
+        <w:t xml:space="preserve"> </w:t>
+      </w:r>
+      <w:r>
+        <w:rPr>
+          <w:rStyle w:val="VerbatimChar"/>
+        </w:rPr>
+        <w:t xml:space="preserve">E9_xai_synthetic_v2.json</w:t>
+      </w:r>
+      <w:r>
+        <w:t xml:space="preserve">, es anterior a la obligatoriedad del identificador de versión. La Figura 5.15 recoge el reparto completo del peso explicativo.</w:t>
+      </w:r>
+    </w:p>
+    <w:p>
+      <w:pPr>
+        <w:keepNext/>
+        <w:pStyle w:val="PieDeFigura"/>
+      </w:pPr>
+      <w:r>
+        <w:rPr>
+          <w:b/>
+          <w:bCs/>
+        </w:rPr>
+        <w:t xml:space="preserve">Figura 5.15. Peso explicativo de cada señal por condición, frente a las señales que el generador declara.</w:t>
+      </w:r>
+    </w:p>
+    <w:p>
+      <w:pPr>
+        <w:keepNext/>
+        <w:pStyle w:val="CaptionedFigure"/>
+      </w:pPr>
+      <w:r>
+        <w:drawing>
+          <wp:inline>
+            <wp:extent cx="5252056" cy="3974653"/>
+            <wp:effectExtent b="0" l="0" r="0" t="0"/>
+            <wp:docPr descr="Mapa de calor del peso de cada señal por condición, con un punto en las señales que la ficha del fallo declara: en la deriva del caudalímetro la columna del caudal está vacía y el peso recae en los dos ajustes de combustible." title="" id="130" name="Picture"/>
+            <a:graphic>
+              <a:graphicData uri="http://schemas.openxmlformats.org/drawingml/2006/picture">
+                <pic:pic>
+                  <pic:nvPicPr>
+                    <pic:cNvPr descr="../../artifacts/figures/memoria/FIG-5-15_mapa_atribucion.png" id="131" name="Picture"/>
+                    <pic:cNvPicPr>
+                      <a:picLocks noChangeArrowheads="1" noChangeAspect="1"/>
+                    </pic:cNvPicPr>
+                  </pic:nvPicPr>
+                  <pic:blipFill>
+                    <a:blip r:embed="rId129"/>
                     <a:stretch>
                       <a:fillRect/>
                     </a:stretch>
@@ -16846,11 +17806,11 @@
         </w:numPr>
         <w:pStyle w:val="Ttulosubapartado"/>
       </w:pPr>
-      <w:bookmarkStart w:id="123" w:name="_4f95feeb115dfa4cd7a894b41f114eab35cc873"/>
+      <w:bookmarkStart w:id="132" w:name="_4f95feeb115dfa4cd7a894b41f114eab35cc873"/>
       <w:r>
         <w:t xml:space="preserve">PI.2 · Recuperación y trazabilidad</w:t>
       </w:r>
-      <w:bookmarkEnd w:id="123"/>
+      <w:bookmarkEnd w:id="132"/>
     </w:p>
     <w:p>
       <w:pPr>
@@ -17351,7 +18311,7 @@
         <w:t xml:space="preserve"> </w:t>
       </w:r>
       <w:r>
-        <w:t xml:space="preserve">entre veinticinco celdas. La Figura 5.13 lo separa en las dos preguntas que de verdad se hacen sobre</w:t>
+        <w:t xml:space="preserve">entre veinticinco celdas. La Figura 5.16 lo separa en las dos preguntas que de verdad se hacen sobre</w:t>
       </w:r>
       <w:r>
         <w:t xml:space="preserve"> </w:t>
@@ -17370,7 +18330,7 @@
           <w:b/>
           <w:bCs/>
         </w:rPr>
-        <w:t xml:space="preserve">Figura 5.13. Recuperación del procedimiento relevante del manual según la estrategia de consulta.</w:t>
+        <w:t xml:space="preserve">Figura 5.16. Recuperación del procedimiento relevante del manual según la estrategia de consulta.</w:t>
       </w:r>
     </w:p>
     <w:p>
@@ -17383,18 +18343,18 @@
           <wp:inline>
             <wp:extent cx="5379363" cy="4535301"/>
             <wp:effectExtent b="0" l="0" r="0" t="0"/>
-            <wp:docPr descr="A la izquierda, casos en que el procedimiento aparece entre los diez primeros: cero con la recuperación semántica pura y cinco de cinco con la guiada por el diagnóstico. A la derecha, MRR, nDCG y precisión de cada estrategia." title="" id="125" name="Picture"/>
+            <wp:docPr descr="A la izquierda, casos en que el procedimiento aparece entre los diez primeros: cero con la recuperación semántica pura y cinco de cinco con la guiada por el diagnóstico. A la derecha, MRR, nDCG y precisión de cada estrategia." title="" id="134" name="Picture"/>
             <a:graphic>
               <a:graphicData uri="http://schemas.openxmlformats.org/drawingml/2006/picture">
                 <pic:pic>
                   <pic:nvPicPr>
-                    <pic:cNvPr descr="../../artifacts/figures/memoria/FIG-5-13_recuperacion.png" id="126" name="Picture"/>
+                    <pic:cNvPr descr="../../artifacts/figures/memoria/FIG-5-16_recuperacion.png" id="135" name="Picture"/>
                     <pic:cNvPicPr>
                       <a:picLocks noChangeArrowheads="1" noChangeAspect="1"/>
                     </pic:cNvPicPr>
                   </pic:nvPicPr>
                   <pic:blipFill>
-                    <a:blip r:embed="rId124"/>
+                    <a:blip r:embed="rId133"/>
                     <a:stretch>
                       <a:fillRect/>
                     </a:stretch>
@@ -17847,11 +18807,11 @@
         </w:numPr>
         <w:pStyle w:val="Ttulosubapartado"/>
       </w:pPr>
-      <w:bookmarkStart w:id="127" w:name="_493a884ed9eca2dd7f8ac314a17d5a8100226a7"/>
+      <w:bookmarkStart w:id="136" w:name="_493a884ed9eca2dd7f8ac314a17d5a8100226a7"/>
       <w:r>
         <w:t xml:space="preserve">PI.3 y PI.4 · Suficiencia, abstención y distractores</w:t>
       </w:r>
-      <w:bookmarkEnd w:id="127"/>
+      <w:bookmarkEnd w:id="136"/>
     </w:p>
     <w:p>
       <w:pPr>
@@ -19413,7 +20373,7 @@
         <w:t xml:space="preserve"> </w:t>
       </w:r>
       <w:r>
-        <w:t xml:space="preserve">magnitudes que el criterio de suficiencia mantiene separadas. La Figura 5.14 las enfrenta por</w:t>
+        <w:t xml:space="preserve">magnitudes que el criterio de suficiencia mantiene separadas. La Figura 5.17 las enfrenta por</w:t>
       </w:r>
       <w:r>
         <w:t xml:space="preserve"> </w:t>
@@ -19432,7 +20392,7 @@
           <w:b/>
           <w:bCs/>
         </w:rPr>
-        <w:t xml:space="preserve">Figura 5.14. Documentos aplicables recuperados y cobertura de afirmaciones alcanzada, por condición de evidencia.</w:t>
+        <w:t xml:space="preserve">Figura 5.17. Documentos aplicables recuperados y cobertura de afirmaciones alcanzada, por condición de evidencia.</w:t>
       </w:r>
     </w:p>
     <w:p>
@@ -19443,20 +20403,20 @@
       <w:r>
         <w:drawing>
           <wp:inline>
-            <wp:extent cx="5397500" cy="5846169"/>
+            <wp:extent cx="5397500" cy="5851033"/>
             <wp:effectExtent b="0" l="0" r="0" t="0"/>
-            <wp:docPr descr="Dos paneles: a la izquierda, los documentos aplicables por condición, entre tres y ocho salvo en la de evidencia retirada; a la derecha, la cobertura de afirmaciones, que solo es distinta de cero en la condición de evidencia completa." title="" id="129" name="Picture"/>
+            <wp:docPr descr="Dos paneles: a la izquierda, los documentos aplicables por condición, entre tres y ocho salvo en la de evidencia retirada; a la derecha, la cobertura de afirmaciones, que solo es distinta de cero en la condición de evidencia completa." title="" id="138" name="Picture"/>
             <a:graphic>
               <a:graphicData uri="http://schemas.openxmlformats.org/drawingml/2006/picture">
                 <pic:pic>
                   <pic:nvPicPr>
-                    <pic:cNvPr descr="../../artifacts/figures/memoria/FIG-5-14_aplicables_vs_cobertura.png" id="130" name="Picture"/>
+                    <pic:cNvPr descr="../../artifacts/figures/memoria/FIG-5-17_aplicables_vs_cobertura.png" id="139" name="Picture"/>
                     <pic:cNvPicPr>
                       <a:picLocks noChangeArrowheads="1" noChangeAspect="1"/>
                     </pic:cNvPicPr>
                   </pic:nvPicPr>
                   <pic:blipFill>
-                    <a:blip r:embed="rId128"/>
+                    <a:blip r:embed="rId137"/>
                     <a:stretch>
                       <a:fillRect/>
                     </a:stretch>
@@ -19464,7 +20424,7 @@
                   <pic:spPr bwMode="auto">
                     <a:xfrm>
                       <a:off x="0" y="0"/>
-                      <a:ext cx="5397500" cy="5846169"/>
+                      <a:ext cx="5397500" cy="5851033"/>
                     </a:xfrm>
                     <a:prstGeom prst="rect">
                       <a:avLst/>
@@ -19944,11 +20904,11 @@
         </w:numPr>
         <w:pStyle w:val="Ttulosubapartado"/>
       </w:pPr>
-      <w:bookmarkStart w:id="131" w:name="_df916f654602c8e5cd8b4410501e796b6f10915"/>
+      <w:bookmarkStart w:id="140" w:name="_df916f654602c8e5cd8b4410501e796b6f10915"/>
       <w:r>
         <w:t xml:space="preserve">El modelo de lenguaje: respeta la decisión y no cita lo que no recibió</w:t>
       </w:r>
-      <w:bookmarkEnd w:id="131"/>
+      <w:bookmarkEnd w:id="140"/>
     </w:p>
     <w:p>
       <w:pPr>
@@ -20621,11 +21581,11 @@
         </w:numPr>
         <w:pStyle w:val="Ttulosubapartado"/>
       </w:pPr>
-      <w:bookmarkStart w:id="132" w:name="_c900e69348fc4de70ba8b163c9e079e0a0c4b02"/>
+      <w:bookmarkStart w:id="141" w:name="_c900e69348fc4de70ba8b163c9e079e0a0c4b02"/>
       <w:r>
         <w:t xml:space="preserve">Contribución de cada componente</w:t>
       </w:r>
-      <w:bookmarkEnd w:id="132"/>
+      <w:bookmarkEnd w:id="141"/>
     </w:p>
     <w:p>
       <w:pPr>
@@ -21106,7 +22066,7 @@
         <w:pStyle w:val="Normal"/>
       </w:pPr>
       <w:r>
-        <w:t xml:space="preserve">La tabla da los cuatro recuentos; lo que la Figura 5.15 añade es la escala relativa de los dos</w:t>
+        <w:t xml:space="preserve">La tabla da los cuatro recuentos; lo que la Figura 5.18 añade es la escala relativa de los dos</w:t>
       </w:r>
       <w:r>
         <w:t xml:space="preserve"> </w:t>
@@ -21125,7 +22085,7 @@
           <w:b/>
           <w:bCs/>
         </w:rPr>
-        <w:t xml:space="preserve">Figura 5.15. Falsa confianza y abstención innecesaria de la configuración canónica y de las cuatro ablaciones.</w:t>
+        <w:t xml:space="preserve">Figura 5.18. Falsa confianza y abstención innecesaria de la configuración canónica y de las cuatro ablaciones.</w:t>
       </w:r>
     </w:p>
     <w:p>
@@ -21138,18 +22098,18 @@
           <wp:inline>
             <wp:extent cx="4896168" cy="5073543"/>
             <wp:effectExtent b="0" l="0" r="0" t="0"/>
-            <wp:docPr descr="Dos paneles de barras: la falsa confianza pasa de 0 de 9 en la configuración canónica a 9 de 9 con una puerta de confianza sola, mientras retirar la atribución no cambia ninguna de las dos cifras." title="" id="134" name="Picture"/>
+            <wp:docPr descr="Dos paneles de barras: la falsa confianza pasa de 0 de 9 en la configuración canónica a 9 de 9 con una puerta de confianza sola, mientras retirar la atribución no cambia ninguna de las dos cifras." title="" id="143" name="Picture"/>
             <a:graphic>
               <a:graphicData uri="http://schemas.openxmlformats.org/drawingml/2006/picture">
                 <pic:pic>
                   <pic:nvPicPr>
-                    <pic:cNvPr descr="../../artifacts/figures/memoria/FIG-5-15_ablaciones.png" id="135" name="Picture"/>
+                    <pic:cNvPr descr="../../artifacts/figures/memoria/FIG-5-18_ablaciones.png" id="144" name="Picture"/>
                     <pic:cNvPicPr>
                       <a:picLocks noChangeArrowheads="1" noChangeAspect="1"/>
                     </pic:cNvPicPr>
                   </pic:nvPicPr>
                   <pic:blipFill>
-                    <a:blip r:embed="rId133"/>
+                    <a:blip r:embed="rId142"/>
                     <a:stretch>
                       <a:fillRect/>
                     </a:stretch>
@@ -21707,11 +22667,11 @@
         </w:numPr>
         <w:pStyle w:val="Ttulosubapartado"/>
       </w:pPr>
-      <w:bookmarkStart w:id="136" w:name="_cca3204ad4efed8db8f1d3e16edf1b843adbb3a"/>
+      <w:bookmarkStart w:id="145" w:name="_cca3204ad4efed8db8f1d3e16edf1b843adbb3a"/>
       <w:r>
         <w:t xml:space="preserve">El rediseño de la condición con distractor</w:t>
       </w:r>
-      <w:bookmarkEnd w:id="136"/>
+      <w:bookmarkEnd w:id="145"/>
     </w:p>
     <w:p>
       <w:pPr>
@@ -22228,11 +23188,11 @@
         </w:numPr>
         <w:pStyle w:val="Ttulosubapartado"/>
       </w:pPr>
-      <w:bookmarkStart w:id="137" w:name="_35b58d368b9e0376a8c57b117efe715ede84344"/>
+      <w:bookmarkStart w:id="146" w:name="_35b58d368b9e0376a8c57b117efe715ede84344"/>
       <w:r>
         <w:t xml:space="preserve">La evaluación final sobre el conjunto de prueba</w:t>
       </w:r>
-      <w:bookmarkEnd w:id="137"/>
+      <w:bookmarkEnd w:id="146"/>
     </w:p>
     <w:p>
       <w:pPr>
@@ -22315,7 +23275,7 @@
         <w:t xml:space="preserve"> </w:t>
       </w:r>
       <w:r>
-        <w:t xml:space="preserve">incorrecto, en las que abstenerse era lo que correspondía. La Figura 5.16 da las tres cifras con sus</w:t>
+        <w:t xml:space="preserve">incorrecto, en las que abstenerse era lo que correspondía. La Figura 5.19 da las tres cifras con sus</w:t>
       </w:r>
       <w:r>
         <w:t xml:space="preserve"> </w:t>
@@ -22334,7 +23294,7 @@
           <w:b/>
           <w:bCs/>
         </w:rPr>
-        <w:t xml:space="preserve">Figura 5.16. Las tres cifras de la evaluación final, con su numerador y su denominador.</w:t>
+        <w:t xml:space="preserve">Figura 5.19. Las tres cifras de la evaluación final, con su numerador y su denominador.</w:t>
       </w:r>
     </w:p>
     <w:p>
@@ -22347,18 +23307,18 @@
           <wp:inline>
             <wp:extent cx="5397500" cy="2714827"/>
             <wp:effectExtent b="0" l="0" r="0" t="0"/>
-            <wp:docPr descr="Tres paneles: falsa confianza 0 de 14, abstención innecesaria 2 de 8 y cobertura con evidencia completa 6 de 10, cada uno con el número de ventanas y de sesiones que lo sostiene." title="" id="139" name="Picture"/>
+            <wp:docPr descr="Tres paneles: falsa confianza 0 de 14, abstención innecesaria 2 de 8 y cobertura con evidencia completa 6 de 10, cada uno con el número de ventanas y de sesiones que lo sostiene." title="" id="148" name="Picture"/>
             <a:graphic>
               <a:graphicData uri="http://schemas.openxmlformats.org/drawingml/2006/picture">
                 <pic:pic>
                   <pic:nvPicPr>
-                    <pic:cNvPr descr="../../artifacts/figures/memoria/FIG-5-16_evaluacion_final.png" id="140" name="Picture"/>
+                    <pic:cNvPr descr="../../artifacts/figures/memoria/FIG-5-19_evaluacion_final.png" id="149" name="Picture"/>
                     <pic:cNvPicPr>
                       <a:picLocks noChangeArrowheads="1" noChangeAspect="1"/>
                     </pic:cNvPicPr>
                   </pic:nvPicPr>
                   <pic:blipFill>
-                    <a:blip r:embed="rId138"/>
+                    <a:blip r:embed="rId147"/>
                     <a:stretch>
                       <a:fillRect/>
                     </a:stretch>
@@ -22594,7 +23554,7 @@
         <w:t xml:space="preserve"> </w:t>
       </w:r>
       <w:r>
-        <w:t xml:space="preserve">y abstenerse era lo correcto en ellas. La parte evitable del coste es la otra cifra, 2 de 8. Caso a caso, la Figura 5.17 muestra en qué</w:t>
+        <w:t xml:space="preserve">y abstenerse era lo correcto en ellas. La parte evitable del coste es la otra cifra, 2 de 8. Caso a caso, la Figura 5.20 muestra en qué</w:t>
       </w:r>
       <w:r>
         <w:t xml:space="preserve"> </w:t>
@@ -22613,7 +23573,7 @@
           <w:b/>
           <w:bCs/>
         </w:rPr>
-        <w:t xml:space="preserve">Figura 5.17. Decisión del sistema en cada una de las 22 ejecuciones del estrato operativo.</w:t>
+        <w:t xml:space="preserve">Figura 5.20. Decisión del sistema en cada una de las 22 ejecuciones del estrato operativo.</w:t>
       </w:r>
     </w:p>
     <w:p>
@@ -22626,18 +23586,18 @@
           <wp:inline>
             <wp:extent cx="5316385" cy="4553620"/>
             <wp:effectExtent b="0" l="0" r="0" t="0"/>
-            <wp:docPr descr="Cada ejecución como un punto, por caso anotado y condición de evidencia: todas las de evidencia parcial y retirada terminan en abstención correcta, y las dos abstenciones innecesarias son las de la deriva del caudalímetro y el fallo de encendido con evidencia completa." title="" id="142" name="Picture"/>
+            <wp:docPr descr="Cada ejecución como un punto, por caso anotado y condición de evidencia: todas las de evidencia parcial y retirada terminan en abstención correcta, y las dos abstenciones innecesarias son las de la deriva del caudalímetro y el fallo de encendido con evidencia completa." title="" id="151" name="Picture"/>
             <a:graphic>
               <a:graphicData uri="http://schemas.openxmlformats.org/drawingml/2006/picture">
                 <pic:pic>
                   <pic:nvPicPr>
-                    <pic:cNvPr descr="../../artifacts/figures/memoria/FIG-5-17_decisiones_e19.png" id="143" name="Picture"/>
+                    <pic:cNvPr descr="../../artifacts/figures/memoria/FIG-5-20_decisiones_e19.png" id="152" name="Picture"/>
                     <pic:cNvPicPr>
                       <a:picLocks noChangeArrowheads="1" noChangeAspect="1"/>
                     </pic:cNvPicPr>
                   </pic:nvPicPr>
                   <pic:blipFill>
-                    <a:blip r:embed="rId141"/>
+                    <a:blip r:embed="rId150"/>
                     <a:stretch>
                       <a:fillRect/>
                     </a:stretch>
@@ -22753,7 +23713,7 @@
         <w:pStyle w:val="Normal"/>
       </w:pPr>
       <w:r>
-        <w:t xml:space="preserve">La Figura 5.17 dice</w:t>
+        <w:t xml:space="preserve">La Figura 5.20 dice</w:t>
       </w:r>
       <w:r>
         <w:t xml:space="preserve"> </w:t>
@@ -22851,7 +23811,7 @@
         <w:t xml:space="preserve"> </w:t>
       </w:r>
       <w:r>
-        <w:t xml:space="preserve">documentos aplicables recibió. La Figura 5.18 lo presenta.</w:t>
+        <w:t xml:space="preserve">documentos aplicables recibió. La Figura 5.21 lo presenta.</w:t>
       </w:r>
     </w:p>
     <w:p>
@@ -22864,7 +23824,7 @@
           <w:b/>
           <w:bCs/>
         </w:rPr>
-        <w:t xml:space="preserve">Figura 5.18. Las 35 ejecuciones de la evaluación final, situadas respecto del umbral de confianza.</w:t>
+        <w:t xml:space="preserve">Figura 5.21. Las 35 ejecuciones de la evaluación final, situadas respecto del umbral de confianza.</w:t>
       </w:r>
     </w:p>
     <w:p>
@@ -22877,18 +23837,18 @@
           <wp:inline>
             <wp:extent cx="5367130" cy="6994089"/>
             <wp:effectExtent b="0" l="0" r="0" t="0"/>
-            <wp:docPr descr="Treinta y cinco ejecuciones ordenadas por estrato y confianza, con el umbral de 0,79 marcado: cuatro ejecuciones quedan por debajo y son las cuatro de las dos abstenciones innecesarias, la de la deriva del caudalímetro a 0,573 y la del fallo de encendido a 0,491; todas las demás quedan por encima, y las que el modelo diagnosticó mal son abstenciones correctas por evidencia insuficiente." title="" id="145" name="Picture"/>
+            <wp:docPr descr="Treinta y cinco ejecuciones ordenadas por estrato y confianza, con el umbral de 0,79 marcado: cuatro ejecuciones quedan por debajo y son las cuatro de las dos abstenciones innecesarias, la de la deriva del caudalímetro a 0,573 y la del fallo de encendido a 0,491; todas las demás quedan por encima, y las que el modelo diagnosticó mal son abstenciones correctas por evidencia insuficiente." title="" id="154" name="Picture"/>
             <a:graphic>
               <a:graphicData uri="http://schemas.openxmlformats.org/drawingml/2006/picture">
                 <pic:pic>
                   <pic:nvPicPr>
-                    <pic:cNvPr descr="../../artifacts/figures/memoria/FIG-5-18_decisiones_y_umbral.png" id="146" name="Picture"/>
+                    <pic:cNvPr descr="../../artifacts/figures/memoria/FIG-5-21_decisiones_y_umbral.png" id="155" name="Picture"/>
                     <pic:cNvPicPr>
                       <a:picLocks noChangeArrowheads="1" noChangeAspect="1"/>
                     </pic:cNvPicPr>
                   </pic:nvPicPr>
                   <pic:blipFill>
-                    <a:blip r:embed="rId144"/>
+                    <a:blip r:embed="rId153"/>
                     <a:stretch>
                       <a:fillRect/>
                     </a:stretch>
@@ -23494,11 +24454,11 @@
         </w:numPr>
         <w:pStyle w:val="TtuloApartado"/>
       </w:pPr>
-      <w:bookmarkStart w:id="147" w:name="_2eaaa1ebbc8da33e815f7715091beeca0e6cc1b"/>
+      <w:bookmarkStart w:id="156" w:name="_2eaaa1ebbc8da33e815f7715091beeca0e6cc1b"/>
       <w:r>
         <w:t xml:space="preserve">Discusión y análisis de los resultados</w:t>
       </w:r>
-      <w:bookmarkEnd w:id="147"/>
+      <w:bookmarkEnd w:id="156"/>
     </w:p>
     <w:p>
       <w:pPr>
@@ -23560,11 +24520,11 @@
         </w:numPr>
         <w:pStyle w:val="Ttulosubapartado"/>
       </w:pPr>
-      <w:bookmarkStart w:id="148" w:name="_a6fa91cc9c2e05a367acd48b6f934f6a2751d08"/>
+      <w:bookmarkStart w:id="157" w:name="_a6fa91cc9c2e05a367acd48b6f934f6a2751d08"/>
       <w:r>
         <w:t xml:space="preserve">PI.1 · Qué sostiene el diagnóstico, y con qué margen</w:t>
       </w:r>
-      <w:bookmarkEnd w:id="148"/>
+      <w:bookmarkEnd w:id="157"/>
     </w:p>
     <w:p>
       <w:pPr>
@@ -23789,11 +24749,11 @@
         </w:numPr>
         <w:pStyle w:val="Ttulosubapartado"/>
       </w:pPr>
-      <w:bookmarkStart w:id="149" w:name="_4ae75fc2edd1221d2d5cf6c41b2cb0ea6e96fb6"/>
+      <w:bookmarkStart w:id="158" w:name="_4ae75fc2edd1221d2d5cf6c41b2cb0ea6e96fb6"/>
       <w:r>
         <w:t xml:space="preserve">PI.2 · Qué significa que la trazabilidad se cumpla por construcción</w:t>
       </w:r>
-      <w:bookmarkEnd w:id="149"/>
+      <w:bookmarkEnd w:id="158"/>
     </w:p>
     <w:p>
       <w:pPr>
@@ -23958,11 +24918,11 @@
         </w:numPr>
         <w:pStyle w:val="Ttulosubapartado"/>
       </w:pPr>
-      <w:bookmarkStart w:id="150" w:name="_23904b260bb38e3a98d237910e0d2090000c9a8"/>
+      <w:bookmarkStart w:id="159" w:name="_23904b260bb38e3a98d237910e0d2090000c9a8"/>
       <w:r>
         <w:t xml:space="preserve">PI.3 · Qué precio tiene la abstención</w:t>
       </w:r>
-      <w:bookmarkEnd w:id="150"/>
+      <w:bookmarkEnd w:id="159"/>
     </w:p>
     <w:p>
       <w:pPr>
@@ -24223,11 +25183,11 @@
         </w:numPr>
         <w:pStyle w:val="Ttulosubapartado"/>
       </w:pPr>
-      <w:bookmarkStart w:id="151" w:name="_7ce5583c7846208abc7c894a48f1463ad41755f"/>
+      <w:bookmarkStart w:id="160" w:name="_7ce5583c7846208abc7c894a48f1463ad41755f"/>
       <w:r>
         <w:t xml:space="preserve">PI.4 · Por qué la condición con distractor no medía lo que decía</w:t>
       </w:r>
-      <w:bookmarkEnd w:id="151"/>
+      <w:bookmarkEnd w:id="160"/>
     </w:p>
     <w:p>
       <w:pPr>
@@ -24379,11 +25339,11 @@
         </w:numPr>
         <w:pStyle w:val="Ttulosubapartado"/>
       </w:pPr>
-      <w:bookmarkStart w:id="152" w:name="_b3ec47366dafe6e7e636c1d6a4af0be71bd241f"/>
+      <w:bookmarkStart w:id="161" w:name="_b3ec47366dafe6e7e636c1d6a4af0be71bd241f"/>
       <w:r>
         <w:t xml:space="preserve">La respuesta a la pregunta de investigación</w:t>
       </w:r>
-      <w:bookmarkEnd w:id="152"/>
+      <w:bookmarkEnd w:id="161"/>
     </w:p>
     <w:p>
       <w:pPr>
@@ -24713,11 +25673,11 @@
         </w:numPr>
         <w:pStyle w:val="Ttulosubapartado"/>
       </w:pPr>
-      <w:bookmarkStart w:id="153" w:name="_f50225193eb05a466c44b3a7bb3e4ad45aa691b"/>
+      <w:bookmarkStart w:id="162" w:name="_f50225193eb05a466c44b3a7bb3e4ad45aa691b"/>
       <w:r>
         <w:t xml:space="preserve">Lo que los resultados no sostienen</w:t>
       </w:r>
-      <w:bookmarkEnd w:id="153"/>
+      <w:bookmarkEnd w:id="162"/>
     </w:p>
     <w:p>
       <w:pPr>
@@ -24880,11 +25840,11 @@
         </w:numPr>
         <w:pStyle w:val="Ttulosubapartado"/>
       </w:pPr>
-      <w:bookmarkStart w:id="154" w:name="_8b4c1a42aa9c4371ad5c693bab9794b58ea2a95"/>
+      <w:bookmarkStart w:id="163" w:name="_8b4c1a42aa9c4371ad5c693bab9794b58ea2a95"/>
       <w:r>
         <w:t xml:space="preserve">El patrón que aparece en los resultados</w:t>
       </w:r>
-      <w:bookmarkEnd w:id="154"/>
+      <w:bookmarkEnd w:id="163"/>
     </w:p>
     <w:p>
       <w:pPr>
@@ -25644,11 +26604,11 @@
       <w:pPr>
         <w:pStyle w:val="Ttulo1"/>
       </w:pPr>
-      <w:bookmarkStart w:id="155" w:name="_e573ea55e4a7d2294a654dc8a2ed3cc7f288b68"/>
+      <w:bookmarkStart w:id="164" w:name="_e573ea55e4a7d2294a654dc8a2ed3cc7f288b68"/>
       <w:r>
         <w:t xml:space="preserve">Capítulo 6: Conclusiones</w:t>
       </w:r>
-      <w:bookmarkEnd w:id="155"/>
+      <w:bookmarkEnd w:id="164"/>
     </w:p>
     <w:p>
       <w:pPr>
@@ -25880,11 +26840,11 @@
         </w:numPr>
         <w:pStyle w:val="TtuloApartado"/>
       </w:pPr>
-      <w:bookmarkStart w:id="156" w:name="_42f1e19b743ed9eadd0780cf65b5e0cac8886fe"/>
+      <w:bookmarkStart w:id="165" w:name="_42f1e19b743ed9eadd0780cf65b5e0cac8886fe"/>
       <w:r>
         <w:t xml:space="preserve">El recorrido experimental y lo que mide cada etapa</w:t>
       </w:r>
-      <w:bookmarkEnd w:id="156"/>
+      <w:bookmarkEnd w:id="165"/>
     </w:p>
     <w:p>
       <w:pPr>
@@ -25923,18 +26883,18 @@
           <wp:inline>
             <wp:extent cx="4383606" cy="5164751"/>
             <wp:effectExtent b="0" l="0" r="0" t="0"/>
-            <wp:docPr descr="Ocho etapas encadenadas, del dato OBD-II al resultado experimental, con los experimentos que cubren cada una anotados a la derecha." title="" id="158" name="Picture"/>
+            <wp:docPr descr="Ocho etapas encadenadas, del dato OBD-II al resultado experimental, con los experimentos que cubren cada una anotados a la derecha." title="" id="167" name="Picture"/>
             <a:graphic>
               <a:graphicData uri="http://schemas.openxmlformats.org/drawingml/2006/picture">
                 <pic:pic>
                   <pic:nvPicPr>
-                    <pic:cNvPr descr="../../artifacts/figures/memoria/FIG-6-01_recorrido_experimental.png" id="159" name="Picture"/>
+                    <pic:cNvPr descr="../../artifacts/figures/memoria/FIG-6-01_recorrido_experimental.png" id="168" name="Picture"/>
                     <pic:cNvPicPr>
                       <a:picLocks noChangeArrowheads="1" noChangeAspect="1"/>
                     </pic:cNvPicPr>
                   </pic:nvPicPr>
                   <pic:blipFill>
-                    <a:blip r:embed="rId157"/>
+                    <a:blip r:embed="rId166"/>
                     <a:stretch>
                       <a:fillRect/>
                     </a:stretch>
@@ -26041,11 +27001,11 @@
         </w:numPr>
         <w:pStyle w:val="TtuloApartado"/>
       </w:pPr>
-      <w:bookmarkStart w:id="160" w:name="_7037725355d06f2fbd13453443a6e839df87984"/>
+      <w:bookmarkStart w:id="169" w:name="_7037725355d06f2fbd13453443a6e839df87984"/>
       <w:r>
         <w:t xml:space="preserve">Cumplimiento de los objetivos específicos</w:t>
       </w:r>
-      <w:bookmarkEnd w:id="160"/>
+      <w:bookmarkEnd w:id="169"/>
     </w:p>
     <w:p>
       <w:pPr>
@@ -26055,11 +27015,11 @@
         </w:numPr>
         <w:pStyle w:val="Ttulosubapartado"/>
       </w:pPr>
-      <w:bookmarkStart w:id="161" w:name="_d29dc16f20b7d11d12c2279e6fd04e3539296d9"/>
+      <w:bookmarkStart w:id="170" w:name="_d29dc16f20b7d11d12c2279e6fd04e3539296d9"/>
       <w:r>
         <w:t xml:space="preserve">OE1 · Delimitación del vacío en el estado del conocimiento</w:t>
       </w:r>
-      <w:bookmarkEnd w:id="161"/>
+      <w:bookmarkEnd w:id="170"/>
     </w:p>
     <w:p>
       <w:pPr>
@@ -26087,11 +27047,11 @@
         </w:numPr>
         <w:pStyle w:val="Ttulosubapartado"/>
       </w:pPr>
-      <w:bookmarkStart w:id="162" w:name="_eb5b4f4146e43a4ce2fbdecb3adac049e5f4d28"/>
+      <w:bookmarkStart w:id="171" w:name="_eb5b4f4146e43a4ce2fbdecb3adac049e5f4d28"/>
       <w:r>
         <w:t xml:space="preserve">OE2 · Un entorno experimental reproducible</w:t>
       </w:r>
-      <w:bookmarkEnd w:id="162"/>
+      <w:bookmarkEnd w:id="171"/>
     </w:p>
     <w:p>
       <w:pPr>
@@ -26278,11 +27238,11 @@
         </w:numPr>
         <w:pStyle w:val="Ttulosubapartado"/>
       </w:pPr>
-      <w:bookmarkStart w:id="163" w:name="_2c92354b528d7092e2e5b5fe6a55c9d3444ef8e"/>
+      <w:bookmarkStart w:id="172" w:name="_2c92354b528d7092e2e5b5fe6a55c9d3444ef8e"/>
       <w:r>
         <w:t xml:space="preserve">OE3 · Diagnóstico, confianza y señales que lo sostienen</w:t>
       </w:r>
-      <w:bookmarkEnd w:id="163"/>
+      <w:bookmarkEnd w:id="172"/>
     </w:p>
     <w:p>
       <w:pPr>
@@ -26307,11 +27267,11 @@
         </w:numPr>
         <w:pStyle w:val="Ttulosubapartado"/>
       </w:pPr>
-      <w:bookmarkStart w:id="164" w:name="_204e438ce8602ed8c5955bf55a60edef982c916"/>
+      <w:bookmarkStart w:id="173" w:name="_204e438ce8602ed8c5955bf55a60edef982c916"/>
       <w:r>
         <w:t xml:space="preserve">OE4 · Recuperación y verificación de la evidencia</w:t>
       </w:r>
-      <w:bookmarkEnd w:id="164"/>
+      <w:bookmarkEnd w:id="173"/>
     </w:p>
     <w:p>
       <w:pPr>
@@ -26339,11 +27299,11 @@
         </w:numPr>
         <w:pStyle w:val="Ttulosubapartado"/>
       </w:pPr>
-      <w:bookmarkStart w:id="165" w:name="_2fad8aa7627bd63e1994181dcc2390c9523ee73"/>
+      <w:bookmarkStart w:id="174" w:name="_2fad8aa7627bd63e1994181dcc2390c9523ee73"/>
       <w:r>
         <w:t xml:space="preserve">OE5 · Comportamiento integrado bajo cada condición de evidencia</w:t>
       </w:r>
-      <w:bookmarkEnd w:id="165"/>
+      <w:bookmarkEnd w:id="174"/>
     </w:p>
     <w:p>
       <w:pPr>
@@ -26414,11 +27374,11 @@
         </w:numPr>
         <w:pStyle w:val="Ttulosubapartado"/>
       </w:pPr>
-      <w:bookmarkStart w:id="166" w:name="_45b34389a8752bc935525e629af3a9cea947331"/>
+      <w:bookmarkStart w:id="175" w:name="_45b34389a8752bc935525e629af3a9cea947331"/>
       <w:r>
         <w:t xml:space="preserve">Lo que cada componente aporta</w:t>
       </w:r>
-      <w:bookmarkEnd w:id="166"/>
+      <w:bookmarkEnd w:id="175"/>
     </w:p>
     <w:p>
       <w:pPr>
@@ -26473,18 +27433,18 @@
           <wp:inline>
             <wp:extent cx="5361014" cy="3428235"/>
             <wp:effectExtent b="0" l="0" r="0" t="0"/>
-            <wp:docPr descr="Los cinco objetivos específicos, con los experimentos que los miden y su estado: OE1 cumplido y los otros cuatro cumplidos parcialmente." title="" id="168" name="Picture"/>
+            <wp:docPr descr="Los cinco objetivos específicos, con los experimentos que los miden y su estado: OE1 cumplido y los otros cuatro cumplidos parcialmente." title="" id="177" name="Picture"/>
             <a:graphic>
               <a:graphicData uri="http://schemas.openxmlformats.org/drawingml/2006/picture">
                 <pic:pic>
                   <pic:nvPicPr>
-                    <pic:cNvPr descr="../../artifacts/figures/memoria/FIG-6-02_objetivos_y_evidencia.png" id="169" name="Picture"/>
+                    <pic:cNvPr descr="../../artifacts/figures/memoria/FIG-6-02_objetivos_y_evidencia.png" id="178" name="Picture"/>
                     <pic:cNvPicPr>
                       <a:picLocks noChangeArrowheads="1" noChangeAspect="1"/>
                     </pic:cNvPicPr>
                   </pic:nvPicPr>
                   <pic:blipFill>
-                    <a:blip r:embed="rId167"/>
+                    <a:blip r:embed="rId176"/>
                     <a:stretch>
                       <a:fillRect/>
                     </a:stretch>
@@ -26581,11 +27541,11 @@
         </w:numPr>
         <w:pStyle w:val="TtuloApartado"/>
       </w:pPr>
-      <w:bookmarkStart w:id="170" w:name="_c6c390915eec22efd04f927b9f0680a1fb845b8"/>
+      <w:bookmarkStart w:id="179" w:name="_c6c390915eec22efd04f927b9f0680a1fb845b8"/>
       <w:r>
         <w:t xml:space="preserve">Respuesta a la pregunta de investigación</w:t>
       </w:r>
-      <w:bookmarkEnd w:id="170"/>
+      <w:bookmarkEnd w:id="179"/>
     </w:p>
     <w:p>
       <w:pPr>
@@ -27186,11 +28146,11 @@
         </w:numPr>
         <w:pStyle w:val="TtuloApartado"/>
       </w:pPr>
-      <w:bookmarkStart w:id="171" w:name="_815d43c319da4d019a2c15f9e193075aa1ef490"/>
+      <w:bookmarkStart w:id="180" w:name="_815d43c319da4d019a2c15f9e193075aa1ef490"/>
       <w:r>
         <w:t xml:space="preserve">Comparación con los trabajos revisados</w:t>
       </w:r>
-      <w:bookmarkEnd w:id="171"/>
+      <w:bookmarkEnd w:id="180"/>
     </w:p>
     <w:p>
       <w:pPr>
@@ -27872,11 +28832,11 @@
         </w:numPr>
         <w:pStyle w:val="TtuloApartado"/>
       </w:pPr>
-      <w:bookmarkStart w:id="172" w:name="_abc527d437527ea60fa9520fa4ad104aa094e74"/>
+      <w:bookmarkStart w:id="181" w:name="_abc527d437527ea60fa9520fa4ad104aa094e74"/>
       <w:r>
         <w:t xml:space="preserve">Contribuciones del trabajo</w:t>
       </w:r>
-      <w:bookmarkEnd w:id="172"/>
+      <w:bookmarkEnd w:id="181"/>
     </w:p>
     <w:p>
       <w:pPr>
@@ -27906,11 +28866,11 @@
         </w:numPr>
         <w:pStyle w:val="Ttulosubapartado"/>
       </w:pPr>
-      <w:bookmarkStart w:id="173" w:name="_f18aa2cc1edcc17b466673d0ef3785ca041ac66"/>
+      <w:bookmarkStart w:id="182" w:name="_f18aa2cc1edcc17b466673d0ef3785ca041ac66"/>
       <w:r>
         <w:t xml:space="preserve">Contribuciones técnicas</w:t>
       </w:r>
-      <w:bookmarkEnd w:id="173"/>
+      <w:bookmarkEnd w:id="182"/>
     </w:p>
     <w:p>
       <w:pPr>
@@ -28018,11 +28978,11 @@
         </w:numPr>
         <w:pStyle w:val="Ttulosubapartado"/>
       </w:pPr>
-      <w:bookmarkStart w:id="174" w:name="_858a404ef0ad9b07b3f0e1c4cf6aaa4d1312966"/>
+      <w:bookmarkStart w:id="183" w:name="_858a404ef0ad9b07b3f0e1c4cf6aaa4d1312966"/>
       <w:r>
         <w:t xml:space="preserve">Contribuciones experimentales</w:t>
       </w:r>
-      <w:bookmarkEnd w:id="174"/>
+      <w:bookmarkEnd w:id="183"/>
     </w:p>
     <w:p>
       <w:pPr>
@@ -28309,11 +29269,11 @@
         </w:numPr>
         <w:pStyle w:val="Ttulosubapartado"/>
       </w:pPr>
-      <w:bookmarkStart w:id="175" w:name="_9151abc5c5a6a374b306237e7747b9d162ea641"/>
+      <w:bookmarkStart w:id="184" w:name="_9151abc5c5a6a374b306237e7747b9d162ea641"/>
       <w:r>
         <w:t xml:space="preserve">Contribución metodológica, complementaria y acotada</w:t>
       </w:r>
-      <w:bookmarkEnd w:id="175"/>
+      <w:bookmarkEnd w:id="184"/>
     </w:p>
     <w:p>
       <w:pPr>
@@ -28579,11 +29539,11 @@
         </w:numPr>
         <w:pStyle w:val="Ttulosubapartado"/>
       </w:pPr>
-      <w:bookmarkStart w:id="176" w:name="_0eb85088bab5c5a235e713ea5e681d5a93db4d7"/>
+      <w:bookmarkStart w:id="185" w:name="_0eb85088bab5c5a235e713ea5e681d5a93db4d7"/>
       <w:r>
         <w:t xml:space="preserve">Limitaciones de las contribuciones</w:t>
       </w:r>
-      <w:bookmarkEnd w:id="176"/>
+      <w:bookmarkEnd w:id="185"/>
     </w:p>
     <w:p>
       <w:pPr>
@@ -28752,11 +29712,11 @@
         </w:numPr>
         <w:pStyle w:val="TtuloApartado"/>
       </w:pPr>
-      <w:bookmarkStart w:id="177" w:name="_limitaciones"/>
+      <w:bookmarkStart w:id="186" w:name="_limitaciones"/>
       <w:r>
         <w:t xml:space="preserve">Limitaciones</w:t>
       </w:r>
-      <w:bookmarkEnd w:id="177"/>
+      <w:bookmarkEnd w:id="186"/>
     </w:p>
     <w:p>
       <w:pPr>
@@ -28851,18 +29811,18 @@
           <wp:inline>
             <wp:extent cx="5364072" cy="4718793"/>
             <wp:effectExtent b="0" l="0" r="0" t="0"/>
-            <wp:docPr descr="Plano de falsa confianza contra abstención innecesaria: el verificador queda en 0 de 9 y 2 de 5; abstenerse siempre, en 0 de 9 y 5 de 5; explicar siempre que el modelo confía, en 9 de 9 y 2 de 5." title="" id="179" name="Picture"/>
+            <wp:docPr descr="Plano de falsa confianza contra abstención innecesaria: el verificador queda en 0 de 9 y 2 de 5; abstenerse siempre, en 0 de 9 y 5 de 5; explicar siempre que el modelo confía, en 9 de 9 y 2 de 5." title="" id="188" name="Picture"/>
             <a:graphic>
               <a:graphicData uri="http://schemas.openxmlformats.org/drawingml/2006/picture">
                 <pic:pic>
                   <pic:nvPicPr>
-                    <pic:cNvPr descr="../../artifacts/figures/memoria/FIG-6-03_compromiso_cobertura_abstencion.png" id="180" name="Picture"/>
+                    <pic:cNvPr descr="../../artifacts/figures/memoria/FIG-6-03_compromiso_cobertura_abstencion.png" id="189" name="Picture"/>
                     <pic:cNvPicPr>
                       <a:picLocks noChangeArrowheads="1" noChangeAspect="1"/>
                     </pic:cNvPicPr>
                   </pic:nvPicPr>
                   <pic:blipFill>
-                    <a:blip r:embed="rId178"/>
+                    <a:blip r:embed="rId187"/>
                     <a:stretch>
                       <a:fillRect/>
                     </a:stretch>
@@ -29299,11 +30259,11 @@
         </w:numPr>
         <w:pStyle w:val="TtuloApartado"/>
       </w:pPr>
-      <w:bookmarkStart w:id="181" w:name="_prospectiva"/>
+      <w:bookmarkStart w:id="190" w:name="_prospectiva"/>
       <w:r>
         <w:t xml:space="preserve">Prospectiva</w:t>
       </w:r>
-      <w:bookmarkEnd w:id="181"/>
+      <w:bookmarkEnd w:id="190"/>
     </w:p>
     <w:p>
       <w:pPr>
@@ -29558,11 +30518,11 @@
         </w:numPr>
         <w:pStyle w:val="TtuloApartado"/>
       </w:pPr>
-      <w:bookmarkStart w:id="182" w:name="_aa4c6f09aa999eafce77a8153cd11976f457860"/>
+      <w:bookmarkStart w:id="191" w:name="_aa4c6f09aa999eafce77a8153cd11976f457860"/>
       <w:r>
         <w:t xml:space="preserve">Consideraciones finales</w:t>
       </w:r>
-      <w:bookmarkEnd w:id="182"/>
+      <w:bookmarkEnd w:id="191"/>
     </w:p>
     <w:p>
       <w:pPr>
@@ -29592,11 +30552,11 @@
       <w:pPr>
         <w:pStyle w:val="Ttulo1"/>
       </w:pPr>
-      <w:bookmarkStart w:id="183" w:name="_bibliografía"/>
+      <w:bookmarkStart w:id="192" w:name="_bibliografía"/>
       <w:r>
         <w:t xml:space="preserve">Bibliografía</w:t>
       </w:r>
-      <w:bookmarkEnd w:id="183"/>
+      <w:bookmarkEnd w:id="192"/>
     </w:p>
     <w:p>
       <w:pPr>
@@ -30460,11 +31420,11 @@
       <w:pPr>
         <w:pStyle w:val="Ttulo1"/>
       </w:pPr>
-      <w:bookmarkStart w:id="184" w:name="_anexos"/>
+      <w:bookmarkStart w:id="193" w:name="_anexos"/>
       <w:r>
         <w:t xml:space="preserve">Anexos</w:t>
       </w:r>
-      <w:bookmarkEnd w:id="184"/>
+      <w:bookmarkEnd w:id="193"/>
     </w:p>
     <w:p>
       <w:pPr>
@@ -30563,11 +31523,11 @@
       <w:pPr>
         <w:pStyle w:val="Ttulo1"/>
       </w:pPr>
-      <w:bookmarkStart w:id="185" w:name="_5082f3c942e6bfb1fda2504becaff3627eadee1"/>
+      <w:bookmarkStart w:id="194" w:name="_5082f3c942e6bfb1fda2504becaff3627eadee1"/>
       <w:r>
         <w:t xml:space="preserve">Anexo A · Arquitectura y datos experimentales</w:t>
       </w:r>
-      <w:bookmarkEnd w:id="185"/>
+      <w:bookmarkEnd w:id="194"/>
     </w:p>
     <w:p>
       <w:pPr>
@@ -30629,11 +31589,11 @@
         </w:numPr>
         <w:pStyle w:val="TtuloApartado"/>
       </w:pPr>
-      <w:bookmarkStart w:id="186" w:name="_346125ca19ecd2944f51dd8524395bede94f04f"/>
+      <w:bookmarkStart w:id="195" w:name="_346125ca19ecd2944f51dd8524395bede94f04f"/>
       <w:r>
         <w:t xml:space="preserve">A.1 · La arquitectura, en una línea por etapa</w:t>
       </w:r>
-      <w:bookmarkEnd w:id="186"/>
+      <w:bookmarkEnd w:id="195"/>
     </w:p>
     <w:p>
       <w:pPr>
@@ -31068,11 +32028,11 @@
         </w:numPr>
         <w:pStyle w:val="TtuloApartado"/>
       </w:pPr>
-      <w:bookmarkStart w:id="187" w:name="_8667d1e0b9d498a4cfddb1f1d3481e29df04289"/>
+      <w:bookmarkStart w:id="196" w:name="_8667d1e0b9d498a4cfddb1f1d3481e29df04289"/>
       <w:r>
         <w:t xml:space="preserve">A.2 · Las doce señales OBD-II</w:t>
       </w:r>
-      <w:bookmarkEnd w:id="187"/>
+      <w:bookmarkEnd w:id="196"/>
     </w:p>
     <w:p>
       <w:pPr>
@@ -31778,11 +32738,11 @@
         </w:numPr>
         <w:pStyle w:val="TtuloApartado"/>
       </w:pPr>
-      <w:bookmarkStart w:id="188" w:name="_9c75383ba58c1cde92da93b11502cc9c7531986"/>
+      <w:bookmarkStart w:id="197" w:name="_9c75383ba58c1cde92da93b11502cc9c7531986"/>
       <w:r>
         <w:t xml:space="preserve">A.3 · Las cinco condiciones de fallo</w:t>
       </w:r>
-      <w:bookmarkEnd w:id="188"/>
+      <w:bookmarkEnd w:id="197"/>
     </w:p>
     <w:p>
       <w:pPr>
@@ -32328,7 +33288,7 @@
         <w:t xml:space="preserve"> </w:t>
       </w:r>
       <w:r>
-        <w:t xml:space="preserve">caída de 260 rpm en el fallo de encendido. El techo de 71 °C es el parámetro que la Figura 5.8 del</w:t>
+        <w:t xml:space="preserve">caída de 260 rpm en el fallo de encendido. El techo de 71 °C es el parámetro que la Figura 5.9 del</w:t>
       </w:r>
       <w:r>
         <w:t xml:space="preserve"> </w:t>
@@ -32345,11 +33305,11 @@
         </w:numPr>
         <w:pStyle w:val="TtuloApartado"/>
       </w:pPr>
-      <w:bookmarkStart w:id="189" w:name="_657486341536a495a6da5c96d73aa0960eb5ee7"/>
+      <w:bookmarkStart w:id="198" w:name="_657486341536a495a6da5c96d73aa0960eb5ee7"/>
       <w:r>
         <w:t xml:space="preserve">A.4 · La calibración contra el manual de taller</w:t>
       </w:r>
-      <w:bookmarkEnd w:id="189"/>
+      <w:bookmarkEnd w:id="198"/>
     </w:p>
     <w:p>
       <w:pPr>
@@ -32684,11 +33644,11 @@
         </w:numPr>
         <w:pStyle w:val="TtuloApartado"/>
       </w:pPr>
-      <w:bookmarkStart w:id="190" w:name="_3b3805a77353db1de84b04a9b6ee9aa5706318b"/>
+      <w:bookmarkStart w:id="199" w:name="_3b3805a77353db1de84b04a9b6ee9aa5706318b"/>
       <w:r>
         <w:t xml:space="preserve">A.5 · Los tres conjuntos, y cuál se puede reconstruir</w:t>
       </w:r>
-      <w:bookmarkEnd w:id="190"/>
+      <w:bookmarkEnd w:id="199"/>
     </w:p>
     <w:p>
       <w:pPr>
@@ -33224,11 +34184,11 @@
         </w:numPr>
         <w:pStyle w:val="TtuloApartado"/>
       </w:pPr>
-      <w:bookmarkStart w:id="191" w:name="_f4952d2743fd56100637acd1cb039ea6b96f53d"/>
+      <w:bookmarkStart w:id="200" w:name="_f4952d2743fd56100637acd1cb039ea6b96f53d"/>
       <w:r>
         <w:t xml:space="preserve">A.6 · La señal testigo de cada condición</w:t>
       </w:r>
-      <w:bookmarkEnd w:id="191"/>
+      <w:bookmarkEnd w:id="200"/>
     </w:p>
     <w:p>
       <w:pPr>
@@ -33267,18 +34227,18 @@
           <wp:inline>
             <wp:extent cx="5397500" cy="6870198"/>
             <wp:effectExtent b="0" l="0" r="0" t="0"/>
-            <wp:docPr descr="Cinco paneles, uno por condición: antes de la marca de entrada del fallo las dos series coinciden exactamente, y la divergencia posterior es el efecto de la condición." title="" id="193" name="Picture"/>
+            <wp:docPr descr="Cinco paneles, uno por condición: antes de la marca de entrada del fallo las dos series coinciden exactamente, y la divergencia posterior es el efecto de la condición." title="" id="202" name="Picture"/>
             <a:graphic>
               <a:graphicData uri="http://schemas.openxmlformats.org/drawingml/2006/picture">
                 <pic:pic>
                   <pic:nvPicPr>
-                    <pic:cNvPr descr="../../artifacts/figures/memoria/FIG-A-01_series_normal_vs_fallo.png" id="194" name="Picture"/>
+                    <pic:cNvPr descr="../../artifacts/figures/memoria/FIG-A-01_series_normal_vs_fallo.png" id="203" name="Picture"/>
                     <pic:cNvPicPr>
                       <a:picLocks noChangeArrowheads="1" noChangeAspect="1"/>
                     </pic:cNvPicPr>
                   </pic:nvPicPr>
                   <pic:blipFill>
-                    <a:blip r:embed="rId192"/>
+                    <a:blip r:embed="rId201"/>
                     <a:stretch>
                       <a:fillRect/>
                     </a:stretch>
@@ -33504,11 +34464,11 @@
         </w:numPr>
         <w:pStyle w:val="TtuloApartado"/>
       </w:pPr>
-      <w:bookmarkStart w:id="195" w:name="_0cd64653c162df5921d3e22283b02d9be08e4fb"/>
+      <w:bookmarkStart w:id="204" w:name="_0cd64653c162df5921d3e22283b02d9be08e4fb"/>
       <w:r>
         <w:t xml:space="preserve">A.7 · La misma comparación, ahora sobre el conjunto canónico</w:t>
       </w:r>
-      <w:bookmarkEnd w:id="195"/>
+      <w:bookmarkEnd w:id="204"/>
     </w:p>
     <w:p>
       <w:pPr>
@@ -33587,18 +34547,18 @@
           <wp:inline>
             <wp:extent cx="5364072" cy="6553709"/>
             <wp:effectExtent b="0" l="0" r="0" t="0"/>
-            <wp:docPr descr="Cinco paneles, uno por condición, cada uno con dos series superpuestas: la sesión con el fallo y la misma sesión sin él. Antes de la marca de entrada las dos coinciden exactamente. Después, el ajuste a largo plazo se separa en la fuga de vacío y en la deriva del caudalímetro, la temperatura del refrigerante se estanca en el termostato, la oscilación de la sonda se amortigua hasta una banda estrecha, y en el fallo de encendido las dos series siguen coincidiendo salvo en dieciséis muestras." title="" id="197" name="Picture"/>
+            <wp:docPr descr="Cinco paneles, uno por condición, cada uno con dos series superpuestas: la sesión con el fallo y la misma sesión sin él. Antes de la marca de entrada las dos coinciden exactamente. Después, el ajuste a largo plazo se separa en la fuga de vacío y en la deriva del caudalímetro, la temperatura del refrigerante se estanca en el termostato, la oscilación de la sonda se amortigua hasta una banda estrecha, y en el fallo de encendido las dos series siguen coincidiendo salvo en dieciséis muestras." title="" id="206" name="Picture"/>
             <a:graphic>
               <a:graphicData uri="http://schemas.openxmlformats.org/drawingml/2006/picture">
                 <pic:pic>
                   <pic:nvPicPr>
-                    <pic:cNvPr descr="../../artifacts/figures/memoria/FIG-A-02_pareja_contrafactual.png" id="198" name="Picture"/>
+                    <pic:cNvPr descr="../../artifacts/figures/memoria/FIG-A-02_pareja_contrafactual.png" id="207" name="Picture"/>
                     <pic:cNvPicPr>
                       <a:picLocks noChangeArrowheads="1" noChangeAspect="1"/>
                     </pic:cNvPicPr>
                   </pic:nvPicPr>
                   <pic:blipFill>
-                    <a:blip r:embed="rId196"/>
+                    <a:blip r:embed="rId205"/>
                     <a:stretch>
                       <a:fillRect/>
                     </a:stretch>
@@ -33976,11 +34936,11 @@
       <w:pPr>
         <w:pStyle w:val="Ttulo1"/>
       </w:pPr>
-      <w:bookmarkStart w:id="199" w:name="_45e509d14ce2f8e03d3f13cfd8915ae0f578989"/>
+      <w:bookmarkStart w:id="208" w:name="_45e509d14ce2f8e03d3f13cfd8915ae0f578989"/>
       <w:r>
         <w:t xml:space="preserve">Anexo B · Evidencia experimental complementaria</w:t>
       </w:r>
-      <w:bookmarkEnd w:id="199"/>
+      <w:bookmarkEnd w:id="208"/>
     </w:p>
     <w:p>
       <w:pPr>
@@ -34044,11 +35004,11 @@
         </w:numPr>
         <w:pStyle w:val="TtuloApartado"/>
       </w:pPr>
-      <w:bookmarkStart w:id="200" w:name="_a39c305f8452d34f67a0c3b120991d9a9cce91f"/>
+      <w:bookmarkStart w:id="209" w:name="_a39c305f8452d34f67a0c3b120991d9a9cce91f"/>
       <w:r>
         <w:t xml:space="preserve">B.1 · Qué estatuto tiene cada resultado</w:t>
       </w:r>
-      <w:bookmarkEnd w:id="200"/>
+      <w:bookmarkEnd w:id="209"/>
     </w:p>
     <w:p>
       <w:pPr>
@@ -34468,189 +35428,24 @@
         </w:numPr>
         <w:pStyle w:val="TtuloApartado"/>
       </w:pPr>
-      <w:bookmarkStart w:id="201" w:name="_c9c10af7f2dcaca9913c8b4f523ceb3bb4cc99c"/>
+      <w:bookmarkStart w:id="210" w:name="_c9c10af7f2dcaca9913c8b4f523ceb3bb4cc99c"/>
       <w:r>
         <w:t xml:space="preserve">B.2 · El rendimiento por condición de los dos modelos</w:t>
       </w:r>
-      <w:bookmarkEnd w:id="201"/>
-    </w:p>
-    <w:p>
-      <w:pPr>
-        <w:pStyle w:val="Normal"/>
-      </w:pPr>
-      <w:r>
-        <w:t xml:space="preserve">El capítulo 5 publica la exactitud y el F1 macro de los dos modelos de diagnóstico, y cita en prosa</w:t>
-      </w:r>
-      <w:r>
-        <w:t xml:space="preserve"> </w:t>
-      </w:r>
-      <w:r>
-        <w:t xml:space="preserve">la única condición en que la red recurrente gana. La Figura B.1 da el detalle por condición.</w:t>
-      </w:r>
-    </w:p>
-    <w:p>
-      <w:pPr>
-        <w:keepNext/>
-        <w:pStyle w:val="PieDeFigura"/>
-      </w:pPr>
-      <w:r>
-        <w:rPr>
-          <w:b/>
-          <w:bCs/>
-        </w:rPr>
-        <w:t xml:space="preserve">Figura B.1. F1 por condición de los dos modelos de diagnóstico y diferencia entre ellos.</w:t>
-      </w:r>
-    </w:p>
-    <w:p>
-      <w:pPr>
-        <w:keepNext/>
-        <w:pStyle w:val="CaptionedFigure"/>
-      </w:pPr>
-      <w:r>
-        <w:drawing>
-          <wp:inline>
-            <wp:extent cx="5351839" cy="4718793"/>
-            <wp:effectExtent b="0" l="0" r="0" t="0"/>
-            <wp:docPr descr="Dos paneles: a la izquierda el F1 de cada condición para el bosque y la red; a la derecha su diferencia, con la red ganando solo en el termostato por 0,032 y perdiendo en las otras cinco, hasta 0,167 en el fallo de encendido." title="" id="203" name="Picture"/>
-            <a:graphic>
-              <a:graphicData uri="http://schemas.openxmlformats.org/drawingml/2006/picture">
-                <pic:pic>
-                  <pic:nvPicPr>
-                    <pic:cNvPr descr="../../artifacts/figures/memoria/FIG-B-01_f1_por_clase.png" id="204" name="Picture"/>
-                    <pic:cNvPicPr>
-                      <a:picLocks noChangeArrowheads="1" noChangeAspect="1"/>
-                    </pic:cNvPicPr>
-                  </pic:nvPicPr>
-                  <pic:blipFill>
-                    <a:blip r:embed="rId202"/>
-                    <a:stretch>
-                      <a:fillRect/>
-                    </a:stretch>
-                  </pic:blipFill>
-                  <pic:spPr bwMode="auto">
-                    <a:xfrm>
-                      <a:off x="0" y="0"/>
-                      <a:ext cx="5351839" cy="4718793"/>
-                    </a:xfrm>
-                    <a:prstGeom prst="rect">
-                      <a:avLst/>
-                    </a:prstGeom>
-                    <a:noFill/>
-                    <a:ln w="9525">
-                      <a:noFill/>
-                      <a:headEnd/>
-                      <a:tailEnd/>
-                    </a:ln>
-                  </pic:spPr>
-                </pic:pic>
-              </a:graphicData>
-            </a:graphic>
-          </wp:inline>
-        </w:drawing>
-      </w:r>
-    </w:p>
-    <w:p>
-      <w:pPr>
-        <w:pStyle w:val="Normal"/>
-      </w:pPr>
-      <w:r>
-        <w:rPr>
-          <w:i/>
-          <w:iCs/>
-        </w:rPr>
-        <w:t xml:space="preserve">Fuente: elaboración propia. Experimentos: E6 y E7. Conjunto:</w:t>
-      </w:r>
-      <w:r>
-        <w:rPr>
-          <w:i/>
-          <w:iCs/>
-        </w:rPr>
-        <w:t xml:space="preserve"> </w:t>
-      </w:r>
-      <w:r>
-        <w:rPr>
-          <w:rStyle w:val="VerbatimChar"/>
-          <w:i/>
-          <w:iCs/>
-        </w:rPr>
-        <w:t xml:space="preserve">synthetic_v2</w:t>
-      </w:r>
-      <w:r>
-        <w:rPr>
-          <w:i/>
-          <w:iCs/>
-        </w:rPr>
-        <w:t xml:space="preserve">, partición de validación. Paneles: (a) F1 de cada condición para los dos modelos; (b) diferencia entre los dos, positiva cuando gana la red. Protocolo: una ejecución por modelo, semilla 20260901; n es el número de ventanas de la clase en validación.</w:t>
-      </w:r>
-    </w:p>
-    <w:p>
-      <w:pPr>
-        <w:pStyle w:val="Normal"/>
-      </w:pPr>
-      <w:r>
-        <w:t xml:space="preserve">La Figura 5.6 del capítulo 5 muestra</w:t>
-      </w:r>
-      <w:r>
-        <w:t xml:space="preserve"> </w:t>
-      </w:r>
-      <w:r>
-        <w:rPr>
-          <w:b/>
-          <w:bCs/>
-        </w:rPr>
-        <w:t xml:space="preserve">adónde</w:t>
-      </w:r>
-      <w:r>
-        <w:t xml:space="preserve"> </w:t>
-      </w:r>
-      <w:r>
-        <w:t xml:space="preserve">van los errores de cada modelo; esta muestra</w:t>
-      </w:r>
-      <w:r>
-        <w:t xml:space="preserve"> </w:t>
-      </w:r>
-      <w:r>
-        <w:rPr>
-          <w:b/>
-          <w:bCs/>
-        </w:rPr>
-        <w:t xml:space="preserve">cuánto</w:t>
-      </w:r>
-      <w:r>
-        <w:t xml:space="preserve"> </w:t>
-      </w:r>
-      <w:r>
-        <w:t xml:space="preserve">pesa cada condición en la diferencia agregada, que es lo que aquella no puede decir. La</w:t>
-      </w:r>
-      <w:r>
-        <w:t xml:space="preserve"> </w:t>
-      </w:r>
-      <w:r>
-        <w:t xml:space="preserve">red gana en una sola condición, el termostato, por 0,032, y pierde en las otras cinco, con el máximo</w:t>
-      </w:r>
-      <w:r>
-        <w:t xml:space="preserve"> </w:t>
-      </w:r>
-      <w:r>
-        <w:t xml:space="preserve">en el fallo de encendido, 0,167. La lectura es que la desventaja agregada de 0,056 en F1 macro no se</w:t>
-      </w:r>
-      <w:r>
-        <w:t xml:space="preserve"> </w:t>
-      </w:r>
-      <w:r>
-        <w:t xml:space="preserve">reparte: se concentra en la condición que menos señal deja. Las limitaciones son las del capítulo:</w:t>
-      </w:r>
-      <w:r>
-        <w:t xml:space="preserve"> </w:t>
-      </w:r>
-      <w:r>
-        <w:t xml:space="preserve">una ejecución por celda, sin repeticiones ni intervalos, y una diferencia de 0,032 sobre catorce</w:t>
-      </w:r>
-      <w:r>
-        <w:t xml:space="preserve"> </w:t>
-      </w:r>
-      <w:r>
-        <w:t xml:space="preserve">ventanas equivale a una ventana y media.</w:t>
+      <w:bookmarkEnd w:id="210"/>
+    </w:p>
+    <w:p>
+      <w:pPr>
+        <w:pStyle w:val="Normal"/>
+      </w:pPr>
+      <w:r>
+        <w:t xml:space="preserve">La Figura 5.7 del capítulo 5 reparte por condición la diferencia entre los dos modelos. Esta tabla</w:t>
+      </w:r>
+      <w:r>
+        <w:t xml:space="preserve"> </w:t>
+      </w:r>
+      <w:r>
+        <w:t xml:space="preserve">publica los valores que esa figura dibuja, para quien quiera leerlos uno a uno.</w:t>
       </w:r>
     </w:p>
     <w:p>
@@ -35161,11 +35956,11 @@
         </w:numPr>
         <w:pStyle w:val="TtuloApartado"/>
       </w:pPr>
-      <w:bookmarkStart w:id="205" w:name="_efd196228a47300a2db9af74479686f4d854794"/>
+      <w:bookmarkStart w:id="211" w:name="_efd196228a47300a2db9af74479686f4d854794"/>
       <w:r>
         <w:t xml:space="preserve">B.3 · Dónde se apoya el modelo, condición a condición</w:t>
       </w:r>
-      <w:bookmarkEnd w:id="205"/>
+      <w:bookmarkEnd w:id="211"/>
     </w:p>
     <w:p>
       <w:pPr>
@@ -35581,7 +36376,7 @@
         <w:t xml:space="preserve"> </w:t>
       </w:r>
       <w:r>
-        <w:t xml:space="preserve">compensa. La Figura 5.12 del capítulo 5 lo muestra para las seis condiciones, y es la razón de que</w:t>
+        <w:t xml:space="preserve">compensa. La Figura 5.15 del capítulo 5 lo muestra para las seis condiciones, y es la razón de que</w:t>
       </w:r>
       <w:r>
         <w:t xml:space="preserve"> </w:t>
@@ -35604,11 +36399,11 @@
         </w:numPr>
         <w:pStyle w:val="TtuloApartado"/>
       </w:pPr>
-      <w:bookmarkStart w:id="206" w:name="_61081aab223e9317eb772ed20d287ada9f7496b"/>
+      <w:bookmarkStart w:id="212" w:name="_61081aab223e9317eb772ed20d287ada9f7496b"/>
       <w:r>
         <w:t xml:space="preserve">B.4 · El barrido del umbral de suficiencia</w:t>
       </w:r>
-      <w:bookmarkEnd w:id="206"/>
+      <w:bookmarkEnd w:id="212"/>
     </w:p>
     <w:p>
       <w:pPr>
@@ -35745,11 +36540,11 @@
         </w:numPr>
         <w:pStyle w:val="TtuloApartado"/>
       </w:pPr>
-      <w:bookmarkStart w:id="207" w:name="_50d858f85cf7555200468b2bb49abb9249698c3"/>
+      <w:bookmarkStart w:id="213" w:name="_50d858f85cf7555200468b2bb49abb9249698c3"/>
       <w:r>
         <w:t xml:space="preserve">B.5 · Las cinco aperturas del conjunto de prueba</w:t>
       </w:r>
-      <w:bookmarkEnd w:id="207"/>
+      <w:bookmarkEnd w:id="213"/>
     </w:p>
     <w:p>
       <w:pPr>
@@ -36148,11 +36943,11 @@
         </w:numPr>
         <w:pStyle w:val="TtuloApartado"/>
       </w:pPr>
-      <w:bookmarkStart w:id="208" w:name="_854f7bc650c45e01dd4fb07419e14d27e37c41b"/>
+      <w:bookmarkStart w:id="214" w:name="_854f7bc650c45e01dd4fb07419e14d27e37c41b"/>
       <w:r>
         <w:t xml:space="preserve">B.6 · Qué separa las dos averías de mezcla pobre</w:t>
       </w:r>
-      <w:bookmarkEnd w:id="208"/>
+      <w:bookmarkEnd w:id="214"/>
     </w:p>
     <w:p>
       <w:pPr>
@@ -36885,11 +37680,11 @@
         </w:numPr>
         <w:pStyle w:val="TtuloApartado"/>
       </w:pPr>
-      <w:bookmarkStart w:id="209" w:name="_1bbbd8e824e4c59976b6285f2434cdcb4490b2e"/>
+      <w:bookmarkStart w:id="215" w:name="_1bbbd8e824e4c59976b6285f2434cdcb4490b2e"/>
       <w:r>
         <w:t xml:space="preserve">B.7 · La enmienda de los criterios de aceptación</w:t>
       </w:r>
-      <w:bookmarkEnd w:id="209"/>
+      <w:bookmarkEnd w:id="215"/>
     </w:p>
     <w:p>
       <w:pPr>
@@ -37495,11 +38290,11 @@
       <w:pPr>
         <w:pStyle w:val="Ttulo1"/>
       </w:pPr>
-      <w:bookmarkStart w:id="210" w:name="_abcaf046201c9c68fccc55a6b785525beec9806"/>
+      <w:bookmarkStart w:id="216" w:name="_abcaf046201c9c68fccc55a6b785525beec9806"/>
       <w:r>
         <w:t xml:space="preserve">Anexo C · Reproducibilidad</w:t>
       </w:r>
-      <w:bookmarkEnd w:id="210"/>
+      <w:bookmarkEnd w:id="216"/>
     </w:p>
     <w:p>
       <w:pPr>
@@ -37549,11 +38344,11 @@
         </w:numPr>
         <w:pStyle w:val="TtuloApartado"/>
       </w:pPr>
-      <w:bookmarkStart w:id="211" w:name="_662edf990d91f7466776c3c6928c8a88c5ceeda"/>
+      <w:bookmarkStart w:id="217" w:name="_662edf990d91f7466776c3c6928c8a88c5ceeda"/>
       <w:r>
         <w:t xml:space="preserve">C.1 · Qué hace falta</w:t>
       </w:r>
-      <w:bookmarkEnd w:id="211"/>
+      <w:bookmarkEnd w:id="217"/>
     </w:p>
     <w:p>
       <w:pPr>
@@ -37760,11 +38555,11 @@
         </w:numPr>
         <w:pStyle w:val="TtuloApartado"/>
       </w:pPr>
-      <w:bookmarkStart w:id="212" w:name="_bd0629c71b4220a71a686c3b1b3abcf1c357ac4"/>
+      <w:bookmarkStart w:id="218" w:name="_bd0629c71b4220a71a686c3b1b3abcf1c357ac4"/>
       <w:r>
         <w:t xml:space="preserve">C.2 · Las cinco órdenes</w:t>
       </w:r>
-      <w:bookmarkEnd w:id="212"/>
+      <w:bookmarkEnd w:id="218"/>
     </w:p>
     <w:p>
       <w:pPr>
@@ -38013,11 +38808,11 @@
         </w:numPr>
         <w:pStyle w:val="TtuloApartado"/>
       </w:pPr>
-      <w:bookmarkStart w:id="213" w:name="_f99443d628ede90f30244d7d3dd267b1f4bed0b"/>
+      <w:bookmarkStart w:id="219" w:name="_f99443d628ede90f30244d7d3dd267b1f4bed0b"/>
       <w:r>
         <w:t xml:space="preserve">C.3 · Los notebooks</w:t>
       </w:r>
-      <w:bookmarkEnd w:id="213"/>
+      <w:bookmarkEnd w:id="219"/>
     </w:p>
     <w:p>
       <w:pPr>
@@ -38413,11 +39208,11 @@
         </w:numPr>
         <w:pStyle w:val="TtuloApartado"/>
       </w:pPr>
-      <w:bookmarkStart w:id="214" w:name="_bd97170dc8f9a70e1be9ea0068248f5d10cc2e4"/>
+      <w:bookmarkStart w:id="220" w:name="_bd97170dc8f9a70e1be9ea0068248f5d10cc2e4"/>
       <w:r>
         <w:t xml:space="preserve">C.4 · Los guiones de verificación</w:t>
       </w:r>
-      <w:bookmarkEnd w:id="214"/>
+      <w:bookmarkEnd w:id="220"/>
     </w:p>
     <w:p>
       <w:pPr>
@@ -38641,11 +39436,11 @@
         </w:numPr>
         <w:pStyle w:val="TtuloApartado"/>
       </w:pPr>
-      <w:bookmarkStart w:id="215" w:name="_7dec08523f00dfbd6fb93cbe3c71ec155298ff7"/>
+      <w:bookmarkStart w:id="221" w:name="_7dec08523f00dfbd6fb93cbe3c71ec155298ff7"/>
       <w:r>
         <w:t xml:space="preserve">C.5 · Lo que no se puede reproducir, y por qué</w:t>
       </w:r>
-      <w:bookmarkEnd w:id="215"/>
+      <w:bookmarkEnd w:id="221"/>
     </w:p>
     <w:p>
       <w:pPr>
@@ -38930,11 +39725,11 @@
         </w:numPr>
         <w:pStyle w:val="TtuloApartado"/>
       </w:pPr>
-      <w:bookmarkStart w:id="216" w:name="_32e3a7affebedc81d94399c442897d2474f4593"/>
+      <w:bookmarkStart w:id="222" w:name="_32e3a7affebedc81d94399c442897d2474f4593"/>
       <w:r>
         <w:t xml:space="preserve">C.6 · De la referencia académica al artefacto del repositorio</w:t>
       </w:r>
-      <w:bookmarkEnd w:id="216"/>
+      <w:bookmarkEnd w:id="222"/>
     </w:p>
     <w:p>
       <w:pPr>
@@ -39578,7 +40373,7 @@
               <w:pStyle w:val="TextoDeTabla"/>
             </w:pPr>
             <w:r>
-              <w:t xml:space="preserve">Figura 5.7</w:t>
+              <w:t xml:space="preserve">Figura 5.8</w:t>
             </w:r>
           </w:p>
         </w:tc>
@@ -39614,7 +40409,7 @@
               <w:rPr>
                 <w:rStyle w:val="VerbatimChar"/>
               </w:rPr>
-              <w:t xml:space="preserve">FIG-5-07_confusor_volumen</w:t>
+              <w:t xml:space="preserve">FIG-5-08_confusor_volumen</w:t>
             </w:r>
           </w:p>
         </w:tc>
@@ -39671,7 +40466,7 @@
               <w:pStyle w:val="TextoDeTabla"/>
             </w:pPr>
             <w:r>
-              <w:t xml:space="preserve">Figura 5.8</w:t>
+              <w:t xml:space="preserve">Figura 5.9</w:t>
             </w:r>
           </w:p>
         </w:tc>
@@ -39707,7 +40502,7 @@
               <w:rPr>
                 <w:rStyle w:val="VerbatimChar"/>
               </w:rPr>
-              <w:t xml:space="preserve">FIG-5-08_limite_evidencia_termostato</w:t>
+              <w:t xml:space="preserve">FIG-5-09_limite_evidencia_termostato</w:t>
             </w:r>
           </w:p>
         </w:tc>
@@ -39753,7 +40548,7 @@
               <w:pStyle w:val="TextoDeTabla"/>
             </w:pPr>
             <w:r>
-              <w:t xml:space="preserve">Figura 5.9</w:t>
+              <w:t xml:space="preserve">Figura 5.10</w:t>
             </w:r>
           </w:p>
         </w:tc>
@@ -39789,7 +40584,7 @@
               <w:rPr>
                 <w:rStyle w:val="VerbatimChar"/>
               </w:rPr>
-              <w:t xml:space="preserve">FIG-5-09_expresion_del_fallo</w:t>
+              <w:t xml:space="preserve">FIG-5-10_expresion_del_fallo</w:t>
             </w:r>
           </w:p>
         </w:tc>
@@ -39822,7 +40617,7 @@
               <w:pStyle w:val="TextoDeTabla"/>
             </w:pPr>
             <w:r>
-              <w:t xml:space="preserve">Figura 5.10</w:t>
+              <w:t xml:space="preserve">Figura 5.11</w:t>
             </w:r>
           </w:p>
         </w:tc>
@@ -39858,7 +40653,7 @@
               <w:rPr>
                 <w:rStyle w:val="VerbatimChar"/>
               </w:rPr>
-              <w:t xml:space="preserve">FIG-5-10_ventana_y_descriptor</w:t>
+              <w:t xml:space="preserve">FIG-5-11_ventana_y_descriptor</w:t>
             </w:r>
           </w:p>
         </w:tc>
@@ -39915,7 +40710,7 @@
               <w:pStyle w:val="TextoDeTabla"/>
             </w:pPr>
             <w:r>
-              <w:t xml:space="preserve">Figura 5.11</w:t>
+              <w:t xml:space="preserve">Figura 5.12</w:t>
             </w:r>
           </w:p>
         </w:tc>
@@ -39951,7 +40746,7 @@
               <w:rPr>
                 <w:rStyle w:val="VerbatimChar"/>
               </w:rPr>
-              <w:t xml:space="preserve">FIG-5-11_calibracion</w:t>
+              <w:t xml:space="preserve">FIG-5-12_calibracion</w:t>
             </w:r>
           </w:p>
         </w:tc>
@@ -39993,7 +40788,7 @@
               <w:pStyle w:val="TextoDeTabla"/>
             </w:pPr>
             <w:r>
-              <w:t xml:space="preserve">Figura 5.12</w:t>
+              <w:t xml:space="preserve">Figura 5.15</w:t>
             </w:r>
           </w:p>
         </w:tc>
@@ -40029,7 +40824,7 @@
               <w:rPr>
                 <w:rStyle w:val="VerbatimChar"/>
               </w:rPr>
-              <w:t xml:space="preserve">FIG-5-12_mapa_atribucion</w:t>
+              <w:t xml:space="preserve">FIG-5-15_mapa_atribucion</w:t>
             </w:r>
           </w:p>
         </w:tc>
@@ -40077,7 +40872,7 @@
               <w:pStyle w:val="TextoDeTabla"/>
             </w:pPr>
             <w:r>
-              <w:t xml:space="preserve">Figura 5.13</w:t>
+              <w:t xml:space="preserve">Figura 5.16</w:t>
             </w:r>
           </w:p>
         </w:tc>
@@ -40113,7 +40908,7 @@
               <w:rPr>
                 <w:rStyle w:val="VerbatimChar"/>
               </w:rPr>
-              <w:t xml:space="preserve">FIG-5-13_recuperacion</w:t>
+              <w:t xml:space="preserve">FIG-5-16_recuperacion</w:t>
             </w:r>
           </w:p>
         </w:tc>
@@ -40155,7 +40950,7 @@
               <w:pStyle w:val="TextoDeTabla"/>
             </w:pPr>
             <w:r>
-              <w:t xml:space="preserve">Figura 5.14</w:t>
+              <w:t xml:space="preserve">Figura 5.17</w:t>
             </w:r>
           </w:p>
         </w:tc>
@@ -40191,7 +40986,7 @@
               <w:rPr>
                 <w:rStyle w:val="VerbatimChar"/>
               </w:rPr>
-              <w:t xml:space="preserve">FIG-5-14_aplicables_vs_cobertura</w:t>
+              <w:t xml:space="preserve">FIG-5-17_aplicables_vs_cobertura</w:t>
             </w:r>
           </w:p>
         </w:tc>
@@ -40239,7 +41034,7 @@
               <w:pStyle w:val="TextoDeTabla"/>
             </w:pPr>
             <w:r>
-              <w:t xml:space="preserve">Figura 5.15</w:t>
+              <w:t xml:space="preserve">Figura 5.18</w:t>
             </w:r>
           </w:p>
         </w:tc>
@@ -40275,7 +41070,7 @@
               <w:rPr>
                 <w:rStyle w:val="VerbatimChar"/>
               </w:rPr>
-              <w:t xml:space="preserve">FIG-5-15_ablaciones</w:t>
+              <w:t xml:space="preserve">FIG-5-18_ablaciones</w:t>
             </w:r>
           </w:p>
         </w:tc>
@@ -40332,7 +41127,7 @@
               <w:pStyle w:val="TextoDeTabla"/>
             </w:pPr>
             <w:r>
-              <w:t xml:space="preserve">Figura 5.16</w:t>
+              <w:t xml:space="preserve">Figura 5.19</w:t>
             </w:r>
           </w:p>
         </w:tc>
@@ -40368,7 +41163,7 @@
               <w:rPr>
                 <w:rStyle w:val="VerbatimChar"/>
               </w:rPr>
-              <w:t xml:space="preserve">FIG-5-16_evaluacion_final</w:t>
+              <w:t xml:space="preserve">FIG-5-19_evaluacion_final</w:t>
             </w:r>
           </w:p>
         </w:tc>
@@ -40416,7 +41211,7 @@
               <w:pStyle w:val="TextoDeTabla"/>
             </w:pPr>
             <w:r>
-              <w:t xml:space="preserve">Figura 5.17</w:t>
+              <w:t xml:space="preserve">Figura 5.20</w:t>
             </w:r>
           </w:p>
         </w:tc>
@@ -40452,7 +41247,7 @@
               <w:rPr>
                 <w:rStyle w:val="VerbatimChar"/>
               </w:rPr>
-              <w:t xml:space="preserve">FIG-5-17_decisiones_e19</w:t>
+              <w:t xml:space="preserve">FIG-5-20_decisiones_e19</w:t>
             </w:r>
           </w:p>
         </w:tc>
@@ -40485,7 +41280,7 @@
               <w:pStyle w:val="TextoDeTabla"/>
             </w:pPr>
             <w:r>
-              <w:t xml:space="preserve">Figura 5.18</w:t>
+              <w:t xml:space="preserve">Figura 5.21</w:t>
             </w:r>
           </w:p>
         </w:tc>
@@ -40521,7 +41316,7 @@
               <w:rPr>
                 <w:rStyle w:val="VerbatimChar"/>
               </w:rPr>
-              <w:t xml:space="preserve">FIG-5-18_decisiones_y_umbral</w:t>
+              <w:t xml:space="preserve">FIG-5-21_decisiones_y_umbral</w:t>
             </w:r>
           </w:p>
         </w:tc>
@@ -40933,7 +41728,7 @@
               <w:pStyle w:val="TextoDeTabla"/>
             </w:pPr>
             <w:r>
-              <w:t xml:space="preserve">Figura B.1</w:t>
+              <w:t xml:space="preserve">Figura 5.7</w:t>
             </w:r>
           </w:p>
         </w:tc>
@@ -40969,7 +41764,7 @@
               <w:rPr>
                 <w:rStyle w:val="VerbatimChar"/>
               </w:rPr>
-              <w:t xml:space="preserve">FIG-B-01_f1_por_clase</w:t>
+              <w:t xml:space="preserve">FIG-5-07_f1_por_clase</w:t>
             </w:r>
           </w:p>
         </w:tc>

</xml_diff>